<commit_message>
add product design chapter
</commit_message>
<xml_diff>
--- a/Final Report.docx
+++ b/Final Report.docx
@@ -8617,70 +8617,7 @@
           <w:rFonts w:ascii="Arial" w:hAnsi="Arial" w:cs="Arial"/>
           <w:lang w:val="en-US"/>
         </w:rPr>
-        <w:t>,</w:t>
-      </w:r>
-      <w:r>
-        <w:rPr>
-          <w:rFonts w:ascii="Arial" w:hAnsi="Arial" w:cs="Arial"/>
-          <w:lang w:val="en-US"/>
-        </w:rPr>
-        <w:t xml:space="preserve"> R2-synthesise degraded images for each image using low-light (using different simulated low-light conditions) and Gaussian-blurring (using different standard deviations for the Gaussian filter) to simulate challenging conditions</w:t>
-      </w:r>
-      <w:r>
-        <w:rPr>
-          <w:rFonts w:ascii="Arial" w:hAnsi="Arial" w:cs="Arial"/>
-          <w:lang w:val="en-US"/>
-        </w:rPr>
-        <w:t xml:space="preserve">, </w:t>
-      </w:r>
-      <w:r>
-        <w:rPr>
-          <w:rFonts w:ascii="Arial" w:hAnsi="Arial" w:cs="Arial"/>
-          <w:lang w:val="en-US"/>
-        </w:rPr>
-        <w:t xml:space="preserve">R3-enhance the pre-processed images using simple enhancements (gamma correction and contrast-limited adaptive histogram </w:t>
-      </w:r>
-      <w:r>
-        <w:rPr>
-          <w:rFonts w:ascii="Arial" w:hAnsi="Arial" w:cs="Arial"/>
-          <w:lang w:val="en-US"/>
-        </w:rPr>
-        <w:t>equalization</w:t>
-      </w:r>
-      <w:r>
-        <w:rPr>
-          <w:rFonts w:ascii="Arial" w:hAnsi="Arial" w:cs="Arial"/>
-          <w:lang w:val="en-US"/>
-        </w:rPr>
-        <w:t xml:space="preserve"> (CLAHE)</w:t>
-      </w:r>
-      <w:r>
-        <w:rPr>
-          <w:rFonts w:ascii="Arial" w:hAnsi="Arial" w:cs="Arial"/>
-          <w:lang w:val="en-US"/>
-        </w:rPr>
-        <w:t>,</w:t>
-      </w:r>
-      <w:r>
-        <w:rPr>
-          <w:rFonts w:ascii="Arial" w:hAnsi="Arial" w:cs="Arial"/>
-          <w:lang w:val="en-US"/>
-        </w:rPr>
-        <w:t xml:space="preserve"> R4-detect the objects in the pre-processed images using pre-trained detectors without model training and fine-tuning</w:t>
-      </w:r>
-      <w:r>
-        <w:rPr>
-          <w:rFonts w:ascii="Arial" w:hAnsi="Arial" w:cs="Arial"/>
-          <w:lang w:val="en-US"/>
-        </w:rPr>
-        <w:t>,</w:t>
-      </w:r>
-      <w:r>
-        <w:rPr>
-          <w:rFonts w:ascii="Arial" w:hAnsi="Arial" w:cs="Arial"/>
-          <w:lang w:val="en-US"/>
-        </w:rPr>
-        <w:t xml:space="preserve"> R5-compare three detectors (YOLOv8, SSD </w:t>
+        <w:t xml:space="preserve">, R2-synthesise degraded images for each image using low-light (using different simulated low-light conditions) and Gaussian-blurring (using different standard deviations for the Gaussian filter) to simulate challenging conditions, R3-enhance the pre-processed images using simple enhancements (gamma correction and contrast-limited adaptive histogram equalization (CLAHE), R4-detect the objects in the pre-processed images using pre-trained detectors without model training and fine-tuning, R5-compare three detectors (YOLOv8, SSD </w:t>
       </w:r>
       <w:proofErr w:type="spellStart"/>
       <w:r>
@@ -8696,21 +8633,7 @@
           <w:rFonts w:ascii="Arial" w:hAnsi="Arial" w:cs="Arial"/>
           <w:lang w:val="en-US"/>
         </w:rPr>
-        <w:t xml:space="preserve"> and Faster R-CNN) under the same conditions</w:t>
-      </w:r>
-      <w:r>
-        <w:rPr>
-          <w:rFonts w:ascii="Arial" w:hAnsi="Arial" w:cs="Arial"/>
-          <w:lang w:val="en-US"/>
-        </w:rPr>
-        <w:t>,</w:t>
-      </w:r>
-      <w:r>
-        <w:rPr>
-          <w:rFonts w:ascii="Arial" w:hAnsi="Arial" w:cs="Arial"/>
-          <w:lang w:val="en-US"/>
-        </w:rPr>
-        <w:t xml:space="preserve"> and R6-evaluate the performance by computing mean average precision, precision, recall and F1-score. The development process mirroring these requirements was to curate the data set, generate synthetic images, enhance them, run pre-trained models, compute metrics and compare results. Using synthetic degradations, we could run experiments with low, medium and high levels of low-light and blur. The results were used to refine the experimental process. This allowed the project to focus on evaluating robustness to degradations, rather than developing and training models.</w:t>
+        <w:t xml:space="preserve"> and Faster R-CNN) under the same conditions, and R6-evaluate the performance by computing mean average precision, precision, recall and F1-score. The development process mirroring these requirements was to curate the data set, generate synthetic images, enhance them, run pre-trained models, compute metrics and compare results. Using synthetic degradations, we could run experiments with low, medium and high levels of low-light and blur. The results were used to refine the experimental process. This allowed the project to focus on evaluating robustness to degradations, rather than developing and training models.</w:t>
       </w:r>
     </w:p>
     <w:p>
@@ -8811,21 +8734,7 @@
           <w:rFonts w:ascii="Arial" w:hAnsi="Arial" w:cs="Arial"/>
           <w:lang w:val="en-US"/>
         </w:rPr>
-        <w:t xml:space="preserve"> Work-in-progress limits ensure the researcher doesn't start too many tasks at once. Kanban is suitable for individual research as it </w:t>
-      </w:r>
-      <w:r>
-        <w:rPr>
-          <w:rFonts w:ascii="Arial" w:hAnsi="Arial" w:cs="Arial"/>
-          <w:lang w:val="en-US"/>
-        </w:rPr>
-        <w:t>visualizes</w:t>
-      </w:r>
-      <w:r>
-        <w:rPr>
-          <w:rFonts w:ascii="Arial" w:hAnsi="Arial" w:cs="Arial"/>
-          <w:lang w:val="en-US"/>
-        </w:rPr>
-        <w:t xml:space="preserve"> </w:t>
+        <w:t xml:space="preserve"> Work-in-progress limits ensure the researcher doesn't start too many tasks at once. Kanban is suitable for individual research as it visualizes </w:t>
       </w:r>
       <w:r>
         <w:rPr>
@@ -8964,35 +8873,7 @@
           <w:rFonts w:ascii="Arial" w:hAnsi="Arial" w:cs="Arial"/>
           <w:lang w:val="en-US"/>
         </w:rPr>
-        <w:t xml:space="preserve">. The project chose not to train models from </w:t>
-      </w:r>
-      <w:r>
-        <w:rPr>
-          <w:rFonts w:ascii="Arial" w:hAnsi="Arial" w:cs="Arial"/>
-          <w:lang w:val="en-US"/>
-        </w:rPr>
-        <w:t>scratch or</w:t>
-      </w:r>
-      <w:r>
-        <w:rPr>
-          <w:rFonts w:ascii="Arial" w:hAnsi="Arial" w:cs="Arial"/>
-          <w:lang w:val="en-US"/>
-        </w:rPr>
-        <w:t xml:space="preserve"> develop deep enhancement or deblurring networks; these would require large data sets and large GPU </w:t>
-      </w:r>
-      <w:r>
-        <w:rPr>
-          <w:rFonts w:ascii="Arial" w:hAnsi="Arial" w:cs="Arial"/>
-          <w:lang w:val="en-US"/>
-        </w:rPr>
-        <w:t>clusters and</w:t>
-      </w:r>
-      <w:r>
-        <w:rPr>
-          <w:rFonts w:ascii="Arial" w:hAnsi="Arial" w:cs="Arial"/>
-          <w:lang w:val="en-US"/>
-        </w:rPr>
-        <w:t xml:space="preserve"> might introduce artefacts that complicate analysis. Instead, gamma correction and CLAHE enhanced visibility in a repeatable manner with CLAHE being a proven local contrast enhancement method</w:t>
+        <w:t>. The project chose not to train models from scratch or develop deep enhancement or deblurring networks; these would require large data sets and large GPU clusters and might introduce artefacts that complicate analysis. Instead, gamma correction and CLAHE enhanced visibility in a repeatable manner with CLAHE being a proven local contrast enhancement method</w:t>
       </w:r>
       <w:r>
         <w:rPr>
@@ -9167,206 +9048,223 @@
     </w:p>
     <w:p>
       <w:pPr>
-        <w:rPr>
-          <w:lang w:val="en-US"/>
-        </w:rPr>
-      </w:pPr>
-    </w:p>
-    <w:p>
-      <w:pPr>
-        <w:jc w:val="center"/>
-        <w:rPr>
-          <w:lang w:val="en-US"/>
-        </w:rPr>
-      </w:pPr>
-    </w:p>
-    <w:p>
-      <w:pPr>
-        <w:jc w:val="center"/>
-        <w:rPr>
-          <w:lang w:val="en-US"/>
-        </w:rPr>
-      </w:pPr>
-    </w:p>
-    <w:p>
-      <w:pPr>
-        <w:jc w:val="center"/>
-        <w:rPr>
-          <w:lang w:val="en-US"/>
-        </w:rPr>
-      </w:pPr>
-    </w:p>
-    <w:p>
-      <w:pPr>
-        <w:jc w:val="center"/>
-        <w:rPr>
-          <w:lang w:val="en-US"/>
-        </w:rPr>
-      </w:pPr>
-    </w:p>
-    <w:p>
-      <w:pPr>
-        <w:jc w:val="center"/>
-        <w:rPr>
-          <w:lang w:val="en-US"/>
-        </w:rPr>
-      </w:pPr>
-    </w:p>
-    <w:p>
-      <w:pPr>
-        <w:jc w:val="center"/>
-        <w:rPr>
-          <w:lang w:val="en-US"/>
-        </w:rPr>
-      </w:pPr>
-    </w:p>
-    <w:p>
-      <w:pPr>
-        <w:jc w:val="center"/>
-        <w:rPr>
-          <w:lang w:val="en-US"/>
-        </w:rPr>
-      </w:pPr>
-    </w:p>
-    <w:p>
-      <w:pPr>
-        <w:jc w:val="center"/>
-        <w:rPr>
-          <w:lang w:val="en-US"/>
-        </w:rPr>
-      </w:pPr>
-    </w:p>
-    <w:p>
-      <w:pPr>
-        <w:jc w:val="center"/>
-        <w:rPr>
-          <w:lang w:val="en-US"/>
-        </w:rPr>
-      </w:pPr>
-    </w:p>
-    <w:p>
-      <w:pPr>
-        <w:jc w:val="center"/>
-        <w:rPr>
-          <w:lang w:val="en-US"/>
-        </w:rPr>
-      </w:pPr>
-    </w:p>
-    <w:p>
-      <w:pPr>
-        <w:jc w:val="center"/>
-        <w:rPr>
-          <w:lang w:val="en-US"/>
-        </w:rPr>
-      </w:pPr>
-    </w:p>
-    <w:p>
-      <w:pPr>
-        <w:jc w:val="center"/>
-        <w:rPr>
-          <w:lang w:val="en-US"/>
-        </w:rPr>
-      </w:pPr>
-    </w:p>
-    <w:p>
-      <w:pPr>
-        <w:jc w:val="center"/>
-        <w:rPr>
-          <w:lang w:val="en-US"/>
-        </w:rPr>
-      </w:pPr>
-    </w:p>
-    <w:p>
-      <w:pPr>
-        <w:jc w:val="center"/>
-        <w:rPr>
-          <w:lang w:val="en-US"/>
-        </w:rPr>
-      </w:pPr>
-    </w:p>
-    <w:p>
-      <w:pPr>
-        <w:jc w:val="center"/>
-        <w:rPr>
-          <w:lang w:val="en-US"/>
-        </w:rPr>
-      </w:pPr>
-    </w:p>
-    <w:p>
-      <w:pPr>
-        <w:jc w:val="center"/>
-        <w:rPr>
-          <w:lang w:val="en-US"/>
-        </w:rPr>
-      </w:pPr>
-    </w:p>
-    <w:p>
-      <w:pPr>
-        <w:jc w:val="center"/>
-        <w:rPr>
-          <w:lang w:val="en-US"/>
-        </w:rPr>
-      </w:pPr>
-    </w:p>
-    <w:p>
-      <w:pPr>
-        <w:jc w:val="center"/>
-        <w:rPr>
-          <w:lang w:val="en-US"/>
-        </w:rPr>
-      </w:pPr>
-    </w:p>
-    <w:p>
-      <w:pPr>
-        <w:jc w:val="center"/>
-        <w:rPr>
-          <w:lang w:val="en-US"/>
-        </w:rPr>
-      </w:pPr>
-    </w:p>
-    <w:p>
-      <w:pPr>
-        <w:jc w:val="center"/>
-        <w:rPr>
-          <w:lang w:val="en-US"/>
-        </w:rPr>
-      </w:pPr>
-    </w:p>
-    <w:p>
-      <w:pPr>
-        <w:jc w:val="center"/>
-        <w:rPr>
-          <w:lang w:val="en-US"/>
-        </w:rPr>
-      </w:pPr>
-    </w:p>
-    <w:p>
-      <w:pPr>
-        <w:jc w:val="center"/>
-        <w:rPr>
-          <w:lang w:val="en-US"/>
-        </w:rPr>
-      </w:pPr>
-    </w:p>
-    <w:p>
-      <w:pPr>
-        <w:jc w:val="center"/>
-        <w:rPr>
-          <w:lang w:val="en-US"/>
-        </w:rPr>
-      </w:pPr>
-    </w:p>
-    <w:p>
-      <w:pPr>
-        <w:jc w:val="center"/>
-        <w:rPr>
-          <w:lang w:val="en-US"/>
-        </w:rPr>
-      </w:pPr>
-    </w:p>
-    <w:p>
-      <w:pPr>
-        <w:jc w:val="center"/>
+        <w:spacing w:line="360" w:lineRule="auto"/>
+        <w:jc w:val="both"/>
+        <w:rPr>
+          <w:rFonts w:ascii="Arial" w:hAnsi="Arial" w:cs="Arial"/>
+          <w:lang w:val="en-US"/>
+        </w:rPr>
+      </w:pPr>
+      <w:r>
+        <w:rPr>
+          <w:rFonts w:ascii="Arial" w:hAnsi="Arial" w:cs="Arial"/>
+          <w:lang w:val="en-US"/>
+        </w:rPr>
+        <w:t xml:space="preserve">The system is a web-based object detection performance evaluation system, developed with </w:t>
+      </w:r>
+      <w:proofErr w:type="spellStart"/>
+      <w:r>
+        <w:rPr>
+          <w:rFonts w:ascii="Arial" w:hAnsi="Arial" w:cs="Arial"/>
+          <w:lang w:val="en-US"/>
+        </w:rPr>
+        <w:t>Streamlit</w:t>
+      </w:r>
+      <w:proofErr w:type="spellEnd"/>
+      <w:r>
+        <w:rPr>
+          <w:rFonts w:ascii="Arial" w:hAnsi="Arial" w:cs="Arial"/>
+          <w:lang w:val="en-US"/>
+        </w:rPr>
+        <w:t xml:space="preserve">, which runs fully in the browser. It features three deep learning models (YOLOv8, SSD </w:t>
+      </w:r>
+      <w:proofErr w:type="spellStart"/>
+      <w:r>
+        <w:rPr>
+          <w:rFonts w:ascii="Arial" w:hAnsi="Arial" w:cs="Arial"/>
+          <w:lang w:val="en-US"/>
+        </w:rPr>
+        <w:t>MobileNet</w:t>
+      </w:r>
+      <w:proofErr w:type="spellEnd"/>
+      <w:r>
+        <w:rPr>
+          <w:rFonts w:ascii="Arial" w:hAnsi="Arial" w:cs="Arial"/>
+          <w:lang w:val="en-US"/>
+        </w:rPr>
+        <w:t xml:space="preserve"> and Faster R-CNN) and the ability to run detection on normal, blurred and low-light images. The webapp has four pages: a Detection Demo page for real-time inference, a Degradation Simulator page for degrading and enhancing images, a Model Comparison page to compare different models, and a Results Dashboard with pre-computed metrics. It is completely web-based and does not require installation.</w:t>
+      </w:r>
+    </w:p>
+    <w:p>
+      <w:pPr>
+        <w:spacing w:line="360" w:lineRule="auto"/>
+        <w:jc w:val="both"/>
+        <w:rPr>
+          <w:rFonts w:ascii="Arial" w:hAnsi="Arial" w:cs="Arial"/>
+          <w:lang w:val="en-US"/>
+        </w:rPr>
+      </w:pPr>
+    </w:p>
+    <w:p>
+      <w:pPr>
+        <w:spacing w:line="360" w:lineRule="auto"/>
+        <w:jc w:val="both"/>
+        <w:rPr>
+          <w:rFonts w:ascii="Arial" w:hAnsi="Arial" w:cs="Arial"/>
+        </w:rPr>
+      </w:pPr>
+      <w:r>
+        <w:rPr>
+          <w:rFonts w:ascii="Arial" w:hAnsi="Arial" w:cs="Arial"/>
+        </w:rPr>
+        <w:t xml:space="preserve">Figure 1: Detection Demo page showing YOLOv8 output </w:t>
+      </w:r>
+    </w:p>
+    <w:p>
+      <w:pPr>
+        <w:spacing w:line="360" w:lineRule="auto"/>
+        <w:jc w:val="both"/>
+        <w:rPr>
+          <w:rFonts w:ascii="Arial" w:hAnsi="Arial" w:cs="Arial"/>
+        </w:rPr>
+      </w:pPr>
+      <w:r>
+        <w:rPr>
+          <w:rFonts w:ascii="Arial" w:hAnsi="Arial" w:cs="Arial"/>
+        </w:rPr>
+        <w:t xml:space="preserve">Figure 2: Degradation Simulator showing low-light severe with CLAHE enhancement </w:t>
+      </w:r>
+    </w:p>
+    <w:p>
+      <w:pPr>
+        <w:spacing w:line="360" w:lineRule="auto"/>
+        <w:jc w:val="both"/>
+        <w:rPr>
+          <w:rFonts w:ascii="Arial" w:hAnsi="Arial" w:cs="Arial"/>
+        </w:rPr>
+      </w:pPr>
+      <w:r>
+        <w:rPr>
+          <w:rFonts w:ascii="Arial" w:hAnsi="Arial" w:cs="Arial"/>
+        </w:rPr>
+        <w:t xml:space="preserve">Figure 3: Model Comparison page </w:t>
+      </w:r>
+    </w:p>
+    <w:p>
+      <w:pPr>
+        <w:spacing w:line="360" w:lineRule="auto"/>
+        <w:jc w:val="both"/>
+        <w:rPr>
+          <w:rFonts w:ascii="Arial" w:hAnsi="Arial" w:cs="Arial"/>
+        </w:rPr>
+      </w:pPr>
+      <w:r>
+        <w:rPr>
+          <w:rFonts w:ascii="Arial" w:hAnsi="Arial" w:cs="Arial"/>
+        </w:rPr>
+        <w:t>Figure 4: Results Dashboard</w:t>
+      </w:r>
+    </w:p>
+    <w:p>
+      <w:pPr>
+        <w:spacing w:line="360" w:lineRule="auto"/>
+        <w:jc w:val="both"/>
+        <w:rPr>
+          <w:rFonts w:ascii="Arial" w:hAnsi="Arial" w:cs="Arial"/>
+          <w:lang w:val="en-US"/>
+        </w:rPr>
+      </w:pPr>
+      <w:r>
+        <w:rPr>
+          <w:rFonts w:ascii="Arial" w:hAnsi="Arial" w:cs="Arial"/>
+        </w:rPr>
+        <w:t>Use case diagram</w:t>
+      </w:r>
+    </w:p>
+    <w:p>
+      <w:pPr>
+        <w:spacing w:line="360" w:lineRule="auto"/>
+        <w:jc w:val="both"/>
+        <w:rPr>
+          <w:rFonts w:ascii="Arial" w:hAnsi="Arial" w:cs="Arial"/>
+          <w:lang w:val="en-US"/>
+        </w:rPr>
+      </w:pPr>
+    </w:p>
+    <w:p>
+      <w:pPr>
+        <w:jc w:val="center"/>
+        <w:rPr>
+          <w:lang w:val="en-US"/>
+        </w:rPr>
+      </w:pPr>
+    </w:p>
+    <w:p>
+      <w:pPr>
+        <w:jc w:val="center"/>
+        <w:rPr>
+          <w:lang w:val="en-US"/>
+        </w:rPr>
+      </w:pPr>
+    </w:p>
+    <w:p>
+      <w:pPr>
+        <w:jc w:val="center"/>
+        <w:rPr>
+          <w:lang w:val="en-US"/>
+        </w:rPr>
+      </w:pPr>
+    </w:p>
+    <w:p>
+      <w:pPr>
+        <w:jc w:val="center"/>
+        <w:rPr>
+          <w:lang w:val="en-US"/>
+        </w:rPr>
+      </w:pPr>
+    </w:p>
+    <w:p>
+      <w:pPr>
+        <w:jc w:val="center"/>
+        <w:rPr>
+          <w:lang w:val="en-US"/>
+        </w:rPr>
+      </w:pPr>
+    </w:p>
+    <w:p>
+      <w:pPr>
+        <w:jc w:val="center"/>
+        <w:rPr>
+          <w:lang w:val="en-US"/>
+        </w:rPr>
+      </w:pPr>
+    </w:p>
+    <w:p>
+      <w:pPr>
+        <w:jc w:val="center"/>
+        <w:rPr>
+          <w:lang w:val="en-US"/>
+        </w:rPr>
+      </w:pPr>
+    </w:p>
+    <w:p>
+      <w:pPr>
+        <w:jc w:val="center"/>
+        <w:rPr>
+          <w:lang w:val="en-US"/>
+        </w:rPr>
+      </w:pPr>
+    </w:p>
+    <w:p>
+      <w:pPr>
+        <w:jc w:val="center"/>
+        <w:rPr>
+          <w:lang w:val="en-US"/>
+        </w:rPr>
+      </w:pPr>
+    </w:p>
+    <w:p>
+      <w:pPr>
         <w:rPr>
           <w:lang w:val="en-US"/>
         </w:rPr>
@@ -9409,6 +9307,7 @@
           <w:szCs w:val="24"/>
           <w:lang w:val="en-US"/>
         </w:rPr>
+        <w:lastRenderedPageBreak/>
         <w:t>Chapter 6</w:t>
       </w:r>
       <w:r>
@@ -11419,6 +11318,92 @@
 <file path=word/numbering.xml><?xml version="1.0" encoding="utf-8"?>
 <w:numbering xmlns:wpc="http://schemas.microsoft.com/office/word/2010/wordprocessingCanvas" xmlns:cx="http://schemas.microsoft.com/office/drawing/2014/chartex" xmlns:cx1="http://schemas.microsoft.com/office/drawing/2015/9/8/chartex" xmlns:cx2="http://schemas.microsoft.com/office/drawing/2015/10/21/chartex" xmlns:cx3="http://schemas.microsoft.com/office/drawing/2016/5/9/chartex" xmlns:cx4="http://schemas.microsoft.com/office/drawing/2016/5/10/chartex" xmlns:cx5="http://schemas.microsoft.com/office/drawing/2016/5/11/chartex" xmlns:cx6="http://schemas.microsoft.com/office/drawing/2016/5/12/chartex" xmlns:cx7="http://schemas.microsoft.com/office/drawing/2016/5/13/chartex" xmlns:cx8="http://schemas.microsoft.com/office/drawing/2016/5/14/chartex" xmlns:mc="http://schemas.openxmlformats.org/markup-compatibility/2006" xmlns:aink="http://schemas.microsoft.com/office/drawing/2016/ink" xmlns:am3d="http://schemas.microsoft.com/office/drawing/2017/model3d" xmlns:o="urn:schemas-microsoft-com:office:office" xmlns:oel="http://schemas.microsoft.com/office/2019/extlst" xmlns:r="http://schemas.openxmlformats.org/officeDocument/2006/relationships" xmlns:m="http://schemas.openxmlformats.org/officeDocument/2006/math" xmlns:v="urn:schemas-microsoft-com:vml" xmlns:wp14="http://schemas.microsoft.com/office/word/2010/wordprocessingDrawing" xmlns:wp="http://schemas.openxmlformats.org/drawingml/2006/wordprocessingDrawing" xmlns:w10="urn:schemas-microsoft-com:office:word" xmlns:w="http://schemas.openxmlformats.org/wordprocessingml/2006/main" xmlns:w14="http://schemas.microsoft.com/office/word/2010/wordml" xmlns:w15="http://schemas.microsoft.com/office/word/2012/wordml" xmlns:w16cex="http://schemas.microsoft.com/office/word/2018/wordml/cex" xmlns:w16cid="http://schemas.microsoft.com/office/word/2016/wordml/cid" xmlns:w16="http://schemas.microsoft.com/office/word/2018/wordml" xmlns:w16du="http://schemas.microsoft.com/office/word/2023/wordml/word16du" xmlns:w16sdtdh="http://schemas.microsoft.com/office/word/2020/wordml/sdtdatahash" xmlns:w16sdtfl="http://schemas.microsoft.com/office/word/2024/wordml/sdtformatlock" xmlns:w16se="http://schemas.microsoft.com/office/word/2015/wordml/symex" xmlns:wpg="http://schemas.microsoft.com/office/word/2010/wordprocessingGroup" xmlns:wpi="http://schemas.microsoft.com/office/word/2010/wordprocessingInk" xmlns:wne="http://schemas.microsoft.com/office/word/2006/wordml" xmlns:wps="http://schemas.microsoft.com/office/word/2010/wordprocessingShape" mc:Ignorable="w14 w15 w16se w16cid w16 w16cex w16sdtdh w16sdtfl w16du wp14">
   <w:abstractNum w:abstractNumId="0" w15:restartNumberingAfterBreak="0">
+    <w:nsid w:val="0839224B"/>
+    <w:multiLevelType w:val="hybridMultilevel"/>
+    <w:tmpl w:val="BD20FC56"/>
+    <w:lvl w:ilvl="0" w:tplc="0809000F">
+      <w:start w:val="1"/>
+      <w:numFmt w:val="decimal"/>
+      <w:lvlText w:val="%1."/>
+      <w:lvlJc w:val="left"/>
+      <w:pPr>
+        <w:ind w:left="720" w:hanging="360"/>
+      </w:pPr>
+    </w:lvl>
+    <w:lvl w:ilvl="1" w:tplc="08090019" w:tentative="1">
+      <w:start w:val="1"/>
+      <w:numFmt w:val="lowerLetter"/>
+      <w:lvlText w:val="%2."/>
+      <w:lvlJc w:val="left"/>
+      <w:pPr>
+        <w:ind w:left="1440" w:hanging="360"/>
+      </w:pPr>
+    </w:lvl>
+    <w:lvl w:ilvl="2" w:tplc="0809001B" w:tentative="1">
+      <w:start w:val="1"/>
+      <w:numFmt w:val="lowerRoman"/>
+      <w:lvlText w:val="%3."/>
+      <w:lvlJc w:val="right"/>
+      <w:pPr>
+        <w:ind w:left="2160" w:hanging="180"/>
+      </w:pPr>
+    </w:lvl>
+    <w:lvl w:ilvl="3" w:tplc="0809000F" w:tentative="1">
+      <w:start w:val="1"/>
+      <w:numFmt w:val="decimal"/>
+      <w:lvlText w:val="%4."/>
+      <w:lvlJc w:val="left"/>
+      <w:pPr>
+        <w:ind w:left="2880" w:hanging="360"/>
+      </w:pPr>
+    </w:lvl>
+    <w:lvl w:ilvl="4" w:tplc="08090019" w:tentative="1">
+      <w:start w:val="1"/>
+      <w:numFmt w:val="lowerLetter"/>
+      <w:lvlText w:val="%5."/>
+      <w:lvlJc w:val="left"/>
+      <w:pPr>
+        <w:ind w:left="3600" w:hanging="360"/>
+      </w:pPr>
+    </w:lvl>
+    <w:lvl w:ilvl="5" w:tplc="0809001B" w:tentative="1">
+      <w:start w:val="1"/>
+      <w:numFmt w:val="lowerRoman"/>
+      <w:lvlText w:val="%6."/>
+      <w:lvlJc w:val="right"/>
+      <w:pPr>
+        <w:ind w:left="4320" w:hanging="180"/>
+      </w:pPr>
+    </w:lvl>
+    <w:lvl w:ilvl="6" w:tplc="0809000F" w:tentative="1">
+      <w:start w:val="1"/>
+      <w:numFmt w:val="decimal"/>
+      <w:lvlText w:val="%7."/>
+      <w:lvlJc w:val="left"/>
+      <w:pPr>
+        <w:ind w:left="5040" w:hanging="360"/>
+      </w:pPr>
+    </w:lvl>
+    <w:lvl w:ilvl="7" w:tplc="08090019" w:tentative="1">
+      <w:start w:val="1"/>
+      <w:numFmt w:val="lowerLetter"/>
+      <w:lvlText w:val="%8."/>
+      <w:lvlJc w:val="left"/>
+      <w:pPr>
+        <w:ind w:left="5760" w:hanging="360"/>
+      </w:pPr>
+    </w:lvl>
+    <w:lvl w:ilvl="8" w:tplc="0809001B" w:tentative="1">
+      <w:start w:val="1"/>
+      <w:numFmt w:val="lowerRoman"/>
+      <w:lvlText w:val="%9."/>
+      <w:lvlJc w:val="right"/>
+      <w:pPr>
+        <w:ind w:left="6480" w:hanging="180"/>
+      </w:pPr>
+    </w:lvl>
+  </w:abstractNum>
+  <w:abstractNum w:abstractNumId="1" w15:restartNumberingAfterBreak="0">
     <w:nsid w:val="1BBD5288"/>
     <w:multiLevelType w:val="hybridMultilevel"/>
     <w:tmpl w:val="F9421688"/>
@@ -11504,7 +11489,7 @@
       </w:pPr>
     </w:lvl>
   </w:abstractNum>
-  <w:abstractNum w:abstractNumId="1" w15:restartNumberingAfterBreak="0">
+  <w:abstractNum w:abstractNumId="2" w15:restartNumberingAfterBreak="0">
     <w:nsid w:val="3EE17BC7"/>
     <w:multiLevelType w:val="multilevel"/>
     <w:tmpl w:val="0809001F"/>
@@ -11590,7 +11575,7 @@
       </w:pPr>
     </w:lvl>
   </w:abstractNum>
-  <w:abstractNum w:abstractNumId="2" w15:restartNumberingAfterBreak="0">
+  <w:abstractNum w:abstractNumId="3" w15:restartNumberingAfterBreak="0">
     <w:nsid w:val="3F65357C"/>
     <w:multiLevelType w:val="hybridMultilevel"/>
     <w:tmpl w:val="3A040FC0"/>
@@ -11676,7 +11661,7 @@
       </w:pPr>
     </w:lvl>
   </w:abstractNum>
-  <w:abstractNum w:abstractNumId="3" w15:restartNumberingAfterBreak="0">
+  <w:abstractNum w:abstractNumId="4" w15:restartNumberingAfterBreak="0">
     <w:nsid w:val="4ABB335D"/>
     <w:multiLevelType w:val="hybridMultilevel"/>
     <w:tmpl w:val="4454AAE6"/>
@@ -11762,7 +11747,7 @@
       </w:pPr>
     </w:lvl>
   </w:abstractNum>
-  <w:abstractNum w:abstractNumId="4" w15:restartNumberingAfterBreak="0">
+  <w:abstractNum w:abstractNumId="5" w15:restartNumberingAfterBreak="0">
     <w:nsid w:val="4CC90960"/>
     <w:multiLevelType w:val="multilevel"/>
     <w:tmpl w:val="0809001F"/>
@@ -11848,7 +11833,7 @@
       </w:pPr>
     </w:lvl>
   </w:abstractNum>
-  <w:abstractNum w:abstractNumId="5" w15:restartNumberingAfterBreak="0">
+  <w:abstractNum w:abstractNumId="6" w15:restartNumberingAfterBreak="0">
     <w:nsid w:val="51C70391"/>
     <w:multiLevelType w:val="multilevel"/>
     <w:tmpl w:val="7098F38C"/>
@@ -11951,7 +11936,7 @@
       </w:pPr>
     </w:lvl>
   </w:abstractNum>
-  <w:abstractNum w:abstractNumId="6" w15:restartNumberingAfterBreak="0">
+  <w:abstractNum w:abstractNumId="7" w15:restartNumberingAfterBreak="0">
     <w:nsid w:val="58CE2D3C"/>
     <w:multiLevelType w:val="multilevel"/>
     <w:tmpl w:val="0809001F"/>
@@ -12037,7 +12022,7 @@
       </w:pPr>
     </w:lvl>
   </w:abstractNum>
-  <w:abstractNum w:abstractNumId="7" w15:restartNumberingAfterBreak="0">
+  <w:abstractNum w:abstractNumId="8" w15:restartNumberingAfterBreak="0">
     <w:nsid w:val="78466AF0"/>
     <w:multiLevelType w:val="multilevel"/>
     <w:tmpl w:val="0809001F"/>
@@ -12123,7 +12108,7 @@
       </w:pPr>
     </w:lvl>
   </w:abstractNum>
-  <w:abstractNum w:abstractNumId="8" w15:restartNumberingAfterBreak="0">
+  <w:abstractNum w:abstractNumId="9" w15:restartNumberingAfterBreak="0">
     <w:nsid w:val="7A240FC1"/>
     <w:multiLevelType w:val="hybridMultilevel"/>
     <w:tmpl w:val="FF4A5E62"/>
@@ -12209,32 +12194,150 @@
       </w:pPr>
     </w:lvl>
   </w:abstractNum>
+  <w:abstractNum w:abstractNumId="10" w15:restartNumberingAfterBreak="0">
+    <w:nsid w:val="7D992C6C"/>
+    <w:multiLevelType w:val="hybridMultilevel"/>
+    <w:tmpl w:val="2F8676C8"/>
+    <w:lvl w:ilvl="0" w:tplc="79BC8E94">
+      <w:numFmt w:val="bullet"/>
+      <w:lvlText w:val=""/>
+      <w:lvlJc w:val="left"/>
+      <w:pPr>
+        <w:ind w:left="720" w:hanging="360"/>
+      </w:pPr>
+      <w:rPr>
+        <w:rFonts w:ascii="Arial" w:eastAsiaTheme="minorHAnsi" w:hAnsi="Arial" w:cs="Arial" w:hint="default"/>
+      </w:rPr>
+    </w:lvl>
+    <w:lvl w:ilvl="1" w:tplc="08090003" w:tentative="1">
+      <w:start w:val="1"/>
+      <w:numFmt w:val="bullet"/>
+      <w:lvlText w:val="o"/>
+      <w:lvlJc w:val="left"/>
+      <w:pPr>
+        <w:ind w:left="1440" w:hanging="360"/>
+      </w:pPr>
+      <w:rPr>
+        <w:rFonts w:ascii="Courier New" w:hAnsi="Courier New" w:cs="Courier New" w:hint="default"/>
+      </w:rPr>
+    </w:lvl>
+    <w:lvl w:ilvl="2" w:tplc="08090005" w:tentative="1">
+      <w:start w:val="1"/>
+      <w:numFmt w:val="bullet"/>
+      <w:lvlText w:val=""/>
+      <w:lvlJc w:val="left"/>
+      <w:pPr>
+        <w:ind w:left="2160" w:hanging="360"/>
+      </w:pPr>
+      <w:rPr>
+        <w:rFonts w:ascii="Wingdings" w:hAnsi="Wingdings" w:hint="default"/>
+      </w:rPr>
+    </w:lvl>
+    <w:lvl w:ilvl="3" w:tplc="08090001" w:tentative="1">
+      <w:start w:val="1"/>
+      <w:numFmt w:val="bullet"/>
+      <w:lvlText w:val=""/>
+      <w:lvlJc w:val="left"/>
+      <w:pPr>
+        <w:ind w:left="2880" w:hanging="360"/>
+      </w:pPr>
+      <w:rPr>
+        <w:rFonts w:ascii="Symbol" w:hAnsi="Symbol" w:hint="default"/>
+      </w:rPr>
+    </w:lvl>
+    <w:lvl w:ilvl="4" w:tplc="08090003" w:tentative="1">
+      <w:start w:val="1"/>
+      <w:numFmt w:val="bullet"/>
+      <w:lvlText w:val="o"/>
+      <w:lvlJc w:val="left"/>
+      <w:pPr>
+        <w:ind w:left="3600" w:hanging="360"/>
+      </w:pPr>
+      <w:rPr>
+        <w:rFonts w:ascii="Courier New" w:hAnsi="Courier New" w:cs="Courier New" w:hint="default"/>
+      </w:rPr>
+    </w:lvl>
+    <w:lvl w:ilvl="5" w:tplc="08090005" w:tentative="1">
+      <w:start w:val="1"/>
+      <w:numFmt w:val="bullet"/>
+      <w:lvlText w:val=""/>
+      <w:lvlJc w:val="left"/>
+      <w:pPr>
+        <w:ind w:left="4320" w:hanging="360"/>
+      </w:pPr>
+      <w:rPr>
+        <w:rFonts w:ascii="Wingdings" w:hAnsi="Wingdings" w:hint="default"/>
+      </w:rPr>
+    </w:lvl>
+    <w:lvl w:ilvl="6" w:tplc="08090001" w:tentative="1">
+      <w:start w:val="1"/>
+      <w:numFmt w:val="bullet"/>
+      <w:lvlText w:val=""/>
+      <w:lvlJc w:val="left"/>
+      <w:pPr>
+        <w:ind w:left="5040" w:hanging="360"/>
+      </w:pPr>
+      <w:rPr>
+        <w:rFonts w:ascii="Symbol" w:hAnsi="Symbol" w:hint="default"/>
+      </w:rPr>
+    </w:lvl>
+    <w:lvl w:ilvl="7" w:tplc="08090003" w:tentative="1">
+      <w:start w:val="1"/>
+      <w:numFmt w:val="bullet"/>
+      <w:lvlText w:val="o"/>
+      <w:lvlJc w:val="left"/>
+      <w:pPr>
+        <w:ind w:left="5760" w:hanging="360"/>
+      </w:pPr>
+      <w:rPr>
+        <w:rFonts w:ascii="Courier New" w:hAnsi="Courier New" w:cs="Courier New" w:hint="default"/>
+      </w:rPr>
+    </w:lvl>
+    <w:lvl w:ilvl="8" w:tplc="08090005" w:tentative="1">
+      <w:start w:val="1"/>
+      <w:numFmt w:val="bullet"/>
+      <w:lvlText w:val=""/>
+      <w:lvlJc w:val="left"/>
+      <w:pPr>
+        <w:ind w:left="6480" w:hanging="360"/>
+      </w:pPr>
+      <w:rPr>
+        <w:rFonts w:ascii="Wingdings" w:hAnsi="Wingdings" w:hint="default"/>
+      </w:rPr>
+    </w:lvl>
+  </w:abstractNum>
   <w:num w:numId="1" w16cid:durableId="10230161">
+    <w:abstractNumId w:val="8"/>
+  </w:num>
+  <w:num w:numId="2" w16cid:durableId="1591504144">
+    <w:abstractNumId w:val="6"/>
+  </w:num>
+  <w:num w:numId="3" w16cid:durableId="249000125">
     <w:abstractNumId w:val="7"/>
   </w:num>
-  <w:num w:numId="2" w16cid:durableId="1591504144">
+  <w:num w:numId="4" w16cid:durableId="719397855">
     <w:abstractNumId w:val="5"/>
   </w:num>
-  <w:num w:numId="3" w16cid:durableId="249000125">
-    <w:abstractNumId w:val="6"/>
+  <w:num w:numId="5" w16cid:durableId="1899314918">
+    <w:abstractNumId w:val="2"/>
   </w:num>
-  <w:num w:numId="4" w16cid:durableId="719397855">
+  <w:num w:numId="6" w16cid:durableId="2100835209">
     <w:abstractNumId w:val="4"/>
   </w:num>
-  <w:num w:numId="5" w16cid:durableId="1899314918">
+  <w:num w:numId="7" w16cid:durableId="1803574744">
+    <w:abstractNumId w:val="9"/>
+  </w:num>
+  <w:num w:numId="8" w16cid:durableId="548105091">
+    <w:abstractNumId w:val="3"/>
+  </w:num>
+  <w:num w:numId="9" w16cid:durableId="1637251457">
     <w:abstractNumId w:val="1"/>
   </w:num>
-  <w:num w:numId="6" w16cid:durableId="2100835209">
-    <w:abstractNumId w:val="3"/>
+  <w:num w:numId="10" w16cid:durableId="1633828864">
+    <w:abstractNumId w:val="0"/>
   </w:num>
-  <w:num w:numId="7" w16cid:durableId="1803574744">
-    <w:abstractNumId w:val="8"/>
-  </w:num>
-  <w:num w:numId="8" w16cid:durableId="548105091">
-    <w:abstractNumId w:val="2"/>
-  </w:num>
-  <w:num w:numId="9" w16cid:durableId="1637251457">
-    <w:abstractNumId w:val="0"/>
+  <w:num w:numId="11" w16cid:durableId="444547814">
+    <w:abstractNumId w:val="10"/>
   </w:num>
 </w:numbering>
 </file>
@@ -12876,7 +12979,6 @@
   <w:style w:type="character" w:default="1" w:styleId="DefaultParagraphFont">
     <w:name w:val="Default Paragraph Font"/>
     <w:uiPriority w:val="1"/>
-    <w:semiHidden/>
     <w:unhideWhenUsed/>
   </w:style>
   <w:style w:type="table" w:default="1" w:styleId="TableNormal">

</xml_diff>

<commit_message>
add the functional and non functional requirements in the software analysis section
</commit_message>
<xml_diff>
--- a/Final Report.docx
+++ b/Final Report.docx
@@ -4798,28 +4798,6 @@
     </w:p>
     <w:p>
       <w:pPr>
-        <w:spacing w:line="360" w:lineRule="auto"/>
-        <w:rPr>
-          <w:rFonts w:ascii="Arial" w:hAnsi="Arial" w:cs="Arial"/>
-          <w:b/>
-          <w:bCs/>
-          <w:lang w:val="en-US"/>
-        </w:rPr>
-      </w:pPr>
-    </w:p>
-    <w:p>
-      <w:pPr>
-        <w:spacing w:line="360" w:lineRule="auto"/>
-        <w:rPr>
-          <w:rFonts w:ascii="Arial" w:hAnsi="Arial" w:cs="Arial"/>
-          <w:b/>
-          <w:bCs/>
-          <w:lang w:val="en-US"/>
-        </w:rPr>
-      </w:pPr>
-    </w:p>
-    <w:p>
-      <w:pPr>
         <w:pStyle w:val="Heading1"/>
         <w:numPr>
           <w:ilvl w:val="0"/>
@@ -4848,6 +4826,7 @@
           <w:szCs w:val="24"/>
           <w:lang w:val="en-US"/>
         </w:rPr>
+        <w:lastRenderedPageBreak/>
         <w:t>Chapter 1</w:t>
       </w:r>
       <w:r>
@@ -5031,7 +5010,7 @@
           <w:rFonts w:ascii="Arial" w:hAnsi="Arial" w:cs="Arial"/>
           <w:lang w:val="en-US"/>
         </w:rPr>
-        <w:t xml:space="preserve"> on clean, high-resolution image sets, but real-world systems in areas like surveillance, transportation and robotics must operate in the dark, during camera movement, or without a focus blur, where objects detection can be unreliable. As a result, the research implements a controlled </w:t>
+        <w:t xml:space="preserve"> on clean, high-resolution image sets, but real-world systems in areas like surveillance, transportation and robotics must operate in the dark, during camera movement, or without a focus blur, where objects detection can be unreliable. As a result, the research implements a controlled and repeatable evaluation pipeline. A fixed number of COCO 2017 validation images (1000) is chosen to generate a wide range of real-life scenes. Several degraded datasets are created using this set of fixed images with three levels of severity of low-</w:t>
       </w:r>
       <w:r>
         <w:rPr>
@@ -5039,7 +5018,7 @@
           <w:lang w:val="en-US"/>
         </w:rPr>
         <w:lastRenderedPageBreak/>
-        <w:t>and repeatable evaluation pipeline. A fixed number of COCO 2017 validation images (1000) is chosen to generate a wide range of real-life scenes. Several degraded datasets are created using this set of fixed images with three levels of severity of low-light and gaussian blur. To research mitigation measures, two lightweight enhancement methods are applied to low-light images before detection: Gamma Correction (to brighten darker areas) and CLAHE (to improve local contrast). The study aims to set a baseline in normal images, measure performance drop across degradations, compare detector families (YOLOv8, SSD MobileNet, Faster R-CNN), and report both accuracy and efficiency metrics (precision, recall, mAP, confidence score, inference time/FPS). Accordingly, the research asks:</w:t>
+        <w:t>light and gaussian blur. To research mitigation measures, two lightweight enhancement methods are applied to low-light images before detection: Gamma Correction (to brighten darker areas) and CLAHE (to improve local contrast). The study aims to set a baseline in normal images, measure performance drop across degradations, compare detector families (YOLOv8, SSD MobileNet, Faster R-CNN), and report both accuracy and efficiency metrics (precision, recall, mAP, confidence score, inference time/FPS). Accordingly, the research asks:</w:t>
       </w:r>
     </w:p>
     <w:p>
@@ -5212,6 +5191,7 @@
           <w:szCs w:val="24"/>
           <w:lang w:val="en-US"/>
         </w:rPr>
+        <w:lastRenderedPageBreak/>
         <w:t>Chapter 2</w:t>
       </w:r>
       <w:r>
@@ -5633,15 +5613,7 @@
           <w:rFonts w:ascii="Arial" w:hAnsi="Arial" w:cs="Arial"/>
           <w:lang w:val="en-US"/>
         </w:rPr>
-        <w:t xml:space="preserve">CNN used a region proposal network (RPN) to provide proposals, resulting </w:t>
-      </w:r>
-      <w:r>
-        <w:rPr>
-          <w:rFonts w:ascii="Arial" w:hAnsi="Arial" w:cs="Arial"/>
-          <w:lang w:val="en-US"/>
-        </w:rPr>
-        <w:lastRenderedPageBreak/>
-        <w:t>in an end</w:t>
+        <w:t>CNN used a region proposal network (RPN) to provide proposals, resulting in an end</w:t>
       </w:r>
       <w:r>
         <w:rPr>
@@ -5714,6 +5686,7 @@
           <w:rFonts w:ascii="Arial" w:hAnsi="Arial" w:cs="Arial"/>
           <w:lang w:val="en-US"/>
         </w:rPr>
+        <w:lastRenderedPageBreak/>
         <w:t>Single</w:t>
       </w:r>
       <w:r>
@@ -6997,15 +6970,7 @@
           <w:rFonts w:ascii="Arial" w:hAnsi="Arial" w:cs="Arial"/>
           <w:lang w:val="en-US"/>
         </w:rPr>
-        <w:t xml:space="preserve">light or blurred images. Domain adaptation methods can learn a mapping from the normal to the degraded domain, by minimizing feature distributions or via adversarial training. For instance, some researchers </w:t>
-      </w:r>
-      <w:proofErr w:type="gramStart"/>
-      <w:r>
-        <w:rPr>
-          <w:rFonts w:ascii="Arial" w:hAnsi="Arial" w:cs="Arial"/>
-          <w:lang w:val="en-US"/>
-        </w:rPr>
-        <w:t>fine</w:t>
+        <w:t>light or blurred images. Domain adaptation methods can learn a mapping from the normal to the degraded domain, by minimizing feature distributions or via adversarial training. For instance, some researchers fine</w:t>
       </w:r>
       <w:r>
         <w:rPr>
@@ -7019,15 +6984,7 @@
           <w:rFonts w:ascii="Arial" w:hAnsi="Arial" w:cs="Arial"/>
           <w:lang w:val="en-US"/>
         </w:rPr>
-        <w:t>tune</w:t>
-      </w:r>
-      <w:proofErr w:type="gramEnd"/>
-      <w:r>
-        <w:rPr>
-          <w:rFonts w:ascii="Arial" w:hAnsi="Arial" w:cs="Arial"/>
-          <w:lang w:val="en-US"/>
-        </w:rPr>
-        <w:t xml:space="preserve"> YOLO variants on </w:t>
+        <w:t xml:space="preserve">tune YOLO variants on </w:t>
       </w:r>
       <w:proofErr w:type="spellStart"/>
       <w:r>
@@ -9327,6 +9284,2129 @@
     </w:p>
     <w:p>
       <w:pPr>
+        <w:rPr>
+          <w:lang w:val="en-US"/>
+        </w:rPr>
+      </w:pPr>
+    </w:p>
+    <w:p>
+      <w:pPr>
+        <w:spacing w:line="360" w:lineRule="auto"/>
+        <w:jc w:val="both"/>
+        <w:rPr>
+          <w:rFonts w:ascii="Arial" w:hAnsi="Arial" w:cs="Arial"/>
+          <w:szCs w:val="24"/>
+          <w:lang w:val="en-US"/>
+        </w:rPr>
+      </w:pPr>
+      <w:r>
+        <w:rPr>
+          <w:rFonts w:ascii="Arial" w:hAnsi="Arial" w:cs="Arial"/>
+          <w:szCs w:val="24"/>
+          <w:lang w:val="en-US"/>
+        </w:rPr>
+        <w:t>This chapter outlines the software requirements of the project Deep Learning Based Object Detection in Low-Light and Blurred Images. The aim of the system is to test the impact of various types of image degradation on object detection. The primary deliverable is an experimental object detection software system where users can upload their own images, create a degraded image through image degradation, enhance the degraded image using image enhancement techniques, compare different object detection models, and view the results. The requirements fall into two categories: functional and non-functional. The priority of the requirement is classified as High, Medium or Low depending on its</w:t>
+      </w:r>
+      <w:r>
+        <w:rPr>
+          <w:rFonts w:ascii="Arial" w:hAnsi="Arial" w:cs="Arial"/>
+          <w:szCs w:val="24"/>
+          <w:lang w:val="en-US"/>
+        </w:rPr>
+        <w:t xml:space="preserve"> importance</w:t>
+      </w:r>
+      <w:r>
+        <w:rPr>
+          <w:rFonts w:ascii="Arial" w:hAnsi="Arial" w:cs="Arial"/>
+          <w:szCs w:val="24"/>
+          <w:lang w:val="en-US"/>
+        </w:rPr>
+        <w:t xml:space="preserve"> to the project.</w:t>
+      </w:r>
+    </w:p>
+    <w:p>
+      <w:pPr>
+        <w:pStyle w:val="Heading2"/>
+        <w:numPr>
+          <w:ilvl w:val="0"/>
+          <w:numId w:val="0"/>
+        </w:numPr>
+        <w:rPr>
+          <w:rFonts w:ascii="Arial" w:hAnsi="Arial" w:cs="Arial"/>
+          <w:b/>
+          <w:bCs/>
+          <w:color w:val="auto"/>
+          <w:sz w:val="24"/>
+          <w:szCs w:val="24"/>
+          <w:lang w:val="en-US"/>
+        </w:rPr>
+      </w:pPr>
+      <w:r>
+        <w:rPr>
+          <w:rFonts w:ascii="Arial" w:hAnsi="Arial" w:cs="Arial"/>
+          <w:b/>
+          <w:bCs/>
+          <w:color w:val="auto"/>
+          <w:sz w:val="24"/>
+          <w:szCs w:val="24"/>
+          <w:lang w:val="en-US"/>
+        </w:rPr>
+        <w:t>6.1</w:t>
+      </w:r>
+      <w:r>
+        <w:rPr>
+          <w:rFonts w:ascii="Arial" w:hAnsi="Arial" w:cs="Arial"/>
+          <w:b/>
+          <w:bCs/>
+          <w:color w:val="auto"/>
+          <w:sz w:val="24"/>
+          <w:szCs w:val="24"/>
+          <w:lang w:val="en-US"/>
+        </w:rPr>
+        <w:tab/>
+        <w:t>Functional Requirements</w:t>
+      </w:r>
+    </w:p>
+    <w:p>
+      <w:pPr>
+        <w:spacing w:line="360" w:lineRule="auto"/>
+        <w:jc w:val="both"/>
+        <w:rPr>
+          <w:rFonts w:ascii="Arial" w:hAnsi="Arial" w:cs="Arial"/>
+          <w:lang w:val="en-US"/>
+        </w:rPr>
+      </w:pPr>
+      <w:r>
+        <w:rPr>
+          <w:rFonts w:ascii="Arial" w:hAnsi="Arial" w:cs="Arial"/>
+          <w:lang w:val="en-US"/>
+        </w:rPr>
+        <w:t xml:space="preserve">Functional requirements are what the system should do. They specify the features and </w:t>
+      </w:r>
+      <w:r>
+        <w:rPr>
+          <w:rFonts w:ascii="Arial" w:hAnsi="Arial" w:cs="Arial"/>
+          <w:lang w:val="en-US"/>
+        </w:rPr>
+        <w:t>behaviors</w:t>
+      </w:r>
+      <w:r>
+        <w:rPr>
+          <w:rFonts w:ascii="Arial" w:hAnsi="Arial" w:cs="Arial"/>
+          <w:lang w:val="en-US"/>
+        </w:rPr>
+        <w:t xml:space="preserve"> that the user can see or interact with. The following requirements are associated with a particular feature of the application.</w:t>
+      </w:r>
+    </w:p>
+    <w:tbl>
+      <w:tblPr>
+        <w:tblW w:w="8910" w:type="dxa"/>
+        <w:tblInd w:w="-10" w:type="dxa"/>
+        <w:tblBorders>
+          <w:top w:val="single" w:sz="8" w:space="0" w:color="000000"/>
+          <w:left w:val="single" w:sz="8" w:space="0" w:color="000000"/>
+          <w:bottom w:val="single" w:sz="8" w:space="0" w:color="000000"/>
+          <w:right w:val="single" w:sz="8" w:space="0" w:color="000000"/>
+          <w:insideH w:val="single" w:sz="8" w:space="0" w:color="000000"/>
+          <w:insideV w:val="single" w:sz="8" w:space="0" w:color="000000"/>
+        </w:tblBorders>
+        <w:tblLayout w:type="fixed"/>
+        <w:tblLook w:val="0600" w:firstRow="0" w:lastRow="0" w:firstColumn="0" w:lastColumn="0" w:noHBand="1" w:noVBand="1"/>
+      </w:tblPr>
+      <w:tblGrid>
+        <w:gridCol w:w="1710"/>
+        <w:gridCol w:w="5687"/>
+        <w:gridCol w:w="1513"/>
+      </w:tblGrid>
+      <w:tr>
+        <w:trPr>
+          <w:trHeight w:val="274"/>
+        </w:trPr>
+        <w:tc>
+          <w:tcPr>
+            <w:tcW w:w="1710" w:type="dxa"/>
+            <w:tcMar>
+              <w:top w:w="100" w:type="dxa"/>
+              <w:left w:w="100" w:type="dxa"/>
+              <w:bottom w:w="100" w:type="dxa"/>
+              <w:right w:w="100" w:type="dxa"/>
+            </w:tcMar>
+          </w:tcPr>
+          <w:p>
+            <w:pPr>
+              <w:widowControl w:val="0"/>
+              <w:spacing w:after="0" w:line="240" w:lineRule="auto"/>
+              <w:jc w:val="center"/>
+              <w:rPr>
+                <w:rFonts w:ascii="Arial" w:eastAsia="Times New Roman" w:hAnsi="Arial" w:cs="Arial"/>
+                <w:b/>
+                <w:bCs/>
+                <w:szCs w:val="24"/>
+              </w:rPr>
+            </w:pPr>
+            <w:r>
+              <w:rPr>
+                <w:rFonts w:ascii="Arial" w:eastAsia="Times New Roman" w:hAnsi="Arial" w:cs="Arial"/>
+                <w:b/>
+                <w:bCs/>
+                <w:szCs w:val="24"/>
+              </w:rPr>
+              <w:t>Feature</w:t>
+            </w:r>
+          </w:p>
+        </w:tc>
+        <w:tc>
+          <w:tcPr>
+            <w:tcW w:w="5687" w:type="dxa"/>
+            <w:tcMar>
+              <w:top w:w="100" w:type="dxa"/>
+              <w:left w:w="100" w:type="dxa"/>
+              <w:bottom w:w="100" w:type="dxa"/>
+              <w:right w:w="100" w:type="dxa"/>
+            </w:tcMar>
+          </w:tcPr>
+          <w:p>
+            <w:pPr>
+              <w:widowControl w:val="0"/>
+              <w:spacing w:after="0" w:line="240" w:lineRule="auto"/>
+              <w:jc w:val="center"/>
+              <w:rPr>
+                <w:rFonts w:ascii="Arial" w:eastAsia="Times New Roman" w:hAnsi="Arial" w:cs="Arial"/>
+                <w:b/>
+                <w:bCs/>
+                <w:szCs w:val="24"/>
+              </w:rPr>
+            </w:pPr>
+            <w:r>
+              <w:rPr>
+                <w:rFonts w:ascii="Arial" w:eastAsia="Times New Roman" w:hAnsi="Arial" w:cs="Arial"/>
+                <w:b/>
+                <w:bCs/>
+                <w:szCs w:val="24"/>
+              </w:rPr>
+              <w:t>Description</w:t>
+            </w:r>
+          </w:p>
+        </w:tc>
+        <w:tc>
+          <w:tcPr>
+            <w:tcW w:w="1513" w:type="dxa"/>
+            <w:tcMar>
+              <w:top w:w="100" w:type="dxa"/>
+              <w:left w:w="100" w:type="dxa"/>
+              <w:bottom w:w="100" w:type="dxa"/>
+              <w:right w:w="100" w:type="dxa"/>
+            </w:tcMar>
+          </w:tcPr>
+          <w:p>
+            <w:pPr>
+              <w:widowControl w:val="0"/>
+              <w:spacing w:after="0" w:line="240" w:lineRule="auto"/>
+              <w:jc w:val="center"/>
+              <w:rPr>
+                <w:rFonts w:ascii="Arial" w:eastAsia="Times New Roman" w:hAnsi="Arial" w:cs="Arial"/>
+                <w:b/>
+                <w:bCs/>
+                <w:szCs w:val="24"/>
+              </w:rPr>
+            </w:pPr>
+            <w:r>
+              <w:rPr>
+                <w:rFonts w:ascii="Arial" w:eastAsia="Times New Roman" w:hAnsi="Arial" w:cs="Arial"/>
+                <w:b/>
+                <w:bCs/>
+                <w:szCs w:val="24"/>
+              </w:rPr>
+              <w:t>Priority</w:t>
+            </w:r>
+          </w:p>
+        </w:tc>
+      </w:tr>
+      <w:tr>
+        <w:trPr>
+          <w:trHeight w:val="264"/>
+        </w:trPr>
+        <w:tc>
+          <w:tcPr>
+            <w:tcW w:w="1710" w:type="dxa"/>
+            <w:tcMar>
+              <w:top w:w="100" w:type="dxa"/>
+              <w:left w:w="100" w:type="dxa"/>
+              <w:bottom w:w="100" w:type="dxa"/>
+              <w:right w:w="100" w:type="dxa"/>
+            </w:tcMar>
+          </w:tcPr>
+          <w:p>
+            <w:pPr>
+              <w:widowControl w:val="0"/>
+              <w:spacing w:after="0" w:line="360" w:lineRule="auto"/>
+              <w:jc w:val="both"/>
+              <w:rPr>
+                <w:rFonts w:ascii="Arial" w:eastAsia="Times New Roman" w:hAnsi="Arial" w:cs="Arial"/>
+                <w:szCs w:val="24"/>
+              </w:rPr>
+            </w:pPr>
+            <w:r>
+              <w:rPr>
+                <w:rFonts w:ascii="Arial" w:eastAsia="Times New Roman" w:hAnsi="Arial" w:cs="Arial"/>
+                <w:szCs w:val="24"/>
+              </w:rPr>
+              <w:t>Image Upload and Detection</w:t>
+            </w:r>
+          </w:p>
+        </w:tc>
+        <w:tc>
+          <w:tcPr>
+            <w:tcW w:w="5687" w:type="dxa"/>
+            <w:tcMar>
+              <w:top w:w="100" w:type="dxa"/>
+              <w:left w:w="100" w:type="dxa"/>
+              <w:bottom w:w="100" w:type="dxa"/>
+              <w:right w:w="100" w:type="dxa"/>
+            </w:tcMar>
+          </w:tcPr>
+          <w:p>
+            <w:pPr>
+              <w:widowControl w:val="0"/>
+              <w:spacing w:after="0" w:line="360" w:lineRule="auto"/>
+              <w:jc w:val="both"/>
+              <w:rPr>
+                <w:rFonts w:ascii="Arial" w:eastAsia="Times New Roman" w:hAnsi="Arial" w:cs="Arial"/>
+                <w:szCs w:val="24"/>
+              </w:rPr>
+            </w:pPr>
+            <w:r>
+              <w:rPr>
+                <w:rFonts w:ascii="Arial" w:eastAsia="Times New Roman" w:hAnsi="Arial" w:cs="Arial"/>
+                <w:szCs w:val="24"/>
+              </w:rPr>
+              <w:t>The system must support the user to upload an image and perform object detection. The output must show bounding boxes, object classes and confidence scores. This is the main feature of the app.</w:t>
+            </w:r>
+          </w:p>
+        </w:tc>
+        <w:tc>
+          <w:tcPr>
+            <w:tcW w:w="1513" w:type="dxa"/>
+            <w:tcMar>
+              <w:top w:w="100" w:type="dxa"/>
+              <w:left w:w="100" w:type="dxa"/>
+              <w:bottom w:w="100" w:type="dxa"/>
+              <w:right w:w="100" w:type="dxa"/>
+            </w:tcMar>
+          </w:tcPr>
+          <w:p>
+            <w:pPr>
+              <w:widowControl w:val="0"/>
+              <w:spacing w:after="0" w:line="240" w:lineRule="auto"/>
+              <w:ind w:right="-156"/>
+              <w:rPr>
+                <w:rFonts w:ascii="Arial" w:eastAsia="Times New Roman" w:hAnsi="Arial" w:cs="Arial"/>
+                <w:szCs w:val="24"/>
+              </w:rPr>
+            </w:pPr>
+          </w:p>
+          <w:p>
+            <w:pPr>
+              <w:widowControl w:val="0"/>
+              <w:spacing w:after="0" w:line="240" w:lineRule="auto"/>
+              <w:ind w:right="-156"/>
+              <w:rPr>
+                <w:rFonts w:ascii="Arial" w:eastAsia="Times New Roman" w:hAnsi="Arial" w:cs="Arial"/>
+                <w:szCs w:val="24"/>
+                <w:highlight w:val="red"/>
+              </w:rPr>
+            </w:pPr>
+          </w:p>
+          <w:p>
+            <w:pPr>
+              <w:widowControl w:val="0"/>
+              <w:spacing w:after="0" w:line="240" w:lineRule="auto"/>
+              <w:ind w:right="-156"/>
+              <w:rPr>
+                <w:rFonts w:ascii="Arial" w:eastAsia="Times New Roman" w:hAnsi="Arial" w:cs="Arial"/>
+                <w:szCs w:val="24"/>
+              </w:rPr>
+            </w:pPr>
+            <w:r>
+              <w:rPr>
+                <w:rFonts w:ascii="Arial" w:eastAsia="Times New Roman" w:hAnsi="Arial" w:cs="Arial"/>
+                <w:szCs w:val="24"/>
+                <w:highlight w:val="red"/>
+              </w:rPr>
+              <w:t>High</w:t>
+            </w:r>
+          </w:p>
+        </w:tc>
+      </w:tr>
+      <w:tr>
+        <w:trPr>
+          <w:trHeight w:val="274"/>
+        </w:trPr>
+        <w:tc>
+          <w:tcPr>
+            <w:tcW w:w="1710" w:type="dxa"/>
+            <w:tcMar>
+              <w:top w:w="100" w:type="dxa"/>
+              <w:left w:w="100" w:type="dxa"/>
+              <w:bottom w:w="100" w:type="dxa"/>
+              <w:right w:w="100" w:type="dxa"/>
+            </w:tcMar>
+          </w:tcPr>
+          <w:p>
+            <w:pPr>
+              <w:widowControl w:val="0"/>
+              <w:spacing w:after="0" w:line="360" w:lineRule="auto"/>
+              <w:jc w:val="both"/>
+              <w:rPr>
+                <w:rFonts w:ascii="Arial" w:eastAsia="Times New Roman" w:hAnsi="Arial" w:cs="Arial"/>
+                <w:szCs w:val="24"/>
+              </w:rPr>
+            </w:pPr>
+            <w:r>
+              <w:rPr>
+                <w:rFonts w:ascii="Arial" w:eastAsia="Times New Roman" w:hAnsi="Arial" w:cs="Arial"/>
+                <w:szCs w:val="24"/>
+              </w:rPr>
+              <w:t>Multi-model Comparison</w:t>
+            </w:r>
+          </w:p>
+        </w:tc>
+        <w:tc>
+          <w:tcPr>
+            <w:tcW w:w="5687" w:type="dxa"/>
+            <w:tcMar>
+              <w:top w:w="100" w:type="dxa"/>
+              <w:left w:w="100" w:type="dxa"/>
+              <w:bottom w:w="100" w:type="dxa"/>
+              <w:right w:w="100" w:type="dxa"/>
+            </w:tcMar>
+          </w:tcPr>
+          <w:p>
+            <w:pPr>
+              <w:widowControl w:val="0"/>
+              <w:spacing w:after="0" w:line="360" w:lineRule="auto"/>
+              <w:jc w:val="both"/>
+              <w:rPr>
+                <w:rFonts w:ascii="Arial" w:eastAsia="Times New Roman" w:hAnsi="Arial" w:cs="Arial"/>
+                <w:szCs w:val="24"/>
+              </w:rPr>
+            </w:pPr>
+            <w:r>
+              <w:rPr>
+                <w:rFonts w:ascii="Arial" w:eastAsia="Times New Roman" w:hAnsi="Arial" w:cs="Arial"/>
+                <w:szCs w:val="24"/>
+              </w:rPr>
+              <w:t xml:space="preserve">The system must allow users to run and compare the performance of three object detection models (YOLOv8, SSD </w:t>
+            </w:r>
+            <w:proofErr w:type="spellStart"/>
+            <w:r>
+              <w:rPr>
+                <w:rFonts w:ascii="Arial" w:eastAsia="Times New Roman" w:hAnsi="Arial" w:cs="Arial"/>
+                <w:szCs w:val="24"/>
+              </w:rPr>
+              <w:t>MobileNet</w:t>
+            </w:r>
+            <w:proofErr w:type="spellEnd"/>
+            <w:r>
+              <w:rPr>
+                <w:rFonts w:ascii="Arial" w:eastAsia="Times New Roman" w:hAnsi="Arial" w:cs="Arial"/>
+                <w:szCs w:val="24"/>
+              </w:rPr>
+              <w:t>, and Faster R-CNN) on the uploaded image. This will enable a comparison of the models on the same image.</w:t>
+            </w:r>
+          </w:p>
+        </w:tc>
+        <w:tc>
+          <w:tcPr>
+            <w:tcW w:w="1513" w:type="dxa"/>
+            <w:tcMar>
+              <w:top w:w="100" w:type="dxa"/>
+              <w:left w:w="100" w:type="dxa"/>
+              <w:bottom w:w="100" w:type="dxa"/>
+              <w:right w:w="100" w:type="dxa"/>
+            </w:tcMar>
+          </w:tcPr>
+          <w:p>
+            <w:pPr>
+              <w:widowControl w:val="0"/>
+              <w:spacing w:after="0" w:line="240" w:lineRule="auto"/>
+              <w:ind w:right="-156"/>
+              <w:rPr>
+                <w:rFonts w:ascii="Arial" w:eastAsia="Times New Roman" w:hAnsi="Arial" w:cs="Arial"/>
+                <w:szCs w:val="24"/>
+              </w:rPr>
+            </w:pPr>
+          </w:p>
+          <w:p>
+            <w:pPr>
+              <w:widowControl w:val="0"/>
+              <w:spacing w:after="0" w:line="240" w:lineRule="auto"/>
+              <w:ind w:right="-156"/>
+              <w:rPr>
+                <w:rFonts w:ascii="Arial" w:eastAsia="Times New Roman" w:hAnsi="Arial" w:cs="Arial"/>
+                <w:szCs w:val="24"/>
+              </w:rPr>
+            </w:pPr>
+          </w:p>
+          <w:p>
+            <w:pPr>
+              <w:widowControl w:val="0"/>
+              <w:spacing w:after="0" w:line="240" w:lineRule="auto"/>
+              <w:ind w:right="-156"/>
+              <w:rPr>
+                <w:rFonts w:ascii="Arial" w:eastAsia="Times New Roman" w:hAnsi="Arial" w:cs="Arial"/>
+                <w:szCs w:val="24"/>
+              </w:rPr>
+            </w:pPr>
+            <w:r>
+              <w:rPr>
+                <w:rFonts w:ascii="Arial" w:eastAsia="Times New Roman" w:hAnsi="Arial" w:cs="Arial"/>
+                <w:szCs w:val="24"/>
+                <w:highlight w:val="red"/>
+              </w:rPr>
+              <w:t>High</w:t>
+            </w:r>
+          </w:p>
+        </w:tc>
+      </w:tr>
+      <w:tr>
+        <w:trPr>
+          <w:trHeight w:val="264"/>
+        </w:trPr>
+        <w:tc>
+          <w:tcPr>
+            <w:tcW w:w="1710" w:type="dxa"/>
+            <w:tcMar>
+              <w:top w:w="100" w:type="dxa"/>
+              <w:left w:w="100" w:type="dxa"/>
+              <w:bottom w:w="100" w:type="dxa"/>
+              <w:right w:w="100" w:type="dxa"/>
+            </w:tcMar>
+          </w:tcPr>
+          <w:p>
+            <w:pPr>
+              <w:widowControl w:val="0"/>
+              <w:spacing w:after="0" w:line="360" w:lineRule="auto"/>
+              <w:jc w:val="both"/>
+              <w:rPr>
+                <w:rFonts w:ascii="Arial" w:eastAsia="Times New Roman" w:hAnsi="Arial" w:cs="Arial"/>
+                <w:szCs w:val="24"/>
+              </w:rPr>
+            </w:pPr>
+            <w:r>
+              <w:rPr>
+                <w:rFonts w:ascii="Arial" w:eastAsia="Times New Roman" w:hAnsi="Arial" w:cs="Arial"/>
+                <w:szCs w:val="24"/>
+              </w:rPr>
+              <w:t>Low-Light Simulation</w:t>
+            </w:r>
+          </w:p>
+        </w:tc>
+        <w:tc>
+          <w:tcPr>
+            <w:tcW w:w="5687" w:type="dxa"/>
+            <w:tcMar>
+              <w:top w:w="100" w:type="dxa"/>
+              <w:left w:w="100" w:type="dxa"/>
+              <w:bottom w:w="100" w:type="dxa"/>
+              <w:right w:w="100" w:type="dxa"/>
+            </w:tcMar>
+          </w:tcPr>
+          <w:p>
+            <w:pPr>
+              <w:widowControl w:val="0"/>
+              <w:spacing w:after="0" w:line="360" w:lineRule="auto"/>
+              <w:jc w:val="both"/>
+              <w:rPr>
+                <w:rFonts w:ascii="Arial" w:eastAsia="Times New Roman" w:hAnsi="Arial" w:cs="Arial"/>
+                <w:szCs w:val="24"/>
+              </w:rPr>
+            </w:pPr>
+            <w:r>
+              <w:rPr>
+                <w:rFonts w:ascii="Arial" w:eastAsia="Times New Roman" w:hAnsi="Arial" w:cs="Arial"/>
+                <w:szCs w:val="24"/>
+              </w:rPr>
+              <w:t xml:space="preserve">The system must produce images with three levels of low light: mild </w:t>
+            </w:r>
+            <w:r>
+              <w:rPr>
+                <w:rFonts w:ascii="Arial" w:eastAsia="Times New Roman" w:hAnsi="Arial" w:cs="Arial"/>
+                <w:szCs w:val="24"/>
+              </w:rPr>
+              <w:t>(</w:t>
+            </w:r>
+            <w:r>
+              <w:rPr>
+                <w:rFonts w:ascii="Arial" w:eastAsia="Times New Roman" w:hAnsi="Arial" w:cs="Arial"/>
+                <w:szCs w:val="24"/>
+              </w:rPr>
+              <w:t xml:space="preserve">0.70), medium </w:t>
+            </w:r>
+            <w:r>
+              <w:rPr>
+                <w:rFonts w:ascii="Arial" w:eastAsia="Times New Roman" w:hAnsi="Arial" w:cs="Arial"/>
+                <w:szCs w:val="24"/>
+              </w:rPr>
+              <w:t>(</w:t>
+            </w:r>
+            <w:r>
+              <w:rPr>
+                <w:rFonts w:ascii="Arial" w:eastAsia="Times New Roman" w:hAnsi="Arial" w:cs="Arial"/>
+                <w:szCs w:val="24"/>
+              </w:rPr>
+              <w:t xml:space="preserve">0.50), and severe (0.30). This will help to </w:t>
+            </w:r>
+            <w:r>
+              <w:rPr>
+                <w:rFonts w:ascii="Arial" w:eastAsia="Times New Roman" w:hAnsi="Arial" w:cs="Arial"/>
+                <w:szCs w:val="24"/>
+              </w:rPr>
+              <w:t>stimulate</w:t>
+            </w:r>
+            <w:r>
+              <w:rPr>
+                <w:rFonts w:ascii="Arial" w:eastAsia="Times New Roman" w:hAnsi="Arial" w:cs="Arial"/>
+                <w:szCs w:val="24"/>
+              </w:rPr>
+              <w:t xml:space="preserve"> performance under low-light conditions.</w:t>
+            </w:r>
+          </w:p>
+        </w:tc>
+        <w:tc>
+          <w:tcPr>
+            <w:tcW w:w="1513" w:type="dxa"/>
+            <w:tcMar>
+              <w:top w:w="100" w:type="dxa"/>
+              <w:left w:w="100" w:type="dxa"/>
+              <w:bottom w:w="100" w:type="dxa"/>
+              <w:right w:w="100" w:type="dxa"/>
+            </w:tcMar>
+          </w:tcPr>
+          <w:p>
+            <w:pPr>
+              <w:widowControl w:val="0"/>
+              <w:spacing w:after="0" w:line="240" w:lineRule="auto"/>
+              <w:ind w:right="-156"/>
+              <w:rPr>
+                <w:rFonts w:ascii="Arial" w:eastAsia="Times New Roman" w:hAnsi="Arial" w:cs="Arial"/>
+                <w:szCs w:val="24"/>
+              </w:rPr>
+            </w:pPr>
+          </w:p>
+          <w:p>
+            <w:pPr>
+              <w:widowControl w:val="0"/>
+              <w:spacing w:after="0" w:line="240" w:lineRule="auto"/>
+              <w:ind w:right="-156"/>
+              <w:rPr>
+                <w:rFonts w:ascii="Arial" w:eastAsia="Times New Roman" w:hAnsi="Arial" w:cs="Arial"/>
+                <w:szCs w:val="24"/>
+              </w:rPr>
+            </w:pPr>
+            <w:r>
+              <w:rPr>
+                <w:rFonts w:ascii="Arial" w:eastAsia="Times New Roman" w:hAnsi="Arial" w:cs="Arial"/>
+                <w:szCs w:val="24"/>
+                <w:highlight w:val="red"/>
+              </w:rPr>
+              <w:t>High</w:t>
+            </w:r>
+          </w:p>
+        </w:tc>
+      </w:tr>
+      <w:tr>
+        <w:trPr>
+          <w:trHeight w:val="274"/>
+        </w:trPr>
+        <w:tc>
+          <w:tcPr>
+            <w:tcW w:w="1710" w:type="dxa"/>
+            <w:tcMar>
+              <w:top w:w="100" w:type="dxa"/>
+              <w:left w:w="100" w:type="dxa"/>
+              <w:bottom w:w="100" w:type="dxa"/>
+              <w:right w:w="100" w:type="dxa"/>
+            </w:tcMar>
+          </w:tcPr>
+          <w:p>
+            <w:pPr>
+              <w:widowControl w:val="0"/>
+              <w:spacing w:after="0" w:line="360" w:lineRule="auto"/>
+              <w:jc w:val="both"/>
+              <w:rPr>
+                <w:rFonts w:ascii="Arial" w:eastAsia="Times New Roman" w:hAnsi="Arial" w:cs="Arial"/>
+                <w:szCs w:val="24"/>
+              </w:rPr>
+            </w:pPr>
+            <w:r>
+              <w:rPr>
+                <w:rFonts w:ascii="Arial" w:eastAsia="Times New Roman" w:hAnsi="Arial" w:cs="Arial"/>
+                <w:szCs w:val="24"/>
+              </w:rPr>
+              <w:lastRenderedPageBreak/>
+              <w:t>Blur Simulation</w:t>
+            </w:r>
+          </w:p>
+        </w:tc>
+        <w:tc>
+          <w:tcPr>
+            <w:tcW w:w="5687" w:type="dxa"/>
+            <w:tcMar>
+              <w:top w:w="100" w:type="dxa"/>
+              <w:left w:w="100" w:type="dxa"/>
+              <w:bottom w:w="100" w:type="dxa"/>
+              <w:right w:w="100" w:type="dxa"/>
+            </w:tcMar>
+          </w:tcPr>
+          <w:p>
+            <w:pPr>
+              <w:widowControl w:val="0"/>
+              <w:spacing w:after="0" w:line="360" w:lineRule="auto"/>
+              <w:jc w:val="both"/>
+              <w:rPr>
+                <w:rFonts w:ascii="Arial" w:eastAsia="Times New Roman" w:hAnsi="Arial" w:cs="Arial"/>
+                <w:szCs w:val="24"/>
+              </w:rPr>
+            </w:pPr>
+            <w:r>
+              <w:rPr>
+                <w:rFonts w:ascii="Arial" w:eastAsia="Times New Roman" w:hAnsi="Arial" w:cs="Arial"/>
+                <w:szCs w:val="24"/>
+              </w:rPr>
+              <w:t>The system must include Gaussian blur with three kernel sizes: mild (5x5), medium (11x11) and severe (21x21). This simulates motion blur and out-of-focus defects often found in images.</w:t>
+            </w:r>
+          </w:p>
+        </w:tc>
+        <w:tc>
+          <w:tcPr>
+            <w:tcW w:w="1513" w:type="dxa"/>
+            <w:tcMar>
+              <w:top w:w="100" w:type="dxa"/>
+              <w:left w:w="100" w:type="dxa"/>
+              <w:bottom w:w="100" w:type="dxa"/>
+              <w:right w:w="100" w:type="dxa"/>
+            </w:tcMar>
+          </w:tcPr>
+          <w:p>
+            <w:pPr>
+              <w:widowControl w:val="0"/>
+              <w:spacing w:after="0" w:line="240" w:lineRule="auto"/>
+              <w:ind w:right="-156"/>
+              <w:rPr>
+                <w:rFonts w:ascii="Arial" w:eastAsia="Times New Roman" w:hAnsi="Arial" w:cs="Arial"/>
+                <w:szCs w:val="24"/>
+                <w:highlight w:val="red"/>
+              </w:rPr>
+            </w:pPr>
+          </w:p>
+          <w:p>
+            <w:pPr>
+              <w:widowControl w:val="0"/>
+              <w:spacing w:after="0" w:line="240" w:lineRule="auto"/>
+              <w:ind w:right="-156"/>
+              <w:rPr>
+                <w:rFonts w:ascii="Arial" w:eastAsia="Times New Roman" w:hAnsi="Arial" w:cs="Arial"/>
+                <w:szCs w:val="24"/>
+                <w:highlight w:val="red"/>
+              </w:rPr>
+            </w:pPr>
+            <w:r>
+              <w:rPr>
+                <w:rFonts w:ascii="Arial" w:eastAsia="Times New Roman" w:hAnsi="Arial" w:cs="Arial"/>
+                <w:szCs w:val="24"/>
+                <w:highlight w:val="red"/>
+              </w:rPr>
+              <w:t>High</w:t>
+            </w:r>
+          </w:p>
+        </w:tc>
+      </w:tr>
+      <w:tr>
+        <w:trPr>
+          <w:trHeight w:val="274"/>
+        </w:trPr>
+        <w:tc>
+          <w:tcPr>
+            <w:tcW w:w="1710" w:type="dxa"/>
+            <w:tcMar>
+              <w:top w:w="100" w:type="dxa"/>
+              <w:left w:w="100" w:type="dxa"/>
+              <w:bottom w:w="100" w:type="dxa"/>
+              <w:right w:w="100" w:type="dxa"/>
+            </w:tcMar>
+          </w:tcPr>
+          <w:p>
+            <w:pPr>
+              <w:widowControl w:val="0"/>
+              <w:spacing w:after="0" w:line="360" w:lineRule="auto"/>
+              <w:jc w:val="both"/>
+              <w:rPr>
+                <w:rFonts w:ascii="Arial" w:eastAsia="Times New Roman" w:hAnsi="Arial" w:cs="Arial"/>
+                <w:szCs w:val="24"/>
+              </w:rPr>
+            </w:pPr>
+            <w:r>
+              <w:rPr>
+                <w:rFonts w:ascii="Arial" w:eastAsia="Times New Roman" w:hAnsi="Arial" w:cs="Arial"/>
+                <w:szCs w:val="24"/>
+              </w:rPr>
+              <w:t>Detection Result Display</w:t>
+            </w:r>
+          </w:p>
+        </w:tc>
+        <w:tc>
+          <w:tcPr>
+            <w:tcW w:w="5687" w:type="dxa"/>
+            <w:tcMar>
+              <w:top w:w="100" w:type="dxa"/>
+              <w:left w:w="100" w:type="dxa"/>
+              <w:bottom w:w="100" w:type="dxa"/>
+              <w:right w:w="100" w:type="dxa"/>
+            </w:tcMar>
+          </w:tcPr>
+          <w:p>
+            <w:pPr>
+              <w:widowControl w:val="0"/>
+              <w:spacing w:after="0" w:line="360" w:lineRule="auto"/>
+              <w:jc w:val="both"/>
+              <w:rPr>
+                <w:rFonts w:ascii="Arial" w:eastAsia="Times New Roman" w:hAnsi="Arial" w:cs="Arial"/>
+                <w:szCs w:val="24"/>
+              </w:rPr>
+            </w:pPr>
+            <w:r>
+              <w:rPr>
+                <w:rFonts w:ascii="Arial" w:eastAsia="Times New Roman" w:hAnsi="Arial" w:cs="Arial"/>
+                <w:szCs w:val="24"/>
+              </w:rPr>
+              <w:t>The system must provide a visual representation of detection results via bounding boxes around objects, with the class label and confidence score. This allows users to understand the model's predictions.</w:t>
+            </w:r>
+          </w:p>
+        </w:tc>
+        <w:tc>
+          <w:tcPr>
+            <w:tcW w:w="1513" w:type="dxa"/>
+            <w:tcMar>
+              <w:top w:w="100" w:type="dxa"/>
+              <w:left w:w="100" w:type="dxa"/>
+              <w:bottom w:w="100" w:type="dxa"/>
+              <w:right w:w="100" w:type="dxa"/>
+            </w:tcMar>
+          </w:tcPr>
+          <w:p>
+            <w:pPr>
+              <w:widowControl w:val="0"/>
+              <w:spacing w:after="0" w:line="240" w:lineRule="auto"/>
+              <w:ind w:right="-156"/>
+              <w:rPr>
+                <w:rFonts w:ascii="Arial" w:eastAsia="Times New Roman" w:hAnsi="Arial" w:cs="Arial"/>
+                <w:szCs w:val="24"/>
+              </w:rPr>
+            </w:pPr>
+          </w:p>
+          <w:p>
+            <w:pPr>
+              <w:widowControl w:val="0"/>
+              <w:spacing w:after="0" w:line="240" w:lineRule="auto"/>
+              <w:ind w:right="-156"/>
+              <w:rPr>
+                <w:rFonts w:ascii="Arial" w:eastAsia="Times New Roman" w:hAnsi="Arial" w:cs="Arial"/>
+                <w:szCs w:val="24"/>
+                <w:highlight w:val="red"/>
+              </w:rPr>
+            </w:pPr>
+          </w:p>
+          <w:p>
+            <w:pPr>
+              <w:widowControl w:val="0"/>
+              <w:spacing w:after="0" w:line="240" w:lineRule="auto"/>
+              <w:ind w:right="-156"/>
+              <w:rPr>
+                <w:rFonts w:ascii="Arial" w:eastAsia="Times New Roman" w:hAnsi="Arial" w:cs="Arial"/>
+                <w:szCs w:val="24"/>
+                <w:highlight w:val="red"/>
+              </w:rPr>
+            </w:pPr>
+          </w:p>
+          <w:p>
+            <w:pPr>
+              <w:widowControl w:val="0"/>
+              <w:spacing w:after="0" w:line="240" w:lineRule="auto"/>
+              <w:ind w:right="-156"/>
+              <w:rPr>
+                <w:rFonts w:ascii="Arial" w:eastAsia="Times New Roman" w:hAnsi="Arial" w:cs="Arial"/>
+                <w:szCs w:val="24"/>
+              </w:rPr>
+            </w:pPr>
+            <w:r>
+              <w:rPr>
+                <w:rFonts w:ascii="Arial" w:eastAsia="Times New Roman" w:hAnsi="Arial" w:cs="Arial"/>
+                <w:szCs w:val="24"/>
+                <w:highlight w:val="red"/>
+              </w:rPr>
+              <w:t>High</w:t>
+            </w:r>
+          </w:p>
+        </w:tc>
+      </w:tr>
+      <w:tr>
+        <w:trPr>
+          <w:trHeight w:val="264"/>
+        </w:trPr>
+        <w:tc>
+          <w:tcPr>
+            <w:tcW w:w="1710" w:type="dxa"/>
+            <w:tcMar>
+              <w:top w:w="100" w:type="dxa"/>
+              <w:left w:w="100" w:type="dxa"/>
+              <w:bottom w:w="100" w:type="dxa"/>
+              <w:right w:w="100" w:type="dxa"/>
+            </w:tcMar>
+          </w:tcPr>
+          <w:p>
+            <w:pPr>
+              <w:widowControl w:val="0"/>
+              <w:spacing w:after="0" w:line="360" w:lineRule="auto"/>
+              <w:jc w:val="both"/>
+              <w:rPr>
+                <w:rFonts w:ascii="Arial" w:eastAsia="Times New Roman" w:hAnsi="Arial" w:cs="Arial"/>
+                <w:szCs w:val="24"/>
+              </w:rPr>
+            </w:pPr>
+            <w:r>
+              <w:rPr>
+                <w:rFonts w:ascii="Arial" w:eastAsia="Times New Roman" w:hAnsi="Arial" w:cs="Arial"/>
+                <w:szCs w:val="24"/>
+              </w:rPr>
+              <w:t>Evaluation Metrics Evaluation</w:t>
+            </w:r>
+          </w:p>
+        </w:tc>
+        <w:tc>
+          <w:tcPr>
+            <w:tcW w:w="5687" w:type="dxa"/>
+            <w:tcMar>
+              <w:top w:w="100" w:type="dxa"/>
+              <w:left w:w="100" w:type="dxa"/>
+              <w:bottom w:w="100" w:type="dxa"/>
+              <w:right w:w="100" w:type="dxa"/>
+            </w:tcMar>
+          </w:tcPr>
+          <w:p>
+            <w:pPr>
+              <w:widowControl w:val="0"/>
+              <w:spacing w:after="0" w:line="360" w:lineRule="auto"/>
+              <w:jc w:val="both"/>
+              <w:rPr>
+                <w:rFonts w:ascii="Arial" w:eastAsia="Times New Roman" w:hAnsi="Arial" w:cs="Arial"/>
+                <w:szCs w:val="24"/>
+              </w:rPr>
+            </w:pPr>
+            <w:r>
+              <w:rPr>
+                <w:rFonts w:ascii="Arial" w:eastAsia="Times New Roman" w:hAnsi="Arial" w:cs="Arial"/>
+                <w:szCs w:val="24"/>
+              </w:rPr>
+              <w:t xml:space="preserve">The system should calculate and show standard performance metrics for detection (Precision, Recall, F1-scores, AP@50 and </w:t>
+            </w:r>
+            <w:proofErr w:type="spellStart"/>
+            <w:r>
+              <w:rPr>
+                <w:rFonts w:ascii="Arial" w:eastAsia="Times New Roman" w:hAnsi="Arial" w:cs="Arial"/>
+                <w:szCs w:val="24"/>
+              </w:rPr>
+              <w:t>mAP</w:t>
+            </w:r>
+            <w:proofErr w:type="spellEnd"/>
+            <w:r>
+              <w:rPr>
+                <w:rFonts w:ascii="Arial" w:eastAsia="Times New Roman" w:hAnsi="Arial" w:cs="Arial"/>
+                <w:szCs w:val="24"/>
+              </w:rPr>
+              <w:t xml:space="preserve">) for all experiment conditions. These measures are needed to </w:t>
+            </w:r>
+            <w:r>
+              <w:rPr>
+                <w:rFonts w:ascii="Arial" w:eastAsia="Times New Roman" w:hAnsi="Arial" w:cs="Arial"/>
+                <w:szCs w:val="24"/>
+              </w:rPr>
+              <w:t>evaluate</w:t>
+            </w:r>
+            <w:r>
+              <w:rPr>
+                <w:rFonts w:ascii="Arial" w:eastAsia="Times New Roman" w:hAnsi="Arial" w:cs="Arial"/>
+                <w:szCs w:val="24"/>
+              </w:rPr>
+              <w:t xml:space="preserve"> and compare model performance.</w:t>
+            </w:r>
+          </w:p>
+        </w:tc>
+        <w:tc>
+          <w:tcPr>
+            <w:tcW w:w="1513" w:type="dxa"/>
+            <w:tcMar>
+              <w:top w:w="100" w:type="dxa"/>
+              <w:left w:w="100" w:type="dxa"/>
+              <w:bottom w:w="100" w:type="dxa"/>
+              <w:right w:w="100" w:type="dxa"/>
+            </w:tcMar>
+          </w:tcPr>
+          <w:p>
+            <w:pPr>
+              <w:widowControl w:val="0"/>
+              <w:spacing w:after="0" w:line="240" w:lineRule="auto"/>
+              <w:ind w:right="-156"/>
+              <w:rPr>
+                <w:rFonts w:ascii="Arial" w:eastAsia="Times New Roman" w:hAnsi="Arial" w:cs="Arial"/>
+                <w:szCs w:val="24"/>
+              </w:rPr>
+            </w:pPr>
+          </w:p>
+          <w:p>
+            <w:pPr>
+              <w:widowControl w:val="0"/>
+              <w:spacing w:after="0" w:line="240" w:lineRule="auto"/>
+              <w:ind w:right="-156"/>
+              <w:rPr>
+                <w:rFonts w:ascii="Arial" w:eastAsia="Times New Roman" w:hAnsi="Arial" w:cs="Arial"/>
+                <w:szCs w:val="24"/>
+                <w:highlight w:val="red"/>
+              </w:rPr>
+            </w:pPr>
+          </w:p>
+          <w:p>
+            <w:pPr>
+              <w:widowControl w:val="0"/>
+              <w:spacing w:after="0" w:line="240" w:lineRule="auto"/>
+              <w:ind w:right="-156"/>
+              <w:rPr>
+                <w:rFonts w:ascii="Arial" w:eastAsia="Times New Roman" w:hAnsi="Arial" w:cs="Arial"/>
+                <w:szCs w:val="24"/>
+                <w:highlight w:val="red"/>
+              </w:rPr>
+            </w:pPr>
+          </w:p>
+          <w:p>
+            <w:pPr>
+              <w:widowControl w:val="0"/>
+              <w:spacing w:after="0" w:line="240" w:lineRule="auto"/>
+              <w:ind w:right="-156"/>
+              <w:rPr>
+                <w:rFonts w:ascii="Arial" w:eastAsia="Times New Roman" w:hAnsi="Arial" w:cs="Arial"/>
+                <w:szCs w:val="24"/>
+              </w:rPr>
+            </w:pPr>
+            <w:r>
+              <w:rPr>
+                <w:rFonts w:ascii="Arial" w:eastAsia="Times New Roman" w:hAnsi="Arial" w:cs="Arial"/>
+                <w:szCs w:val="24"/>
+                <w:highlight w:val="red"/>
+              </w:rPr>
+              <w:t>High</w:t>
+            </w:r>
+          </w:p>
+        </w:tc>
+      </w:tr>
+      <w:tr>
+        <w:trPr>
+          <w:trHeight w:val="274"/>
+        </w:trPr>
+        <w:tc>
+          <w:tcPr>
+            <w:tcW w:w="1710" w:type="dxa"/>
+            <w:tcMar>
+              <w:top w:w="100" w:type="dxa"/>
+              <w:left w:w="100" w:type="dxa"/>
+              <w:bottom w:w="100" w:type="dxa"/>
+              <w:right w:w="100" w:type="dxa"/>
+            </w:tcMar>
+          </w:tcPr>
+          <w:p>
+            <w:pPr>
+              <w:widowControl w:val="0"/>
+              <w:spacing w:after="0" w:line="360" w:lineRule="auto"/>
+              <w:jc w:val="both"/>
+              <w:rPr>
+                <w:rFonts w:ascii="Arial" w:eastAsia="Times New Roman" w:hAnsi="Arial" w:cs="Arial"/>
+                <w:szCs w:val="24"/>
+              </w:rPr>
+            </w:pPr>
+            <w:r>
+              <w:rPr>
+                <w:rFonts w:ascii="Arial" w:eastAsia="Times New Roman" w:hAnsi="Arial" w:cs="Arial"/>
+                <w:szCs w:val="24"/>
+              </w:rPr>
+              <w:t xml:space="preserve">Image Enhancement </w:t>
+            </w:r>
+          </w:p>
+        </w:tc>
+        <w:tc>
+          <w:tcPr>
+            <w:tcW w:w="5687" w:type="dxa"/>
+            <w:tcMar>
+              <w:top w:w="100" w:type="dxa"/>
+              <w:left w:w="100" w:type="dxa"/>
+              <w:bottom w:w="100" w:type="dxa"/>
+              <w:right w:w="100" w:type="dxa"/>
+            </w:tcMar>
+          </w:tcPr>
+          <w:p>
+            <w:pPr>
+              <w:widowControl w:val="0"/>
+              <w:spacing w:after="0" w:line="360" w:lineRule="auto"/>
+              <w:jc w:val="both"/>
+              <w:rPr>
+                <w:rFonts w:ascii="Arial" w:eastAsia="Times New Roman" w:hAnsi="Arial" w:cs="Arial"/>
+                <w:szCs w:val="24"/>
+              </w:rPr>
+            </w:pPr>
+            <w:r>
+              <w:rPr>
+                <w:rFonts w:ascii="Arial" w:eastAsia="Times New Roman" w:hAnsi="Arial" w:cs="Arial"/>
+                <w:szCs w:val="24"/>
+              </w:rPr>
+              <w:t>The system must enhance low-light images (Gamma Correction, CLAHE, and Gamma + CLAHE) prior to detection. This enables the system to determine if enhancement improves detection.</w:t>
+            </w:r>
+          </w:p>
+        </w:tc>
+        <w:tc>
+          <w:tcPr>
+            <w:tcW w:w="1513" w:type="dxa"/>
+            <w:tcMar>
+              <w:top w:w="100" w:type="dxa"/>
+              <w:left w:w="100" w:type="dxa"/>
+              <w:bottom w:w="100" w:type="dxa"/>
+              <w:right w:w="100" w:type="dxa"/>
+            </w:tcMar>
+          </w:tcPr>
+          <w:p>
+            <w:pPr>
+              <w:widowControl w:val="0"/>
+              <w:spacing w:after="0" w:line="240" w:lineRule="auto"/>
+              <w:ind w:right="-156"/>
+              <w:rPr>
+                <w:rFonts w:ascii="Arial" w:eastAsia="Times New Roman" w:hAnsi="Arial" w:cs="Arial"/>
+                <w:szCs w:val="24"/>
+                <w:highlight w:val="yellow"/>
+              </w:rPr>
+            </w:pPr>
+          </w:p>
+          <w:p>
+            <w:pPr>
+              <w:widowControl w:val="0"/>
+              <w:spacing w:after="0" w:line="240" w:lineRule="auto"/>
+              <w:ind w:right="-156"/>
+              <w:rPr>
+                <w:rFonts w:ascii="Arial" w:eastAsia="Times New Roman" w:hAnsi="Arial" w:cs="Arial"/>
+                <w:szCs w:val="24"/>
+                <w:highlight w:val="yellow"/>
+              </w:rPr>
+            </w:pPr>
+          </w:p>
+          <w:p>
+            <w:pPr>
+              <w:widowControl w:val="0"/>
+              <w:spacing w:after="0" w:line="240" w:lineRule="auto"/>
+              <w:ind w:right="-156"/>
+              <w:rPr>
+                <w:rFonts w:ascii="Arial" w:eastAsia="Times New Roman" w:hAnsi="Arial" w:cs="Arial"/>
+                <w:szCs w:val="24"/>
+                <w:highlight w:val="yellow"/>
+              </w:rPr>
+            </w:pPr>
+            <w:r>
+              <w:rPr>
+                <w:rFonts w:ascii="Arial" w:eastAsia="Times New Roman" w:hAnsi="Arial" w:cs="Arial"/>
+                <w:szCs w:val="24"/>
+                <w:highlight w:val="yellow"/>
+              </w:rPr>
+              <w:t>Medium</w:t>
+            </w:r>
+          </w:p>
+        </w:tc>
+      </w:tr>
+      <w:tr>
+        <w:trPr>
+          <w:trHeight w:val="264"/>
+        </w:trPr>
+        <w:tc>
+          <w:tcPr>
+            <w:tcW w:w="1710" w:type="dxa"/>
+            <w:tcMar>
+              <w:top w:w="100" w:type="dxa"/>
+              <w:left w:w="100" w:type="dxa"/>
+              <w:bottom w:w="100" w:type="dxa"/>
+              <w:right w:w="100" w:type="dxa"/>
+            </w:tcMar>
+          </w:tcPr>
+          <w:p>
+            <w:pPr>
+              <w:widowControl w:val="0"/>
+              <w:spacing w:after="0" w:line="360" w:lineRule="auto"/>
+              <w:jc w:val="both"/>
+              <w:rPr>
+                <w:rFonts w:ascii="Arial" w:eastAsia="Times New Roman" w:hAnsi="Arial" w:cs="Arial"/>
+                <w:szCs w:val="24"/>
+              </w:rPr>
+            </w:pPr>
+            <w:r>
+              <w:rPr>
+                <w:rFonts w:ascii="Arial" w:eastAsia="Times New Roman" w:hAnsi="Arial" w:cs="Arial"/>
+                <w:szCs w:val="24"/>
+              </w:rPr>
+              <w:t>Results Dashboard</w:t>
+            </w:r>
+          </w:p>
+        </w:tc>
+        <w:tc>
+          <w:tcPr>
+            <w:tcW w:w="5687" w:type="dxa"/>
+            <w:tcMar>
+              <w:top w:w="100" w:type="dxa"/>
+              <w:left w:w="100" w:type="dxa"/>
+              <w:bottom w:w="100" w:type="dxa"/>
+              <w:right w:w="100" w:type="dxa"/>
+            </w:tcMar>
+          </w:tcPr>
+          <w:p>
+            <w:pPr>
+              <w:widowControl w:val="0"/>
+              <w:spacing w:after="0" w:line="360" w:lineRule="auto"/>
+              <w:jc w:val="both"/>
+              <w:rPr>
+                <w:rFonts w:ascii="Arial" w:eastAsia="Times New Roman" w:hAnsi="Arial" w:cs="Arial"/>
+                <w:szCs w:val="24"/>
+              </w:rPr>
+            </w:pPr>
+            <w:r>
+              <w:rPr>
+                <w:rFonts w:ascii="Arial" w:eastAsia="Times New Roman" w:hAnsi="Arial" w:cs="Arial"/>
+                <w:szCs w:val="24"/>
+              </w:rPr>
+              <w:t>All model comparison data should be returned in the form of charts, bar graphs, line graphs and tables. This should help users and evaluators visualise and compare results across models and conditions.</w:t>
+            </w:r>
+          </w:p>
+        </w:tc>
+        <w:tc>
+          <w:tcPr>
+            <w:tcW w:w="1513" w:type="dxa"/>
+            <w:tcMar>
+              <w:top w:w="100" w:type="dxa"/>
+              <w:left w:w="100" w:type="dxa"/>
+              <w:bottom w:w="100" w:type="dxa"/>
+              <w:right w:w="100" w:type="dxa"/>
+            </w:tcMar>
+          </w:tcPr>
+          <w:p>
+            <w:pPr>
+              <w:widowControl w:val="0"/>
+              <w:spacing w:after="0" w:line="240" w:lineRule="auto"/>
+              <w:ind w:right="-156"/>
+              <w:rPr>
+                <w:rFonts w:ascii="Arial" w:eastAsia="Times New Roman" w:hAnsi="Arial" w:cs="Arial"/>
+                <w:szCs w:val="24"/>
+              </w:rPr>
+            </w:pPr>
+          </w:p>
+          <w:p>
+            <w:pPr>
+              <w:widowControl w:val="0"/>
+              <w:spacing w:after="0" w:line="240" w:lineRule="auto"/>
+              <w:ind w:right="-156"/>
+              <w:rPr>
+                <w:rFonts w:ascii="Arial" w:eastAsia="Times New Roman" w:hAnsi="Arial" w:cs="Arial"/>
+                <w:szCs w:val="24"/>
+                <w:highlight w:val="yellow"/>
+              </w:rPr>
+            </w:pPr>
+          </w:p>
+          <w:p>
+            <w:pPr>
+              <w:widowControl w:val="0"/>
+              <w:spacing w:after="0" w:line="240" w:lineRule="auto"/>
+              <w:ind w:right="-156"/>
+              <w:rPr>
+                <w:rFonts w:ascii="Arial" w:eastAsia="Times New Roman" w:hAnsi="Arial" w:cs="Arial"/>
+                <w:szCs w:val="24"/>
+              </w:rPr>
+            </w:pPr>
+            <w:r>
+              <w:rPr>
+                <w:rFonts w:ascii="Arial" w:eastAsia="Times New Roman" w:hAnsi="Arial" w:cs="Arial"/>
+                <w:szCs w:val="24"/>
+                <w:highlight w:val="yellow"/>
+              </w:rPr>
+              <w:t>Medium</w:t>
+            </w:r>
+          </w:p>
+        </w:tc>
+      </w:tr>
+    </w:tbl>
+    <w:p>
+      <w:pPr>
+        <w:rPr>
+          <w:lang w:val="en-US"/>
+        </w:rPr>
+      </w:pPr>
+    </w:p>
+    <w:p>
+      <w:pPr>
+        <w:rPr>
+          <w:lang w:val="en-US"/>
+        </w:rPr>
+      </w:pPr>
+    </w:p>
+    <w:p>
+      <w:pPr>
+        <w:rPr>
+          <w:lang w:val="en-US"/>
+        </w:rPr>
+      </w:pPr>
+    </w:p>
+    <w:p>
+      <w:pPr>
+        <w:rPr>
+          <w:lang w:val="en-US"/>
+        </w:rPr>
+      </w:pPr>
+    </w:p>
+    <w:p>
+      <w:pPr>
+        <w:rPr>
+          <w:lang w:val="en-US"/>
+        </w:rPr>
+      </w:pPr>
+    </w:p>
+    <w:p>
+      <w:pPr>
+        <w:rPr>
+          <w:lang w:val="en-US"/>
+        </w:rPr>
+      </w:pPr>
+    </w:p>
+    <w:p>
+      <w:pPr>
+        <w:rPr>
+          <w:lang w:val="en-US"/>
+        </w:rPr>
+      </w:pPr>
+    </w:p>
+    <w:p>
+      <w:pPr>
+        <w:pStyle w:val="Heading2"/>
+        <w:numPr>
+          <w:ilvl w:val="0"/>
+          <w:numId w:val="0"/>
+        </w:numPr>
+        <w:rPr>
+          <w:rFonts w:ascii="Arial" w:hAnsi="Arial" w:cs="Arial"/>
+          <w:b/>
+          <w:bCs/>
+          <w:color w:val="auto"/>
+          <w:sz w:val="24"/>
+          <w:szCs w:val="24"/>
+          <w:lang w:val="en-US"/>
+        </w:rPr>
+      </w:pPr>
+      <w:r>
+        <w:rPr>
+          <w:rFonts w:ascii="Arial" w:hAnsi="Arial" w:cs="Arial"/>
+          <w:b/>
+          <w:bCs/>
+          <w:color w:val="auto"/>
+          <w:sz w:val="24"/>
+          <w:szCs w:val="24"/>
+          <w:lang w:val="en-US"/>
+        </w:rPr>
+        <w:lastRenderedPageBreak/>
+        <w:t>6.</w:t>
+      </w:r>
+      <w:r>
+        <w:rPr>
+          <w:rFonts w:ascii="Arial" w:hAnsi="Arial" w:cs="Arial"/>
+          <w:b/>
+          <w:bCs/>
+          <w:color w:val="auto"/>
+          <w:sz w:val="24"/>
+          <w:szCs w:val="24"/>
+          <w:lang w:val="en-US"/>
+        </w:rPr>
+        <w:t>2</w:t>
+      </w:r>
+      <w:r>
+        <w:rPr>
+          <w:rFonts w:ascii="Arial" w:hAnsi="Arial" w:cs="Arial"/>
+          <w:b/>
+          <w:bCs/>
+          <w:color w:val="auto"/>
+          <w:sz w:val="24"/>
+          <w:szCs w:val="24"/>
+          <w:lang w:val="en-US"/>
+        </w:rPr>
+        <w:tab/>
+      </w:r>
+      <w:r>
+        <w:rPr>
+          <w:rFonts w:ascii="Arial" w:hAnsi="Arial" w:cs="Arial"/>
+          <w:b/>
+          <w:bCs/>
+          <w:color w:val="auto"/>
+          <w:sz w:val="24"/>
+          <w:szCs w:val="24"/>
+          <w:lang w:val="en-US"/>
+        </w:rPr>
+        <w:t>Non-</w:t>
+      </w:r>
+      <w:r>
+        <w:rPr>
+          <w:rFonts w:ascii="Arial" w:hAnsi="Arial" w:cs="Arial"/>
+          <w:b/>
+          <w:bCs/>
+          <w:color w:val="auto"/>
+          <w:sz w:val="24"/>
+          <w:szCs w:val="24"/>
+          <w:lang w:val="en-US"/>
+        </w:rPr>
+        <w:t>Functional Requirements</w:t>
+      </w:r>
+    </w:p>
+    <w:p>
+      <w:pPr>
+        <w:rPr>
+          <w:lang w:val="en-US"/>
+        </w:rPr>
+      </w:pPr>
+    </w:p>
+    <w:p>
+      <w:pPr>
+        <w:rPr>
+          <w:lang w:val="en-US"/>
+        </w:rPr>
+      </w:pPr>
+    </w:p>
+    <w:tbl>
+      <w:tblPr>
+        <w:tblW w:w="8910" w:type="dxa"/>
+        <w:tblInd w:w="-10" w:type="dxa"/>
+        <w:tblBorders>
+          <w:top w:val="single" w:sz="8" w:space="0" w:color="000000"/>
+          <w:left w:val="single" w:sz="8" w:space="0" w:color="000000"/>
+          <w:bottom w:val="single" w:sz="8" w:space="0" w:color="000000"/>
+          <w:right w:val="single" w:sz="8" w:space="0" w:color="000000"/>
+          <w:insideH w:val="single" w:sz="8" w:space="0" w:color="000000"/>
+          <w:insideV w:val="single" w:sz="8" w:space="0" w:color="000000"/>
+        </w:tblBorders>
+        <w:tblLayout w:type="fixed"/>
+        <w:tblLook w:val="0600" w:firstRow="0" w:lastRow="0" w:firstColumn="0" w:lastColumn="0" w:noHBand="1" w:noVBand="1"/>
+      </w:tblPr>
+      <w:tblGrid>
+        <w:gridCol w:w="1710"/>
+        <w:gridCol w:w="5687"/>
+        <w:gridCol w:w="1513"/>
+      </w:tblGrid>
+      <w:tr>
+        <w:trPr>
+          <w:trHeight w:val="274"/>
+        </w:trPr>
+        <w:tc>
+          <w:tcPr>
+            <w:tcW w:w="1710" w:type="dxa"/>
+            <w:tcMar>
+              <w:top w:w="100" w:type="dxa"/>
+              <w:left w:w="100" w:type="dxa"/>
+              <w:bottom w:w="100" w:type="dxa"/>
+              <w:right w:w="100" w:type="dxa"/>
+            </w:tcMar>
+          </w:tcPr>
+          <w:p>
+            <w:pPr>
+              <w:widowControl w:val="0"/>
+              <w:spacing w:after="0" w:line="240" w:lineRule="auto"/>
+              <w:jc w:val="center"/>
+              <w:rPr>
+                <w:rFonts w:ascii="Arial" w:eastAsia="Times New Roman" w:hAnsi="Arial" w:cs="Arial"/>
+                <w:b/>
+                <w:bCs/>
+                <w:szCs w:val="24"/>
+              </w:rPr>
+            </w:pPr>
+            <w:r>
+              <w:rPr>
+                <w:rFonts w:ascii="Arial" w:eastAsia="Times New Roman" w:hAnsi="Arial" w:cs="Arial"/>
+                <w:b/>
+                <w:bCs/>
+                <w:szCs w:val="24"/>
+              </w:rPr>
+              <w:t>Feature</w:t>
+            </w:r>
+          </w:p>
+        </w:tc>
+        <w:tc>
+          <w:tcPr>
+            <w:tcW w:w="5687" w:type="dxa"/>
+            <w:tcMar>
+              <w:top w:w="100" w:type="dxa"/>
+              <w:left w:w="100" w:type="dxa"/>
+              <w:bottom w:w="100" w:type="dxa"/>
+              <w:right w:w="100" w:type="dxa"/>
+            </w:tcMar>
+          </w:tcPr>
+          <w:p>
+            <w:pPr>
+              <w:widowControl w:val="0"/>
+              <w:spacing w:after="0" w:line="240" w:lineRule="auto"/>
+              <w:jc w:val="center"/>
+              <w:rPr>
+                <w:rFonts w:ascii="Arial" w:eastAsia="Times New Roman" w:hAnsi="Arial" w:cs="Arial"/>
+                <w:b/>
+                <w:bCs/>
+                <w:szCs w:val="24"/>
+              </w:rPr>
+            </w:pPr>
+            <w:r>
+              <w:rPr>
+                <w:rFonts w:ascii="Arial" w:eastAsia="Times New Roman" w:hAnsi="Arial" w:cs="Arial"/>
+                <w:b/>
+                <w:bCs/>
+                <w:szCs w:val="24"/>
+              </w:rPr>
+              <w:t>Description</w:t>
+            </w:r>
+          </w:p>
+        </w:tc>
+        <w:tc>
+          <w:tcPr>
+            <w:tcW w:w="1513" w:type="dxa"/>
+            <w:tcMar>
+              <w:top w:w="100" w:type="dxa"/>
+              <w:left w:w="100" w:type="dxa"/>
+              <w:bottom w:w="100" w:type="dxa"/>
+              <w:right w:w="100" w:type="dxa"/>
+            </w:tcMar>
+          </w:tcPr>
+          <w:p>
+            <w:pPr>
+              <w:widowControl w:val="0"/>
+              <w:spacing w:after="0" w:line="240" w:lineRule="auto"/>
+              <w:jc w:val="center"/>
+              <w:rPr>
+                <w:rFonts w:ascii="Arial" w:eastAsia="Times New Roman" w:hAnsi="Arial" w:cs="Arial"/>
+                <w:b/>
+                <w:bCs/>
+                <w:szCs w:val="24"/>
+              </w:rPr>
+            </w:pPr>
+            <w:r>
+              <w:rPr>
+                <w:rFonts w:ascii="Arial" w:eastAsia="Times New Roman" w:hAnsi="Arial" w:cs="Arial"/>
+                <w:b/>
+                <w:bCs/>
+                <w:szCs w:val="24"/>
+              </w:rPr>
+              <w:t>Priority</w:t>
+            </w:r>
+          </w:p>
+        </w:tc>
+      </w:tr>
+      <w:tr>
+        <w:trPr>
+          <w:trHeight w:val="264"/>
+        </w:trPr>
+        <w:tc>
+          <w:tcPr>
+            <w:tcW w:w="1710" w:type="dxa"/>
+            <w:tcMar>
+              <w:top w:w="100" w:type="dxa"/>
+              <w:left w:w="100" w:type="dxa"/>
+              <w:bottom w:w="100" w:type="dxa"/>
+              <w:right w:w="100" w:type="dxa"/>
+            </w:tcMar>
+          </w:tcPr>
+          <w:p>
+            <w:pPr>
+              <w:widowControl w:val="0"/>
+              <w:spacing w:after="0" w:line="360" w:lineRule="auto"/>
+              <w:jc w:val="both"/>
+              <w:rPr>
+                <w:rFonts w:ascii="Arial" w:eastAsia="Times New Roman" w:hAnsi="Arial" w:cs="Arial"/>
+                <w:szCs w:val="24"/>
+              </w:rPr>
+            </w:pPr>
+          </w:p>
+        </w:tc>
+        <w:tc>
+          <w:tcPr>
+            <w:tcW w:w="5687" w:type="dxa"/>
+            <w:tcMar>
+              <w:top w:w="100" w:type="dxa"/>
+              <w:left w:w="100" w:type="dxa"/>
+              <w:bottom w:w="100" w:type="dxa"/>
+              <w:right w:w="100" w:type="dxa"/>
+            </w:tcMar>
+          </w:tcPr>
+          <w:p>
+            <w:pPr>
+              <w:widowControl w:val="0"/>
+              <w:spacing w:after="0" w:line="360" w:lineRule="auto"/>
+              <w:jc w:val="both"/>
+              <w:rPr>
+                <w:rFonts w:ascii="Arial" w:eastAsia="Times New Roman" w:hAnsi="Arial" w:cs="Arial"/>
+                <w:szCs w:val="24"/>
+              </w:rPr>
+            </w:pPr>
+          </w:p>
+        </w:tc>
+        <w:tc>
+          <w:tcPr>
+            <w:tcW w:w="1513" w:type="dxa"/>
+            <w:tcMar>
+              <w:top w:w="100" w:type="dxa"/>
+              <w:left w:w="100" w:type="dxa"/>
+              <w:bottom w:w="100" w:type="dxa"/>
+              <w:right w:w="100" w:type="dxa"/>
+            </w:tcMar>
+          </w:tcPr>
+          <w:p>
+            <w:pPr>
+              <w:widowControl w:val="0"/>
+              <w:spacing w:after="0" w:line="240" w:lineRule="auto"/>
+              <w:ind w:right="-156"/>
+              <w:rPr>
+                <w:rFonts w:ascii="Arial" w:eastAsia="Times New Roman" w:hAnsi="Arial" w:cs="Arial"/>
+                <w:szCs w:val="24"/>
+              </w:rPr>
+            </w:pPr>
+          </w:p>
+        </w:tc>
+      </w:tr>
+      <w:tr>
+        <w:trPr>
+          <w:trHeight w:val="274"/>
+        </w:trPr>
+        <w:tc>
+          <w:tcPr>
+            <w:tcW w:w="1710" w:type="dxa"/>
+            <w:tcMar>
+              <w:top w:w="100" w:type="dxa"/>
+              <w:left w:w="100" w:type="dxa"/>
+              <w:bottom w:w="100" w:type="dxa"/>
+              <w:right w:w="100" w:type="dxa"/>
+            </w:tcMar>
+          </w:tcPr>
+          <w:p>
+            <w:pPr>
+              <w:widowControl w:val="0"/>
+              <w:spacing w:after="0" w:line="360" w:lineRule="auto"/>
+              <w:jc w:val="both"/>
+              <w:rPr>
+                <w:rFonts w:ascii="Arial" w:eastAsia="Times New Roman" w:hAnsi="Arial" w:cs="Arial"/>
+                <w:szCs w:val="24"/>
+              </w:rPr>
+            </w:pPr>
+          </w:p>
+        </w:tc>
+        <w:tc>
+          <w:tcPr>
+            <w:tcW w:w="5687" w:type="dxa"/>
+            <w:tcMar>
+              <w:top w:w="100" w:type="dxa"/>
+              <w:left w:w="100" w:type="dxa"/>
+              <w:bottom w:w="100" w:type="dxa"/>
+              <w:right w:w="100" w:type="dxa"/>
+            </w:tcMar>
+          </w:tcPr>
+          <w:p>
+            <w:pPr>
+              <w:widowControl w:val="0"/>
+              <w:spacing w:after="0" w:line="360" w:lineRule="auto"/>
+              <w:jc w:val="both"/>
+              <w:rPr>
+                <w:rFonts w:ascii="Arial" w:eastAsia="Times New Roman" w:hAnsi="Arial" w:cs="Arial"/>
+                <w:szCs w:val="24"/>
+              </w:rPr>
+            </w:pPr>
+          </w:p>
+        </w:tc>
+        <w:tc>
+          <w:tcPr>
+            <w:tcW w:w="1513" w:type="dxa"/>
+            <w:tcMar>
+              <w:top w:w="100" w:type="dxa"/>
+              <w:left w:w="100" w:type="dxa"/>
+              <w:bottom w:w="100" w:type="dxa"/>
+              <w:right w:w="100" w:type="dxa"/>
+            </w:tcMar>
+          </w:tcPr>
+          <w:p>
+            <w:pPr>
+              <w:widowControl w:val="0"/>
+              <w:spacing w:after="0" w:line="240" w:lineRule="auto"/>
+              <w:ind w:right="-156"/>
+              <w:rPr>
+                <w:rFonts w:ascii="Arial" w:eastAsia="Times New Roman" w:hAnsi="Arial" w:cs="Arial"/>
+                <w:szCs w:val="24"/>
+              </w:rPr>
+            </w:pPr>
+          </w:p>
+        </w:tc>
+      </w:tr>
+      <w:tr>
+        <w:trPr>
+          <w:trHeight w:val="264"/>
+        </w:trPr>
+        <w:tc>
+          <w:tcPr>
+            <w:tcW w:w="1710" w:type="dxa"/>
+            <w:tcMar>
+              <w:top w:w="100" w:type="dxa"/>
+              <w:left w:w="100" w:type="dxa"/>
+              <w:bottom w:w="100" w:type="dxa"/>
+              <w:right w:w="100" w:type="dxa"/>
+            </w:tcMar>
+          </w:tcPr>
+          <w:p>
+            <w:pPr>
+              <w:widowControl w:val="0"/>
+              <w:spacing w:after="0" w:line="360" w:lineRule="auto"/>
+              <w:jc w:val="both"/>
+              <w:rPr>
+                <w:rFonts w:ascii="Arial" w:eastAsia="Times New Roman" w:hAnsi="Arial" w:cs="Arial"/>
+                <w:szCs w:val="24"/>
+              </w:rPr>
+            </w:pPr>
+          </w:p>
+        </w:tc>
+        <w:tc>
+          <w:tcPr>
+            <w:tcW w:w="5687" w:type="dxa"/>
+            <w:tcMar>
+              <w:top w:w="100" w:type="dxa"/>
+              <w:left w:w="100" w:type="dxa"/>
+              <w:bottom w:w="100" w:type="dxa"/>
+              <w:right w:w="100" w:type="dxa"/>
+            </w:tcMar>
+          </w:tcPr>
+          <w:p>
+            <w:pPr>
+              <w:widowControl w:val="0"/>
+              <w:spacing w:after="0" w:line="360" w:lineRule="auto"/>
+              <w:jc w:val="both"/>
+              <w:rPr>
+                <w:rFonts w:ascii="Arial" w:eastAsia="Times New Roman" w:hAnsi="Arial" w:cs="Arial"/>
+                <w:szCs w:val="24"/>
+              </w:rPr>
+            </w:pPr>
+          </w:p>
+        </w:tc>
+        <w:tc>
+          <w:tcPr>
+            <w:tcW w:w="1513" w:type="dxa"/>
+            <w:tcMar>
+              <w:top w:w="100" w:type="dxa"/>
+              <w:left w:w="100" w:type="dxa"/>
+              <w:bottom w:w="100" w:type="dxa"/>
+              <w:right w:w="100" w:type="dxa"/>
+            </w:tcMar>
+          </w:tcPr>
+          <w:p>
+            <w:pPr>
+              <w:widowControl w:val="0"/>
+              <w:spacing w:after="0" w:line="240" w:lineRule="auto"/>
+              <w:ind w:right="-156"/>
+              <w:rPr>
+                <w:rFonts w:ascii="Arial" w:eastAsia="Times New Roman" w:hAnsi="Arial" w:cs="Arial"/>
+                <w:szCs w:val="24"/>
+              </w:rPr>
+            </w:pPr>
+          </w:p>
+        </w:tc>
+      </w:tr>
+      <w:tr>
+        <w:trPr>
+          <w:trHeight w:val="274"/>
+        </w:trPr>
+        <w:tc>
+          <w:tcPr>
+            <w:tcW w:w="1710" w:type="dxa"/>
+            <w:tcMar>
+              <w:top w:w="100" w:type="dxa"/>
+              <w:left w:w="100" w:type="dxa"/>
+              <w:bottom w:w="100" w:type="dxa"/>
+              <w:right w:w="100" w:type="dxa"/>
+            </w:tcMar>
+          </w:tcPr>
+          <w:p>
+            <w:pPr>
+              <w:widowControl w:val="0"/>
+              <w:spacing w:after="0" w:line="360" w:lineRule="auto"/>
+              <w:jc w:val="both"/>
+              <w:rPr>
+                <w:rFonts w:ascii="Arial" w:eastAsia="Times New Roman" w:hAnsi="Arial" w:cs="Arial"/>
+                <w:szCs w:val="24"/>
+              </w:rPr>
+            </w:pPr>
+          </w:p>
+        </w:tc>
+        <w:tc>
+          <w:tcPr>
+            <w:tcW w:w="5687" w:type="dxa"/>
+            <w:tcMar>
+              <w:top w:w="100" w:type="dxa"/>
+              <w:left w:w="100" w:type="dxa"/>
+              <w:bottom w:w="100" w:type="dxa"/>
+              <w:right w:w="100" w:type="dxa"/>
+            </w:tcMar>
+          </w:tcPr>
+          <w:p>
+            <w:pPr>
+              <w:widowControl w:val="0"/>
+              <w:spacing w:after="0" w:line="360" w:lineRule="auto"/>
+              <w:jc w:val="both"/>
+              <w:rPr>
+                <w:rFonts w:ascii="Arial" w:eastAsia="Times New Roman" w:hAnsi="Arial" w:cs="Arial"/>
+                <w:szCs w:val="24"/>
+              </w:rPr>
+            </w:pPr>
+          </w:p>
+        </w:tc>
+        <w:tc>
+          <w:tcPr>
+            <w:tcW w:w="1513" w:type="dxa"/>
+            <w:tcMar>
+              <w:top w:w="100" w:type="dxa"/>
+              <w:left w:w="100" w:type="dxa"/>
+              <w:bottom w:w="100" w:type="dxa"/>
+              <w:right w:w="100" w:type="dxa"/>
+            </w:tcMar>
+          </w:tcPr>
+          <w:p>
+            <w:pPr>
+              <w:widowControl w:val="0"/>
+              <w:spacing w:after="0" w:line="240" w:lineRule="auto"/>
+              <w:ind w:right="-156"/>
+              <w:rPr>
+                <w:rFonts w:ascii="Arial" w:eastAsia="Times New Roman" w:hAnsi="Arial" w:cs="Arial"/>
+                <w:szCs w:val="24"/>
+                <w:highlight w:val="red"/>
+              </w:rPr>
+            </w:pPr>
+          </w:p>
+        </w:tc>
+      </w:tr>
+      <w:tr>
+        <w:trPr>
+          <w:trHeight w:val="274"/>
+        </w:trPr>
+        <w:tc>
+          <w:tcPr>
+            <w:tcW w:w="1710" w:type="dxa"/>
+            <w:tcMar>
+              <w:top w:w="100" w:type="dxa"/>
+              <w:left w:w="100" w:type="dxa"/>
+              <w:bottom w:w="100" w:type="dxa"/>
+              <w:right w:w="100" w:type="dxa"/>
+            </w:tcMar>
+          </w:tcPr>
+          <w:p>
+            <w:pPr>
+              <w:widowControl w:val="0"/>
+              <w:spacing w:after="0" w:line="360" w:lineRule="auto"/>
+              <w:jc w:val="both"/>
+              <w:rPr>
+                <w:rFonts w:ascii="Arial" w:eastAsia="Times New Roman" w:hAnsi="Arial" w:cs="Arial"/>
+                <w:szCs w:val="24"/>
+              </w:rPr>
+            </w:pPr>
+          </w:p>
+        </w:tc>
+        <w:tc>
+          <w:tcPr>
+            <w:tcW w:w="5687" w:type="dxa"/>
+            <w:tcMar>
+              <w:top w:w="100" w:type="dxa"/>
+              <w:left w:w="100" w:type="dxa"/>
+              <w:bottom w:w="100" w:type="dxa"/>
+              <w:right w:w="100" w:type="dxa"/>
+            </w:tcMar>
+          </w:tcPr>
+          <w:p>
+            <w:pPr>
+              <w:widowControl w:val="0"/>
+              <w:spacing w:after="0" w:line="360" w:lineRule="auto"/>
+              <w:jc w:val="both"/>
+              <w:rPr>
+                <w:rFonts w:ascii="Arial" w:eastAsia="Times New Roman" w:hAnsi="Arial" w:cs="Arial"/>
+                <w:szCs w:val="24"/>
+              </w:rPr>
+            </w:pPr>
+          </w:p>
+        </w:tc>
+        <w:tc>
+          <w:tcPr>
+            <w:tcW w:w="1513" w:type="dxa"/>
+            <w:tcMar>
+              <w:top w:w="100" w:type="dxa"/>
+              <w:left w:w="100" w:type="dxa"/>
+              <w:bottom w:w="100" w:type="dxa"/>
+              <w:right w:w="100" w:type="dxa"/>
+            </w:tcMar>
+          </w:tcPr>
+          <w:p>
+            <w:pPr>
+              <w:widowControl w:val="0"/>
+              <w:spacing w:after="0" w:line="240" w:lineRule="auto"/>
+              <w:ind w:right="-156"/>
+              <w:rPr>
+                <w:rFonts w:ascii="Arial" w:eastAsia="Times New Roman" w:hAnsi="Arial" w:cs="Arial"/>
+                <w:szCs w:val="24"/>
+              </w:rPr>
+            </w:pPr>
+          </w:p>
+        </w:tc>
+      </w:tr>
+      <w:tr>
+        <w:trPr>
+          <w:trHeight w:val="264"/>
+        </w:trPr>
+        <w:tc>
+          <w:tcPr>
+            <w:tcW w:w="1710" w:type="dxa"/>
+            <w:tcMar>
+              <w:top w:w="100" w:type="dxa"/>
+              <w:left w:w="100" w:type="dxa"/>
+              <w:bottom w:w="100" w:type="dxa"/>
+              <w:right w:w="100" w:type="dxa"/>
+            </w:tcMar>
+          </w:tcPr>
+          <w:p>
+            <w:pPr>
+              <w:widowControl w:val="0"/>
+              <w:spacing w:after="0" w:line="360" w:lineRule="auto"/>
+              <w:jc w:val="both"/>
+              <w:rPr>
+                <w:rFonts w:ascii="Arial" w:eastAsia="Times New Roman" w:hAnsi="Arial" w:cs="Arial"/>
+                <w:szCs w:val="24"/>
+              </w:rPr>
+            </w:pPr>
+          </w:p>
+        </w:tc>
+        <w:tc>
+          <w:tcPr>
+            <w:tcW w:w="5687" w:type="dxa"/>
+            <w:tcMar>
+              <w:top w:w="100" w:type="dxa"/>
+              <w:left w:w="100" w:type="dxa"/>
+              <w:bottom w:w="100" w:type="dxa"/>
+              <w:right w:w="100" w:type="dxa"/>
+            </w:tcMar>
+          </w:tcPr>
+          <w:p>
+            <w:pPr>
+              <w:widowControl w:val="0"/>
+              <w:spacing w:after="0" w:line="360" w:lineRule="auto"/>
+              <w:jc w:val="both"/>
+              <w:rPr>
+                <w:rFonts w:ascii="Arial" w:eastAsia="Times New Roman" w:hAnsi="Arial" w:cs="Arial"/>
+                <w:szCs w:val="24"/>
+              </w:rPr>
+            </w:pPr>
+          </w:p>
+        </w:tc>
+        <w:tc>
+          <w:tcPr>
+            <w:tcW w:w="1513" w:type="dxa"/>
+            <w:tcMar>
+              <w:top w:w="100" w:type="dxa"/>
+              <w:left w:w="100" w:type="dxa"/>
+              <w:bottom w:w="100" w:type="dxa"/>
+              <w:right w:w="100" w:type="dxa"/>
+            </w:tcMar>
+          </w:tcPr>
+          <w:p>
+            <w:pPr>
+              <w:widowControl w:val="0"/>
+              <w:spacing w:after="0" w:line="240" w:lineRule="auto"/>
+              <w:ind w:right="-156"/>
+              <w:rPr>
+                <w:rFonts w:ascii="Arial" w:eastAsia="Times New Roman" w:hAnsi="Arial" w:cs="Arial"/>
+                <w:szCs w:val="24"/>
+              </w:rPr>
+            </w:pPr>
+          </w:p>
+        </w:tc>
+      </w:tr>
+      <w:tr>
+        <w:trPr>
+          <w:trHeight w:val="274"/>
+        </w:trPr>
+        <w:tc>
+          <w:tcPr>
+            <w:tcW w:w="1710" w:type="dxa"/>
+            <w:tcMar>
+              <w:top w:w="100" w:type="dxa"/>
+              <w:left w:w="100" w:type="dxa"/>
+              <w:bottom w:w="100" w:type="dxa"/>
+              <w:right w:w="100" w:type="dxa"/>
+            </w:tcMar>
+          </w:tcPr>
+          <w:p>
+            <w:pPr>
+              <w:widowControl w:val="0"/>
+              <w:spacing w:after="0" w:line="360" w:lineRule="auto"/>
+              <w:jc w:val="both"/>
+              <w:rPr>
+                <w:rFonts w:ascii="Arial" w:eastAsia="Times New Roman" w:hAnsi="Arial" w:cs="Arial"/>
+                <w:szCs w:val="24"/>
+              </w:rPr>
+            </w:pPr>
+          </w:p>
+        </w:tc>
+        <w:tc>
+          <w:tcPr>
+            <w:tcW w:w="5687" w:type="dxa"/>
+            <w:tcMar>
+              <w:top w:w="100" w:type="dxa"/>
+              <w:left w:w="100" w:type="dxa"/>
+              <w:bottom w:w="100" w:type="dxa"/>
+              <w:right w:w="100" w:type="dxa"/>
+            </w:tcMar>
+          </w:tcPr>
+          <w:p>
+            <w:pPr>
+              <w:widowControl w:val="0"/>
+              <w:spacing w:after="0" w:line="360" w:lineRule="auto"/>
+              <w:jc w:val="both"/>
+              <w:rPr>
+                <w:rFonts w:ascii="Arial" w:eastAsia="Times New Roman" w:hAnsi="Arial" w:cs="Arial"/>
+                <w:szCs w:val="24"/>
+              </w:rPr>
+            </w:pPr>
+          </w:p>
+        </w:tc>
+        <w:tc>
+          <w:tcPr>
+            <w:tcW w:w="1513" w:type="dxa"/>
+            <w:tcMar>
+              <w:top w:w="100" w:type="dxa"/>
+              <w:left w:w="100" w:type="dxa"/>
+              <w:bottom w:w="100" w:type="dxa"/>
+              <w:right w:w="100" w:type="dxa"/>
+            </w:tcMar>
+          </w:tcPr>
+          <w:p>
+            <w:pPr>
+              <w:widowControl w:val="0"/>
+              <w:spacing w:after="0" w:line="240" w:lineRule="auto"/>
+              <w:ind w:right="-156"/>
+              <w:rPr>
+                <w:rFonts w:ascii="Arial" w:eastAsia="Times New Roman" w:hAnsi="Arial" w:cs="Arial"/>
+                <w:szCs w:val="24"/>
+                <w:highlight w:val="yellow"/>
+              </w:rPr>
+            </w:pPr>
+          </w:p>
+        </w:tc>
+      </w:tr>
+      <w:tr>
+        <w:trPr>
+          <w:trHeight w:val="264"/>
+        </w:trPr>
+        <w:tc>
+          <w:tcPr>
+            <w:tcW w:w="1710" w:type="dxa"/>
+            <w:tcMar>
+              <w:top w:w="100" w:type="dxa"/>
+              <w:left w:w="100" w:type="dxa"/>
+              <w:bottom w:w="100" w:type="dxa"/>
+              <w:right w:w="100" w:type="dxa"/>
+            </w:tcMar>
+          </w:tcPr>
+          <w:p>
+            <w:pPr>
+              <w:widowControl w:val="0"/>
+              <w:spacing w:after="0" w:line="360" w:lineRule="auto"/>
+              <w:jc w:val="both"/>
+              <w:rPr>
+                <w:rFonts w:ascii="Arial" w:eastAsia="Times New Roman" w:hAnsi="Arial" w:cs="Arial"/>
+                <w:szCs w:val="24"/>
+              </w:rPr>
+            </w:pPr>
+          </w:p>
+        </w:tc>
+        <w:tc>
+          <w:tcPr>
+            <w:tcW w:w="5687" w:type="dxa"/>
+            <w:tcMar>
+              <w:top w:w="100" w:type="dxa"/>
+              <w:left w:w="100" w:type="dxa"/>
+              <w:bottom w:w="100" w:type="dxa"/>
+              <w:right w:w="100" w:type="dxa"/>
+            </w:tcMar>
+          </w:tcPr>
+          <w:p>
+            <w:pPr>
+              <w:widowControl w:val="0"/>
+              <w:spacing w:after="0" w:line="360" w:lineRule="auto"/>
+              <w:jc w:val="both"/>
+              <w:rPr>
+                <w:rFonts w:ascii="Arial" w:eastAsia="Times New Roman" w:hAnsi="Arial" w:cs="Arial"/>
+                <w:szCs w:val="24"/>
+              </w:rPr>
+            </w:pPr>
+          </w:p>
+        </w:tc>
+        <w:tc>
+          <w:tcPr>
+            <w:tcW w:w="1513" w:type="dxa"/>
+            <w:tcMar>
+              <w:top w:w="100" w:type="dxa"/>
+              <w:left w:w="100" w:type="dxa"/>
+              <w:bottom w:w="100" w:type="dxa"/>
+              <w:right w:w="100" w:type="dxa"/>
+            </w:tcMar>
+          </w:tcPr>
+          <w:p>
+            <w:pPr>
+              <w:widowControl w:val="0"/>
+              <w:spacing w:after="0" w:line="240" w:lineRule="auto"/>
+              <w:ind w:right="-156"/>
+              <w:rPr>
+                <w:rFonts w:ascii="Arial" w:eastAsia="Times New Roman" w:hAnsi="Arial" w:cs="Arial"/>
+                <w:szCs w:val="24"/>
+              </w:rPr>
+            </w:pPr>
+          </w:p>
+        </w:tc>
+      </w:tr>
+    </w:tbl>
+    <w:p>
+      <w:pPr>
+        <w:rPr>
+          <w:lang w:val="en-US"/>
+        </w:rPr>
+      </w:pPr>
+    </w:p>
+    <w:p>
+      <w:pPr>
+        <w:rPr>
+          <w:lang w:val="en-US"/>
+        </w:rPr>
+      </w:pPr>
+    </w:p>
+    <w:p>
+      <w:pPr>
+        <w:spacing w:line="360" w:lineRule="auto"/>
+        <w:jc w:val="both"/>
+        <w:rPr>
+          <w:rFonts w:ascii="Arial" w:hAnsi="Arial" w:cs="Arial"/>
+          <w:szCs w:val="24"/>
+          <w:lang w:val="en-US"/>
+        </w:rPr>
+      </w:pPr>
+    </w:p>
+    <w:p>
+      <w:pPr>
         <w:jc w:val="center"/>
         <w:rPr>
           <w:lang w:val="en-US"/>
@@ -9562,7 +11642,6 @@
           <w:szCs w:val="24"/>
           <w:lang w:val="en-US"/>
         </w:rPr>
-        <w:lastRenderedPageBreak/>
         <w:t>Chapter 7</w:t>
       </w:r>
       <w:r>
@@ -9825,7 +11904,6 @@
           <w:szCs w:val="24"/>
           <w:lang w:val="en-US"/>
         </w:rPr>
-        <w:lastRenderedPageBreak/>
         <w:t>Chapter 8</w:t>
       </w:r>
       <w:r>
@@ -10088,7 +12166,6 @@
           <w:szCs w:val="24"/>
           <w:lang w:val="en-US"/>
         </w:rPr>
-        <w:lastRenderedPageBreak/>
         <w:t>Chapter 9</w:t>
       </w:r>
       <w:r>
@@ -10351,7 +12428,6 @@
           <w:szCs w:val="24"/>
           <w:lang w:val="en-US"/>
         </w:rPr>
-        <w:lastRenderedPageBreak/>
         <w:t>Chapter 10</w:t>
       </w:r>
       <w:r>
@@ -12742,7 +14818,7 @@
   <w:style w:type="paragraph" w:default="1" w:styleId="Normal">
     <w:name w:val="Normal"/>
     <w:qFormat/>
-    <w:rsid w:val="00D72736"/>
+    <w:rsid w:val="00DD099E"/>
   </w:style>
   <w:style w:type="paragraph" w:styleId="Heading1">
     <w:name w:val="heading 1"/>

</xml_diff>

<commit_message>
completed functional requirement and completed chapter 6
</commit_message>
<xml_diff>
--- a/Final Report.docx
+++ b/Final Report.docx
@@ -602,94 +602,146 @@
     <w:p/>
     <w:p>
       <w:pPr>
+        <w:rPr>
+          <w:lang w:val="en-US"/>
+        </w:rPr>
+      </w:pPr>
+    </w:p>
+    <w:p>
+      <w:pPr>
+        <w:rPr>
+          <w:lang w:val="en-US"/>
+        </w:rPr>
+      </w:pPr>
+    </w:p>
+    <w:p>
+      <w:pPr>
         <w:spacing w:line="360" w:lineRule="auto"/>
-        <w:jc w:val="both"/>
-        <w:rPr>
-          <w:rFonts w:ascii="Arial" w:hAnsi="Arial" w:cs="Arial"/>
-          <w:lang w:val="en-US"/>
-        </w:rPr>
-      </w:pPr>
-      <w:r>
-        <w:rPr>
-          <w:rFonts w:ascii="Arial" w:hAnsi="Arial" w:cs="Arial"/>
-          <w:lang w:val="en-US"/>
-        </w:rPr>
-        <w:t xml:space="preserve">In the recent past, much research has been invested in deep learning-based object detection. Due to that, already numerous real-time applications are emerging. They include identifying pedestrians, </w:t>
-      </w:r>
-      <w:r>
-        <w:rPr>
-          <w:rFonts w:ascii="Arial" w:hAnsi="Arial" w:cs="Arial"/>
-          <w:lang w:val="en-US"/>
-        </w:rPr>
-        <w:t>identifying,</w:t>
-      </w:r>
-      <w:r>
-        <w:rPr>
-          <w:rFonts w:ascii="Arial" w:hAnsi="Arial" w:cs="Arial"/>
-          <w:lang w:val="en-US"/>
-        </w:rPr>
-        <w:t xml:space="preserve"> and counting vehicles, visual quality inspection in factory manufacturing and packaging, identifying damage and face recognition.</w:t>
-      </w:r>
-      <w:r>
-        <w:rPr>
-          <w:rFonts w:ascii="Arial" w:hAnsi="Arial" w:cs="Arial"/>
-          <w:lang w:val="en-US"/>
-        </w:rPr>
-        <w:t xml:space="preserve"> </w:t>
-      </w:r>
-      <w:r>
-        <w:rPr>
-          <w:rFonts w:ascii="Arial" w:hAnsi="Arial" w:cs="Arial"/>
-          <w:lang w:val="en-US"/>
-        </w:rPr>
-        <w:t xml:space="preserve">However, the quality of such detection models tends to degrade in cases where images are taken in adverse conditions such as in low-light conditions or where they are affected by blurring effects. This research explores how the quality of the pre-trained object detection models can be </w:t>
-      </w:r>
-      <w:r>
-        <w:rPr>
-          <w:rFonts w:ascii="Arial" w:hAnsi="Arial" w:cs="Arial"/>
-          <w:lang w:val="en-US"/>
-        </w:rPr>
-        <w:t>evaluated</w:t>
-      </w:r>
-      <w:r>
-        <w:rPr>
-          <w:rFonts w:ascii="Arial" w:hAnsi="Arial" w:cs="Arial"/>
-          <w:lang w:val="en-US"/>
-        </w:rPr>
-        <w:t xml:space="preserve"> in the presence of poor image conditions. To generate controlled low-light and blurred variations of different severity levels, a benchmark image set will be used, and low light enhancement methods such as Gamma Correction and Contrast Limited Adaptive Histogram Equalization (CLAHE), will be used to access </w:t>
-      </w:r>
-      <w:r>
-        <w:rPr>
-          <w:rFonts w:ascii="Arial" w:hAnsi="Arial" w:cs="Arial"/>
-          <w:lang w:val="en-US"/>
-        </w:rPr>
-        <w:t>advances</w:t>
-      </w:r>
-      <w:r>
-        <w:rPr>
-          <w:rFonts w:ascii="Arial" w:hAnsi="Arial" w:cs="Arial"/>
-          <w:lang w:val="en-US"/>
-        </w:rPr>
-        <w:t xml:space="preserve">. The analysis will include YOLO, SSD, and Faster R-CNN categories of images, namely normal, degraded, and enhanced. The standard performance measures including accuracy, recall, confidence scores, and inference speed, will be calculated, and the outcomes will be complemented with the visual inspection of the detected </w:t>
-      </w:r>
-      <w:r>
-        <w:rPr>
-          <w:rFonts w:ascii="Arial" w:hAnsi="Arial" w:cs="Arial"/>
-          <w:lang w:val="en-US"/>
-        </w:rPr>
-        <w:t>results.</w:t>
-      </w:r>
-    </w:p>
-    <w:p>
-      <w:pPr>
-        <w:rPr>
-          <w:lang w:val="en-US"/>
-        </w:rPr>
-      </w:pPr>
-    </w:p>
-    <w:p>
-      <w:pPr>
-        <w:rPr>
+        <w:rPr>
+          <w:rFonts w:ascii="Arial" w:hAnsi="Arial" w:cs="Arial"/>
+          <w:b/>
+          <w:bCs/>
+          <w:lang w:val="en-US"/>
+        </w:rPr>
+      </w:pPr>
+    </w:p>
+    <w:p>
+      <w:pPr>
+        <w:spacing w:line="360" w:lineRule="auto"/>
+        <w:rPr>
+          <w:rFonts w:ascii="Arial" w:hAnsi="Arial" w:cs="Arial"/>
+          <w:b/>
+          <w:bCs/>
+          <w:lang w:val="en-US"/>
+        </w:rPr>
+      </w:pPr>
+    </w:p>
+    <w:p>
+      <w:pPr>
+        <w:spacing w:line="360" w:lineRule="auto"/>
+        <w:rPr>
+          <w:rFonts w:ascii="Arial" w:hAnsi="Arial" w:cs="Arial"/>
+          <w:b/>
+          <w:bCs/>
+          <w:lang w:val="en-US"/>
+        </w:rPr>
+      </w:pPr>
+    </w:p>
+    <w:p>
+      <w:pPr>
+        <w:spacing w:line="360" w:lineRule="auto"/>
+        <w:rPr>
+          <w:rFonts w:ascii="Arial" w:hAnsi="Arial" w:cs="Arial"/>
+          <w:b/>
+          <w:bCs/>
+          <w:lang w:val="en-US"/>
+        </w:rPr>
+      </w:pPr>
+    </w:p>
+    <w:p>
+      <w:pPr>
+        <w:spacing w:line="360" w:lineRule="auto"/>
+        <w:rPr>
+          <w:rFonts w:ascii="Arial" w:hAnsi="Arial" w:cs="Arial"/>
+          <w:b/>
+          <w:bCs/>
+          <w:lang w:val="en-US"/>
+        </w:rPr>
+      </w:pPr>
+    </w:p>
+    <w:p>
+      <w:pPr>
+        <w:spacing w:line="360" w:lineRule="auto"/>
+        <w:rPr>
+          <w:rFonts w:ascii="Arial" w:hAnsi="Arial" w:cs="Arial"/>
+          <w:b/>
+          <w:bCs/>
+          <w:lang w:val="en-US"/>
+        </w:rPr>
+      </w:pPr>
+    </w:p>
+    <w:p>
+      <w:pPr>
+        <w:spacing w:line="360" w:lineRule="auto"/>
+        <w:rPr>
+          <w:rFonts w:ascii="Arial" w:hAnsi="Arial" w:cs="Arial"/>
+          <w:b/>
+          <w:bCs/>
+          <w:lang w:val="en-US"/>
+        </w:rPr>
+      </w:pPr>
+    </w:p>
+    <w:p>
+      <w:pPr>
+        <w:spacing w:line="360" w:lineRule="auto"/>
+        <w:rPr>
+          <w:rFonts w:ascii="Arial" w:hAnsi="Arial" w:cs="Arial"/>
+          <w:b/>
+          <w:bCs/>
+          <w:lang w:val="en-US"/>
+        </w:rPr>
+      </w:pPr>
+    </w:p>
+    <w:p>
+      <w:pPr>
+        <w:spacing w:line="360" w:lineRule="auto"/>
+        <w:rPr>
+          <w:rFonts w:ascii="Arial" w:hAnsi="Arial" w:cs="Arial"/>
+          <w:b/>
+          <w:bCs/>
+          <w:lang w:val="en-US"/>
+        </w:rPr>
+      </w:pPr>
+    </w:p>
+    <w:p>
+      <w:pPr>
+        <w:spacing w:line="360" w:lineRule="auto"/>
+        <w:rPr>
+          <w:rFonts w:ascii="Arial" w:hAnsi="Arial" w:cs="Arial"/>
+          <w:b/>
+          <w:bCs/>
+          <w:lang w:val="en-US"/>
+        </w:rPr>
+      </w:pPr>
+    </w:p>
+    <w:p>
+      <w:pPr>
+        <w:spacing w:line="360" w:lineRule="auto"/>
+        <w:rPr>
+          <w:rFonts w:ascii="Arial" w:hAnsi="Arial" w:cs="Arial"/>
+          <w:b/>
+          <w:bCs/>
+          <w:lang w:val="en-US"/>
+        </w:rPr>
+      </w:pPr>
+    </w:p>
+    <w:p>
+      <w:pPr>
+        <w:spacing w:line="360" w:lineRule="auto"/>
+        <w:rPr>
+          <w:rFonts w:ascii="Arial" w:hAnsi="Arial" w:cs="Arial"/>
+          <w:b/>
+          <w:bCs/>
           <w:lang w:val="en-US"/>
         </w:rPr>
       </w:pPr>
@@ -4191,20 +4243,6 @@
     </w:p>
     <w:p>
       <w:pPr>
-        <w:rPr>
-          <w:lang w:val="en-US"/>
-        </w:rPr>
-      </w:pPr>
-    </w:p>
-    <w:p>
-      <w:pPr>
-        <w:rPr>
-          <w:lang w:val="en-US"/>
-        </w:rPr>
-      </w:pPr>
-    </w:p>
-    <w:p>
-      <w:pPr>
         <w:pStyle w:val="Heading1"/>
         <w:numPr>
           <w:ilvl w:val="0"/>
@@ -4225,6 +4263,7 @@
           <w:color w:val="000000" w:themeColor="text1"/>
           <w:lang w:val="en-US"/>
         </w:rPr>
+        <w:lastRenderedPageBreak/>
         <w:t>LIST OF ABBREVIATIONS</w:t>
       </w:r>
       <w:bookmarkEnd w:id="7"/>
@@ -4565,6 +4604,7 @@
           <w:color w:val="000000" w:themeColor="text1"/>
           <w:lang w:val="en-US"/>
         </w:rPr>
+        <w:lastRenderedPageBreak/>
         <w:t>LIST OF APPENDICES</w:t>
       </w:r>
       <w:bookmarkEnd w:id="8"/>
@@ -4572,6 +4612,17 @@
     <w:p>
       <w:pPr>
         <w:rPr>
+          <w:lang w:val="en-US"/>
+        </w:rPr>
+      </w:pPr>
+    </w:p>
+    <w:p>
+      <w:pPr>
+        <w:spacing w:line="360" w:lineRule="auto"/>
+        <w:rPr>
+          <w:rFonts w:ascii="Arial" w:hAnsi="Arial" w:cs="Arial"/>
+          <w:b/>
+          <w:bCs/>
           <w:lang w:val="en-US"/>
         </w:rPr>
       </w:pPr>
@@ -5553,23 +5604,7 @@
           <w:rFonts w:ascii="Arial" w:hAnsi="Arial" w:cs="Arial"/>
           <w:lang w:val="en-US"/>
         </w:rPr>
-        <w:t>to-processed features to classify the bounding boxes (</w:t>
-      </w:r>
-      <w:proofErr w:type="spellStart"/>
-      <w:r>
-        <w:rPr>
-          <w:rFonts w:ascii="Arial" w:hAnsi="Arial" w:cs="Arial"/>
-          <w:lang w:val="en-US"/>
-        </w:rPr>
-        <w:t>Girshick</w:t>
-      </w:r>
-      <w:proofErr w:type="spellEnd"/>
-      <w:r>
-        <w:rPr>
-          <w:rFonts w:ascii="Arial" w:hAnsi="Arial" w:cs="Arial"/>
-          <w:lang w:val="en-US"/>
-        </w:rPr>
-        <w:t xml:space="preserve"> et al. 2014). Fast R</w:t>
+        <w:t>to-processed features to classify the bounding boxes (Girshick et al. 2014). Fast R</w:t>
       </w:r>
       <w:r>
         <w:rPr>
@@ -5583,23 +5618,7 @@
           <w:rFonts w:ascii="Arial" w:hAnsi="Arial" w:cs="Arial"/>
           <w:lang w:val="en-US"/>
         </w:rPr>
-        <w:t>CNN sped up the approach by running the CNN only once on the entire image and then extracting features of different regions using region of interest pooling (</w:t>
-      </w:r>
-      <w:proofErr w:type="spellStart"/>
-      <w:r>
-        <w:rPr>
-          <w:rFonts w:ascii="Arial" w:hAnsi="Arial" w:cs="Arial"/>
-          <w:lang w:val="en-US"/>
-        </w:rPr>
-        <w:t>Girshick</w:t>
-      </w:r>
-      <w:proofErr w:type="spellEnd"/>
-      <w:r>
-        <w:rPr>
-          <w:rFonts w:ascii="Arial" w:hAnsi="Arial" w:cs="Arial"/>
-          <w:lang w:val="en-US"/>
-        </w:rPr>
-        <w:t xml:space="preserve"> 2015). Faster R</w:t>
+        <w:t>CNN sped up the approach by running the CNN only once on the entire image and then extracting features of different regions using region of interest pooling (Girshick 2015). Faster R</w:t>
       </w:r>
       <w:r>
         <w:rPr>
@@ -5760,23 +5779,7 @@
           <w:rFonts w:ascii="Arial" w:hAnsi="Arial" w:cs="Arial"/>
           <w:lang w:val="en-US"/>
         </w:rPr>
-        <w:t xml:space="preserve">It uses a </w:t>
-      </w:r>
-      <w:proofErr w:type="spellStart"/>
-      <w:r>
-        <w:rPr>
-          <w:rFonts w:ascii="Arial" w:hAnsi="Arial" w:cs="Arial"/>
-          <w:lang w:val="en-US"/>
-        </w:rPr>
-        <w:t>CSPDarknet</w:t>
-      </w:r>
-      <w:proofErr w:type="spellEnd"/>
-      <w:r>
-        <w:rPr>
-          <w:rFonts w:ascii="Arial" w:hAnsi="Arial" w:cs="Arial"/>
-          <w:lang w:val="en-US"/>
-        </w:rPr>
-        <w:t xml:space="preserve"> backbone, feature pyramid and path aggregation neck, and anchor</w:t>
+        <w:t>It uses a CSPDarknet backbone, feature pyramid and path aggregation neck, and anchor</w:t>
       </w:r>
       <w:r>
         <w:rPr>
@@ -5846,23 +5849,7 @@
           <w:rFonts w:ascii="Arial" w:hAnsi="Arial" w:cs="Arial"/>
           <w:lang w:val="en-US"/>
         </w:rPr>
-        <w:t xml:space="preserve">offs. For an input of 640×640, YOLOv8n has 2 million parameters and a mAP@0.5 of 47.2 % and YOLOv8x has 90 million parameters and a mAP@0.5 of 71.5 %. These measurements suggest that larger models are more accurate but slower. The medium model (YOLOv8m) strikes a balance, with 25 million parameters, 66.3 % mAP@0.5 and 7.8 </w:t>
-      </w:r>
-      <w:proofErr w:type="spellStart"/>
-      <w:r>
-        <w:rPr>
-          <w:rFonts w:ascii="Arial" w:hAnsi="Arial" w:cs="Arial"/>
-          <w:lang w:val="en-US"/>
-        </w:rPr>
-        <w:t>ms</w:t>
-      </w:r>
-      <w:proofErr w:type="spellEnd"/>
-      <w:r>
-        <w:rPr>
-          <w:rFonts w:ascii="Arial" w:hAnsi="Arial" w:cs="Arial"/>
-          <w:lang w:val="en-US"/>
-        </w:rPr>
-        <w:t xml:space="preserve"> inference time on a GPU.</w:t>
+        <w:t>offs. For an input of 640×640, YOLOv8n has 2 million parameters and a mAP@0.5 of 47.2 % and YOLOv8x has 90 million parameters and a mAP@0.5 of 71.5 %. These measurements suggest that larger models are more accurate but slower. The medium model (YOLOv8m) strikes a balance, with 25 million parameters, 66.3 % mAP@0.5 and 7.8 ms inference time on a GPU.</w:t>
       </w:r>
     </w:p>
     <w:p>
@@ -5892,39 +5879,7 @@
           <w:rFonts w:ascii="Arial" w:hAnsi="Arial" w:cs="Arial"/>
           <w:lang w:val="en-US"/>
         </w:rPr>
-        <w:t>light object detection, a 2024 empirical paper evaluated various YOLOv8 models on the Exclusively Dark (</w:t>
-      </w:r>
-      <w:proofErr w:type="spellStart"/>
-      <w:r>
-        <w:rPr>
-          <w:rFonts w:ascii="Arial" w:hAnsi="Arial" w:cs="Arial"/>
-          <w:lang w:val="en-US"/>
-        </w:rPr>
-        <w:t>ExDark</w:t>
-      </w:r>
-      <w:proofErr w:type="spellEnd"/>
-      <w:r>
-        <w:rPr>
-          <w:rFonts w:ascii="Arial" w:hAnsi="Arial" w:cs="Arial"/>
-          <w:lang w:val="en-US"/>
-        </w:rPr>
-        <w:t xml:space="preserve">) dataset. YOLOv8m achieved the highest performance: precision 0.908, recall 0.819, mAP@0.50 0.886 and F1 score 0.85. The smaller and larger models had slightly lower performance: for YOLOv8l (large) precision 0.897 and </w:t>
-      </w:r>
-      <w:proofErr w:type="spellStart"/>
-      <w:r>
-        <w:rPr>
-          <w:rFonts w:ascii="Arial" w:hAnsi="Arial" w:cs="Arial"/>
-          <w:lang w:val="en-US"/>
-        </w:rPr>
-        <w:t>mAP</w:t>
-      </w:r>
-      <w:proofErr w:type="spellEnd"/>
-      <w:r>
-        <w:rPr>
-          <w:rFonts w:ascii="Arial" w:hAnsi="Arial" w:cs="Arial"/>
-          <w:lang w:val="en-US"/>
-        </w:rPr>
-        <w:t xml:space="preserve"> 0.865. In fact, YOLOv8m also achieved higher performance than other detectors tested in the same work: Faster R</w:t>
+        <w:t>light object detection, a 2024 empirical paper evaluated various YOLOv8 models on the Exclusively Dark (ExDark) dataset. YOLOv8m achieved the highest performance: precision 0.908, recall 0.819, mAP@0.50 0.886 and F1 score 0.85. The smaller and larger models had slightly lower performance: for YOLOv8l (large) precision 0.897 and mAP 0.865. In fact, YOLOv8m also achieved higher performance than other detectors tested in the same work: Faster R</w:t>
       </w:r>
       <w:r>
         <w:rPr>
@@ -6079,23 +6034,7 @@
           <w:rFonts w:ascii="Arial" w:hAnsi="Arial" w:cs="Arial"/>
           <w:lang w:val="en-US"/>
         </w:rPr>
-        <w:t xml:space="preserve">light images are difficult. This decreases image contrast, fades textures and edges and adds noise. In consequence, small objects can disappear into the background, and large objects can lose their textures. These problems impact conventional detectors because the kernels in convolutions learn from local contrast and gradients. The </w:t>
-      </w:r>
-      <w:proofErr w:type="spellStart"/>
-      <w:r>
-        <w:rPr>
-          <w:rFonts w:ascii="Arial" w:hAnsi="Arial" w:cs="Arial"/>
-          <w:lang w:val="en-US"/>
-        </w:rPr>
-        <w:t>ExDark</w:t>
-      </w:r>
-      <w:proofErr w:type="spellEnd"/>
-      <w:r>
-        <w:rPr>
-          <w:rFonts w:ascii="Arial" w:hAnsi="Arial" w:cs="Arial"/>
-          <w:lang w:val="en-US"/>
-        </w:rPr>
-        <w:t xml:space="preserve"> dataset (Loh &amp; Chan 2019) was developed to facilitate research on dark images; it consists of more than 7,000 images in ten low</w:t>
+        <w:t>light images are difficult. This decreases image contrast, fades textures and edges and adds noise. In consequence, small objects can disappear into the background, and large objects can lose their textures. These problems impact conventional detectors because the kernels in convolutions learn from local contrast and gradients. The ExDark dataset (Loh &amp; Chan 2019) was developed to facilitate research on dark images; it consists of more than 7,000 images in ten low</w:t>
       </w:r>
       <w:r>
         <w:rPr>
@@ -6109,23 +6048,7 @@
           <w:rFonts w:ascii="Arial" w:hAnsi="Arial" w:cs="Arial"/>
           <w:lang w:val="en-US"/>
         </w:rPr>
-        <w:t xml:space="preserve">light scenarios with twelve object classes. Research on </w:t>
-      </w:r>
-      <w:proofErr w:type="spellStart"/>
-      <w:r>
-        <w:rPr>
-          <w:rFonts w:ascii="Arial" w:hAnsi="Arial" w:cs="Arial"/>
-          <w:lang w:val="en-US"/>
-        </w:rPr>
-        <w:t>ExDark</w:t>
-      </w:r>
-      <w:proofErr w:type="spellEnd"/>
-      <w:r>
-        <w:rPr>
-          <w:rFonts w:ascii="Arial" w:hAnsi="Arial" w:cs="Arial"/>
-          <w:lang w:val="en-US"/>
-        </w:rPr>
-        <w:t xml:space="preserve"> has confirmed detectors trained in well</w:t>
+        <w:t>light scenarios with twelve object classes. Research on ExDark has confirmed detectors trained in well</w:t>
       </w:r>
       <w:r>
         <w:rPr>
@@ -6153,39 +6076,7 @@
           <w:rFonts w:ascii="Arial" w:hAnsi="Arial" w:cs="Arial"/>
           <w:lang w:val="en-US"/>
         </w:rPr>
-        <w:t xml:space="preserve">light. The 2024 comparison of YOLOv8m with other detectors found that YOLOv8m has a </w:t>
-      </w:r>
-      <w:proofErr w:type="spellStart"/>
-      <w:r>
-        <w:rPr>
-          <w:rFonts w:ascii="Arial" w:hAnsi="Arial" w:cs="Arial"/>
-          <w:lang w:val="en-US"/>
-        </w:rPr>
-        <w:t>mAP</w:t>
-      </w:r>
-      <w:proofErr w:type="spellEnd"/>
-      <w:r>
-        <w:rPr>
-          <w:rFonts w:ascii="Arial" w:hAnsi="Arial" w:cs="Arial"/>
-          <w:lang w:val="en-US"/>
-        </w:rPr>
-        <w:t xml:space="preserve"> on </w:t>
-      </w:r>
-      <w:proofErr w:type="spellStart"/>
-      <w:r>
-        <w:rPr>
-          <w:rFonts w:ascii="Arial" w:hAnsi="Arial" w:cs="Arial"/>
-          <w:lang w:val="en-US"/>
-        </w:rPr>
-        <w:t>ExDark</w:t>
-      </w:r>
-      <w:proofErr w:type="spellEnd"/>
-      <w:r>
-        <w:rPr>
-          <w:rFonts w:ascii="Arial" w:hAnsi="Arial" w:cs="Arial"/>
-          <w:lang w:val="en-US"/>
-        </w:rPr>
-        <w:t xml:space="preserve"> of 0.886, which is higher than previous detectors, showing that newer network designs can alleviate the degradation caused by low</w:t>
+        <w:t>light. The 2024 comparison of YOLOv8m with other detectors found that YOLOv8m has a mAP on ExDark of 0.886, which is higher than previous detectors, showing that newer network designs can alleviate the degradation caused by low</w:t>
       </w:r>
       <w:r>
         <w:rPr>
@@ -6229,39 +6120,7 @@
           <w:rFonts w:ascii="Arial" w:hAnsi="Arial" w:cs="Arial"/>
           <w:lang w:val="en-US"/>
         </w:rPr>
-        <w:t xml:space="preserve">frequency features like edges and textures, which deep networks rely on. Initial work on deblurring relied on blind deconvolution but was limited as it can give rise to different sharp images for the same blurred image. Deep networks have enhanced deblurring: </w:t>
-      </w:r>
-      <w:proofErr w:type="spellStart"/>
-      <w:r>
-        <w:rPr>
-          <w:rFonts w:ascii="Arial" w:hAnsi="Arial" w:cs="Arial"/>
-          <w:lang w:val="en-US"/>
-        </w:rPr>
-        <w:t>DeblurGAN</w:t>
-      </w:r>
-      <w:proofErr w:type="spellEnd"/>
-      <w:r>
-        <w:rPr>
-          <w:rFonts w:ascii="Arial" w:hAnsi="Arial" w:cs="Arial"/>
-          <w:lang w:val="en-US"/>
-        </w:rPr>
-        <w:t xml:space="preserve"> trains on blurry images to produce sharp images (</w:t>
-      </w:r>
-      <w:proofErr w:type="spellStart"/>
-      <w:r>
-        <w:rPr>
-          <w:rFonts w:ascii="Arial" w:hAnsi="Arial" w:cs="Arial"/>
-          <w:lang w:val="en-US"/>
-        </w:rPr>
-        <w:t>Kupyn</w:t>
-      </w:r>
-      <w:proofErr w:type="spellEnd"/>
-      <w:r>
-        <w:rPr>
-          <w:rFonts w:ascii="Arial" w:hAnsi="Arial" w:cs="Arial"/>
-          <w:lang w:val="en-US"/>
-        </w:rPr>
-        <w:t xml:space="preserve"> et al. 2018), and multi</w:t>
+        <w:t>frequency features like edges and textures, which deep networks rely on. Initial work on deblurring relied on blind deconvolution but was limited as it can give rise to different sharp images for the same blurred image. Deep networks have enhanced deblurring: DeblurGAN trains on blurry images to produce sharp images (Kupyn et al. 2018), and multi</w:t>
       </w:r>
       <w:r>
         <w:rPr>
@@ -6275,39 +6134,7 @@
           <w:rFonts w:ascii="Arial" w:hAnsi="Arial" w:cs="Arial"/>
           <w:lang w:val="en-US"/>
         </w:rPr>
-        <w:t>scale CNNs can reproduce textures at multiple scales (Nah, Kim &amp; Lee 2017). But deblurring models are slow and potentially introduce artefacts that can mislead detectors. Researchers have reported that object detectors perform worse with increasing blur, with mean average precision (</w:t>
-      </w:r>
-      <w:proofErr w:type="spellStart"/>
-      <w:r>
-        <w:rPr>
-          <w:rFonts w:ascii="Arial" w:hAnsi="Arial" w:cs="Arial"/>
-          <w:lang w:val="en-US"/>
-        </w:rPr>
-        <w:t>mAP</w:t>
-      </w:r>
-      <w:proofErr w:type="spellEnd"/>
-      <w:r>
-        <w:rPr>
-          <w:rFonts w:ascii="Arial" w:hAnsi="Arial" w:cs="Arial"/>
-          <w:lang w:val="en-US"/>
-        </w:rPr>
-        <w:t xml:space="preserve">) dropping as blur increases, but this varies depending on the dataset and model. But, instead of deblurring, this project looks at the robustness of detectors by blurring images with a range of Gaussian kernel sizes and calculating their precision, recall and </w:t>
-      </w:r>
-      <w:proofErr w:type="spellStart"/>
-      <w:r>
-        <w:rPr>
-          <w:rFonts w:ascii="Arial" w:hAnsi="Arial" w:cs="Arial"/>
-          <w:lang w:val="en-US"/>
-        </w:rPr>
-        <w:t>mAP</w:t>
-      </w:r>
-      <w:proofErr w:type="spellEnd"/>
-      <w:r>
-        <w:rPr>
-          <w:rFonts w:ascii="Arial" w:hAnsi="Arial" w:cs="Arial"/>
-          <w:lang w:val="en-US"/>
-        </w:rPr>
-        <w:t>. This method focuses on blur degradation without introducing deblurring artefacts</w:t>
+        <w:t>scale CNNs can reproduce textures at multiple scales (Nah, Kim &amp; Lee 2017). But deblurring models are slow and potentially introduce artefacts that can mislead detectors. Researchers have reported that object detectors perform worse with increasing blur, with mean average precision (mAP) dropping as blur increases, but this varies depending on the dataset and model. But, instead of deblurring, this project looks at the robustness of detectors by blurring images with a range of Gaussian kernel sizes and calculating their precision, recall and mAP. This method focuses on blur degradation without introducing deblurring artefacts</w:t>
       </w:r>
       <w:r>
         <w:rPr>
@@ -6401,23 +6228,7 @@
           <w:rFonts w:ascii="Arial" w:hAnsi="Arial" w:cs="Arial"/>
           <w:lang w:val="en-US"/>
         </w:rPr>
-        <w:t xml:space="preserve">limited adaptive histogram </w:t>
-      </w:r>
-      <w:proofErr w:type="spellStart"/>
-      <w:r>
-        <w:rPr>
-          <w:rFonts w:ascii="Arial" w:hAnsi="Arial" w:cs="Arial"/>
-          <w:lang w:val="en-US"/>
-        </w:rPr>
-        <w:t>equalisation</w:t>
-      </w:r>
-      <w:proofErr w:type="spellEnd"/>
-      <w:r>
-        <w:rPr>
-          <w:rFonts w:ascii="Arial" w:hAnsi="Arial" w:cs="Arial"/>
-          <w:lang w:val="en-US"/>
-        </w:rPr>
-        <w:t xml:space="preserve"> (CLAHE). Gamma correction uses a power</w:t>
+        <w:t>limited adaptive histogram equalisation (CLAHE). Gamma correction uses a power</w:t>
       </w:r>
       <w:r>
         <w:rPr>
@@ -6439,23 +6250,7 @@
           <w:lang w:val="en-US"/>
         </w:rPr>
         <w:lastRenderedPageBreak/>
-        <w:t xml:space="preserve">local regions while preventing the noise from being amplified (Pizer et al. 1987). Both techniques can increase contrast and reveal details in dark regions, but they may also amplify noise or reduce natural </w:t>
-      </w:r>
-      <w:proofErr w:type="spellStart"/>
-      <w:r>
-        <w:rPr>
-          <w:rFonts w:ascii="Arial" w:hAnsi="Arial" w:cs="Arial"/>
-          <w:lang w:val="en-US"/>
-        </w:rPr>
-        <w:t>colour</w:t>
-      </w:r>
-      <w:proofErr w:type="spellEnd"/>
-      <w:r>
-        <w:rPr>
-          <w:rFonts w:ascii="Arial" w:hAnsi="Arial" w:cs="Arial"/>
-          <w:lang w:val="en-US"/>
-        </w:rPr>
-        <w:t xml:space="preserve"> relationships if the parameters are not carefully chosen. Gamma correction and CLAHE are fast and deterministic, making them useful for real</w:t>
+        <w:t>local regions while preventing the noise from being amplified (Pizer et al. 1987). Both techniques can increase contrast and reveal details in dark regions, but they may also amplify noise or reduce natural colour relationships if the parameters are not carefully chosen. Gamma correction and CLAHE are fast and deterministic, making them useful for real</w:t>
       </w:r>
       <w:r>
         <w:rPr>
@@ -6486,23 +6281,7 @@
           <w:rFonts w:ascii="Arial" w:hAnsi="Arial" w:cs="Arial"/>
           <w:lang w:val="en-US"/>
         </w:rPr>
-        <w:t xml:space="preserve">More sophisticated methods rely on deep learning. </w:t>
-      </w:r>
-      <w:proofErr w:type="spellStart"/>
-      <w:r>
-        <w:rPr>
-          <w:rFonts w:ascii="Arial" w:hAnsi="Arial" w:cs="Arial"/>
-          <w:lang w:val="en-US"/>
-        </w:rPr>
-        <w:t>LLNet</w:t>
-      </w:r>
-      <w:proofErr w:type="spellEnd"/>
-      <w:r>
-        <w:rPr>
-          <w:rFonts w:ascii="Arial" w:hAnsi="Arial" w:cs="Arial"/>
-          <w:lang w:val="en-US"/>
-        </w:rPr>
-        <w:t xml:space="preserve"> employs a deep autoencoder to learn mappings from low</w:t>
+        <w:t>More sophisticated methods rely on deep learning. LLNet employs a deep autoencoder to learn mappings from low</w:t>
       </w:r>
       <w:r>
         <w:rPr>
@@ -6516,23 +6295,7 @@
           <w:rFonts w:ascii="Arial" w:hAnsi="Arial" w:cs="Arial"/>
           <w:lang w:val="en-US"/>
         </w:rPr>
-        <w:t xml:space="preserve">light to normal images and simultaneously enhances contrast and suppresses noise (Lore, Akintayo &amp; Sarkar 2017). </w:t>
-      </w:r>
-      <w:proofErr w:type="spellStart"/>
-      <w:r>
-        <w:rPr>
-          <w:rFonts w:ascii="Arial" w:hAnsi="Arial" w:cs="Arial"/>
-          <w:lang w:val="en-US"/>
-        </w:rPr>
-        <w:t>RetinexNet</w:t>
-      </w:r>
-      <w:proofErr w:type="spellEnd"/>
-      <w:r>
-        <w:rPr>
-          <w:rFonts w:ascii="Arial" w:hAnsi="Arial" w:cs="Arial"/>
-          <w:lang w:val="en-US"/>
-        </w:rPr>
-        <w:t xml:space="preserve"> decomposes an image into reflectance and illumination components and trains two subnetworks to predict these two components; then it enhances illumination while keeping the reflectance unchanged (Wei et al. 2018). Zero</w:t>
+        <w:t>light to normal images and simultaneously enhances contrast and suppresses noise (Lore, Akintayo &amp; Sarkar 2017). RetinexNet decomposes an image into reflectance and illumination components and trains two subnetworks to predict these two components; then it enhances illumination while keeping the reflectance unchanged (Wei et al. 2018). Zero</w:t>
       </w:r>
       <w:r>
         <w:rPr>
@@ -6574,39 +6337,7 @@
           <w:rFonts w:ascii="Arial" w:hAnsi="Arial" w:cs="Arial"/>
           <w:lang w:val="en-US"/>
         </w:rPr>
-        <w:t xml:space="preserve">resources. They can also produce artefacts and </w:t>
-      </w:r>
-      <w:proofErr w:type="spellStart"/>
-      <w:r>
-        <w:rPr>
-          <w:rFonts w:ascii="Arial" w:hAnsi="Arial" w:cs="Arial"/>
-          <w:lang w:val="en-US"/>
-        </w:rPr>
-        <w:t>colour</w:t>
-      </w:r>
-      <w:proofErr w:type="spellEnd"/>
-      <w:r>
-        <w:rPr>
-          <w:rFonts w:ascii="Arial" w:hAnsi="Arial" w:cs="Arial"/>
-          <w:lang w:val="en-US"/>
-        </w:rPr>
-        <w:t xml:space="preserve"> distortions that are not natural, impacting detection. The 2024 </w:t>
-      </w:r>
-      <w:proofErr w:type="spellStart"/>
-      <w:r>
-        <w:rPr>
-          <w:rFonts w:ascii="Arial" w:hAnsi="Arial" w:cs="Arial"/>
-          <w:lang w:val="en-US"/>
-        </w:rPr>
-        <w:t>ExDark</w:t>
-      </w:r>
-      <w:proofErr w:type="spellEnd"/>
-      <w:r>
-        <w:rPr>
-          <w:rFonts w:ascii="Arial" w:hAnsi="Arial" w:cs="Arial"/>
-          <w:lang w:val="en-US"/>
-        </w:rPr>
-        <w:t xml:space="preserve"> study found that detection gains in YOLOv8m resulted from improved network design and training, rather than complex pre</w:t>
+        <w:t>resources. They can also produce artefacts and colour distortions that are not natural, impacting detection. The 2024 ExDark study found that detection gains in YOLOv8m resulted from improved network design and training, rather than complex pre</w:t>
       </w:r>
       <w:r>
         <w:rPr>
@@ -6682,103 +6413,7 @@
           <w:rFonts w:ascii="Arial" w:hAnsi="Arial" w:cs="Arial"/>
           <w:lang w:val="en-US"/>
         </w:rPr>
-        <w:t xml:space="preserve">Object detectors are evaluated on both classification and </w:t>
-      </w:r>
-      <w:proofErr w:type="spellStart"/>
-      <w:r>
-        <w:rPr>
-          <w:rFonts w:ascii="Arial" w:hAnsi="Arial" w:cs="Arial"/>
-          <w:lang w:val="en-US"/>
-        </w:rPr>
-        <w:t>localisation</w:t>
-      </w:r>
-      <w:proofErr w:type="spellEnd"/>
-      <w:r>
-        <w:rPr>
-          <w:rFonts w:ascii="Arial" w:hAnsi="Arial" w:cs="Arial"/>
-          <w:lang w:val="en-US"/>
-        </w:rPr>
-        <w:t xml:space="preserve"> performance. The main metric is the mean average precision (</w:t>
-      </w:r>
-      <w:proofErr w:type="spellStart"/>
-      <w:r>
-        <w:rPr>
-          <w:rFonts w:ascii="Arial" w:hAnsi="Arial" w:cs="Arial"/>
-          <w:lang w:val="en-US"/>
-        </w:rPr>
-        <w:t>mAP</w:t>
-      </w:r>
-      <w:proofErr w:type="spellEnd"/>
-      <w:r>
-        <w:rPr>
-          <w:rFonts w:ascii="Arial" w:hAnsi="Arial" w:cs="Arial"/>
-          <w:lang w:val="en-US"/>
-        </w:rPr>
-        <w:t xml:space="preserve">). The precision–recall curve is calculated over confidence levels for each class, from which average precision (AP) is calculated by integration. The </w:t>
-      </w:r>
-      <w:proofErr w:type="spellStart"/>
-      <w:r>
-        <w:rPr>
-          <w:rFonts w:ascii="Arial" w:hAnsi="Arial" w:cs="Arial"/>
-          <w:lang w:val="en-US"/>
-        </w:rPr>
-        <w:t>mAP</w:t>
-      </w:r>
-      <w:proofErr w:type="spellEnd"/>
-      <w:r>
-        <w:rPr>
-          <w:rFonts w:ascii="Arial" w:hAnsi="Arial" w:cs="Arial"/>
-          <w:lang w:val="en-US"/>
-        </w:rPr>
-        <w:t xml:space="preserve"> is the average of AP across all classes. The COCO evaluation uses AP@0.50 for </w:t>
-      </w:r>
-      <w:proofErr w:type="spellStart"/>
-      <w:r>
-        <w:rPr>
-          <w:rFonts w:ascii="Arial" w:hAnsi="Arial" w:cs="Arial"/>
-          <w:lang w:val="en-US"/>
-        </w:rPr>
-        <w:t>IoU</w:t>
-      </w:r>
-      <w:proofErr w:type="spellEnd"/>
-      <w:r>
-        <w:rPr>
-          <w:rFonts w:ascii="Arial" w:hAnsi="Arial" w:cs="Arial"/>
-          <w:lang w:val="en-US"/>
-        </w:rPr>
-        <w:t xml:space="preserve"> threshold 0.50, and AP@0.75 and AP@0.95 for higher </w:t>
-      </w:r>
-      <w:proofErr w:type="spellStart"/>
-      <w:r>
-        <w:rPr>
-          <w:rFonts w:ascii="Arial" w:hAnsi="Arial" w:cs="Arial"/>
-          <w:lang w:val="en-US"/>
-        </w:rPr>
-        <w:t>IoU</w:t>
-      </w:r>
-      <w:proofErr w:type="spellEnd"/>
-      <w:r>
-        <w:rPr>
-          <w:rFonts w:ascii="Arial" w:hAnsi="Arial" w:cs="Arial"/>
-          <w:lang w:val="en-US"/>
-        </w:rPr>
-        <w:t xml:space="preserve"> thresholds (0.75 and 0.95). At AP@0.50, the model needs to detect an object with coarse </w:t>
-      </w:r>
-      <w:proofErr w:type="spellStart"/>
-      <w:r>
-        <w:rPr>
-          <w:rFonts w:ascii="Arial" w:hAnsi="Arial" w:cs="Arial"/>
-          <w:lang w:val="en-US"/>
-        </w:rPr>
-        <w:t>localisation</w:t>
-      </w:r>
-      <w:proofErr w:type="spellEnd"/>
-      <w:r>
-        <w:rPr>
-          <w:rFonts w:ascii="Arial" w:hAnsi="Arial" w:cs="Arial"/>
-          <w:lang w:val="en-US"/>
-        </w:rPr>
-        <w:t>, while for AP@0.75 and above, the model needs to accurately locate the object. Average recall (AR) is the highest recall for varying numbers of detections per image. Other metrics found in research include precision, recall and F1 score. Precision is the proportion of true positives among all positives; recall is the proportion of true positives among all true positives; F1 score is the harmonic mean of precision and recall.</w:t>
+        <w:t>Object detectors are evaluated on both classification and localisation performance. The main metric is the mean average precision (mAP). The precision–recall curve is calculated over confidence levels for each class, from which average precision (AP) is calculated by integration. The mAP is the average of AP across all classes. The COCO evaluation uses AP@0.50 for IoU threshold 0.50, and AP@0.75 and AP@0.95 for higher IoU thresholds (0.75 and 0.95). At AP@0.50, the model needs to detect an object with coarse localisation, while for AP@0.75 and above, the model needs to accurately locate the object. Average recall (AR) is the highest recall for varying numbers of detections per image. Other metrics found in research include precision, recall and F1 score. Precision is the proportion of true positives among all positives; recall is the proportion of true positives among all true positives; F1 score is the harmonic mean of precision and recall.</w:t>
       </w:r>
     </w:p>
     <w:p>
@@ -6796,39 +6431,7 @@
           <w:lang w:val="en-US"/>
         </w:rPr>
         <w:lastRenderedPageBreak/>
-        <w:t xml:space="preserve">Another recent focus is robustness to image corruptions. Hendrycks and Dietterich (2019) tested classifier robustness to various corruptions such as blur, noise and brightness and observed that accuracy may degrade significantly on corrupted images. Michaelis et al. (2019) applied this approach to object detection and showed that detectors can have 10-20% lower </w:t>
-      </w:r>
-      <w:proofErr w:type="spellStart"/>
-      <w:r>
-        <w:rPr>
-          <w:rFonts w:ascii="Arial" w:hAnsi="Arial" w:cs="Arial"/>
-          <w:lang w:val="en-US"/>
-        </w:rPr>
-        <w:t>mAP</w:t>
-      </w:r>
-      <w:proofErr w:type="spellEnd"/>
-      <w:r>
-        <w:rPr>
-          <w:rFonts w:ascii="Arial" w:hAnsi="Arial" w:cs="Arial"/>
-          <w:lang w:val="en-US"/>
-        </w:rPr>
-        <w:t xml:space="preserve"> on common corruptions. These results highlight the importance of evaluating detectors on corrupted images, not just the standard test sets. In this project, performance is measured with COCO </w:t>
-      </w:r>
-      <w:proofErr w:type="spellStart"/>
-      <w:r>
-        <w:rPr>
-          <w:rFonts w:ascii="Arial" w:hAnsi="Arial" w:cs="Arial"/>
-          <w:lang w:val="en-US"/>
-        </w:rPr>
-        <w:t>mAP</w:t>
-      </w:r>
-      <w:proofErr w:type="spellEnd"/>
-      <w:r>
-        <w:rPr>
-          <w:rFonts w:ascii="Arial" w:hAnsi="Arial" w:cs="Arial"/>
-          <w:lang w:val="en-US"/>
-        </w:rPr>
-        <w:t xml:space="preserve"> (AP@0.50:0.95, AP@0.50, AP@0.75) and other metrics, such as precision, recall, F1 score, mean confidence and confidence drop, to better understand both detection accuracy and prediction confidence under normal, low</w:t>
+        <w:t>Another recent focus is robustness to image corruptions. Hendrycks and Dietterich (2019) tested classifier robustness to various corruptions such as blur, noise and brightness and observed that accuracy may degrade significantly on corrupted images. Michaelis et al. (2019) applied this approach to object detection and showed that detectors can have 10-20% lower mAP on common corruptions. These results highlight the importance of evaluating detectors on corrupted images, not just the standard test sets. In this project, performance is measured with COCO mAP (AP@0.50:0.95, AP@0.50, AP@0.75) and other metrics, such as precision, recall, F1 score, mean confidence and confidence drop, to better understand both detection accuracy and prediction confidence under normal, low</w:t>
       </w:r>
       <w:r>
         <w:rPr>
@@ -6984,23 +6587,7 @@
           <w:rFonts w:ascii="Arial" w:hAnsi="Arial" w:cs="Arial"/>
           <w:lang w:val="en-US"/>
         </w:rPr>
-        <w:t xml:space="preserve">tune YOLO variants on </w:t>
-      </w:r>
-      <w:proofErr w:type="spellStart"/>
-      <w:r>
-        <w:rPr>
-          <w:rFonts w:ascii="Arial" w:hAnsi="Arial" w:cs="Arial"/>
-          <w:lang w:val="en-US"/>
-        </w:rPr>
-        <w:t>ExDark</w:t>
-      </w:r>
-      <w:proofErr w:type="spellEnd"/>
-      <w:r>
-        <w:rPr>
-          <w:rFonts w:ascii="Arial" w:hAnsi="Arial" w:cs="Arial"/>
-          <w:lang w:val="en-US"/>
-        </w:rPr>
-        <w:t xml:space="preserve"> images to enhance low</w:t>
+        <w:t>tune YOLO variants on ExDark images to enhance low</w:t>
       </w:r>
       <w:r>
         <w:rPr>
@@ -7129,23 +6716,7 @@
           <w:rFonts w:ascii="Arial" w:hAnsi="Arial" w:cs="Arial"/>
           <w:lang w:val="en-US"/>
         </w:rPr>
-        <w:t xml:space="preserve">light or blurred images with detections, which are not readily available. Second, using advanced image restoration networks would increase the complexity and number of parameters; it would be hard to determine whether improving performance is due to better restoration or model size. Third, the aim is to compare popular models (YOLOv8, SSD </w:t>
-      </w:r>
-      <w:proofErr w:type="spellStart"/>
-      <w:r>
-        <w:rPr>
-          <w:rFonts w:ascii="Arial" w:hAnsi="Arial" w:cs="Arial"/>
-          <w:lang w:val="en-US"/>
-        </w:rPr>
-        <w:t>MobileNet</w:t>
-      </w:r>
-      <w:proofErr w:type="spellEnd"/>
-      <w:r>
-        <w:rPr>
-          <w:rFonts w:ascii="Arial" w:hAnsi="Arial" w:cs="Arial"/>
-          <w:lang w:val="en-US"/>
-        </w:rPr>
-        <w:t xml:space="preserve"> and Faster R</w:t>
+        <w:t>light or blurred images with detections, which are not readily available. Second, using advanced image restoration networks would increase the complexity and number of parameters; it would be hard to determine whether improving performance is due to better restoration or model size. Third, the aim is to compare popular models (YOLOv8, SSD MobileNet and Faster R</w:t>
       </w:r>
       <w:r>
         <w:rPr>
@@ -7308,39 +6879,7 @@
           <w:rFonts w:ascii="Arial" w:hAnsi="Arial" w:cs="Arial"/>
           <w:lang w:val="en-US"/>
         </w:rPr>
-        <w:t xml:space="preserve">light and blur on different detector models, and whether they can be restored by simple image enhancement techniques such as gamma correction or CLAHE. The </w:t>
-      </w:r>
-      <w:proofErr w:type="spellStart"/>
-      <w:r>
-        <w:rPr>
-          <w:rFonts w:ascii="Arial" w:hAnsi="Arial" w:cs="Arial"/>
-          <w:lang w:val="en-US"/>
-        </w:rPr>
-        <w:t>ExDark</w:t>
-      </w:r>
-      <w:proofErr w:type="spellEnd"/>
-      <w:r>
-        <w:rPr>
-          <w:rFonts w:ascii="Arial" w:hAnsi="Arial" w:cs="Arial"/>
-          <w:lang w:val="en-US"/>
-        </w:rPr>
-        <w:t xml:space="preserve"> 2024 study only compared YOLOv8 models. As such, there is still a need to understand how detectors, such as SSD </w:t>
-      </w:r>
-      <w:proofErr w:type="spellStart"/>
-      <w:r>
-        <w:rPr>
-          <w:rFonts w:ascii="Arial" w:hAnsi="Arial" w:cs="Arial"/>
-          <w:lang w:val="en-US"/>
-        </w:rPr>
-        <w:t>MobileNet</w:t>
-      </w:r>
-      <w:proofErr w:type="spellEnd"/>
-      <w:r>
-        <w:rPr>
-          <w:rFonts w:ascii="Arial" w:hAnsi="Arial" w:cs="Arial"/>
-          <w:lang w:val="en-US"/>
-        </w:rPr>
-        <w:t xml:space="preserve"> and Faster R</w:t>
+        <w:t>light and blur on different detector models, and whether they can be restored by simple image enhancement techniques such as gamma correction or CLAHE. The ExDark 2024 study only compared YOLOv8 models. As such, there is still a need to understand how detectors, such as SSD MobileNet and Faster R</w:t>
       </w:r>
       <w:r>
         <w:rPr>
@@ -7385,23 +6924,7 @@
           <w:rFonts w:ascii="Arial" w:hAnsi="Arial" w:cs="Arial"/>
           <w:lang w:val="en-US"/>
         </w:rPr>
-        <w:t xml:space="preserve">light and blur degradations, and enhancements (gamma correction and CLAHE) to assess the performance of YOLOv8, SSD </w:t>
-      </w:r>
-      <w:proofErr w:type="spellStart"/>
-      <w:r>
-        <w:rPr>
-          <w:rFonts w:ascii="Arial" w:hAnsi="Arial" w:cs="Arial"/>
-          <w:lang w:val="en-US"/>
-        </w:rPr>
-        <w:t>MobileNet</w:t>
-      </w:r>
-      <w:proofErr w:type="spellEnd"/>
-      <w:r>
-        <w:rPr>
-          <w:rFonts w:ascii="Arial" w:hAnsi="Arial" w:cs="Arial"/>
-          <w:lang w:val="en-US"/>
-        </w:rPr>
-        <w:t xml:space="preserve"> and Faster R</w:t>
+        <w:t>light and blur degradations, and enhancements (gamma correction and CLAHE) to assess the performance of YOLOv8, SSD MobileNet and Faster R</w:t>
       </w:r>
       <w:r>
         <w:rPr>
@@ -8574,23 +8097,7 @@
           <w:rFonts w:ascii="Arial" w:hAnsi="Arial" w:cs="Arial"/>
           <w:lang w:val="en-US"/>
         </w:rPr>
-        <w:t xml:space="preserve">, R2-synthesise degraded images for each image using low-light (using different simulated low-light conditions) and Gaussian-blurring (using different standard deviations for the Gaussian filter) to simulate challenging conditions, R3-enhance the pre-processed images using simple enhancements (gamma correction and contrast-limited adaptive histogram equalization (CLAHE), R4-detect the objects in the pre-processed images using pre-trained detectors without model training and fine-tuning, R5-compare three detectors (YOLOv8, SSD </w:t>
-      </w:r>
-      <w:proofErr w:type="spellStart"/>
-      <w:r>
-        <w:rPr>
-          <w:rFonts w:ascii="Arial" w:hAnsi="Arial" w:cs="Arial"/>
-          <w:lang w:val="en-US"/>
-        </w:rPr>
-        <w:t>MobileNet</w:t>
-      </w:r>
-      <w:proofErr w:type="spellEnd"/>
-      <w:r>
-        <w:rPr>
-          <w:rFonts w:ascii="Arial" w:hAnsi="Arial" w:cs="Arial"/>
-          <w:lang w:val="en-US"/>
-        </w:rPr>
-        <w:t xml:space="preserve"> and Faster R-CNN) under the same conditions, and R6-evaluate the performance by computing mean average precision, precision, recall and F1-score. The development process mirroring these requirements was to curate the data set, generate synthetic images, enhance them, run pre-trained models, compute metrics and compare results. Using synthetic degradations, we could run experiments with low, medium and high levels of low-light and blur. The results were used to refine the experimental process. This allowed the project to focus on evaluating robustness to degradations, rather than developing and training models.</w:t>
+        <w:t>, R2-synthesise degraded images for each image using low-light (using different simulated low-light conditions) and Gaussian-blurring (using different standard deviations for the Gaussian filter) to simulate challenging conditions, R3-enhance the pre-processed images using simple enhancements (gamma correction and contrast-limited adaptive histogram equalization (CLAHE), R4-detect the objects in the pre-processed images using pre-trained detectors without model training and fine-tuning, R5-compare three detectors (YOLOv8, SSD MobileNet and Faster R-CNN) under the same conditions, and R6-evaluate the performance by computing mean average precision, precision, recall and F1-score. The development process mirroring these requirements was to curate the data set, generate synthetic images, enhance them, run pre-trained models, compute metrics and compare results. Using synthetic degradations, we could run experiments with low, medium and high levels of low-light and blur. The results were used to refine the experimental process. This allowed the project to focus on evaluating robustness to degradations, rather than developing and training models.</w:t>
       </w:r>
     </w:p>
     <w:p>
@@ -8772,23 +8279,7 @@
           <w:rFonts w:ascii="Arial" w:hAnsi="Arial" w:cs="Arial"/>
           <w:lang w:val="en-US"/>
         </w:rPr>
-        <w:t xml:space="preserve">, SSD </w:t>
-      </w:r>
-      <w:proofErr w:type="spellStart"/>
-      <w:r>
-        <w:rPr>
-          <w:rFonts w:ascii="Arial" w:hAnsi="Arial" w:cs="Arial"/>
-          <w:lang w:val="en-US"/>
-        </w:rPr>
-        <w:t>MobileNet</w:t>
-      </w:r>
-      <w:proofErr w:type="spellEnd"/>
-      <w:r>
-        <w:rPr>
-          <w:rFonts w:ascii="Arial" w:hAnsi="Arial" w:cs="Arial"/>
-          <w:lang w:val="en-US"/>
-        </w:rPr>
-        <w:t xml:space="preserve"> (lightweight, fast)</w:t>
+        <w:t>, SSD MobileNet (lightweight, fast)</w:t>
       </w:r>
       <w:r>
         <w:rPr>
@@ -9017,39 +8508,7 @@
           <w:rFonts w:ascii="Arial" w:hAnsi="Arial" w:cs="Arial"/>
           <w:lang w:val="en-US"/>
         </w:rPr>
-        <w:t xml:space="preserve">The system is a web-based object detection performance evaluation system, developed with </w:t>
-      </w:r>
-      <w:proofErr w:type="spellStart"/>
-      <w:r>
-        <w:rPr>
-          <w:rFonts w:ascii="Arial" w:hAnsi="Arial" w:cs="Arial"/>
-          <w:lang w:val="en-US"/>
-        </w:rPr>
-        <w:t>Streamlit</w:t>
-      </w:r>
-      <w:proofErr w:type="spellEnd"/>
-      <w:r>
-        <w:rPr>
-          <w:rFonts w:ascii="Arial" w:hAnsi="Arial" w:cs="Arial"/>
-          <w:lang w:val="en-US"/>
-        </w:rPr>
-        <w:t xml:space="preserve">, which runs fully in the browser. It features three deep learning models (YOLOv8, SSD </w:t>
-      </w:r>
-      <w:proofErr w:type="spellStart"/>
-      <w:r>
-        <w:rPr>
-          <w:rFonts w:ascii="Arial" w:hAnsi="Arial" w:cs="Arial"/>
-          <w:lang w:val="en-US"/>
-        </w:rPr>
-        <w:t>MobileNet</w:t>
-      </w:r>
-      <w:proofErr w:type="spellEnd"/>
-      <w:r>
-        <w:rPr>
-          <w:rFonts w:ascii="Arial" w:hAnsi="Arial" w:cs="Arial"/>
-          <w:lang w:val="en-US"/>
-        </w:rPr>
-        <w:t xml:space="preserve"> and Faster R-CNN) and the ability to run detection on normal, blurred and low-light images. The webapp has four pages: a Detection Demo page for real-time inference, a Degradation Simulator page for degrading and enhancing images, a Model Comparison page to compare different models, and a Results Dashboard with pre-computed metrics. It is completely web-based and does not require installation.</w:t>
+        <w:t>The system is a web-based object detection performance evaluation system, developed with Streamlit, which runs fully in the browser. It features three deep learning models (YOLOv8, SSD MobileNet and Faster R-CNN) and the ability to run detection on normal, blurred and low-light images. The webapp has four pages: a Detection Demo page for real-time inference, a Degradation Simulator page for degrading and enhancing images, a Model Comparison page to compare different models, and a Results Dashboard with pre-computed metrics. It is completely web-based and does not require installation.</w:t>
       </w:r>
     </w:p>
     <w:p>
@@ -9381,21 +8840,7 @@
           <w:rFonts w:ascii="Arial" w:hAnsi="Arial" w:cs="Arial"/>
           <w:lang w:val="en-US"/>
         </w:rPr>
-        <w:t xml:space="preserve">Functional requirements are what the system should do. They specify the features and </w:t>
-      </w:r>
-      <w:r>
-        <w:rPr>
-          <w:rFonts w:ascii="Arial" w:hAnsi="Arial" w:cs="Arial"/>
-          <w:lang w:val="en-US"/>
-        </w:rPr>
-        <w:t>behaviors</w:t>
-      </w:r>
-      <w:r>
-        <w:rPr>
-          <w:rFonts w:ascii="Arial" w:hAnsi="Arial" w:cs="Arial"/>
-          <w:lang w:val="en-US"/>
-        </w:rPr>
-        <w:t xml:space="preserve"> that the user can see or interact with. The following requirements are associated with a particular feature of the application.</w:t>
+        <w:t>Functional requirements are what the system should do. They specify the features and behaviors that the user can see or interact with. The following requirements are associated with a particular feature of the application.</w:t>
       </w:r>
     </w:p>
     <w:tbl>
@@ -9696,23 +9141,7 @@
                 <w:rFonts w:ascii="Arial" w:eastAsia="Times New Roman" w:hAnsi="Arial" w:cs="Arial"/>
                 <w:szCs w:val="24"/>
               </w:rPr>
-              <w:t xml:space="preserve">The system must allow users to run and compare the performance of three object detection models (YOLOv8, SSD </w:t>
-            </w:r>
-            <w:proofErr w:type="spellStart"/>
-            <w:r>
-              <w:rPr>
-                <w:rFonts w:ascii="Arial" w:eastAsia="Times New Roman" w:hAnsi="Arial" w:cs="Arial"/>
-                <w:szCs w:val="24"/>
-              </w:rPr>
-              <w:t>MobileNet</w:t>
-            </w:r>
-            <w:proofErr w:type="spellEnd"/>
-            <w:r>
-              <w:rPr>
-                <w:rFonts w:ascii="Arial" w:eastAsia="Times New Roman" w:hAnsi="Arial" w:cs="Arial"/>
-                <w:szCs w:val="24"/>
-              </w:rPr>
-              <w:t>, and Faster R-CNN) on the uploaded image. This will enable a comparison of the models on the same image.</w:t>
+              <w:t>The system must allow users to run and compare the performance of three object detection models (YOLOv8, SSD MobileNet, and Faster R-CNN) on the uploaded image. This will enable a comparison of the models on the same image.</w:t>
             </w:r>
           </w:p>
         </w:tc>
@@ -9827,49 +9256,7 @@
                 <w:rFonts w:ascii="Arial" w:eastAsia="Times New Roman" w:hAnsi="Arial" w:cs="Arial"/>
                 <w:szCs w:val="24"/>
               </w:rPr>
-              <w:t xml:space="preserve">The system must produce images with three levels of low light: mild </w:t>
-            </w:r>
-            <w:r>
-              <w:rPr>
-                <w:rFonts w:ascii="Arial" w:eastAsia="Times New Roman" w:hAnsi="Arial" w:cs="Arial"/>
-                <w:szCs w:val="24"/>
-              </w:rPr>
-              <w:t>(</w:t>
-            </w:r>
-            <w:r>
-              <w:rPr>
-                <w:rFonts w:ascii="Arial" w:eastAsia="Times New Roman" w:hAnsi="Arial" w:cs="Arial"/>
-                <w:szCs w:val="24"/>
-              </w:rPr>
-              <w:t xml:space="preserve">0.70), medium </w:t>
-            </w:r>
-            <w:r>
-              <w:rPr>
-                <w:rFonts w:ascii="Arial" w:eastAsia="Times New Roman" w:hAnsi="Arial" w:cs="Arial"/>
-                <w:szCs w:val="24"/>
-              </w:rPr>
-              <w:t>(</w:t>
-            </w:r>
-            <w:r>
-              <w:rPr>
-                <w:rFonts w:ascii="Arial" w:eastAsia="Times New Roman" w:hAnsi="Arial" w:cs="Arial"/>
-                <w:szCs w:val="24"/>
-              </w:rPr>
-              <w:t xml:space="preserve">0.50), and severe (0.30). This will help to </w:t>
-            </w:r>
-            <w:r>
-              <w:rPr>
-                <w:rFonts w:ascii="Arial" w:eastAsia="Times New Roman" w:hAnsi="Arial" w:cs="Arial"/>
-                <w:szCs w:val="24"/>
-              </w:rPr>
-              <w:t>stimulate</w:t>
-            </w:r>
-            <w:r>
-              <w:rPr>
-                <w:rFonts w:ascii="Arial" w:eastAsia="Times New Roman" w:hAnsi="Arial" w:cs="Arial"/>
-                <w:szCs w:val="24"/>
-              </w:rPr>
-              <w:t xml:space="preserve"> performance under low-light conditions.</w:t>
+              <w:t>The system must produce images with three levels of low light: mild (0.70), medium (0.50), and severe (0.30). This will help to stimulate performance under low-light conditions.</w:t>
             </w:r>
           </w:p>
         </w:tc>
@@ -10208,37 +9595,7 @@
                 <w:rFonts w:ascii="Arial" w:eastAsia="Times New Roman" w:hAnsi="Arial" w:cs="Arial"/>
                 <w:szCs w:val="24"/>
               </w:rPr>
-              <w:t xml:space="preserve">The system should calculate and show standard performance metrics for detection (Precision, Recall, F1-scores, AP@50 and </w:t>
-            </w:r>
-            <w:proofErr w:type="spellStart"/>
-            <w:r>
-              <w:rPr>
-                <w:rFonts w:ascii="Arial" w:eastAsia="Times New Roman" w:hAnsi="Arial" w:cs="Arial"/>
-                <w:szCs w:val="24"/>
-              </w:rPr>
-              <w:t>mAP</w:t>
-            </w:r>
-            <w:proofErr w:type="spellEnd"/>
-            <w:r>
-              <w:rPr>
-                <w:rFonts w:ascii="Arial" w:eastAsia="Times New Roman" w:hAnsi="Arial" w:cs="Arial"/>
-                <w:szCs w:val="24"/>
-              </w:rPr>
-              <w:t xml:space="preserve">) for all experiment conditions. These measures are needed to </w:t>
-            </w:r>
-            <w:r>
-              <w:rPr>
-                <w:rFonts w:ascii="Arial" w:eastAsia="Times New Roman" w:hAnsi="Arial" w:cs="Arial"/>
-                <w:szCs w:val="24"/>
-              </w:rPr>
-              <w:t>evaluate</w:t>
-            </w:r>
-            <w:r>
-              <w:rPr>
-                <w:rFonts w:ascii="Arial" w:eastAsia="Times New Roman" w:hAnsi="Arial" w:cs="Arial"/>
-                <w:szCs w:val="24"/>
-              </w:rPr>
-              <w:t xml:space="preserve"> and compare model performance.</w:t>
+              <w:t>The system should calculate and show standard performance metrics for detection (Precision, Recall, F1-scores, AP@50 and mAP) for all experiment conditions. These measures are needed to evaluate and compare model performance.</w:t>
             </w:r>
           </w:p>
         </w:tc>
@@ -10673,17 +10030,62 @@
     </w:p>
     <w:p>
       <w:pPr>
-        <w:rPr>
-          <w:lang w:val="en-US"/>
-        </w:rPr>
-      </w:pPr>
-    </w:p>
-    <w:p>
-      <w:pPr>
-        <w:rPr>
-          <w:lang w:val="en-US"/>
-        </w:rPr>
-      </w:pPr>
+        <w:spacing w:line="360" w:lineRule="auto"/>
+        <w:jc w:val="both"/>
+        <w:rPr>
+          <w:rFonts w:ascii="Arial" w:hAnsi="Arial" w:cs="Arial"/>
+          <w:lang w:val="en-US"/>
+        </w:rPr>
+      </w:pPr>
+      <w:r>
+        <w:rPr>
+          <w:rFonts w:ascii="Arial" w:hAnsi="Arial" w:cs="Arial"/>
+          <w:lang w:val="en-US"/>
+        </w:rPr>
+        <w:t xml:space="preserve">Non-functional requirements specify system </w:t>
+      </w:r>
+      <w:r>
+        <w:rPr>
+          <w:rFonts w:ascii="Arial" w:hAnsi="Arial" w:cs="Arial"/>
+          <w:lang w:val="en-US"/>
+        </w:rPr>
+        <w:t>behavior</w:t>
+      </w:r>
+      <w:r>
+        <w:rPr>
+          <w:rFonts w:ascii="Arial" w:hAnsi="Arial" w:cs="Arial"/>
+          <w:lang w:val="en-US"/>
+        </w:rPr>
+        <w:t>. They</w:t>
+      </w:r>
+      <w:r>
+        <w:rPr>
+          <w:rFonts w:ascii="Arial" w:hAnsi="Arial" w:cs="Arial"/>
+          <w:lang w:val="en-US"/>
+        </w:rPr>
+        <w:t xml:space="preserve"> define </w:t>
+      </w:r>
+      <w:r>
+        <w:rPr>
+          <w:rFonts w:ascii="Arial" w:hAnsi="Arial" w:cs="Arial"/>
+          <w:lang w:val="en-US"/>
+        </w:rPr>
+        <w:t>quality</w:t>
+      </w:r>
+      <w:r>
+        <w:rPr>
+          <w:rFonts w:ascii="Arial" w:hAnsi="Arial" w:cs="Arial"/>
+          <w:lang w:val="en-US"/>
+        </w:rPr>
+        <w:t xml:space="preserve"> standards</w:t>
+      </w:r>
+      <w:r>
+        <w:rPr>
+          <w:rFonts w:ascii="Arial" w:hAnsi="Arial" w:cs="Arial"/>
+          <w:lang w:val="en-US"/>
+        </w:rPr>
+        <w:t>, constraints, and other system properties that are not visible to the user but necessary for the system to function properly and effectively.</w:t>
+      </w:r>
     </w:p>
     <w:tbl>
       <w:tblPr>
@@ -10701,8 +10103,8 @@
         <w:tblLook w:val="0600" w:firstRow="0" w:lastRow="0" w:firstColumn="0" w:lastColumn="0" w:noHBand="1" w:noVBand="1"/>
       </w:tblPr>
       <w:tblGrid>
-        <w:gridCol w:w="1710"/>
-        <w:gridCol w:w="5687"/>
+        <w:gridCol w:w="1890"/>
+        <w:gridCol w:w="5507"/>
         <w:gridCol w:w="1513"/>
       </w:tblGrid>
       <w:tr>
@@ -10711,7 +10113,7 @@
         </w:trPr>
         <w:tc>
           <w:tcPr>
-            <w:tcW w:w="1710" w:type="dxa"/>
+            <w:tcW w:w="1890" w:type="dxa"/>
             <w:tcMar>
               <w:top w:w="100" w:type="dxa"/>
               <w:left w:w="100" w:type="dxa"/>
@@ -10744,7 +10146,7 @@
         </w:tc>
         <w:tc>
           <w:tcPr>
-            <w:tcW w:w="5687" w:type="dxa"/>
+            <w:tcW w:w="5507" w:type="dxa"/>
             <w:tcMar>
               <w:top w:w="100" w:type="dxa"/>
               <w:left w:w="100" w:type="dxa"/>
@@ -10815,7 +10217,7 @@
         </w:trPr>
         <w:tc>
           <w:tcPr>
-            <w:tcW w:w="1710" w:type="dxa"/>
+            <w:tcW w:w="1890" w:type="dxa"/>
             <w:tcMar>
               <w:top w:w="100" w:type="dxa"/>
               <w:left w:w="100" w:type="dxa"/>
@@ -10833,11 +10235,18 @@
                 <w:szCs w:val="24"/>
               </w:rPr>
             </w:pPr>
+            <w:r>
+              <w:rPr>
+                <w:rFonts w:ascii="Arial" w:eastAsia="Times New Roman" w:hAnsi="Arial" w:cs="Arial"/>
+                <w:szCs w:val="24"/>
+              </w:rPr>
+              <w:t>Accuracy</w:t>
+            </w:r>
           </w:p>
         </w:tc>
         <w:tc>
           <w:tcPr>
-            <w:tcW w:w="5687" w:type="dxa"/>
+            <w:tcW w:w="5507" w:type="dxa"/>
             <w:tcMar>
               <w:top w:w="100" w:type="dxa"/>
               <w:left w:w="100" w:type="dxa"/>
@@ -10855,6 +10264,13 @@
                 <w:szCs w:val="24"/>
               </w:rPr>
             </w:pPr>
+            <w:r>
+              <w:rPr>
+                <w:rFonts w:ascii="Arial" w:eastAsia="Times New Roman" w:hAnsi="Arial" w:cs="Arial"/>
+                <w:szCs w:val="24"/>
+              </w:rPr>
+              <w:t>The system must evaluate the results using the official pycocotools evaluation module to produce the same results as published COCO benchmark standards. If the metrics are not computed correctly, the results of the experiments will be invalid.</w:t>
+            </w:r>
           </w:p>
         </w:tc>
         <w:tc>
@@ -10878,6 +10294,47 @@
               </w:rPr>
             </w:pPr>
           </w:p>
+          <w:p>
+            <w:pPr>
+              <w:widowControl w:val="0"/>
+              <w:spacing w:after="0" w:line="240" w:lineRule="auto"/>
+              <w:ind w:right="-156"/>
+              <w:rPr>
+                <w:rFonts w:ascii="Arial" w:eastAsia="Times New Roman" w:hAnsi="Arial" w:cs="Arial"/>
+                <w:szCs w:val="24"/>
+              </w:rPr>
+            </w:pPr>
+          </w:p>
+          <w:p>
+            <w:pPr>
+              <w:widowControl w:val="0"/>
+              <w:spacing w:after="0" w:line="240" w:lineRule="auto"/>
+              <w:ind w:right="-156"/>
+              <w:rPr>
+                <w:rFonts w:ascii="Arial" w:eastAsia="Times New Roman" w:hAnsi="Arial" w:cs="Arial"/>
+                <w:szCs w:val="24"/>
+              </w:rPr>
+            </w:pPr>
+          </w:p>
+          <w:p>
+            <w:pPr>
+              <w:widowControl w:val="0"/>
+              <w:spacing w:after="0" w:line="240" w:lineRule="auto"/>
+              <w:ind w:right="-156"/>
+              <w:rPr>
+                <w:rFonts w:ascii="Arial" w:eastAsia="Times New Roman" w:hAnsi="Arial" w:cs="Arial"/>
+                <w:szCs w:val="24"/>
+              </w:rPr>
+            </w:pPr>
+            <w:r>
+              <w:rPr>
+                <w:rFonts w:ascii="Arial" w:eastAsia="Times New Roman" w:hAnsi="Arial" w:cs="Arial"/>
+                <w:szCs w:val="24"/>
+                <w:highlight w:val="red"/>
+              </w:rPr>
+              <w:t>High</w:t>
+            </w:r>
+          </w:p>
         </w:tc>
       </w:tr>
       <w:tr>
@@ -10886,7 +10343,7 @@
         </w:trPr>
         <w:tc>
           <w:tcPr>
-            <w:tcW w:w="1710" w:type="dxa"/>
+            <w:tcW w:w="1890" w:type="dxa"/>
             <w:tcMar>
               <w:top w:w="100" w:type="dxa"/>
               <w:left w:w="100" w:type="dxa"/>
@@ -10904,11 +10361,18 @@
                 <w:szCs w:val="24"/>
               </w:rPr>
             </w:pPr>
+            <w:r>
+              <w:rPr>
+                <w:rFonts w:ascii="Arial" w:eastAsia="Times New Roman" w:hAnsi="Arial" w:cs="Arial"/>
+                <w:szCs w:val="24"/>
+              </w:rPr>
+              <w:t>Usability</w:t>
+            </w:r>
           </w:p>
         </w:tc>
         <w:tc>
           <w:tcPr>
-            <w:tcW w:w="5687" w:type="dxa"/>
+            <w:tcW w:w="5507" w:type="dxa"/>
             <w:tcMar>
               <w:top w:w="100" w:type="dxa"/>
               <w:left w:w="100" w:type="dxa"/>
@@ -10926,6 +10390,20 @@
                 <w:szCs w:val="24"/>
               </w:rPr>
             </w:pPr>
+            <w:r>
+              <w:rPr>
+                <w:rFonts w:ascii="Arial" w:eastAsia="Times New Roman" w:hAnsi="Arial" w:cs="Arial"/>
+                <w:szCs w:val="24"/>
+              </w:rPr>
+              <w:t xml:space="preserve">The system must be user-friendly to allow users to interact with the system during the demonstration. Users must be able to move between the four application pages easily, without any technical </w:t>
+            </w:r>
+            <w:r>
+              <w:rPr>
+                <w:rFonts w:ascii="Arial" w:eastAsia="Times New Roman" w:hAnsi="Arial" w:cs="Arial"/>
+                <w:szCs w:val="24"/>
+              </w:rPr>
+              <w:t>background.</w:t>
+            </w:r>
           </w:p>
         </w:tc>
         <w:tc>
@@ -10949,6 +10427,36 @@
               </w:rPr>
             </w:pPr>
           </w:p>
+          <w:p>
+            <w:pPr>
+              <w:widowControl w:val="0"/>
+              <w:spacing w:after="0" w:line="240" w:lineRule="auto"/>
+              <w:ind w:right="-156"/>
+              <w:rPr>
+                <w:rFonts w:ascii="Arial" w:eastAsia="Times New Roman" w:hAnsi="Arial" w:cs="Arial"/>
+                <w:szCs w:val="24"/>
+              </w:rPr>
+            </w:pPr>
+          </w:p>
+          <w:p>
+            <w:pPr>
+              <w:widowControl w:val="0"/>
+              <w:spacing w:after="0" w:line="240" w:lineRule="auto"/>
+              <w:ind w:right="-156"/>
+              <w:rPr>
+                <w:rFonts w:ascii="Arial" w:eastAsia="Times New Roman" w:hAnsi="Arial" w:cs="Arial"/>
+                <w:szCs w:val="24"/>
+              </w:rPr>
+            </w:pPr>
+            <w:r>
+              <w:rPr>
+                <w:rFonts w:ascii="Arial" w:eastAsia="Times New Roman" w:hAnsi="Arial" w:cs="Arial"/>
+                <w:szCs w:val="24"/>
+                <w:highlight w:val="red"/>
+              </w:rPr>
+              <w:t>High</w:t>
+            </w:r>
+          </w:p>
         </w:tc>
       </w:tr>
       <w:tr>
@@ -10957,7 +10465,7 @@
         </w:trPr>
         <w:tc>
           <w:tcPr>
-            <w:tcW w:w="1710" w:type="dxa"/>
+            <w:tcW w:w="1890" w:type="dxa"/>
             <w:tcMar>
               <w:top w:w="100" w:type="dxa"/>
               <w:left w:w="100" w:type="dxa"/>
@@ -10975,11 +10483,18 @@
                 <w:szCs w:val="24"/>
               </w:rPr>
             </w:pPr>
+            <w:r>
+              <w:rPr>
+                <w:rFonts w:ascii="Arial" w:eastAsia="Times New Roman" w:hAnsi="Arial" w:cs="Arial"/>
+                <w:szCs w:val="24"/>
+              </w:rPr>
+              <w:t>Repeatability</w:t>
+            </w:r>
           </w:p>
         </w:tc>
         <w:tc>
           <w:tcPr>
-            <w:tcW w:w="5687" w:type="dxa"/>
+            <w:tcW w:w="5507" w:type="dxa"/>
             <w:tcMar>
               <w:top w:w="100" w:type="dxa"/>
               <w:left w:w="100" w:type="dxa"/>
@@ -10997,6 +10512,27 @@
                 <w:szCs w:val="24"/>
               </w:rPr>
             </w:pPr>
+            <w:r>
+              <w:rPr>
+                <w:rFonts w:ascii="Arial" w:eastAsia="Times New Roman" w:hAnsi="Arial" w:cs="Arial"/>
+                <w:szCs w:val="24"/>
+              </w:rPr>
+              <w:t xml:space="preserve">The system must always </w:t>
+            </w:r>
+            <w:r>
+              <w:rPr>
+                <w:rFonts w:ascii="Arial" w:eastAsia="Times New Roman" w:hAnsi="Arial" w:cs="Arial"/>
+                <w:szCs w:val="24"/>
+              </w:rPr>
+              <w:t>produce</w:t>
+            </w:r>
+            <w:r>
+              <w:rPr>
+                <w:rFonts w:ascii="Arial" w:eastAsia="Times New Roman" w:hAnsi="Arial" w:cs="Arial"/>
+                <w:szCs w:val="24"/>
+              </w:rPr>
+              <w:t xml:space="preserve"> the same results for any given image, model, confidence threshold, and degradation level. This makes the experiments valid and repeatable.</w:t>
+            </w:r>
           </w:p>
         </w:tc>
         <w:tc>
@@ -11020,6 +10556,36 @@
               </w:rPr>
             </w:pPr>
           </w:p>
+          <w:p>
+            <w:pPr>
+              <w:widowControl w:val="0"/>
+              <w:spacing w:after="0" w:line="240" w:lineRule="auto"/>
+              <w:ind w:right="-156"/>
+              <w:rPr>
+                <w:rFonts w:ascii="Arial" w:eastAsia="Times New Roman" w:hAnsi="Arial" w:cs="Arial"/>
+                <w:szCs w:val="24"/>
+              </w:rPr>
+            </w:pPr>
+          </w:p>
+          <w:p>
+            <w:pPr>
+              <w:widowControl w:val="0"/>
+              <w:spacing w:after="0" w:line="240" w:lineRule="auto"/>
+              <w:ind w:right="-156"/>
+              <w:rPr>
+                <w:rFonts w:ascii="Arial" w:eastAsia="Times New Roman" w:hAnsi="Arial" w:cs="Arial"/>
+                <w:szCs w:val="24"/>
+              </w:rPr>
+            </w:pPr>
+            <w:r>
+              <w:rPr>
+                <w:rFonts w:ascii="Arial" w:eastAsia="Times New Roman" w:hAnsi="Arial" w:cs="Arial"/>
+                <w:szCs w:val="24"/>
+                <w:highlight w:val="red"/>
+              </w:rPr>
+              <w:t>High</w:t>
+            </w:r>
+          </w:p>
         </w:tc>
       </w:tr>
       <w:tr>
@@ -11028,7 +10594,7 @@
         </w:trPr>
         <w:tc>
           <w:tcPr>
-            <w:tcW w:w="1710" w:type="dxa"/>
+            <w:tcW w:w="1890" w:type="dxa"/>
             <w:tcMar>
               <w:top w:w="100" w:type="dxa"/>
               <w:left w:w="100" w:type="dxa"/>
@@ -11046,11 +10612,18 @@
                 <w:szCs w:val="24"/>
               </w:rPr>
             </w:pPr>
+            <w:r>
+              <w:rPr>
+                <w:rFonts w:ascii="Arial" w:eastAsia="Times New Roman" w:hAnsi="Arial" w:cs="Arial"/>
+                <w:szCs w:val="24"/>
+              </w:rPr>
+              <w:t>Performance</w:t>
+            </w:r>
           </w:p>
         </w:tc>
         <w:tc>
           <w:tcPr>
-            <w:tcW w:w="5687" w:type="dxa"/>
+            <w:tcW w:w="5507" w:type="dxa"/>
             <w:tcMar>
               <w:top w:w="100" w:type="dxa"/>
               <w:left w:w="100" w:type="dxa"/>
@@ -11068,6 +10641,27 @@
                 <w:szCs w:val="24"/>
               </w:rPr>
             </w:pPr>
+            <w:r>
+              <w:rPr>
+                <w:rFonts w:ascii="Arial" w:eastAsia="Times New Roman" w:hAnsi="Arial" w:cs="Arial"/>
+                <w:szCs w:val="24"/>
+              </w:rPr>
+              <w:t xml:space="preserve">The system should be able to detect objects in a single image within 60 seconds in a normal CPU environment, not using a GPU for acceleration. This allows the system to run on a typical demonstration </w:t>
+            </w:r>
+            <w:r>
+              <w:rPr>
+                <w:rFonts w:ascii="Arial" w:eastAsia="Times New Roman" w:hAnsi="Arial" w:cs="Arial"/>
+                <w:szCs w:val="24"/>
+              </w:rPr>
+              <w:t>environment</w:t>
+            </w:r>
+            <w:r>
+              <w:rPr>
+                <w:rFonts w:ascii="Arial" w:eastAsia="Times New Roman" w:hAnsi="Arial" w:cs="Arial"/>
+                <w:szCs w:val="24"/>
+              </w:rPr>
+              <w:t>.</w:t>
+            </w:r>
           </w:p>
         </w:tc>
         <w:tc>
@@ -11092,6 +10686,50 @@
               </w:rPr>
             </w:pPr>
           </w:p>
+          <w:p>
+            <w:pPr>
+              <w:widowControl w:val="0"/>
+              <w:spacing w:after="0" w:line="240" w:lineRule="auto"/>
+              <w:ind w:right="-156"/>
+              <w:rPr>
+                <w:rFonts w:ascii="Arial" w:eastAsia="Times New Roman" w:hAnsi="Arial" w:cs="Arial"/>
+                <w:szCs w:val="24"/>
+                <w:highlight w:val="red"/>
+              </w:rPr>
+            </w:pPr>
+          </w:p>
+          <w:p>
+            <w:pPr>
+              <w:widowControl w:val="0"/>
+              <w:spacing w:after="0" w:line="240" w:lineRule="auto"/>
+              <w:ind w:right="-156"/>
+              <w:rPr>
+                <w:rFonts w:ascii="Arial" w:eastAsia="Times New Roman" w:hAnsi="Arial" w:cs="Arial"/>
+                <w:szCs w:val="24"/>
+                <w:highlight w:val="yellow"/>
+              </w:rPr>
+            </w:pPr>
+          </w:p>
+          <w:p>
+            <w:pPr>
+              <w:widowControl w:val="0"/>
+              <w:spacing w:after="0" w:line="240" w:lineRule="auto"/>
+              <w:ind w:right="-156"/>
+              <w:rPr>
+                <w:rFonts w:ascii="Arial" w:eastAsia="Times New Roman" w:hAnsi="Arial" w:cs="Arial"/>
+                <w:szCs w:val="24"/>
+                <w:highlight w:val="red"/>
+              </w:rPr>
+            </w:pPr>
+            <w:r>
+              <w:rPr>
+                <w:rFonts w:ascii="Arial" w:eastAsia="Times New Roman" w:hAnsi="Arial" w:cs="Arial"/>
+                <w:szCs w:val="24"/>
+                <w:highlight w:val="yellow"/>
+              </w:rPr>
+              <w:t>Medium</w:t>
+            </w:r>
+          </w:p>
         </w:tc>
       </w:tr>
       <w:tr>
@@ -11100,7 +10738,7 @@
         </w:trPr>
         <w:tc>
           <w:tcPr>
-            <w:tcW w:w="1710" w:type="dxa"/>
+            <w:tcW w:w="1890" w:type="dxa"/>
             <w:tcMar>
               <w:top w:w="100" w:type="dxa"/>
               <w:left w:w="100" w:type="dxa"/>
@@ -11118,11 +10756,18 @@
                 <w:szCs w:val="24"/>
               </w:rPr>
             </w:pPr>
+            <w:r>
+              <w:rPr>
+                <w:rFonts w:ascii="Arial" w:eastAsia="Times New Roman" w:hAnsi="Arial" w:cs="Arial"/>
+                <w:szCs w:val="24"/>
+              </w:rPr>
+              <w:t>Maintainability</w:t>
+            </w:r>
           </w:p>
         </w:tc>
         <w:tc>
           <w:tcPr>
-            <w:tcW w:w="5687" w:type="dxa"/>
+            <w:tcW w:w="5507" w:type="dxa"/>
             <w:tcMar>
               <w:top w:w="100" w:type="dxa"/>
               <w:left w:w="100" w:type="dxa"/>
@@ -11140,6 +10785,13 @@
                 <w:szCs w:val="24"/>
               </w:rPr>
             </w:pPr>
+            <w:r>
+              <w:rPr>
+                <w:rFonts w:ascii="Arial" w:eastAsia="Times New Roman" w:hAnsi="Arial" w:cs="Arial"/>
+                <w:szCs w:val="24"/>
+              </w:rPr>
+              <w:t>The system should have well organised code and folder structure to enable easy testing, modification and review of the project. The pipeline scripts should be focused on one single task.</w:t>
+            </w:r>
           </w:p>
         </w:tc>
         <w:tc>
@@ -11163,6 +10815,36 @@
               </w:rPr>
             </w:pPr>
           </w:p>
+          <w:p>
+            <w:pPr>
+              <w:widowControl w:val="0"/>
+              <w:spacing w:after="0" w:line="240" w:lineRule="auto"/>
+              <w:ind w:right="-156"/>
+              <w:rPr>
+                <w:rFonts w:ascii="Arial" w:eastAsia="Times New Roman" w:hAnsi="Arial" w:cs="Arial"/>
+                <w:szCs w:val="24"/>
+              </w:rPr>
+            </w:pPr>
+          </w:p>
+          <w:p>
+            <w:pPr>
+              <w:widowControl w:val="0"/>
+              <w:spacing w:after="0" w:line="240" w:lineRule="auto"/>
+              <w:ind w:right="-156"/>
+              <w:rPr>
+                <w:rFonts w:ascii="Arial" w:eastAsia="Times New Roman" w:hAnsi="Arial" w:cs="Arial"/>
+                <w:szCs w:val="24"/>
+              </w:rPr>
+            </w:pPr>
+            <w:r>
+              <w:rPr>
+                <w:rFonts w:ascii="Arial" w:eastAsia="Times New Roman" w:hAnsi="Arial" w:cs="Arial"/>
+                <w:szCs w:val="24"/>
+                <w:highlight w:val="yellow"/>
+              </w:rPr>
+              <w:t>Medium</w:t>
+            </w:r>
+          </w:p>
         </w:tc>
       </w:tr>
       <w:tr>
@@ -11171,7 +10853,7 @@
         </w:trPr>
         <w:tc>
           <w:tcPr>
-            <w:tcW w:w="1710" w:type="dxa"/>
+            <w:tcW w:w="1890" w:type="dxa"/>
             <w:tcMar>
               <w:top w:w="100" w:type="dxa"/>
               <w:left w:w="100" w:type="dxa"/>
@@ -11189,11 +10871,19 @@
                 <w:szCs w:val="24"/>
               </w:rPr>
             </w:pPr>
+            <w:r>
+              <w:rPr>
+                <w:rFonts w:ascii="Arial" w:eastAsia="Times New Roman" w:hAnsi="Arial" w:cs="Arial"/>
+                <w:szCs w:val="24"/>
+              </w:rPr>
+              <w:lastRenderedPageBreak/>
+              <w:t>Portability</w:t>
+            </w:r>
           </w:p>
         </w:tc>
         <w:tc>
           <w:tcPr>
-            <w:tcW w:w="5687" w:type="dxa"/>
+            <w:tcW w:w="5507" w:type="dxa"/>
             <w:tcMar>
               <w:top w:w="100" w:type="dxa"/>
               <w:left w:w="100" w:type="dxa"/>
@@ -11211,6 +10901,13 @@
                 <w:szCs w:val="24"/>
               </w:rPr>
             </w:pPr>
+            <w:r>
+              <w:rPr>
+                <w:rFonts w:ascii="Arial" w:eastAsia="Times New Roman" w:hAnsi="Arial" w:cs="Arial"/>
+                <w:szCs w:val="24"/>
+              </w:rPr>
+              <w:t>This should be a standard development environment, using Python and Streamlit, and not require any special hardware or setup to deploy. This allows the system to be run on any laptop.</w:t>
+            </w:r>
           </w:p>
         </w:tc>
         <w:tc>
@@ -11234,6 +10931,36 @@
               </w:rPr>
             </w:pPr>
           </w:p>
+          <w:p>
+            <w:pPr>
+              <w:widowControl w:val="0"/>
+              <w:spacing w:after="0" w:line="240" w:lineRule="auto"/>
+              <w:ind w:right="-156"/>
+              <w:rPr>
+                <w:rFonts w:ascii="Arial" w:eastAsia="Times New Roman" w:hAnsi="Arial" w:cs="Arial"/>
+                <w:szCs w:val="24"/>
+              </w:rPr>
+            </w:pPr>
+          </w:p>
+          <w:p>
+            <w:pPr>
+              <w:widowControl w:val="0"/>
+              <w:spacing w:after="0" w:line="240" w:lineRule="auto"/>
+              <w:ind w:right="-156"/>
+              <w:rPr>
+                <w:rFonts w:ascii="Arial" w:eastAsia="Times New Roman" w:hAnsi="Arial" w:cs="Arial"/>
+                <w:szCs w:val="24"/>
+              </w:rPr>
+            </w:pPr>
+            <w:r>
+              <w:rPr>
+                <w:rFonts w:ascii="Arial" w:eastAsia="Times New Roman" w:hAnsi="Arial" w:cs="Arial"/>
+                <w:szCs w:val="24"/>
+                <w:highlight w:val="yellow"/>
+              </w:rPr>
+              <w:t>Medium</w:t>
+            </w:r>
+          </w:p>
         </w:tc>
       </w:tr>
       <w:tr>
@@ -11242,7 +10969,7 @@
         </w:trPr>
         <w:tc>
           <w:tcPr>
-            <w:tcW w:w="1710" w:type="dxa"/>
+            <w:tcW w:w="1890" w:type="dxa"/>
             <w:tcMar>
               <w:top w:w="100" w:type="dxa"/>
               <w:left w:w="100" w:type="dxa"/>
@@ -11260,11 +10987,18 @@
                 <w:szCs w:val="24"/>
               </w:rPr>
             </w:pPr>
+            <w:r>
+              <w:rPr>
+                <w:rFonts w:ascii="Arial" w:eastAsia="Times New Roman" w:hAnsi="Arial" w:cs="Arial"/>
+                <w:szCs w:val="24"/>
+              </w:rPr>
+              <w:t>Scability</w:t>
+            </w:r>
           </w:p>
         </w:tc>
         <w:tc>
           <w:tcPr>
-            <w:tcW w:w="5687" w:type="dxa"/>
+            <w:tcW w:w="5507" w:type="dxa"/>
             <w:tcMar>
               <w:top w:w="100" w:type="dxa"/>
               <w:left w:w="100" w:type="dxa"/>
@@ -11282,6 +11016,13 @@
                 <w:szCs w:val="24"/>
               </w:rPr>
             </w:pPr>
+            <w:r>
+              <w:rPr>
+                <w:rFonts w:ascii="Arial" w:eastAsia="Times New Roman" w:hAnsi="Arial" w:cs="Arial"/>
+                <w:szCs w:val="24"/>
+              </w:rPr>
+              <w:t>The system should be designed to allow for a larger data set or more models to be added in the future without significant changes to the experimental pipeline. This is not needed for this project but is a future consideration.</w:t>
+            </w:r>
           </w:p>
         </w:tc>
         <w:tc>
@@ -11306,66 +11047,6 @@
               </w:rPr>
             </w:pPr>
           </w:p>
-        </w:tc>
-      </w:tr>
-      <w:tr>
-        <w:trPr>
-          <w:trHeight w:val="264"/>
-        </w:trPr>
-        <w:tc>
-          <w:tcPr>
-            <w:tcW w:w="1710" w:type="dxa"/>
-            <w:tcMar>
-              <w:top w:w="100" w:type="dxa"/>
-              <w:left w:w="100" w:type="dxa"/>
-              <w:bottom w:w="100" w:type="dxa"/>
-              <w:right w:w="100" w:type="dxa"/>
-            </w:tcMar>
-          </w:tcPr>
-          <w:p>
-            <w:pPr>
-              <w:widowControl w:val="0"/>
-              <w:spacing w:after="0" w:line="360" w:lineRule="auto"/>
-              <w:jc w:val="both"/>
-              <w:rPr>
-                <w:rFonts w:ascii="Arial" w:eastAsia="Times New Roman" w:hAnsi="Arial" w:cs="Arial"/>
-                <w:szCs w:val="24"/>
-              </w:rPr>
-            </w:pPr>
-          </w:p>
-        </w:tc>
-        <w:tc>
-          <w:tcPr>
-            <w:tcW w:w="5687" w:type="dxa"/>
-            <w:tcMar>
-              <w:top w:w="100" w:type="dxa"/>
-              <w:left w:w="100" w:type="dxa"/>
-              <w:bottom w:w="100" w:type="dxa"/>
-              <w:right w:w="100" w:type="dxa"/>
-            </w:tcMar>
-          </w:tcPr>
-          <w:p>
-            <w:pPr>
-              <w:widowControl w:val="0"/>
-              <w:spacing w:after="0" w:line="360" w:lineRule="auto"/>
-              <w:jc w:val="both"/>
-              <w:rPr>
-                <w:rFonts w:ascii="Arial" w:eastAsia="Times New Roman" w:hAnsi="Arial" w:cs="Arial"/>
-                <w:szCs w:val="24"/>
-              </w:rPr>
-            </w:pPr>
-          </w:p>
-        </w:tc>
-        <w:tc>
-          <w:tcPr>
-            <w:tcW w:w="1513" w:type="dxa"/>
-            <w:tcMar>
-              <w:top w:w="100" w:type="dxa"/>
-              <w:left w:w="100" w:type="dxa"/>
-              <w:bottom w:w="100" w:type="dxa"/>
-              <w:right w:w="100" w:type="dxa"/>
-            </w:tcMar>
-          </w:tcPr>
           <w:p>
             <w:pPr>
               <w:widowControl w:val="0"/>
@@ -11374,8 +11055,42 @@
               <w:rPr>
                 <w:rFonts w:ascii="Arial" w:eastAsia="Times New Roman" w:hAnsi="Arial" w:cs="Arial"/>
                 <w:szCs w:val="24"/>
+                <w:highlight w:val="yellow"/>
               </w:rPr>
             </w:pPr>
+          </w:p>
+          <w:p>
+            <w:pPr>
+              <w:widowControl w:val="0"/>
+              <w:spacing w:after="0" w:line="240" w:lineRule="auto"/>
+              <w:ind w:right="-156"/>
+              <w:rPr>
+                <w:rFonts w:ascii="Arial" w:eastAsia="Times New Roman" w:hAnsi="Arial" w:cs="Arial"/>
+                <w:szCs w:val="24"/>
+                <w:highlight w:val="yellow"/>
+              </w:rPr>
+            </w:pPr>
+          </w:p>
+          <w:p>
+            <w:pPr>
+              <w:widowControl w:val="0"/>
+              <w:spacing w:after="0" w:line="240" w:lineRule="auto"/>
+              <w:ind w:right="-156"/>
+              <w:rPr>
+                <w:rFonts w:ascii="Arial" w:eastAsia="Times New Roman" w:hAnsi="Arial" w:cs="Arial"/>
+                <w:color w:val="EE0000"/>
+                <w:szCs w:val="24"/>
+                <w:highlight w:val="yellow"/>
+              </w:rPr>
+            </w:pPr>
+            <w:r>
+              <w:rPr>
+                <w:rFonts w:ascii="Arial" w:eastAsia="Times New Roman" w:hAnsi="Arial" w:cs="Arial"/>
+                <w:szCs w:val="24"/>
+                <w:highlight w:val="green"/>
+              </w:rPr>
+              <w:t>Low</w:t>
+            </w:r>
           </w:p>
         </w:tc>
       </w:tr>
@@ -11389,17 +11104,27 @@
     </w:p>
     <w:p>
       <w:pPr>
-        <w:rPr>
-          <w:lang w:val="en-US"/>
-        </w:rPr>
-      </w:pPr>
-    </w:p>
-    <w:p>
-      <w:pPr>
         <w:spacing w:line="360" w:lineRule="auto"/>
         <w:jc w:val="both"/>
         <w:rPr>
           <w:rFonts w:ascii="Arial" w:hAnsi="Arial" w:cs="Arial"/>
+          <w:lang w:val="en-US"/>
+        </w:rPr>
+      </w:pPr>
+      <w:r>
+        <w:rPr>
+          <w:rFonts w:ascii="Arial" w:hAnsi="Arial" w:cs="Arial"/>
+          <w:lang w:val="en-US"/>
+        </w:rPr>
+        <w:t>The system has eight functional requirements and seven non-functional requirements. All High priority requirements are implemented. All Medium priority requirements are also implemented to provide a fully functioning system. The Low priority requirement for scalability is identified for possible future work outside the project.</w:t>
+      </w:r>
+    </w:p>
+    <w:p>
+      <w:pPr>
+        <w:spacing w:line="360" w:lineRule="auto"/>
+        <w:jc w:val="both"/>
+        <w:rPr>
+          <w:rFonts w:ascii="Arial" w:hAnsi="Arial" w:cs="Arial"/>
           <w:szCs w:val="24"/>
           <w:lang w:val="en-US"/>
         </w:rPr>
@@ -11511,103 +11236,6 @@
     </w:p>
     <w:p>
       <w:pPr>
-        <w:jc w:val="center"/>
-        <w:rPr>
-          <w:lang w:val="en-US"/>
-        </w:rPr>
-      </w:pPr>
-    </w:p>
-    <w:p>
-      <w:pPr>
-        <w:jc w:val="center"/>
-        <w:rPr>
-          <w:lang w:val="en-US"/>
-        </w:rPr>
-      </w:pPr>
-    </w:p>
-    <w:p>
-      <w:pPr>
-        <w:jc w:val="center"/>
-        <w:rPr>
-          <w:lang w:val="en-US"/>
-        </w:rPr>
-      </w:pPr>
-    </w:p>
-    <w:p>
-      <w:pPr>
-        <w:jc w:val="center"/>
-        <w:rPr>
-          <w:lang w:val="en-US"/>
-        </w:rPr>
-      </w:pPr>
-    </w:p>
-    <w:p>
-      <w:pPr>
-        <w:jc w:val="center"/>
-        <w:rPr>
-          <w:lang w:val="en-US"/>
-        </w:rPr>
-      </w:pPr>
-    </w:p>
-    <w:p>
-      <w:pPr>
-        <w:jc w:val="center"/>
-        <w:rPr>
-          <w:lang w:val="en-US"/>
-        </w:rPr>
-      </w:pPr>
-    </w:p>
-    <w:p>
-      <w:pPr>
-        <w:jc w:val="center"/>
-        <w:rPr>
-          <w:lang w:val="en-US"/>
-        </w:rPr>
-      </w:pPr>
-    </w:p>
-    <w:p>
-      <w:pPr>
-        <w:jc w:val="center"/>
-        <w:rPr>
-          <w:lang w:val="en-US"/>
-        </w:rPr>
-      </w:pPr>
-    </w:p>
-    <w:p>
-      <w:pPr>
-        <w:jc w:val="center"/>
-        <w:rPr>
-          <w:lang w:val="en-US"/>
-        </w:rPr>
-      </w:pPr>
-    </w:p>
-    <w:p>
-      <w:pPr>
-        <w:jc w:val="center"/>
-        <w:rPr>
-          <w:lang w:val="en-US"/>
-        </w:rPr>
-      </w:pPr>
-    </w:p>
-    <w:p>
-      <w:pPr>
-        <w:jc w:val="center"/>
-        <w:rPr>
-          <w:lang w:val="en-US"/>
-        </w:rPr>
-      </w:pPr>
-    </w:p>
-    <w:p>
-      <w:pPr>
-        <w:jc w:val="center"/>
-        <w:rPr>
-          <w:lang w:val="en-US"/>
-        </w:rPr>
-      </w:pPr>
-    </w:p>
-    <w:p>
-      <w:pPr>
-        <w:jc w:val="center"/>
         <w:rPr>
           <w:lang w:val="en-US"/>
         </w:rPr>
@@ -11642,6 +11270,7 @@
           <w:szCs w:val="24"/>
           <w:lang w:val="en-US"/>
         </w:rPr>
+        <w:lastRenderedPageBreak/>
         <w:t>Chapter 7</w:t>
       </w:r>
       <w:r>
@@ -11661,215 +11290,581 @@
     </w:p>
     <w:p>
       <w:pPr>
-        <w:jc w:val="center"/>
-        <w:rPr>
-          <w:lang w:val="en-US"/>
-        </w:rPr>
-      </w:pPr>
-    </w:p>
-    <w:p>
-      <w:pPr>
-        <w:jc w:val="center"/>
-        <w:rPr>
-          <w:lang w:val="en-US"/>
-        </w:rPr>
-      </w:pPr>
-    </w:p>
-    <w:p>
-      <w:pPr>
-        <w:jc w:val="center"/>
-        <w:rPr>
-          <w:lang w:val="en-US"/>
-        </w:rPr>
-      </w:pPr>
-    </w:p>
-    <w:p>
-      <w:pPr>
-        <w:jc w:val="center"/>
-        <w:rPr>
-          <w:lang w:val="en-US"/>
-        </w:rPr>
-      </w:pPr>
-    </w:p>
-    <w:p>
-      <w:pPr>
-        <w:jc w:val="center"/>
-        <w:rPr>
-          <w:lang w:val="en-US"/>
-        </w:rPr>
-      </w:pPr>
-    </w:p>
-    <w:p>
-      <w:pPr>
-        <w:jc w:val="center"/>
-        <w:rPr>
-          <w:lang w:val="en-US"/>
-        </w:rPr>
-      </w:pPr>
-    </w:p>
-    <w:p>
-      <w:pPr>
-        <w:jc w:val="center"/>
-        <w:rPr>
-          <w:lang w:val="en-US"/>
-        </w:rPr>
-      </w:pPr>
-    </w:p>
-    <w:p>
-      <w:pPr>
-        <w:jc w:val="center"/>
-        <w:rPr>
-          <w:lang w:val="en-US"/>
-        </w:rPr>
-      </w:pPr>
-    </w:p>
-    <w:p>
-      <w:pPr>
-        <w:jc w:val="center"/>
-        <w:rPr>
-          <w:lang w:val="en-US"/>
-        </w:rPr>
-      </w:pPr>
-    </w:p>
-    <w:p>
-      <w:pPr>
-        <w:jc w:val="center"/>
-        <w:rPr>
-          <w:lang w:val="en-US"/>
-        </w:rPr>
-      </w:pPr>
-    </w:p>
-    <w:p>
-      <w:pPr>
-        <w:jc w:val="center"/>
-        <w:rPr>
-          <w:lang w:val="en-US"/>
-        </w:rPr>
-      </w:pPr>
-    </w:p>
-    <w:p>
-      <w:pPr>
-        <w:jc w:val="center"/>
-        <w:rPr>
-          <w:lang w:val="en-US"/>
-        </w:rPr>
-      </w:pPr>
-    </w:p>
-    <w:p>
-      <w:pPr>
-        <w:jc w:val="center"/>
-        <w:rPr>
-          <w:lang w:val="en-US"/>
-        </w:rPr>
-      </w:pPr>
-    </w:p>
-    <w:p>
-      <w:pPr>
-        <w:jc w:val="center"/>
-        <w:rPr>
-          <w:lang w:val="en-US"/>
-        </w:rPr>
-      </w:pPr>
-    </w:p>
-    <w:p>
-      <w:pPr>
-        <w:jc w:val="center"/>
-        <w:rPr>
-          <w:lang w:val="en-US"/>
-        </w:rPr>
-      </w:pPr>
-    </w:p>
-    <w:p>
-      <w:pPr>
-        <w:jc w:val="center"/>
-        <w:rPr>
-          <w:lang w:val="en-US"/>
-        </w:rPr>
-      </w:pPr>
-    </w:p>
-    <w:p>
-      <w:pPr>
-        <w:jc w:val="center"/>
-        <w:rPr>
-          <w:lang w:val="en-US"/>
-        </w:rPr>
-      </w:pPr>
-    </w:p>
-    <w:p>
-      <w:pPr>
-        <w:jc w:val="center"/>
-        <w:rPr>
-          <w:lang w:val="en-US"/>
-        </w:rPr>
-      </w:pPr>
-    </w:p>
-    <w:p>
-      <w:pPr>
-        <w:jc w:val="center"/>
-        <w:rPr>
-          <w:lang w:val="en-US"/>
-        </w:rPr>
-      </w:pPr>
-    </w:p>
-    <w:p>
-      <w:pPr>
-        <w:jc w:val="center"/>
-        <w:rPr>
-          <w:lang w:val="en-US"/>
-        </w:rPr>
-      </w:pPr>
-    </w:p>
-    <w:p>
-      <w:pPr>
-        <w:jc w:val="center"/>
-        <w:rPr>
-          <w:lang w:val="en-US"/>
-        </w:rPr>
-      </w:pPr>
-    </w:p>
-    <w:p>
-      <w:pPr>
-        <w:jc w:val="center"/>
-        <w:rPr>
-          <w:lang w:val="en-US"/>
-        </w:rPr>
-      </w:pPr>
-    </w:p>
-    <w:p>
-      <w:pPr>
-        <w:jc w:val="center"/>
-        <w:rPr>
-          <w:lang w:val="en-US"/>
-        </w:rPr>
-      </w:pPr>
-    </w:p>
-    <w:p>
-      <w:pPr>
-        <w:jc w:val="center"/>
-        <w:rPr>
-          <w:lang w:val="en-US"/>
-        </w:rPr>
-      </w:pPr>
-    </w:p>
-    <w:p>
-      <w:pPr>
-        <w:jc w:val="center"/>
-        <w:rPr>
-          <w:lang w:val="en-US"/>
-        </w:rPr>
-      </w:pPr>
-    </w:p>
-    <w:p>
-      <w:pPr>
-        <w:jc w:val="center"/>
-        <w:rPr>
-          <w:lang w:val="en-US"/>
-        </w:rPr>
-      </w:pPr>
-    </w:p>
-    <w:p>
-      <w:pPr>
-        <w:jc w:val="center"/>
+        <w:pStyle w:val="Heading2"/>
+        <w:numPr>
+          <w:ilvl w:val="0"/>
+          <w:numId w:val="0"/>
+        </w:numPr>
+        <w:rPr>
+          <w:rFonts w:ascii="Arial" w:hAnsi="Arial" w:cs="Arial"/>
+          <w:b/>
+          <w:bCs/>
+          <w:color w:val="auto"/>
+          <w:sz w:val="24"/>
+          <w:szCs w:val="24"/>
+          <w:lang w:val="en-US"/>
+        </w:rPr>
+      </w:pPr>
+      <w:r>
+        <w:rPr>
+          <w:rFonts w:ascii="Arial" w:hAnsi="Arial" w:cs="Arial"/>
+          <w:b/>
+          <w:bCs/>
+          <w:color w:val="auto"/>
+          <w:sz w:val="24"/>
+          <w:szCs w:val="24"/>
+          <w:lang w:val="en-US"/>
+        </w:rPr>
+        <w:t>7.1</w:t>
+      </w:r>
+      <w:r>
+        <w:rPr>
+          <w:rFonts w:ascii="Arial" w:hAnsi="Arial" w:cs="Arial"/>
+          <w:b/>
+          <w:bCs/>
+          <w:color w:val="auto"/>
+          <w:sz w:val="24"/>
+          <w:szCs w:val="24"/>
+          <w:lang w:val="en-US"/>
+        </w:rPr>
+        <w:tab/>
+      </w:r>
+      <w:r>
+        <w:rPr>
+          <w:rFonts w:ascii="Arial" w:hAnsi="Arial" w:cs="Arial"/>
+          <w:b/>
+          <w:bCs/>
+          <w:color w:val="auto"/>
+          <w:sz w:val="24"/>
+          <w:szCs w:val="24"/>
+          <w:lang w:val="en-US"/>
+        </w:rPr>
+        <w:t>Development Environment</w:t>
+      </w:r>
+    </w:p>
+    <w:p>
+      <w:pPr>
+        <w:pStyle w:val="Heading2"/>
+        <w:numPr>
+          <w:ilvl w:val="0"/>
+          <w:numId w:val="0"/>
+        </w:numPr>
+        <w:rPr>
+          <w:rFonts w:ascii="Arial" w:hAnsi="Arial" w:cs="Arial"/>
+          <w:b/>
+          <w:bCs/>
+          <w:color w:val="auto"/>
+          <w:sz w:val="24"/>
+          <w:szCs w:val="24"/>
+          <w:lang w:val="en-US"/>
+        </w:rPr>
+      </w:pPr>
+      <w:r>
+        <w:rPr>
+          <w:rFonts w:ascii="Arial" w:hAnsi="Arial" w:cs="Arial"/>
+          <w:b/>
+          <w:bCs/>
+          <w:color w:val="auto"/>
+          <w:sz w:val="24"/>
+          <w:szCs w:val="24"/>
+          <w:lang w:val="en-US"/>
+        </w:rPr>
+        <w:t>7.2</w:t>
+      </w:r>
+      <w:r>
+        <w:rPr>
+          <w:rFonts w:ascii="Arial" w:hAnsi="Arial" w:cs="Arial"/>
+          <w:b/>
+          <w:bCs/>
+          <w:color w:val="auto"/>
+          <w:sz w:val="24"/>
+          <w:szCs w:val="24"/>
+          <w:lang w:val="en-US"/>
+        </w:rPr>
+        <w:tab/>
+      </w:r>
+      <w:r>
+        <w:rPr>
+          <w:rFonts w:ascii="Arial" w:hAnsi="Arial" w:cs="Arial"/>
+          <w:b/>
+          <w:bCs/>
+          <w:color w:val="auto"/>
+          <w:sz w:val="24"/>
+          <w:szCs w:val="24"/>
+          <w:lang w:val="en-US"/>
+        </w:rPr>
+        <w:t>Dataset Preparation</w:t>
+      </w:r>
+    </w:p>
+    <w:p>
+      <w:pPr>
+        <w:pStyle w:val="Heading2"/>
+        <w:numPr>
+          <w:ilvl w:val="0"/>
+          <w:numId w:val="0"/>
+        </w:numPr>
+        <w:rPr>
+          <w:rFonts w:ascii="Arial" w:hAnsi="Arial" w:cs="Arial"/>
+          <w:b/>
+          <w:bCs/>
+          <w:color w:val="auto"/>
+          <w:sz w:val="24"/>
+          <w:szCs w:val="24"/>
+          <w:lang w:val="en-US"/>
+        </w:rPr>
+      </w:pPr>
+      <w:r>
+        <w:rPr>
+          <w:rFonts w:ascii="Arial" w:hAnsi="Arial" w:cs="Arial"/>
+          <w:b/>
+          <w:bCs/>
+          <w:color w:val="auto"/>
+          <w:sz w:val="24"/>
+          <w:szCs w:val="24"/>
+          <w:lang w:val="en-US"/>
+        </w:rPr>
+        <w:t>7.3</w:t>
+      </w:r>
+      <w:r>
+        <w:rPr>
+          <w:rFonts w:ascii="Arial" w:hAnsi="Arial" w:cs="Arial"/>
+          <w:b/>
+          <w:bCs/>
+          <w:color w:val="auto"/>
+          <w:sz w:val="24"/>
+          <w:szCs w:val="24"/>
+          <w:lang w:val="en-US"/>
+        </w:rPr>
+        <w:tab/>
+      </w:r>
+      <w:r>
+        <w:rPr>
+          <w:rFonts w:ascii="Arial" w:hAnsi="Arial" w:cs="Arial"/>
+          <w:b/>
+          <w:bCs/>
+          <w:color w:val="auto"/>
+          <w:sz w:val="24"/>
+          <w:szCs w:val="24"/>
+          <w:lang w:val="en-US"/>
+        </w:rPr>
+        <w:t>Image Degradation Pipeline</w:t>
+      </w:r>
+    </w:p>
+    <w:p>
+      <w:pPr>
+        <w:pStyle w:val="Heading2"/>
+        <w:numPr>
+          <w:ilvl w:val="0"/>
+          <w:numId w:val="0"/>
+        </w:numPr>
+        <w:rPr>
+          <w:rFonts w:ascii="Arial" w:hAnsi="Arial" w:cs="Arial"/>
+          <w:b/>
+          <w:bCs/>
+          <w:color w:val="auto"/>
+          <w:sz w:val="24"/>
+          <w:szCs w:val="24"/>
+          <w:lang w:val="en-US"/>
+        </w:rPr>
+      </w:pPr>
+      <w:r>
+        <w:rPr>
+          <w:rFonts w:ascii="Arial" w:hAnsi="Arial" w:cs="Arial"/>
+          <w:b/>
+          <w:bCs/>
+          <w:color w:val="auto"/>
+          <w:sz w:val="24"/>
+          <w:szCs w:val="24"/>
+          <w:lang w:val="en-US"/>
+        </w:rPr>
+        <w:t>7.4</w:t>
+      </w:r>
+      <w:r>
+        <w:rPr>
+          <w:rFonts w:ascii="Arial" w:hAnsi="Arial" w:cs="Arial"/>
+          <w:b/>
+          <w:bCs/>
+          <w:color w:val="auto"/>
+          <w:sz w:val="24"/>
+          <w:szCs w:val="24"/>
+          <w:lang w:val="en-US"/>
+        </w:rPr>
+        <w:tab/>
+      </w:r>
+      <w:r>
+        <w:rPr>
+          <w:rFonts w:ascii="Arial" w:hAnsi="Arial" w:cs="Arial"/>
+          <w:b/>
+          <w:bCs/>
+          <w:color w:val="auto"/>
+          <w:sz w:val="24"/>
+          <w:szCs w:val="24"/>
+          <w:lang w:val="en-US"/>
+        </w:rPr>
+        <w:t>Image Enhancement Pipeline</w:t>
+      </w:r>
+    </w:p>
+    <w:p>
+      <w:pPr>
+        <w:pStyle w:val="Heading2"/>
+        <w:numPr>
+          <w:ilvl w:val="0"/>
+          <w:numId w:val="0"/>
+        </w:numPr>
+        <w:rPr>
+          <w:rFonts w:ascii="Arial" w:hAnsi="Arial" w:cs="Arial"/>
+          <w:b/>
+          <w:bCs/>
+          <w:color w:val="auto"/>
+          <w:sz w:val="24"/>
+          <w:szCs w:val="24"/>
+          <w:lang w:val="en-US"/>
+        </w:rPr>
+      </w:pPr>
+      <w:r>
+        <w:rPr>
+          <w:rFonts w:ascii="Arial" w:hAnsi="Arial" w:cs="Arial"/>
+          <w:b/>
+          <w:bCs/>
+          <w:color w:val="auto"/>
+          <w:sz w:val="24"/>
+          <w:szCs w:val="24"/>
+          <w:lang w:val="en-US"/>
+        </w:rPr>
+        <w:t>7.5</w:t>
+      </w:r>
+      <w:r>
+        <w:rPr>
+          <w:rFonts w:ascii="Arial" w:hAnsi="Arial" w:cs="Arial"/>
+          <w:b/>
+          <w:bCs/>
+          <w:color w:val="auto"/>
+          <w:sz w:val="24"/>
+          <w:szCs w:val="24"/>
+          <w:lang w:val="en-US"/>
+        </w:rPr>
+        <w:tab/>
+      </w:r>
+      <w:r>
+        <w:rPr>
+          <w:rFonts w:ascii="Arial" w:hAnsi="Arial" w:cs="Arial"/>
+          <w:b/>
+          <w:bCs/>
+          <w:color w:val="auto"/>
+          <w:sz w:val="24"/>
+          <w:szCs w:val="24"/>
+          <w:lang w:val="en-US"/>
+        </w:rPr>
+        <w:t>Model Implementation</w:t>
+      </w:r>
+    </w:p>
+    <w:p>
+      <w:pPr>
+        <w:pStyle w:val="Heading2"/>
+        <w:numPr>
+          <w:ilvl w:val="0"/>
+          <w:numId w:val="0"/>
+        </w:numPr>
+        <w:rPr>
+          <w:rFonts w:ascii="Arial" w:hAnsi="Arial" w:cs="Arial"/>
+          <w:b/>
+          <w:bCs/>
+          <w:color w:val="auto"/>
+          <w:sz w:val="24"/>
+          <w:szCs w:val="24"/>
+          <w:lang w:val="en-US"/>
+        </w:rPr>
+      </w:pPr>
+      <w:r>
+        <w:rPr>
+          <w:rFonts w:ascii="Arial" w:hAnsi="Arial" w:cs="Arial"/>
+          <w:b/>
+          <w:bCs/>
+          <w:color w:val="auto"/>
+          <w:sz w:val="24"/>
+          <w:szCs w:val="24"/>
+          <w:lang w:val="en-US"/>
+        </w:rPr>
+        <w:t>7.6</w:t>
+      </w:r>
+      <w:r>
+        <w:rPr>
+          <w:rFonts w:ascii="Arial" w:hAnsi="Arial" w:cs="Arial"/>
+          <w:b/>
+          <w:bCs/>
+          <w:color w:val="auto"/>
+          <w:sz w:val="24"/>
+          <w:szCs w:val="24"/>
+          <w:lang w:val="en-US"/>
+        </w:rPr>
+        <w:tab/>
+      </w:r>
+      <w:r>
+        <w:rPr>
+          <w:rFonts w:ascii="Arial" w:hAnsi="Arial" w:cs="Arial"/>
+          <w:b/>
+          <w:bCs/>
+          <w:color w:val="auto"/>
+          <w:sz w:val="24"/>
+          <w:szCs w:val="24"/>
+          <w:lang w:val="en-US"/>
+        </w:rPr>
+        <w:t>Evaluation Pipeline</w:t>
+      </w:r>
+    </w:p>
+    <w:p>
+      <w:pPr>
+        <w:pStyle w:val="Heading2"/>
+        <w:numPr>
+          <w:ilvl w:val="0"/>
+          <w:numId w:val="0"/>
+        </w:numPr>
+        <w:rPr>
+          <w:rFonts w:ascii="Arial" w:hAnsi="Arial" w:cs="Arial"/>
+          <w:b/>
+          <w:bCs/>
+          <w:color w:val="auto"/>
+          <w:sz w:val="24"/>
+          <w:szCs w:val="24"/>
+          <w:lang w:val="en-US"/>
+        </w:rPr>
+      </w:pPr>
+      <w:r>
+        <w:rPr>
+          <w:rFonts w:ascii="Arial" w:hAnsi="Arial" w:cs="Arial"/>
+          <w:b/>
+          <w:bCs/>
+          <w:color w:val="auto"/>
+          <w:sz w:val="24"/>
+          <w:szCs w:val="24"/>
+          <w:lang w:val="en-US"/>
+        </w:rPr>
+        <w:t>7.7</w:t>
+      </w:r>
+      <w:r>
+        <w:rPr>
+          <w:rFonts w:ascii="Arial" w:hAnsi="Arial" w:cs="Arial"/>
+          <w:b/>
+          <w:bCs/>
+          <w:color w:val="auto"/>
+          <w:sz w:val="24"/>
+          <w:szCs w:val="24"/>
+          <w:lang w:val="en-US"/>
+        </w:rPr>
+        <w:tab/>
+      </w:r>
+      <w:r>
+        <w:rPr>
+          <w:rFonts w:ascii="Arial" w:hAnsi="Arial" w:cs="Arial"/>
+          <w:b/>
+          <w:bCs/>
+          <w:color w:val="auto"/>
+          <w:sz w:val="24"/>
+          <w:szCs w:val="24"/>
+          <w:lang w:val="en-US"/>
+        </w:rPr>
+        <w:t>Streamlit Application</w:t>
+      </w:r>
+    </w:p>
+    <w:p>
+      <w:pPr>
+        <w:pStyle w:val="Heading2"/>
+        <w:numPr>
+          <w:ilvl w:val="0"/>
+          <w:numId w:val="0"/>
+        </w:numPr>
+        <w:rPr>
+          <w:rFonts w:ascii="Arial" w:hAnsi="Arial" w:cs="Arial"/>
+          <w:b/>
+          <w:bCs/>
+          <w:color w:val="auto"/>
+          <w:sz w:val="24"/>
+          <w:szCs w:val="24"/>
+          <w:lang w:val="en-US"/>
+        </w:rPr>
+      </w:pPr>
+      <w:r>
+        <w:rPr>
+          <w:rFonts w:ascii="Arial" w:hAnsi="Arial" w:cs="Arial"/>
+          <w:b/>
+          <w:bCs/>
+          <w:color w:val="auto"/>
+          <w:sz w:val="24"/>
+          <w:szCs w:val="24"/>
+          <w:lang w:val="en-US"/>
+        </w:rPr>
+        <w:t>7.8</w:t>
+      </w:r>
+      <w:r>
+        <w:rPr>
+          <w:rFonts w:ascii="Arial" w:hAnsi="Arial" w:cs="Arial"/>
+          <w:b/>
+          <w:bCs/>
+          <w:color w:val="auto"/>
+          <w:sz w:val="24"/>
+          <w:szCs w:val="24"/>
+          <w:lang w:val="en-US"/>
+        </w:rPr>
+        <w:tab/>
+      </w:r>
+      <w:r>
+        <w:rPr>
+          <w:rFonts w:ascii="Arial" w:hAnsi="Arial" w:cs="Arial"/>
+          <w:b/>
+          <w:bCs/>
+          <w:color w:val="auto"/>
+          <w:sz w:val="24"/>
+          <w:szCs w:val="24"/>
+          <w:lang w:val="en-US"/>
+        </w:rPr>
+        <w:t>Functional Testing</w:t>
+      </w:r>
+    </w:p>
+    <w:p>
+      <w:pPr>
+        <w:rPr>
+          <w:lang w:val="en-US"/>
+        </w:rPr>
+      </w:pPr>
+    </w:p>
+    <w:p>
+      <w:pPr>
+        <w:jc w:val="center"/>
+        <w:rPr>
+          <w:lang w:val="en-US"/>
+        </w:rPr>
+      </w:pPr>
+    </w:p>
+    <w:p>
+      <w:pPr>
+        <w:jc w:val="center"/>
+        <w:rPr>
+          <w:lang w:val="en-US"/>
+        </w:rPr>
+      </w:pPr>
+    </w:p>
+    <w:p>
+      <w:pPr>
+        <w:jc w:val="center"/>
+        <w:rPr>
+          <w:lang w:val="en-US"/>
+        </w:rPr>
+      </w:pPr>
+    </w:p>
+    <w:p>
+      <w:pPr>
+        <w:jc w:val="center"/>
+        <w:rPr>
+          <w:lang w:val="en-US"/>
+        </w:rPr>
+      </w:pPr>
+    </w:p>
+    <w:p>
+      <w:pPr>
+        <w:jc w:val="center"/>
+        <w:rPr>
+          <w:lang w:val="en-US"/>
+        </w:rPr>
+      </w:pPr>
+    </w:p>
+    <w:p>
+      <w:pPr>
+        <w:jc w:val="center"/>
+        <w:rPr>
+          <w:lang w:val="en-US"/>
+        </w:rPr>
+      </w:pPr>
+    </w:p>
+    <w:p>
+      <w:pPr>
+        <w:jc w:val="center"/>
+        <w:rPr>
+          <w:lang w:val="en-US"/>
+        </w:rPr>
+      </w:pPr>
+    </w:p>
+    <w:p>
+      <w:pPr>
+        <w:jc w:val="center"/>
+        <w:rPr>
+          <w:lang w:val="en-US"/>
+        </w:rPr>
+      </w:pPr>
+    </w:p>
+    <w:p>
+      <w:pPr>
+        <w:jc w:val="center"/>
+        <w:rPr>
+          <w:lang w:val="en-US"/>
+        </w:rPr>
+      </w:pPr>
+    </w:p>
+    <w:p>
+      <w:pPr>
+        <w:jc w:val="center"/>
+        <w:rPr>
+          <w:lang w:val="en-US"/>
+        </w:rPr>
+      </w:pPr>
+    </w:p>
+    <w:p>
+      <w:pPr>
+        <w:jc w:val="center"/>
+        <w:rPr>
+          <w:lang w:val="en-US"/>
+        </w:rPr>
+      </w:pPr>
+    </w:p>
+    <w:p>
+      <w:pPr>
+        <w:jc w:val="center"/>
+        <w:rPr>
+          <w:lang w:val="en-US"/>
+        </w:rPr>
+      </w:pPr>
+    </w:p>
+    <w:p>
+      <w:pPr>
+        <w:jc w:val="center"/>
+        <w:rPr>
+          <w:lang w:val="en-US"/>
+        </w:rPr>
+      </w:pPr>
+    </w:p>
+    <w:p>
+      <w:pPr>
+        <w:jc w:val="center"/>
+        <w:rPr>
+          <w:lang w:val="en-US"/>
+        </w:rPr>
+      </w:pPr>
+    </w:p>
+    <w:p>
+      <w:pPr>
+        <w:jc w:val="center"/>
+        <w:rPr>
+          <w:lang w:val="en-US"/>
+        </w:rPr>
+      </w:pPr>
+    </w:p>
+    <w:p>
+      <w:pPr>
+        <w:jc w:val="center"/>
+        <w:rPr>
+          <w:lang w:val="en-US"/>
+        </w:rPr>
+      </w:pPr>
+    </w:p>
+    <w:p>
+      <w:pPr>
+        <w:jc w:val="center"/>
+        <w:rPr>
+          <w:lang w:val="en-US"/>
+        </w:rPr>
+      </w:pPr>
+    </w:p>
+    <w:p>
+      <w:pPr>
         <w:rPr>
           <w:lang w:val="en-US"/>
         </w:rPr>
@@ -11904,6 +11899,7 @@
           <w:szCs w:val="24"/>
           <w:lang w:val="en-US"/>
         </w:rPr>
+        <w:lastRenderedPageBreak/>
         <w:t>Chapter 8</w:t>
       </w:r>
       <w:r>
@@ -11987,151 +11983,127 @@
     </w:p>
     <w:p>
       <w:pPr>
-        <w:jc w:val="center"/>
-        <w:rPr>
-          <w:lang w:val="en-US"/>
-        </w:rPr>
-      </w:pPr>
-    </w:p>
-    <w:p>
-      <w:pPr>
-        <w:jc w:val="center"/>
-        <w:rPr>
-          <w:lang w:val="en-US"/>
-        </w:rPr>
-      </w:pPr>
-    </w:p>
-    <w:p>
-      <w:pPr>
-        <w:jc w:val="center"/>
-        <w:rPr>
-          <w:lang w:val="en-US"/>
-        </w:rPr>
-      </w:pPr>
-    </w:p>
-    <w:p>
-      <w:pPr>
-        <w:jc w:val="center"/>
-        <w:rPr>
-          <w:lang w:val="en-US"/>
-        </w:rPr>
-      </w:pPr>
-    </w:p>
-    <w:p>
-      <w:pPr>
-        <w:jc w:val="center"/>
-        <w:rPr>
-          <w:lang w:val="en-US"/>
-        </w:rPr>
-      </w:pPr>
-    </w:p>
-    <w:p>
-      <w:pPr>
-        <w:jc w:val="center"/>
-        <w:rPr>
-          <w:lang w:val="en-US"/>
-        </w:rPr>
-      </w:pPr>
-    </w:p>
-    <w:p>
-      <w:pPr>
-        <w:jc w:val="center"/>
-        <w:rPr>
-          <w:lang w:val="en-US"/>
-        </w:rPr>
-      </w:pPr>
-    </w:p>
-    <w:p>
-      <w:pPr>
-        <w:jc w:val="center"/>
-        <w:rPr>
-          <w:lang w:val="en-US"/>
-        </w:rPr>
-      </w:pPr>
-    </w:p>
-    <w:p>
-      <w:pPr>
-        <w:jc w:val="center"/>
-        <w:rPr>
-          <w:lang w:val="en-US"/>
-        </w:rPr>
-      </w:pPr>
-    </w:p>
-    <w:p>
-      <w:pPr>
-        <w:jc w:val="center"/>
-        <w:rPr>
-          <w:lang w:val="en-US"/>
-        </w:rPr>
-      </w:pPr>
-    </w:p>
-    <w:p>
-      <w:pPr>
-        <w:jc w:val="center"/>
-        <w:rPr>
-          <w:lang w:val="en-US"/>
-        </w:rPr>
-      </w:pPr>
-    </w:p>
-    <w:p>
-      <w:pPr>
-        <w:jc w:val="center"/>
-        <w:rPr>
-          <w:lang w:val="en-US"/>
-        </w:rPr>
-      </w:pPr>
-    </w:p>
-    <w:p>
-      <w:pPr>
-        <w:jc w:val="center"/>
-        <w:rPr>
-          <w:lang w:val="en-US"/>
-        </w:rPr>
-      </w:pPr>
-    </w:p>
-    <w:p>
-      <w:pPr>
-        <w:jc w:val="center"/>
-        <w:rPr>
-          <w:lang w:val="en-US"/>
-        </w:rPr>
-      </w:pPr>
-    </w:p>
-    <w:p>
-      <w:pPr>
-        <w:jc w:val="center"/>
-        <w:rPr>
-          <w:lang w:val="en-US"/>
-        </w:rPr>
-      </w:pPr>
-    </w:p>
-    <w:p>
-      <w:pPr>
-        <w:jc w:val="center"/>
-        <w:rPr>
-          <w:lang w:val="en-US"/>
-        </w:rPr>
-      </w:pPr>
-    </w:p>
-    <w:p>
-      <w:pPr>
-        <w:jc w:val="center"/>
-        <w:rPr>
-          <w:lang w:val="en-US"/>
-        </w:rPr>
-      </w:pPr>
-    </w:p>
-    <w:p>
-      <w:pPr>
-        <w:jc w:val="center"/>
-        <w:rPr>
-          <w:lang w:val="en-US"/>
-        </w:rPr>
-      </w:pPr>
-    </w:p>
-    <w:p>
-      <w:pPr>
-        <w:jc w:val="center"/>
+        <w:rPr>
+          <w:lang w:val="en-US"/>
+        </w:rPr>
+      </w:pPr>
+    </w:p>
+    <w:p>
+      <w:pPr>
+        <w:jc w:val="center"/>
+        <w:rPr>
+          <w:lang w:val="en-US"/>
+        </w:rPr>
+      </w:pPr>
+    </w:p>
+    <w:p>
+      <w:pPr>
+        <w:jc w:val="center"/>
+        <w:rPr>
+          <w:lang w:val="en-US"/>
+        </w:rPr>
+      </w:pPr>
+    </w:p>
+    <w:p>
+      <w:pPr>
+        <w:rPr>
+          <w:lang w:val="en-US"/>
+        </w:rPr>
+      </w:pPr>
+    </w:p>
+    <w:p>
+      <w:pPr>
+        <w:rPr>
+          <w:lang w:val="en-US"/>
+        </w:rPr>
+      </w:pPr>
+    </w:p>
+    <w:p>
+      <w:pPr>
+        <w:rPr>
+          <w:lang w:val="en-US"/>
+        </w:rPr>
+      </w:pPr>
+    </w:p>
+    <w:p>
+      <w:pPr>
+        <w:rPr>
+          <w:lang w:val="en-US"/>
+        </w:rPr>
+      </w:pPr>
+    </w:p>
+    <w:p>
+      <w:pPr>
+        <w:rPr>
+          <w:lang w:val="en-US"/>
+        </w:rPr>
+      </w:pPr>
+    </w:p>
+    <w:p>
+      <w:pPr>
+        <w:rPr>
+          <w:lang w:val="en-US"/>
+        </w:rPr>
+      </w:pPr>
+    </w:p>
+    <w:p>
+      <w:pPr>
+        <w:rPr>
+          <w:lang w:val="en-US"/>
+        </w:rPr>
+      </w:pPr>
+    </w:p>
+    <w:p>
+      <w:pPr>
+        <w:rPr>
+          <w:lang w:val="en-US"/>
+        </w:rPr>
+      </w:pPr>
+    </w:p>
+    <w:p>
+      <w:pPr>
+        <w:rPr>
+          <w:lang w:val="en-US"/>
+        </w:rPr>
+      </w:pPr>
+    </w:p>
+    <w:p>
+      <w:pPr>
+        <w:rPr>
+          <w:lang w:val="en-US"/>
+        </w:rPr>
+      </w:pPr>
+    </w:p>
+    <w:p>
+      <w:pPr>
+        <w:rPr>
+          <w:lang w:val="en-US"/>
+        </w:rPr>
+      </w:pPr>
+    </w:p>
+    <w:p>
+      <w:pPr>
+        <w:rPr>
+          <w:lang w:val="en-US"/>
+        </w:rPr>
+      </w:pPr>
+    </w:p>
+    <w:p>
+      <w:pPr>
+        <w:rPr>
+          <w:lang w:val="en-US"/>
+        </w:rPr>
+      </w:pPr>
+    </w:p>
+    <w:p>
+      <w:pPr>
+        <w:rPr>
+          <w:lang w:val="en-US"/>
+        </w:rPr>
+      </w:pPr>
+    </w:p>
+    <w:p>
+      <w:pPr>
         <w:rPr>
           <w:lang w:val="en-US"/>
         </w:rPr>
@@ -12166,6 +12138,7 @@
           <w:szCs w:val="24"/>
           <w:lang w:val="en-US"/>
         </w:rPr>
+        <w:lastRenderedPageBreak/>
         <w:t>Chapter 9</w:t>
       </w:r>
       <w:r>
@@ -12257,15 +12230,6 @@
     </w:p>
     <w:p>
       <w:pPr>
-        <w:jc w:val="center"/>
-        <w:rPr>
-          <w:lang w:val="en-US"/>
-        </w:rPr>
-      </w:pPr>
-    </w:p>
-    <w:p>
-      <w:pPr>
-        <w:jc w:val="center"/>
         <w:rPr>
           <w:lang w:val="en-US"/>
         </w:rPr>
@@ -12428,6 +12392,7 @@
           <w:szCs w:val="24"/>
           <w:lang w:val="en-US"/>
         </w:rPr>
+        <w:lastRenderedPageBreak/>
         <w:t>Chapter 10</w:t>
       </w:r>
       <w:r>
@@ -12656,6 +12621,81 @@
     <w:p>
       <w:pPr>
         <w:jc w:val="center"/>
+        <w:rPr>
+          <w:lang w:val="en-US"/>
+        </w:rPr>
+      </w:pPr>
+    </w:p>
+    <w:p>
+      <w:pPr>
+        <w:pStyle w:val="Heading1"/>
+        <w:numPr>
+          <w:ilvl w:val="0"/>
+          <w:numId w:val="0"/>
+        </w:numPr>
+        <w:jc w:val="center"/>
+        <w:rPr>
+          <w:rFonts w:ascii="Arial" w:hAnsi="Arial" w:cs="Arial"/>
+          <w:b/>
+          <w:bCs/>
+          <w:color w:val="auto"/>
+          <w:sz w:val="24"/>
+          <w:szCs w:val="24"/>
+          <w:lang w:val="en-US"/>
+        </w:rPr>
+      </w:pPr>
+      <w:r>
+        <w:rPr>
+          <w:rFonts w:ascii="Arial" w:hAnsi="Arial" w:cs="Arial"/>
+          <w:b/>
+          <w:bCs/>
+          <w:color w:val="auto"/>
+          <w:sz w:val="24"/>
+          <w:szCs w:val="24"/>
+          <w:lang w:val="en-US"/>
+        </w:rPr>
+        <w:lastRenderedPageBreak/>
+        <w:t>Chapter 1</w:t>
+      </w:r>
+      <w:r>
+        <w:rPr>
+          <w:rFonts w:ascii="Arial" w:hAnsi="Arial" w:cs="Arial"/>
+          <w:b/>
+          <w:bCs/>
+          <w:color w:val="auto"/>
+          <w:sz w:val="24"/>
+          <w:szCs w:val="24"/>
+          <w:lang w:val="en-US"/>
+        </w:rPr>
+        <w:t>1</w:t>
+      </w:r>
+      <w:r>
+        <w:rPr>
+          <w:rFonts w:ascii="Arial" w:hAnsi="Arial" w:cs="Arial"/>
+          <w:b/>
+          <w:bCs/>
+          <w:color w:val="auto"/>
+          <w:sz w:val="24"/>
+          <w:szCs w:val="24"/>
+          <w:lang w:val="en-US"/>
+        </w:rPr>
+        <w:tab/>
+      </w:r>
+      <w:r>
+        <w:rPr>
+          <w:rFonts w:ascii="Arial" w:hAnsi="Arial" w:cs="Arial"/>
+          <w:b/>
+          <w:bCs/>
+          <w:color w:val="auto"/>
+          <w:sz w:val="24"/>
+          <w:szCs w:val="24"/>
+          <w:lang w:val="en-US"/>
+        </w:rPr>
+        <w:t>References</w:t>
+      </w:r>
+    </w:p>
+    <w:p>
+      <w:pPr>
         <w:rPr>
           <w:lang w:val="en-US"/>
         </w:rPr>

</xml_diff>

<commit_message>
done sub chapter model implementation
</commit_message>
<xml_diff>
--- a/Final Report.docx
+++ b/Final Report.docx
@@ -195,7 +195,7 @@
           <w:color w:val="000000" w:themeColor="text1"/>
         </w:rPr>
       </w:pPr>
-      <w:bookmarkStart w:id="0" w:name="_Toc228478041"/>
+      <w:bookmarkStart w:id="0" w:name="_Toc228539640"/>
       <w:r>
         <w:rPr>
           <w:rFonts w:ascii="Arial" w:hAnsi="Arial" w:cs="Arial"/>
@@ -399,7 +399,7 @@
           <w:color w:val="000000" w:themeColor="text1"/>
         </w:rPr>
       </w:pPr>
-      <w:bookmarkStart w:id="1" w:name="_Toc228478042"/>
+      <w:bookmarkStart w:id="1" w:name="_Toc228539641"/>
       <w:r>
         <w:rPr>
           <w:rFonts w:ascii="Arial" w:hAnsi="Arial" w:cs="Arial"/>
@@ -588,7 +588,7 @@
           <w:color w:val="000000" w:themeColor="text1"/>
         </w:rPr>
       </w:pPr>
-      <w:bookmarkStart w:id="2" w:name="_Toc228478043"/>
+      <w:bookmarkStart w:id="2" w:name="_Toc228539642"/>
       <w:r>
         <w:rPr>
           <w:rFonts w:ascii="Arial" w:hAnsi="Arial" w:cs="Arial"/>
@@ -838,7 +838,7 @@
           <w:lang w:val="en-US"/>
         </w:rPr>
       </w:pPr>
-      <w:bookmarkStart w:id="3" w:name="_Toc228478044"/>
+      <w:bookmarkStart w:id="3" w:name="_Toc228539643"/>
       <w:r>
         <w:rPr>
           <w:rFonts w:ascii="Arial" w:hAnsi="Arial" w:cs="Arial"/>
@@ -1204,7 +1204,7 @@
           <w:r>
             <w:fldChar w:fldCharType="separate"/>
           </w:r>
-          <w:hyperlink w:anchor="_Toc228478041" w:history="1">
+          <w:hyperlink w:anchor="_Toc228539640" w:history="1">
             <w:r>
               <w:rPr>
                 <w:rStyle w:val="Hyperlink"/>
@@ -1232,7 +1232,7 @@
                 <w:noProof/>
                 <w:webHidden/>
               </w:rPr>
-              <w:instrText xml:space="preserve"> PAGEREF _Toc228478041 \h </w:instrText>
+              <w:instrText xml:space="preserve"> PAGEREF _Toc228539640 \h </w:instrText>
             </w:r>
             <w:r>
               <w:rPr>
@@ -1279,7 +1279,7 @@
               <w14:ligatures w14:val="standardContextual"/>
             </w:rPr>
           </w:pPr>
-          <w:hyperlink w:anchor="_Toc228478042" w:history="1">
+          <w:hyperlink w:anchor="_Toc228539641" w:history="1">
             <w:r>
               <w:rPr>
                 <w:rStyle w:val="Hyperlink"/>
@@ -1307,7 +1307,7 @@
                 <w:noProof/>
                 <w:webHidden/>
               </w:rPr>
-              <w:instrText xml:space="preserve"> PAGEREF _Toc228478042 \h </w:instrText>
+              <w:instrText xml:space="preserve"> PAGEREF _Toc228539641 \h </w:instrText>
             </w:r>
             <w:r>
               <w:rPr>
@@ -1354,7 +1354,7 @@
               <w14:ligatures w14:val="standardContextual"/>
             </w:rPr>
           </w:pPr>
-          <w:hyperlink w:anchor="_Toc228478043" w:history="1">
+          <w:hyperlink w:anchor="_Toc228539642" w:history="1">
             <w:r>
               <w:rPr>
                 <w:rStyle w:val="Hyperlink"/>
@@ -1382,7 +1382,7 @@
                 <w:noProof/>
                 <w:webHidden/>
               </w:rPr>
-              <w:instrText xml:space="preserve"> PAGEREF _Toc228478043 \h </w:instrText>
+              <w:instrText xml:space="preserve"> PAGEREF _Toc228539642 \h </w:instrText>
             </w:r>
             <w:r>
               <w:rPr>
@@ -1429,7 +1429,7 @@
               <w14:ligatures w14:val="standardContextual"/>
             </w:rPr>
           </w:pPr>
-          <w:hyperlink w:anchor="_Toc228478044" w:history="1">
+          <w:hyperlink w:anchor="_Toc228539643" w:history="1">
             <w:r>
               <w:rPr>
                 <w:rStyle w:val="Hyperlink"/>
@@ -1457,7 +1457,7 @@
                 <w:noProof/>
                 <w:webHidden/>
               </w:rPr>
-              <w:instrText xml:space="preserve"> PAGEREF _Toc228478044 \h </w:instrText>
+              <w:instrText xml:space="preserve"> PAGEREF _Toc228539643 \h </w:instrText>
             </w:r>
             <w:r>
               <w:rPr>
@@ -1504,7 +1504,7 @@
               <w14:ligatures w14:val="standardContextual"/>
             </w:rPr>
           </w:pPr>
-          <w:hyperlink w:anchor="_Toc228478045" w:history="1">
+          <w:hyperlink w:anchor="_Toc228539644" w:history="1">
             <w:r>
               <w:rPr>
                 <w:rStyle w:val="Hyperlink"/>
@@ -1532,7 +1532,7 @@
                 <w:noProof/>
                 <w:webHidden/>
               </w:rPr>
-              <w:instrText xml:space="preserve"> PAGEREF _Toc228478045 \h </w:instrText>
+              <w:instrText xml:space="preserve"> PAGEREF _Toc228539644 \h </w:instrText>
             </w:r>
             <w:r>
               <w:rPr>
@@ -1579,7 +1579,7 @@
               <w14:ligatures w14:val="standardContextual"/>
             </w:rPr>
           </w:pPr>
-          <w:hyperlink w:anchor="_Toc228478046" w:history="1">
+          <w:hyperlink w:anchor="_Toc228539645" w:history="1">
             <w:r>
               <w:rPr>
                 <w:rStyle w:val="Hyperlink"/>
@@ -1607,7 +1607,7 @@
                 <w:noProof/>
                 <w:webHidden/>
               </w:rPr>
-              <w:instrText xml:space="preserve"> PAGEREF _Toc228478046 \h </w:instrText>
+              <w:instrText xml:space="preserve"> PAGEREF _Toc228539645 \h </w:instrText>
             </w:r>
             <w:r>
               <w:rPr>
@@ -1654,7 +1654,7 @@
               <w14:ligatures w14:val="standardContextual"/>
             </w:rPr>
           </w:pPr>
-          <w:hyperlink w:anchor="_Toc228478047" w:history="1">
+          <w:hyperlink w:anchor="_Toc228539646" w:history="1">
             <w:r>
               <w:rPr>
                 <w:rStyle w:val="Hyperlink"/>
@@ -1682,7 +1682,7 @@
                 <w:noProof/>
                 <w:webHidden/>
               </w:rPr>
-              <w:instrText xml:space="preserve"> PAGEREF _Toc228478047 \h </w:instrText>
+              <w:instrText xml:space="preserve"> PAGEREF _Toc228539646 \h </w:instrText>
             </w:r>
             <w:r>
               <w:rPr>
@@ -1729,7 +1729,7 @@
               <w14:ligatures w14:val="standardContextual"/>
             </w:rPr>
           </w:pPr>
-          <w:hyperlink w:anchor="_Toc228478048" w:history="1">
+          <w:hyperlink w:anchor="_Toc228539647" w:history="1">
             <w:r>
               <w:rPr>
                 <w:rStyle w:val="Hyperlink"/>
@@ -1757,7 +1757,7 @@
                 <w:noProof/>
                 <w:webHidden/>
               </w:rPr>
-              <w:instrText xml:space="preserve"> PAGEREF _Toc228478048 \h </w:instrText>
+              <w:instrText xml:space="preserve"> PAGEREF _Toc228539647 \h </w:instrText>
             </w:r>
             <w:r>
               <w:rPr>
@@ -1804,7 +1804,7 @@
               <w14:ligatures w14:val="standardContextual"/>
             </w:rPr>
           </w:pPr>
-          <w:hyperlink w:anchor="_Toc228478049" w:history="1">
+          <w:hyperlink w:anchor="_Toc228539648" w:history="1">
             <w:r>
               <w:rPr>
                 <w:rStyle w:val="Hyperlink"/>
@@ -1832,7 +1832,7 @@
                 <w:noProof/>
                 <w:webHidden/>
               </w:rPr>
-              <w:instrText xml:space="preserve"> PAGEREF _Toc228478049 \h </w:instrText>
+              <w:instrText xml:space="preserve"> PAGEREF _Toc228539648 \h </w:instrText>
             </w:r>
             <w:r>
               <w:rPr>
@@ -1880,7 +1880,7 @@
               <w14:ligatures w14:val="standardContextual"/>
             </w:rPr>
           </w:pPr>
-          <w:hyperlink w:anchor="_Toc228478050" w:history="1">
+          <w:hyperlink w:anchor="_Toc228539649" w:history="1">
             <w:r>
               <w:rPr>
                 <w:rStyle w:val="Hyperlink"/>
@@ -1932,7 +1932,7 @@
                 <w:noProof/>
                 <w:webHidden/>
               </w:rPr>
-              <w:instrText xml:space="preserve"> PAGEREF _Toc228478050 \h </w:instrText>
+              <w:instrText xml:space="preserve"> PAGEREF _Toc228539649 \h </w:instrText>
             </w:r>
             <w:r>
               <w:rPr>
@@ -1980,7 +1980,7 @@
               <w14:ligatures w14:val="standardContextual"/>
             </w:rPr>
           </w:pPr>
-          <w:hyperlink w:anchor="_Toc228478051" w:history="1">
+          <w:hyperlink w:anchor="_Toc228539650" w:history="1">
             <w:r>
               <w:rPr>
                 <w:rStyle w:val="Hyperlink"/>
@@ -2032,7 +2032,7 @@
                 <w:noProof/>
                 <w:webHidden/>
               </w:rPr>
-              <w:instrText xml:space="preserve"> PAGEREF _Toc228478051 \h </w:instrText>
+              <w:instrText xml:space="preserve"> PAGEREF _Toc228539650 \h </w:instrText>
             </w:r>
             <w:r>
               <w:rPr>
@@ -2080,7 +2080,7 @@
               <w14:ligatures w14:val="standardContextual"/>
             </w:rPr>
           </w:pPr>
-          <w:hyperlink w:anchor="_Toc228478052" w:history="1">
+          <w:hyperlink w:anchor="_Toc228539651" w:history="1">
             <w:r>
               <w:rPr>
                 <w:rStyle w:val="Hyperlink"/>
@@ -2132,7 +2132,7 @@
                 <w:noProof/>
                 <w:webHidden/>
               </w:rPr>
-              <w:instrText xml:space="preserve"> PAGEREF _Toc228478052 \h </w:instrText>
+              <w:instrText xml:space="preserve"> PAGEREF _Toc228539651 \h </w:instrText>
             </w:r>
             <w:r>
               <w:rPr>
@@ -2180,7 +2180,7 @@
               <w14:ligatures w14:val="standardContextual"/>
             </w:rPr>
           </w:pPr>
-          <w:hyperlink w:anchor="_Toc228478053" w:history="1">
+          <w:hyperlink w:anchor="_Toc228539652" w:history="1">
             <w:r>
               <w:rPr>
                 <w:rStyle w:val="Hyperlink"/>
@@ -2232,7 +2232,7 @@
                 <w:noProof/>
                 <w:webHidden/>
               </w:rPr>
-              <w:instrText xml:space="preserve"> PAGEREF _Toc228478053 \h </w:instrText>
+              <w:instrText xml:space="preserve"> PAGEREF _Toc228539652 \h </w:instrText>
             </w:r>
             <w:r>
               <w:rPr>
@@ -2280,7 +2280,7 @@
               <w14:ligatures w14:val="standardContextual"/>
             </w:rPr>
           </w:pPr>
-          <w:hyperlink w:anchor="_Toc228478054" w:history="1">
+          <w:hyperlink w:anchor="_Toc228539653" w:history="1">
             <w:r>
               <w:rPr>
                 <w:rStyle w:val="Hyperlink"/>
@@ -2332,7 +2332,7 @@
                 <w:noProof/>
                 <w:webHidden/>
               </w:rPr>
-              <w:instrText xml:space="preserve"> PAGEREF _Toc228478054 \h </w:instrText>
+              <w:instrText xml:space="preserve"> PAGEREF _Toc228539653 \h </w:instrText>
             </w:r>
             <w:r>
               <w:rPr>
@@ -2352,7 +2352,7 @@
                 <w:noProof/>
                 <w:webHidden/>
               </w:rPr>
-              <w:t>13</w:t>
+              <w:t>14</w:t>
             </w:r>
             <w:r>
               <w:rPr>
@@ -2380,7 +2380,7 @@
               <w14:ligatures w14:val="standardContextual"/>
             </w:rPr>
           </w:pPr>
-          <w:hyperlink w:anchor="_Toc228478055" w:history="1">
+          <w:hyperlink w:anchor="_Toc228539654" w:history="1">
             <w:r>
               <w:rPr>
                 <w:rStyle w:val="Hyperlink"/>
@@ -2432,7 +2432,7 @@
                 <w:noProof/>
                 <w:webHidden/>
               </w:rPr>
-              <w:instrText xml:space="preserve"> PAGEREF _Toc228478055 \h </w:instrText>
+              <w:instrText xml:space="preserve"> PAGEREF _Toc228539654 \h </w:instrText>
             </w:r>
             <w:r>
               <w:rPr>
@@ -2480,7 +2480,7 @@
               <w14:ligatures w14:val="standardContextual"/>
             </w:rPr>
           </w:pPr>
-          <w:hyperlink w:anchor="_Toc228478056" w:history="1">
+          <w:hyperlink w:anchor="_Toc228539655" w:history="1">
             <w:r>
               <w:rPr>
                 <w:rStyle w:val="Hyperlink"/>
@@ -2532,7 +2532,7 @@
                 <w:noProof/>
                 <w:webHidden/>
               </w:rPr>
-              <w:instrText xml:space="preserve"> PAGEREF _Toc228478056 \h </w:instrText>
+              <w:instrText xml:space="preserve"> PAGEREF _Toc228539655 \h </w:instrText>
             </w:r>
             <w:r>
               <w:rPr>
@@ -2580,7 +2580,7 @@
               <w14:ligatures w14:val="standardContextual"/>
             </w:rPr>
           </w:pPr>
-          <w:hyperlink w:anchor="_Toc228478057" w:history="1">
+          <w:hyperlink w:anchor="_Toc228539656" w:history="1">
             <w:r>
               <w:rPr>
                 <w:rStyle w:val="Hyperlink"/>
@@ -2632,7 +2632,7 @@
                 <w:noProof/>
                 <w:webHidden/>
               </w:rPr>
-              <w:instrText xml:space="preserve"> PAGEREF _Toc228478057 \h </w:instrText>
+              <w:instrText xml:space="preserve"> PAGEREF _Toc228539656 \h </w:instrText>
             </w:r>
             <w:r>
               <w:rPr>
@@ -2680,7 +2680,7 @@
               <w14:ligatures w14:val="standardContextual"/>
             </w:rPr>
           </w:pPr>
-          <w:hyperlink w:anchor="_Toc228478058" w:history="1">
+          <w:hyperlink w:anchor="_Toc228539657" w:history="1">
             <w:r>
               <w:rPr>
                 <w:rStyle w:val="Hyperlink"/>
@@ -2732,7 +2732,7 @@
                 <w:noProof/>
                 <w:webHidden/>
               </w:rPr>
-              <w:instrText xml:space="preserve"> PAGEREF _Toc228478058 \h </w:instrText>
+              <w:instrText xml:space="preserve"> PAGEREF _Toc228539657 \h </w:instrText>
             </w:r>
             <w:r>
               <w:rPr>
@@ -2780,7 +2780,7 @@
               <w14:ligatures w14:val="standardContextual"/>
             </w:rPr>
           </w:pPr>
-          <w:hyperlink w:anchor="_Toc228478059" w:history="1">
+          <w:hyperlink w:anchor="_Toc228539658" w:history="1">
             <w:r>
               <w:rPr>
                 <w:rStyle w:val="Hyperlink"/>
@@ -2832,7 +2832,7 @@
                 <w:noProof/>
                 <w:webHidden/>
               </w:rPr>
-              <w:instrText xml:space="preserve"> PAGEREF _Toc228478059 \h </w:instrText>
+              <w:instrText xml:space="preserve"> PAGEREF _Toc228539658 \h </w:instrText>
             </w:r>
             <w:r>
               <w:rPr>
@@ -2880,7 +2880,7 @@
               <w14:ligatures w14:val="standardContextual"/>
             </w:rPr>
           </w:pPr>
-          <w:hyperlink w:anchor="_Toc228478060" w:history="1">
+          <w:hyperlink w:anchor="_Toc228539659" w:history="1">
             <w:r>
               <w:rPr>
                 <w:rStyle w:val="Hyperlink"/>
@@ -2932,7 +2932,7 @@
                 <w:noProof/>
                 <w:webHidden/>
               </w:rPr>
-              <w:instrText xml:space="preserve"> PAGEREF _Toc228478060 \h </w:instrText>
+              <w:instrText xml:space="preserve"> PAGEREF _Toc228539659 \h </w:instrText>
             </w:r>
             <w:r>
               <w:rPr>
@@ -2980,7 +2980,7 @@
               <w14:ligatures w14:val="standardContextual"/>
             </w:rPr>
           </w:pPr>
-          <w:hyperlink w:anchor="_Toc228478061" w:history="1">
+          <w:hyperlink w:anchor="_Toc228539660" w:history="1">
             <w:r>
               <w:rPr>
                 <w:rStyle w:val="Hyperlink"/>
@@ -3032,7 +3032,7 @@
                 <w:noProof/>
                 <w:webHidden/>
               </w:rPr>
-              <w:instrText xml:space="preserve"> PAGEREF _Toc228478061 \h </w:instrText>
+              <w:instrText xml:space="preserve"> PAGEREF _Toc228539660 \h </w:instrText>
             </w:r>
             <w:r>
               <w:rPr>
@@ -3080,7 +3080,7 @@
               <w14:ligatures w14:val="standardContextual"/>
             </w:rPr>
           </w:pPr>
-          <w:hyperlink w:anchor="_Toc228478062" w:history="1">
+          <w:hyperlink w:anchor="_Toc228539661" w:history="1">
             <w:r>
               <w:rPr>
                 <w:rStyle w:val="Hyperlink"/>
@@ -3132,7 +3132,7 @@
                 <w:noProof/>
                 <w:webHidden/>
               </w:rPr>
-              <w:instrText xml:space="preserve"> PAGEREF _Toc228478062 \h </w:instrText>
+              <w:instrText xml:space="preserve"> PAGEREF _Toc228539661 \h </w:instrText>
             </w:r>
             <w:r>
               <w:rPr>
@@ -3180,7 +3180,7 @@
               <w14:ligatures w14:val="standardContextual"/>
             </w:rPr>
           </w:pPr>
-          <w:hyperlink w:anchor="_Toc228478063" w:history="1">
+          <w:hyperlink w:anchor="_Toc228539662" w:history="1">
             <w:r>
               <w:rPr>
                 <w:rStyle w:val="Hyperlink"/>
@@ -3232,7 +3232,7 @@
                 <w:noProof/>
                 <w:webHidden/>
               </w:rPr>
-              <w:instrText xml:space="preserve"> PAGEREF _Toc228478063 \h </w:instrText>
+              <w:instrText xml:space="preserve"> PAGEREF _Toc228539662 \h </w:instrText>
             </w:r>
             <w:r>
               <w:rPr>
@@ -3280,7 +3280,7 @@
               <w14:ligatures w14:val="standardContextual"/>
             </w:rPr>
           </w:pPr>
-          <w:hyperlink w:anchor="_Toc228478064" w:history="1">
+          <w:hyperlink w:anchor="_Toc228539663" w:history="1">
             <w:r>
               <w:rPr>
                 <w:rStyle w:val="Hyperlink"/>
@@ -3332,7 +3332,7 @@
                 <w:noProof/>
                 <w:webHidden/>
               </w:rPr>
-              <w:instrText xml:space="preserve"> PAGEREF _Toc228478064 \h </w:instrText>
+              <w:instrText xml:space="preserve"> PAGEREF _Toc228539663 \h </w:instrText>
             </w:r>
             <w:r>
               <w:rPr>
@@ -3380,7 +3380,7 @@
               <w14:ligatures w14:val="standardContextual"/>
             </w:rPr>
           </w:pPr>
-          <w:hyperlink w:anchor="_Toc228478065" w:history="1">
+          <w:hyperlink w:anchor="_Toc228539664" w:history="1">
             <w:r>
               <w:rPr>
                 <w:rStyle w:val="Hyperlink"/>
@@ -3432,7 +3432,7 @@
                 <w:noProof/>
                 <w:webHidden/>
               </w:rPr>
-              <w:instrText xml:space="preserve"> PAGEREF _Toc228478065 \h </w:instrText>
+              <w:instrText xml:space="preserve"> PAGEREF _Toc228539664 \h </w:instrText>
             </w:r>
             <w:r>
               <w:rPr>
@@ -3480,7 +3480,7 @@
               <w14:ligatures w14:val="standardContextual"/>
             </w:rPr>
           </w:pPr>
-          <w:hyperlink w:anchor="_Toc228478066" w:history="1">
+          <w:hyperlink w:anchor="_Toc228539665" w:history="1">
             <w:r>
               <w:rPr>
                 <w:rStyle w:val="Hyperlink"/>
@@ -3532,7 +3532,7 @@
                 <w:noProof/>
                 <w:webHidden/>
               </w:rPr>
-              <w:instrText xml:space="preserve"> PAGEREF _Toc228478066 \h </w:instrText>
+              <w:instrText xml:space="preserve"> PAGEREF _Toc228539665 \h </w:instrText>
             </w:r>
             <w:r>
               <w:rPr>
@@ -3580,7 +3580,7 @@
               <w14:ligatures w14:val="standardContextual"/>
             </w:rPr>
           </w:pPr>
-          <w:hyperlink w:anchor="_Toc228478067" w:history="1">
+          <w:hyperlink w:anchor="_Toc228539666" w:history="1">
             <w:r>
               <w:rPr>
                 <w:rStyle w:val="Hyperlink"/>
@@ -3632,7 +3632,7 @@
                 <w:noProof/>
                 <w:webHidden/>
               </w:rPr>
-              <w:instrText xml:space="preserve"> PAGEREF _Toc228478067 \h </w:instrText>
+              <w:instrText xml:space="preserve"> PAGEREF _Toc228539666 \h </w:instrText>
             </w:r>
             <w:r>
               <w:rPr>
@@ -3680,7 +3680,7 @@
               <w14:ligatures w14:val="standardContextual"/>
             </w:rPr>
           </w:pPr>
-          <w:hyperlink w:anchor="_Toc228478068" w:history="1">
+          <w:hyperlink w:anchor="_Toc228539667" w:history="1">
             <w:r>
               <w:rPr>
                 <w:rStyle w:val="Hyperlink"/>
@@ -3732,7 +3732,7 @@
                 <w:noProof/>
                 <w:webHidden/>
               </w:rPr>
-              <w:instrText xml:space="preserve"> PAGEREF _Toc228478068 \h </w:instrText>
+              <w:instrText xml:space="preserve"> PAGEREF _Toc228539667 \h </w:instrText>
             </w:r>
             <w:r>
               <w:rPr>
@@ -3780,7 +3780,7 @@
               <w14:ligatures w14:val="standardContextual"/>
             </w:rPr>
           </w:pPr>
-          <w:hyperlink w:anchor="_Toc228478069" w:history="1">
+          <w:hyperlink w:anchor="_Toc228539668" w:history="1">
             <w:r>
               <w:rPr>
                 <w:rStyle w:val="Hyperlink"/>
@@ -3832,7 +3832,7 @@
                 <w:noProof/>
                 <w:webHidden/>
               </w:rPr>
-              <w:instrText xml:space="preserve"> PAGEREF _Toc228478069 \h </w:instrText>
+              <w:instrText xml:space="preserve"> PAGEREF _Toc228539668 \h </w:instrText>
             </w:r>
             <w:r>
               <w:rPr>
@@ -3880,7 +3880,7 @@
               <w14:ligatures w14:val="standardContextual"/>
             </w:rPr>
           </w:pPr>
-          <w:hyperlink w:anchor="_Toc228478070" w:history="1">
+          <w:hyperlink w:anchor="_Toc228539669" w:history="1">
             <w:r>
               <w:rPr>
                 <w:rStyle w:val="Hyperlink"/>
@@ -3932,7 +3932,7 @@
                 <w:noProof/>
                 <w:webHidden/>
               </w:rPr>
-              <w:instrText xml:space="preserve"> PAGEREF _Toc228478070 \h </w:instrText>
+              <w:instrText xml:space="preserve"> PAGEREF _Toc228539669 \h </w:instrText>
             </w:r>
             <w:r>
               <w:rPr>
@@ -3980,7 +3980,7 @@
               <w14:ligatures w14:val="standardContextual"/>
             </w:rPr>
           </w:pPr>
-          <w:hyperlink w:anchor="_Toc228478071" w:history="1">
+          <w:hyperlink w:anchor="_Toc228539670" w:history="1">
             <w:r>
               <w:rPr>
                 <w:rStyle w:val="Hyperlink"/>
@@ -4032,7 +4032,7 @@
                 <w:noProof/>
                 <w:webHidden/>
               </w:rPr>
-              <w:instrText xml:space="preserve"> PAGEREF _Toc228478071 \h </w:instrText>
+              <w:instrText xml:space="preserve"> PAGEREF _Toc228539670 \h </w:instrText>
             </w:r>
             <w:r>
               <w:rPr>
@@ -4080,7 +4080,7 @@
               <w14:ligatures w14:val="standardContextual"/>
             </w:rPr>
           </w:pPr>
-          <w:hyperlink w:anchor="_Toc228478072" w:history="1">
+          <w:hyperlink w:anchor="_Toc228539671" w:history="1">
             <w:r>
               <w:rPr>
                 <w:rStyle w:val="Hyperlink"/>
@@ -4132,7 +4132,7 @@
                 <w:noProof/>
                 <w:webHidden/>
               </w:rPr>
-              <w:instrText xml:space="preserve"> PAGEREF _Toc228478072 \h </w:instrText>
+              <w:instrText xml:space="preserve"> PAGEREF _Toc228539671 \h </w:instrText>
             </w:r>
             <w:r>
               <w:rPr>
@@ -4180,7 +4180,7 @@
               <w14:ligatures w14:val="standardContextual"/>
             </w:rPr>
           </w:pPr>
-          <w:hyperlink w:anchor="_Toc228478073" w:history="1">
+          <w:hyperlink w:anchor="_Toc228539672" w:history="1">
             <w:r>
               <w:rPr>
                 <w:rStyle w:val="Hyperlink"/>
@@ -4232,7 +4232,7 @@
                 <w:noProof/>
                 <w:webHidden/>
               </w:rPr>
-              <w:instrText xml:space="preserve"> PAGEREF _Toc228478073 \h </w:instrText>
+              <w:instrText xml:space="preserve"> PAGEREF _Toc228539672 \h </w:instrText>
             </w:r>
             <w:r>
               <w:rPr>
@@ -4280,7 +4280,7 @@
               <w14:ligatures w14:val="standardContextual"/>
             </w:rPr>
           </w:pPr>
-          <w:hyperlink w:anchor="_Toc228478074" w:history="1">
+          <w:hyperlink w:anchor="_Toc228539673" w:history="1">
             <w:r>
               <w:rPr>
                 <w:rStyle w:val="Hyperlink"/>
@@ -4332,7 +4332,7 @@
                 <w:noProof/>
                 <w:webHidden/>
               </w:rPr>
-              <w:instrText xml:space="preserve"> PAGEREF _Toc228478074 \h </w:instrText>
+              <w:instrText xml:space="preserve"> PAGEREF _Toc228539673 \h </w:instrText>
             </w:r>
             <w:r>
               <w:rPr>
@@ -4380,7 +4380,7 @@
               <w14:ligatures w14:val="standardContextual"/>
             </w:rPr>
           </w:pPr>
-          <w:hyperlink w:anchor="_Toc228478075" w:history="1">
+          <w:hyperlink w:anchor="_Toc228539674" w:history="1">
             <w:r>
               <w:rPr>
                 <w:rStyle w:val="Hyperlink"/>
@@ -4411,27 +4411,7 @@
                 <w:bCs/>
                 <w:noProof/>
               </w:rPr>
-              <w:t>Image Enhan</w:t>
-            </w:r>
-            <w:r>
-              <w:rPr>
-                <w:rStyle w:val="Hyperlink"/>
-                <w:rFonts w:ascii="Arial" w:hAnsi="Arial" w:cs="Arial"/>
-                <w:b/>
-                <w:bCs/>
-                <w:noProof/>
-              </w:rPr>
-              <w:t>c</w:t>
-            </w:r>
-            <w:r>
-              <w:rPr>
-                <w:rStyle w:val="Hyperlink"/>
-                <w:rFonts w:ascii="Arial" w:hAnsi="Arial" w:cs="Arial"/>
-                <w:b/>
-                <w:bCs/>
-                <w:noProof/>
-              </w:rPr>
-              <w:t>ement Pipeline</w:t>
+              <w:t>Image Enhancement Pipeline</w:t>
             </w:r>
             <w:r>
               <w:rPr>
@@ -4452,7 +4432,7 @@
                 <w:noProof/>
                 <w:webHidden/>
               </w:rPr>
-              <w:instrText xml:space="preserve"> PAGEREF _Toc228478075 \h </w:instrText>
+              <w:instrText xml:space="preserve"> PAGEREF _Toc228539674 \h </w:instrText>
             </w:r>
             <w:r>
               <w:rPr>
@@ -4500,7 +4480,7 @@
               <w14:ligatures w14:val="standardContextual"/>
             </w:rPr>
           </w:pPr>
-          <w:hyperlink w:anchor="_Toc228478076" w:history="1">
+          <w:hyperlink w:anchor="_Toc228539675" w:history="1">
             <w:r>
               <w:rPr>
                 <w:rStyle w:val="Hyperlink"/>
@@ -4552,7 +4532,7 @@
                 <w:noProof/>
                 <w:webHidden/>
               </w:rPr>
-              <w:instrText xml:space="preserve"> PAGEREF _Toc228478076 \h </w:instrText>
+              <w:instrText xml:space="preserve"> PAGEREF _Toc228539675 \h </w:instrText>
             </w:r>
             <w:r>
               <w:rPr>
@@ -4600,7 +4580,7 @@
               <w14:ligatures w14:val="standardContextual"/>
             </w:rPr>
           </w:pPr>
-          <w:hyperlink w:anchor="_Toc228478077" w:history="1">
+          <w:hyperlink w:anchor="_Toc228539676" w:history="1">
             <w:r>
               <w:rPr>
                 <w:rStyle w:val="Hyperlink"/>
@@ -4652,7 +4632,7 @@
                 <w:noProof/>
                 <w:webHidden/>
               </w:rPr>
-              <w:instrText xml:space="preserve"> PAGEREF _Toc228478077 \h </w:instrText>
+              <w:instrText xml:space="preserve"> PAGEREF _Toc228539676 \h </w:instrText>
             </w:r>
             <w:r>
               <w:rPr>
@@ -4700,7 +4680,7 @@
               <w14:ligatures w14:val="standardContextual"/>
             </w:rPr>
           </w:pPr>
-          <w:hyperlink w:anchor="_Toc228478078" w:history="1">
+          <w:hyperlink w:anchor="_Toc228539677" w:history="1">
             <w:r>
               <w:rPr>
                 <w:rStyle w:val="Hyperlink"/>
@@ -4752,7 +4732,7 @@
                 <w:noProof/>
                 <w:webHidden/>
               </w:rPr>
-              <w:instrText xml:space="preserve"> PAGEREF _Toc228478078 \h </w:instrText>
+              <w:instrText xml:space="preserve"> PAGEREF _Toc228539677 \h </w:instrText>
             </w:r>
             <w:r>
               <w:rPr>
@@ -4800,7 +4780,7 @@
               <w14:ligatures w14:val="standardContextual"/>
             </w:rPr>
           </w:pPr>
-          <w:hyperlink w:anchor="_Toc228478079" w:history="1">
+          <w:hyperlink w:anchor="_Toc228539678" w:history="1">
             <w:r>
               <w:rPr>
                 <w:rStyle w:val="Hyperlink"/>
@@ -4852,7 +4832,7 @@
                 <w:noProof/>
                 <w:webHidden/>
               </w:rPr>
-              <w:instrText xml:space="preserve"> PAGEREF _Toc228478079 \h </w:instrText>
+              <w:instrText xml:space="preserve"> PAGEREF _Toc228539678 \h </w:instrText>
             </w:r>
             <w:r>
               <w:rPr>
@@ -4873,6 +4853,306 @@
                 <w:webHidden/>
               </w:rPr>
               <w:t>35</w:t>
+            </w:r>
+            <w:r>
+              <w:rPr>
+                <w:noProof/>
+                <w:webHidden/>
+              </w:rPr>
+              <w:fldChar w:fldCharType="end"/>
+            </w:r>
+          </w:hyperlink>
+        </w:p>
+        <w:p>
+          <w:pPr>
+            <w:pStyle w:val="TOC3"/>
+            <w:tabs>
+              <w:tab w:val="left" w:pos="1200"/>
+              <w:tab w:val="right" w:leader="dot" w:pos="9016"/>
+            </w:tabs>
+            <w:rPr>
+              <w:rFonts w:cstheme="minorBidi"/>
+              <w:noProof/>
+              <w:kern w:val="2"/>
+              <w:sz w:val="24"/>
+              <w:szCs w:val="21"/>
+              <w:lang w:val="en-GB" w:eastAsia="en-GB" w:bidi="ne-NP"/>
+              <w14:ligatures w14:val="standardContextual"/>
+            </w:rPr>
+          </w:pPr>
+          <w:hyperlink w:anchor="_Toc228539679" w:history="1">
+            <w:r>
+              <w:rPr>
+                <w:rStyle w:val="Hyperlink"/>
+                <w:rFonts w:ascii="Arial" w:hAnsi="Arial" w:cs="Arial"/>
+                <w:b/>
+                <w:bCs/>
+                <w:noProof/>
+              </w:rPr>
+              <w:t>7.5.1</w:t>
+            </w:r>
+            <w:r>
+              <w:rPr>
+                <w:rFonts w:cstheme="minorBidi"/>
+                <w:noProof/>
+                <w:kern w:val="2"/>
+                <w:sz w:val="24"/>
+                <w:szCs w:val="21"/>
+                <w:lang w:val="en-GB" w:eastAsia="en-GB" w:bidi="ne-NP"/>
+                <w14:ligatures w14:val="standardContextual"/>
+              </w:rPr>
+              <w:tab/>
+            </w:r>
+            <w:r>
+              <w:rPr>
+                <w:rStyle w:val="Hyperlink"/>
+                <w:rFonts w:ascii="Arial" w:hAnsi="Arial" w:cs="Arial"/>
+                <w:b/>
+                <w:bCs/>
+                <w:noProof/>
+              </w:rPr>
+              <w:t>YOLOv8</w:t>
+            </w:r>
+            <w:r>
+              <w:rPr>
+                <w:noProof/>
+                <w:webHidden/>
+              </w:rPr>
+              <w:tab/>
+            </w:r>
+            <w:r>
+              <w:rPr>
+                <w:noProof/>
+                <w:webHidden/>
+              </w:rPr>
+              <w:fldChar w:fldCharType="begin"/>
+            </w:r>
+            <w:r>
+              <w:rPr>
+                <w:noProof/>
+                <w:webHidden/>
+              </w:rPr>
+              <w:instrText xml:space="preserve"> PAGEREF _Toc228539679 \h </w:instrText>
+            </w:r>
+            <w:r>
+              <w:rPr>
+                <w:noProof/>
+                <w:webHidden/>
+              </w:rPr>
+            </w:r>
+            <w:r>
+              <w:rPr>
+                <w:noProof/>
+                <w:webHidden/>
+              </w:rPr>
+              <w:fldChar w:fldCharType="separate"/>
+            </w:r>
+            <w:r>
+              <w:rPr>
+                <w:noProof/>
+                <w:webHidden/>
+              </w:rPr>
+              <w:t>35</w:t>
+            </w:r>
+            <w:r>
+              <w:rPr>
+                <w:noProof/>
+                <w:webHidden/>
+              </w:rPr>
+              <w:fldChar w:fldCharType="end"/>
+            </w:r>
+          </w:hyperlink>
+        </w:p>
+        <w:p>
+          <w:pPr>
+            <w:pStyle w:val="TOC3"/>
+            <w:tabs>
+              <w:tab w:val="left" w:pos="1200"/>
+              <w:tab w:val="right" w:leader="dot" w:pos="9016"/>
+            </w:tabs>
+            <w:rPr>
+              <w:rFonts w:cstheme="minorBidi"/>
+              <w:noProof/>
+              <w:kern w:val="2"/>
+              <w:sz w:val="24"/>
+              <w:szCs w:val="21"/>
+              <w:lang w:val="en-GB" w:eastAsia="en-GB" w:bidi="ne-NP"/>
+              <w14:ligatures w14:val="standardContextual"/>
+            </w:rPr>
+          </w:pPr>
+          <w:hyperlink w:anchor="_Toc228539680" w:history="1">
+            <w:r>
+              <w:rPr>
+                <w:rStyle w:val="Hyperlink"/>
+                <w:rFonts w:ascii="Arial" w:hAnsi="Arial" w:cs="Arial"/>
+                <w:b/>
+                <w:bCs/>
+                <w:noProof/>
+              </w:rPr>
+              <w:t>7.5.2</w:t>
+            </w:r>
+            <w:r>
+              <w:rPr>
+                <w:rFonts w:cstheme="minorBidi"/>
+                <w:noProof/>
+                <w:kern w:val="2"/>
+                <w:sz w:val="24"/>
+                <w:szCs w:val="21"/>
+                <w:lang w:val="en-GB" w:eastAsia="en-GB" w:bidi="ne-NP"/>
+                <w14:ligatures w14:val="standardContextual"/>
+              </w:rPr>
+              <w:tab/>
+            </w:r>
+            <w:r>
+              <w:rPr>
+                <w:rStyle w:val="Hyperlink"/>
+                <w:rFonts w:ascii="Arial" w:hAnsi="Arial" w:cs="Arial"/>
+                <w:b/>
+                <w:bCs/>
+                <w:noProof/>
+              </w:rPr>
+              <w:t>SSD MobileNet</w:t>
+            </w:r>
+            <w:r>
+              <w:rPr>
+                <w:noProof/>
+                <w:webHidden/>
+              </w:rPr>
+              <w:tab/>
+            </w:r>
+            <w:r>
+              <w:rPr>
+                <w:noProof/>
+                <w:webHidden/>
+              </w:rPr>
+              <w:fldChar w:fldCharType="begin"/>
+            </w:r>
+            <w:r>
+              <w:rPr>
+                <w:noProof/>
+                <w:webHidden/>
+              </w:rPr>
+              <w:instrText xml:space="preserve"> PAGEREF _Toc228539680 \h </w:instrText>
+            </w:r>
+            <w:r>
+              <w:rPr>
+                <w:noProof/>
+                <w:webHidden/>
+              </w:rPr>
+            </w:r>
+            <w:r>
+              <w:rPr>
+                <w:noProof/>
+                <w:webHidden/>
+              </w:rPr>
+              <w:fldChar w:fldCharType="separate"/>
+            </w:r>
+            <w:r>
+              <w:rPr>
+                <w:noProof/>
+                <w:webHidden/>
+              </w:rPr>
+              <w:t>35</w:t>
+            </w:r>
+            <w:r>
+              <w:rPr>
+                <w:noProof/>
+                <w:webHidden/>
+              </w:rPr>
+              <w:fldChar w:fldCharType="end"/>
+            </w:r>
+          </w:hyperlink>
+        </w:p>
+        <w:p>
+          <w:pPr>
+            <w:pStyle w:val="TOC3"/>
+            <w:tabs>
+              <w:tab w:val="left" w:pos="1200"/>
+              <w:tab w:val="right" w:leader="dot" w:pos="9016"/>
+            </w:tabs>
+            <w:rPr>
+              <w:rFonts w:cstheme="minorBidi"/>
+              <w:noProof/>
+              <w:kern w:val="2"/>
+              <w:sz w:val="24"/>
+              <w:szCs w:val="21"/>
+              <w:lang w:val="en-GB" w:eastAsia="en-GB" w:bidi="ne-NP"/>
+              <w14:ligatures w14:val="standardContextual"/>
+            </w:rPr>
+          </w:pPr>
+          <w:hyperlink w:anchor="_Toc228539681" w:history="1">
+            <w:r>
+              <w:rPr>
+                <w:rStyle w:val="Hyperlink"/>
+                <w:rFonts w:ascii="Arial" w:hAnsi="Arial" w:cs="Arial"/>
+                <w:b/>
+                <w:bCs/>
+                <w:noProof/>
+              </w:rPr>
+              <w:t>7.5.3</w:t>
+            </w:r>
+            <w:r>
+              <w:rPr>
+                <w:rFonts w:cstheme="minorBidi"/>
+                <w:noProof/>
+                <w:kern w:val="2"/>
+                <w:sz w:val="24"/>
+                <w:szCs w:val="21"/>
+                <w:lang w:val="en-GB" w:eastAsia="en-GB" w:bidi="ne-NP"/>
+                <w14:ligatures w14:val="standardContextual"/>
+              </w:rPr>
+              <w:tab/>
+            </w:r>
+            <w:r>
+              <w:rPr>
+                <w:rStyle w:val="Hyperlink"/>
+                <w:rFonts w:ascii="Arial" w:hAnsi="Arial" w:cs="Arial"/>
+                <w:b/>
+                <w:bCs/>
+                <w:noProof/>
+              </w:rPr>
+              <w:t>Faster R-CNN</w:t>
+            </w:r>
+            <w:r>
+              <w:rPr>
+                <w:noProof/>
+                <w:webHidden/>
+              </w:rPr>
+              <w:tab/>
+            </w:r>
+            <w:r>
+              <w:rPr>
+                <w:noProof/>
+                <w:webHidden/>
+              </w:rPr>
+              <w:fldChar w:fldCharType="begin"/>
+            </w:r>
+            <w:r>
+              <w:rPr>
+                <w:noProof/>
+                <w:webHidden/>
+              </w:rPr>
+              <w:instrText xml:space="preserve"> PAGEREF _Toc228539681 \h </w:instrText>
+            </w:r>
+            <w:r>
+              <w:rPr>
+                <w:noProof/>
+                <w:webHidden/>
+              </w:rPr>
+            </w:r>
+            <w:r>
+              <w:rPr>
+                <w:noProof/>
+                <w:webHidden/>
+              </w:rPr>
+              <w:fldChar w:fldCharType="separate"/>
+            </w:r>
+            <w:r>
+              <w:rPr>
+                <w:noProof/>
+                <w:webHidden/>
+              </w:rPr>
+              <w:t>36</w:t>
             </w:r>
             <w:r>
               <w:rPr>
@@ -4900,7 +5180,7 @@
               <w14:ligatures w14:val="standardContextual"/>
             </w:rPr>
           </w:pPr>
-          <w:hyperlink w:anchor="_Toc228478080" w:history="1">
+          <w:hyperlink w:anchor="_Toc228539682" w:history="1">
             <w:r>
               <w:rPr>
                 <w:rStyle w:val="Hyperlink"/>
@@ -4952,7 +5232,7 @@
                 <w:noProof/>
                 <w:webHidden/>
               </w:rPr>
-              <w:instrText xml:space="preserve"> PAGEREF _Toc228478080 \h </w:instrText>
+              <w:instrText xml:space="preserve"> PAGEREF _Toc228539682 \h </w:instrText>
             </w:r>
             <w:r>
               <w:rPr>
@@ -4972,7 +5252,307 @@
                 <w:noProof/>
                 <w:webHidden/>
               </w:rPr>
-              <w:t>35</w:t>
+              <w:t>36</w:t>
+            </w:r>
+            <w:r>
+              <w:rPr>
+                <w:noProof/>
+                <w:webHidden/>
+              </w:rPr>
+              <w:fldChar w:fldCharType="end"/>
+            </w:r>
+          </w:hyperlink>
+        </w:p>
+        <w:p>
+          <w:pPr>
+            <w:pStyle w:val="TOC3"/>
+            <w:tabs>
+              <w:tab w:val="left" w:pos="1200"/>
+              <w:tab w:val="right" w:leader="dot" w:pos="9016"/>
+            </w:tabs>
+            <w:rPr>
+              <w:rFonts w:cstheme="minorBidi"/>
+              <w:noProof/>
+              <w:kern w:val="2"/>
+              <w:sz w:val="24"/>
+              <w:szCs w:val="21"/>
+              <w:lang w:val="en-GB" w:eastAsia="en-GB" w:bidi="ne-NP"/>
+              <w14:ligatures w14:val="standardContextual"/>
+            </w:rPr>
+          </w:pPr>
+          <w:hyperlink w:anchor="_Toc228539683" w:history="1">
+            <w:r>
+              <w:rPr>
+                <w:rStyle w:val="Hyperlink"/>
+                <w:rFonts w:ascii="Arial" w:hAnsi="Arial" w:cs="Arial"/>
+                <w:b/>
+                <w:bCs/>
+                <w:noProof/>
+              </w:rPr>
+              <w:t>7.6.1</w:t>
+            </w:r>
+            <w:r>
+              <w:rPr>
+                <w:rFonts w:cstheme="minorBidi"/>
+                <w:noProof/>
+                <w:kern w:val="2"/>
+                <w:sz w:val="24"/>
+                <w:szCs w:val="21"/>
+                <w:lang w:val="en-GB" w:eastAsia="en-GB" w:bidi="ne-NP"/>
+                <w14:ligatures w14:val="standardContextual"/>
+              </w:rPr>
+              <w:tab/>
+            </w:r>
+            <w:r>
+              <w:rPr>
+                <w:rStyle w:val="Hyperlink"/>
+                <w:rFonts w:ascii="Arial" w:hAnsi="Arial" w:cs="Arial"/>
+                <w:b/>
+                <w:bCs/>
+                <w:noProof/>
+              </w:rPr>
+              <w:t>Intersection over Union (IoU)</w:t>
+            </w:r>
+            <w:r>
+              <w:rPr>
+                <w:noProof/>
+                <w:webHidden/>
+              </w:rPr>
+              <w:tab/>
+            </w:r>
+            <w:r>
+              <w:rPr>
+                <w:noProof/>
+                <w:webHidden/>
+              </w:rPr>
+              <w:fldChar w:fldCharType="begin"/>
+            </w:r>
+            <w:r>
+              <w:rPr>
+                <w:noProof/>
+                <w:webHidden/>
+              </w:rPr>
+              <w:instrText xml:space="preserve"> PAGEREF _Toc228539683 \h </w:instrText>
+            </w:r>
+            <w:r>
+              <w:rPr>
+                <w:noProof/>
+                <w:webHidden/>
+              </w:rPr>
+            </w:r>
+            <w:r>
+              <w:rPr>
+                <w:noProof/>
+                <w:webHidden/>
+              </w:rPr>
+              <w:fldChar w:fldCharType="separate"/>
+            </w:r>
+            <w:r>
+              <w:rPr>
+                <w:noProof/>
+                <w:webHidden/>
+              </w:rPr>
+              <w:t>36</w:t>
+            </w:r>
+            <w:r>
+              <w:rPr>
+                <w:noProof/>
+                <w:webHidden/>
+              </w:rPr>
+              <w:fldChar w:fldCharType="end"/>
+            </w:r>
+          </w:hyperlink>
+        </w:p>
+        <w:p>
+          <w:pPr>
+            <w:pStyle w:val="TOC3"/>
+            <w:tabs>
+              <w:tab w:val="left" w:pos="1200"/>
+              <w:tab w:val="right" w:leader="dot" w:pos="9016"/>
+            </w:tabs>
+            <w:rPr>
+              <w:rFonts w:cstheme="minorBidi"/>
+              <w:noProof/>
+              <w:kern w:val="2"/>
+              <w:sz w:val="24"/>
+              <w:szCs w:val="21"/>
+              <w:lang w:val="en-GB" w:eastAsia="en-GB" w:bidi="ne-NP"/>
+              <w14:ligatures w14:val="standardContextual"/>
+            </w:rPr>
+          </w:pPr>
+          <w:hyperlink w:anchor="_Toc228539684" w:history="1">
+            <w:r>
+              <w:rPr>
+                <w:rStyle w:val="Hyperlink"/>
+                <w:rFonts w:ascii="Arial" w:hAnsi="Arial" w:cs="Arial"/>
+                <w:b/>
+                <w:bCs/>
+                <w:noProof/>
+              </w:rPr>
+              <w:t>7.6.2</w:t>
+            </w:r>
+            <w:r>
+              <w:rPr>
+                <w:rFonts w:cstheme="minorBidi"/>
+                <w:noProof/>
+                <w:kern w:val="2"/>
+                <w:sz w:val="24"/>
+                <w:szCs w:val="21"/>
+                <w:lang w:val="en-GB" w:eastAsia="en-GB" w:bidi="ne-NP"/>
+                <w14:ligatures w14:val="standardContextual"/>
+              </w:rPr>
+              <w:tab/>
+            </w:r>
+            <w:r>
+              <w:rPr>
+                <w:rStyle w:val="Hyperlink"/>
+                <w:rFonts w:ascii="Arial" w:hAnsi="Arial" w:cs="Arial"/>
+                <w:b/>
+                <w:bCs/>
+                <w:noProof/>
+              </w:rPr>
+              <w:t>Precision, Recall, and F1 Score</w:t>
+            </w:r>
+            <w:r>
+              <w:rPr>
+                <w:noProof/>
+                <w:webHidden/>
+              </w:rPr>
+              <w:tab/>
+            </w:r>
+            <w:r>
+              <w:rPr>
+                <w:noProof/>
+                <w:webHidden/>
+              </w:rPr>
+              <w:fldChar w:fldCharType="begin"/>
+            </w:r>
+            <w:r>
+              <w:rPr>
+                <w:noProof/>
+                <w:webHidden/>
+              </w:rPr>
+              <w:instrText xml:space="preserve"> PAGEREF _Toc228539684 \h </w:instrText>
+            </w:r>
+            <w:r>
+              <w:rPr>
+                <w:noProof/>
+                <w:webHidden/>
+              </w:rPr>
+            </w:r>
+            <w:r>
+              <w:rPr>
+                <w:noProof/>
+                <w:webHidden/>
+              </w:rPr>
+              <w:fldChar w:fldCharType="separate"/>
+            </w:r>
+            <w:r>
+              <w:rPr>
+                <w:noProof/>
+                <w:webHidden/>
+              </w:rPr>
+              <w:t>36</w:t>
+            </w:r>
+            <w:r>
+              <w:rPr>
+                <w:noProof/>
+                <w:webHidden/>
+              </w:rPr>
+              <w:fldChar w:fldCharType="end"/>
+            </w:r>
+          </w:hyperlink>
+        </w:p>
+        <w:p>
+          <w:pPr>
+            <w:pStyle w:val="TOC3"/>
+            <w:tabs>
+              <w:tab w:val="left" w:pos="1200"/>
+              <w:tab w:val="right" w:leader="dot" w:pos="9016"/>
+            </w:tabs>
+            <w:rPr>
+              <w:rFonts w:cstheme="minorBidi"/>
+              <w:noProof/>
+              <w:kern w:val="2"/>
+              <w:sz w:val="24"/>
+              <w:szCs w:val="21"/>
+              <w:lang w:val="en-GB" w:eastAsia="en-GB" w:bidi="ne-NP"/>
+              <w14:ligatures w14:val="standardContextual"/>
+            </w:rPr>
+          </w:pPr>
+          <w:hyperlink w:anchor="_Toc228539685" w:history="1">
+            <w:r>
+              <w:rPr>
+                <w:rStyle w:val="Hyperlink"/>
+                <w:rFonts w:ascii="Arial" w:hAnsi="Arial" w:cs="Arial"/>
+                <w:b/>
+                <w:bCs/>
+                <w:noProof/>
+              </w:rPr>
+              <w:t>7.6.3</w:t>
+            </w:r>
+            <w:r>
+              <w:rPr>
+                <w:rFonts w:cstheme="minorBidi"/>
+                <w:noProof/>
+                <w:kern w:val="2"/>
+                <w:sz w:val="24"/>
+                <w:szCs w:val="21"/>
+                <w:lang w:val="en-GB" w:eastAsia="en-GB" w:bidi="ne-NP"/>
+                <w14:ligatures w14:val="standardContextual"/>
+              </w:rPr>
+              <w:tab/>
+            </w:r>
+            <w:r>
+              <w:rPr>
+                <w:rStyle w:val="Hyperlink"/>
+                <w:rFonts w:ascii="Arial" w:hAnsi="Arial" w:cs="Arial"/>
+                <w:b/>
+                <w:bCs/>
+                <w:noProof/>
+              </w:rPr>
+              <w:t>AP @50 and mAP</w:t>
+            </w:r>
+            <w:r>
+              <w:rPr>
+                <w:noProof/>
+                <w:webHidden/>
+              </w:rPr>
+              <w:tab/>
+            </w:r>
+            <w:r>
+              <w:rPr>
+                <w:noProof/>
+                <w:webHidden/>
+              </w:rPr>
+              <w:fldChar w:fldCharType="begin"/>
+            </w:r>
+            <w:r>
+              <w:rPr>
+                <w:noProof/>
+                <w:webHidden/>
+              </w:rPr>
+              <w:instrText xml:space="preserve"> PAGEREF _Toc228539685 \h </w:instrText>
+            </w:r>
+            <w:r>
+              <w:rPr>
+                <w:noProof/>
+                <w:webHidden/>
+              </w:rPr>
+            </w:r>
+            <w:r>
+              <w:rPr>
+                <w:noProof/>
+                <w:webHidden/>
+              </w:rPr>
+              <w:fldChar w:fldCharType="separate"/>
+            </w:r>
+            <w:r>
+              <w:rPr>
+                <w:noProof/>
+                <w:webHidden/>
+              </w:rPr>
+              <w:t>37</w:t>
             </w:r>
             <w:r>
               <w:rPr>
@@ -5000,7 +5580,7 @@
               <w14:ligatures w14:val="standardContextual"/>
             </w:rPr>
           </w:pPr>
-          <w:hyperlink w:anchor="_Toc228478081" w:history="1">
+          <w:hyperlink w:anchor="_Toc228539686" w:history="1">
             <w:r>
               <w:rPr>
                 <w:rStyle w:val="Hyperlink"/>
@@ -5052,7 +5632,7 @@
                 <w:noProof/>
                 <w:webHidden/>
               </w:rPr>
-              <w:instrText xml:space="preserve"> PAGEREF _Toc228478081 \h </w:instrText>
+              <w:instrText xml:space="preserve"> PAGEREF _Toc228539686 \h </w:instrText>
             </w:r>
             <w:r>
               <w:rPr>
@@ -5072,7 +5652,7 @@
                 <w:noProof/>
                 <w:webHidden/>
               </w:rPr>
-              <w:t>35</w:t>
+              <w:t>38</w:t>
             </w:r>
             <w:r>
               <w:rPr>
@@ -5100,7 +5680,7 @@
               <w14:ligatures w14:val="standardContextual"/>
             </w:rPr>
           </w:pPr>
-          <w:hyperlink w:anchor="_Toc228478082" w:history="1">
+          <w:hyperlink w:anchor="_Toc228539687" w:history="1">
             <w:r>
               <w:rPr>
                 <w:rStyle w:val="Hyperlink"/>
@@ -5152,7 +5732,7 @@
                 <w:noProof/>
                 <w:webHidden/>
               </w:rPr>
-              <w:instrText xml:space="preserve"> PAGEREF _Toc228478082 \h </w:instrText>
+              <w:instrText xml:space="preserve"> PAGEREF _Toc228539687 \h </w:instrText>
             </w:r>
             <w:r>
               <w:rPr>
@@ -5172,7 +5752,7 @@
                 <w:noProof/>
                 <w:webHidden/>
               </w:rPr>
-              <w:t>35</w:t>
+              <w:t>38</w:t>
             </w:r>
             <w:r>
               <w:rPr>
@@ -5200,7 +5780,7 @@
               <w14:ligatures w14:val="standardContextual"/>
             </w:rPr>
           </w:pPr>
-          <w:hyperlink w:anchor="_Toc228478083" w:history="1">
+          <w:hyperlink w:anchor="_Toc228539688" w:history="1">
             <w:r>
               <w:rPr>
                 <w:rStyle w:val="Hyperlink"/>
@@ -5252,7 +5832,7 @@
                 <w:noProof/>
                 <w:webHidden/>
               </w:rPr>
-              <w:instrText xml:space="preserve"> PAGEREF _Toc228478083 \h </w:instrText>
+              <w:instrText xml:space="preserve"> PAGEREF _Toc228539688 \h </w:instrText>
             </w:r>
             <w:r>
               <w:rPr>
@@ -5272,7 +5852,7 @@
                 <w:noProof/>
                 <w:webHidden/>
               </w:rPr>
-              <w:t>36</w:t>
+              <w:t>39</w:t>
             </w:r>
             <w:r>
               <w:rPr>
@@ -5300,7 +5880,7 @@
               <w14:ligatures w14:val="standardContextual"/>
             </w:rPr>
           </w:pPr>
-          <w:hyperlink w:anchor="_Toc228478084" w:history="1">
+          <w:hyperlink w:anchor="_Toc228539689" w:history="1">
             <w:r>
               <w:rPr>
                 <w:rStyle w:val="Hyperlink"/>
@@ -5352,7 +5932,7 @@
                 <w:noProof/>
                 <w:webHidden/>
               </w:rPr>
-              <w:instrText xml:space="preserve"> PAGEREF _Toc228478084 \h </w:instrText>
+              <w:instrText xml:space="preserve"> PAGEREF _Toc228539689 \h </w:instrText>
             </w:r>
             <w:r>
               <w:rPr>
@@ -5372,7 +5952,7 @@
                 <w:noProof/>
                 <w:webHidden/>
               </w:rPr>
-              <w:t>37</w:t>
+              <w:t>40</w:t>
             </w:r>
             <w:r>
               <w:rPr>
@@ -5400,7 +5980,7 @@
               <w14:ligatures w14:val="standardContextual"/>
             </w:rPr>
           </w:pPr>
-          <w:hyperlink w:anchor="_Toc228478085" w:history="1">
+          <w:hyperlink w:anchor="_Toc228539690" w:history="1">
             <w:r>
               <w:rPr>
                 <w:rStyle w:val="Hyperlink"/>
@@ -5452,7 +6032,7 @@
                 <w:noProof/>
                 <w:webHidden/>
               </w:rPr>
-              <w:instrText xml:space="preserve"> PAGEREF _Toc228478085 \h </w:instrText>
+              <w:instrText xml:space="preserve"> PAGEREF _Toc228539690 \h </w:instrText>
             </w:r>
             <w:r>
               <w:rPr>
@@ -5472,7 +6052,7 @@
                 <w:noProof/>
                 <w:webHidden/>
               </w:rPr>
-              <w:t>38</w:t>
+              <w:t>41</w:t>
             </w:r>
             <w:r>
               <w:rPr>
@@ -5500,7 +6080,7 @@
               <w14:ligatures w14:val="standardContextual"/>
             </w:rPr>
           </w:pPr>
-          <w:hyperlink w:anchor="_Toc228478086" w:history="1">
+          <w:hyperlink w:anchor="_Toc228539691" w:history="1">
             <w:r>
               <w:rPr>
                 <w:rStyle w:val="Hyperlink"/>
@@ -5552,7 +6132,7 @@
                 <w:noProof/>
                 <w:webHidden/>
               </w:rPr>
-              <w:instrText xml:space="preserve"> PAGEREF _Toc228478086 \h </w:instrText>
+              <w:instrText xml:space="preserve"> PAGEREF _Toc228539691 \h </w:instrText>
             </w:r>
             <w:r>
               <w:rPr>
@@ -5572,7 +6152,7 @@
                 <w:noProof/>
                 <w:webHidden/>
               </w:rPr>
-              <w:t>39</w:t>
+              <w:t>42</w:t>
             </w:r>
             <w:r>
               <w:rPr>
@@ -5665,7 +6245,7 @@
           <w:lang w:val="en-US"/>
         </w:rPr>
       </w:pPr>
-      <w:bookmarkStart w:id="4" w:name="_Toc228478045"/>
+      <w:bookmarkStart w:id="4" w:name="_Toc228539644"/>
       <w:r>
         <w:rPr>
           <w:rFonts w:ascii="Arial" w:hAnsi="Arial" w:cs="Arial"/>
@@ -5691,7 +6271,7 @@
           <w:lang w:val="en-US"/>
         </w:rPr>
       </w:pPr>
-      <w:bookmarkStart w:id="5" w:name="_Toc228478046"/>
+      <w:bookmarkStart w:id="5" w:name="_Toc228539645"/>
       <w:r>
         <w:rPr>
           <w:rFonts w:ascii="Arial" w:hAnsi="Arial" w:cs="Arial"/>
@@ -5717,7 +6297,7 @@
           <w:lang w:val="en-US"/>
         </w:rPr>
       </w:pPr>
-      <w:bookmarkStart w:id="6" w:name="_Toc228478047"/>
+      <w:bookmarkStart w:id="6" w:name="_Toc228539646"/>
       <w:r>
         <w:rPr>
           <w:rFonts w:ascii="Arial" w:hAnsi="Arial" w:cs="Arial"/>
@@ -5813,7 +6393,7 @@
           <w:lang w:val="en-US"/>
         </w:rPr>
       </w:pPr>
-      <w:bookmarkStart w:id="7" w:name="_Toc228478048"/>
+      <w:bookmarkStart w:id="7" w:name="_Toc228539647"/>
       <w:r>
         <w:rPr>
           <w:rFonts w:ascii="Arial" w:hAnsi="Arial" w:cs="Arial"/>
@@ -6153,7 +6733,7 @@
           <w:lang w:val="en-US"/>
         </w:rPr>
       </w:pPr>
-      <w:bookmarkStart w:id="8" w:name="_Toc228478049"/>
+      <w:bookmarkStart w:id="8" w:name="_Toc228539648"/>
       <w:r>
         <w:rPr>
           <w:rFonts w:ascii="Arial" w:hAnsi="Arial" w:cs="Arial"/>
@@ -6421,7 +7001,7 @@
           <w:lang w:val="en-US"/>
         </w:rPr>
       </w:pPr>
-      <w:bookmarkStart w:id="9" w:name="_Toc228478050"/>
+      <w:bookmarkStart w:id="9" w:name="_Toc228539649"/>
       <w:r>
         <w:rPr>
           <w:rFonts w:ascii="Arial" w:hAnsi="Arial" w:cs="Arial"/>
@@ -6601,7 +7181,15 @@
           <w:rFonts w:ascii="Arial" w:hAnsi="Arial" w:cs="Arial"/>
           <w:lang w:val="en-US"/>
         </w:rPr>
-        <w:t xml:space="preserve">Blurred Image” since making detection models work well in difficult image conditions is still a real gap between benchmark results and real-world use. Many studies on object detection have shown </w:t>
+        <w:t xml:space="preserve">Blurred Image” since making detection models work well in difficult image conditions is still a real gap between benchmark results and real-world use. Many studies on </w:t>
+      </w:r>
+      <w:r>
+        <w:rPr>
+          <w:rFonts w:ascii="Arial" w:hAnsi="Arial" w:cs="Arial"/>
+          <w:lang w:val="en-US"/>
+        </w:rPr>
+        <w:lastRenderedPageBreak/>
+        <w:t xml:space="preserve">object detection have shown </w:t>
       </w:r>
       <w:r>
         <w:rPr>
@@ -6615,15 +7203,7 @@
           <w:rFonts w:ascii="Arial" w:hAnsi="Arial" w:cs="Arial"/>
           <w:lang w:val="en-US"/>
         </w:rPr>
-        <w:t xml:space="preserve"> on clean, high-resolution image sets, but real-world systems in areas like surveillance, transportation and robotics must operate in the dark, during camera movement, or without a focus blur, where objects detection can be unreliable. As a result, the research implements a controlled </w:t>
-      </w:r>
-      <w:r>
-        <w:rPr>
-          <w:rFonts w:ascii="Arial" w:hAnsi="Arial" w:cs="Arial"/>
-          <w:lang w:val="en-US"/>
-        </w:rPr>
-        <w:lastRenderedPageBreak/>
-        <w:t>and repeatable evaluation pipeline. A fixed number of COCO 2017 validation images (1000) is chosen to generate a wide range of real-life scenes. Several degraded datasets are created using this set of fixed images with three levels of severity of low-light and gaussian blur. To research mitigation measures, two lightweight enhancement methods are applied to low-light images before detection: Gamma Correction (to brighten darker areas) and CLAHE (to improve local contrast). The study aims to set a baseline in normal images, measure performance drop across degradations, compare detector families (YOLOv8, SSD MobileNet, Faster R-CNN), and report both accuracy and efficiency metrics (precision, recall, mAP, confidence score, inference time/FPS). Accordingly, the research asks:</w:t>
+        <w:t xml:space="preserve"> on clean, high-resolution image sets, but real-world systems in areas like surveillance, transportation and robotics must operate in the dark, during camera movement, or without a focus blur, where objects detection can be unreliable. As a result, the research implements a controlled and repeatable evaluation pipeline. A fixed number of COCO 2017 validation images (1000) is chosen to generate a wide range of real-life scenes. Several degraded datasets are created using this set of fixed images with three levels of severity of low-light and gaussian blur. To research mitigation measures, two lightweight enhancement methods are applied to low-light images before detection: Gamma Correction (to brighten darker areas) and CLAHE (to improve local contrast). The study aims to set a baseline in normal images, measure performance drop across degradations, compare detector families (YOLOv8, SSD MobileNet, Faster R-CNN), and report both accuracy and efficiency metrics (precision, recall, mAP, confidence score, inference time/FPS). Accordingly, the research asks:</w:t>
       </w:r>
     </w:p>
     <w:p>
@@ -6728,7 +7308,15 @@
           <w:rFonts w:ascii="Arial" w:hAnsi="Arial" w:cs="Arial"/>
           <w:lang w:val="en-US"/>
         </w:rPr>
-        <w:t xml:space="preserve"> and technologies that this project will make use of, such as the benchmark dataset, the Python/Google Colab environment and the choice of detection frameworks and libraries. Chapter 4 (Methodology) describes experimental design, such as the selection of the subset of data, the creation of low-light and blur severity levels, the introduction of gamma correction and CLAHE, and the metrics of evaluation of performance. Chapter 5 (Product Design) gives the design of the experimental pipeline and how the outputs will be generated so that it can be demonstrated and reported. Chapter 6 (Software Requirement Analysis) describes the functional and non-functional requirements where they are needed. Chapter 7 (Implementation and Testing) outlines the implementation phase and testing process of baseline, degraded, and enhanced experiments of models. Chapter 8 (Product Evaluation) assesses the final system results based on quantitative and qualitative comparison. The 9th chapter (Project Evaluation) reflects project planning, management considerations, </w:t>
+        <w:t xml:space="preserve"> and technologies that this project will make use of, such as the benchmark dataset, the Python/Google Colab environment and the choice of detection frameworks and libraries. Chapter 4 (Methodology) describes experimental design, such as the selection of the subset of data, the creation of low-light and blur severity levels, the introduction of gamma correction and CLAHE, and the metrics of evaluation of performance. Chapter 5 (Product Design) gives the design of the experimental pipeline and how the outputs will be generated so that it can be demonstrated and reported. Chapter 6 (Software Requirement Analysis) describes the functional and non-functional requirements where they are needed. Chapter 7 (Implementation and Testing) outlines the implementation phase and testing process of baseline, degraded, and enhanced experiments of models. Chapter 8 (Product Evaluation) assesses the </w:t>
+      </w:r>
+      <w:r>
+        <w:rPr>
+          <w:rFonts w:ascii="Arial" w:hAnsi="Arial" w:cs="Arial"/>
+          <w:lang w:val="en-US"/>
+        </w:rPr>
+        <w:lastRenderedPageBreak/>
+        <w:t xml:space="preserve">final system results based on quantitative and qualitative comparison. The 9th chapter (Project Evaluation) reflects project planning, management considerations, </w:t>
       </w:r>
       <w:r>
         <w:rPr>
@@ -6783,7 +7371,7 @@
           <w:lang w:val="en-US"/>
         </w:rPr>
       </w:pPr>
-      <w:bookmarkStart w:id="10" w:name="_Toc228478051"/>
+      <w:bookmarkStart w:id="10" w:name="_Toc228539650"/>
       <w:r>
         <w:rPr>
           <w:rFonts w:ascii="Arial" w:hAnsi="Arial" w:cs="Arial"/>
@@ -6835,7 +7423,7 @@
           <w:lang w:val="en-US"/>
         </w:rPr>
       </w:pPr>
-      <w:bookmarkStart w:id="11" w:name="_Toc228478052"/>
+      <w:bookmarkStart w:id="11" w:name="_Toc228539651"/>
       <w:r>
         <w:rPr>
           <w:rFonts w:ascii="Arial" w:hAnsi="Arial" w:cs="Arial"/>
@@ -7015,7 +7603,7 @@
           <w:lang w:val="en-US"/>
         </w:rPr>
       </w:pPr>
-      <w:bookmarkStart w:id="12" w:name="_Toc228478053"/>
+      <w:bookmarkStart w:id="12" w:name="_Toc228539652"/>
       <w:r>
         <w:rPr>
           <w:rFonts w:ascii="Arial" w:hAnsi="Arial" w:cs="Arial"/>
@@ -7127,6 +7715,7 @@
           <w:rFonts w:ascii="Arial" w:hAnsi="Arial" w:cs="Arial"/>
           <w:lang w:val="en-US"/>
         </w:rPr>
+        <w:lastRenderedPageBreak/>
         <w:t>Deep learning brought about a change. R</w:t>
       </w:r>
       <w:r>
@@ -7183,15 +7772,7 @@
           <w:rFonts w:ascii="Arial" w:hAnsi="Arial" w:cs="Arial"/>
           <w:lang w:val="en-US"/>
         </w:rPr>
-        <w:t xml:space="preserve">CNN used a region proposal network (RPN) to provide proposals, resulting </w:t>
-      </w:r>
-      <w:r>
-        <w:rPr>
-          <w:rFonts w:ascii="Arial" w:hAnsi="Arial" w:cs="Arial"/>
-          <w:lang w:val="en-US"/>
-        </w:rPr>
-        <w:lastRenderedPageBreak/>
-        <w:t>in an end</w:t>
+        <w:t>CNN used a region proposal network (RPN) to provide proposals, resulting in an end</w:t>
       </w:r>
       <w:r>
         <w:rPr>
@@ -7499,7 +8080,7 @@
           <w:lang w:val="en-US"/>
         </w:rPr>
       </w:pPr>
-      <w:bookmarkStart w:id="13" w:name="_Toc228478054"/>
+      <w:bookmarkStart w:id="13" w:name="_Toc228539653"/>
       <w:r>
         <w:rPr>
           <w:rFonts w:ascii="Arial" w:hAnsi="Arial" w:cs="Arial"/>
@@ -7510,6 +8091,7 @@
           <w:szCs w:val="24"/>
           <w:lang w:val="en-US"/>
         </w:rPr>
+        <w:lastRenderedPageBreak/>
         <w:t xml:space="preserve">2.3 </w:t>
       </w:r>
       <w:r>
@@ -7555,15 +8137,7 @@
           <w:rFonts w:ascii="Arial" w:hAnsi="Arial" w:cs="Arial"/>
           <w:lang w:val="en-US"/>
         </w:rPr>
-        <w:t xml:space="preserve">light images are difficult. This decreases image contrast, fades textures and edges and adds noise. In consequence, small objects can disappear into the background, and large objects can lose their textures. These problems impact conventional detectors because the kernels in convolutions learn from local contrast </w:t>
-      </w:r>
-      <w:r>
-        <w:rPr>
-          <w:rFonts w:ascii="Arial" w:hAnsi="Arial" w:cs="Arial"/>
-          <w:lang w:val="en-US"/>
-        </w:rPr>
-        <w:lastRenderedPageBreak/>
-        <w:t>and gradients. The ExDark dataset (Loh &amp; Chan 2019) was developed to facilitate research on dark images; it consists of more than 7,000 images in ten low</w:t>
+        <w:t>light images are difficult. This decreases image contrast, fades textures and edges and adds noise. In consequence, small objects can disappear into the background, and large objects can lose their textures. These problems impact conventional detectors because the kernels in convolutions learn from local contrast and gradients. The ExDark dataset (Loh &amp; Chan 2019) was developed to facilitate research on dark images; it consists of more than 7,000 images in ten low</w:t>
       </w:r>
       <w:r>
         <w:rPr>
@@ -7689,7 +8263,7 @@
           <w:lang w:val="en-US"/>
         </w:rPr>
       </w:pPr>
-      <w:bookmarkStart w:id="14" w:name="_Toc228478055"/>
+      <w:bookmarkStart w:id="14" w:name="_Toc228539654"/>
       <w:r>
         <w:rPr>
           <w:rFonts w:ascii="Arial" w:hAnsi="Arial" w:cs="Arial"/>
@@ -7771,7 +8345,7 @@
           <w:rFonts w:ascii="Arial" w:hAnsi="Arial" w:cs="Arial"/>
           <w:lang w:val="en-US"/>
         </w:rPr>
-        <w:t xml:space="preserve">law transformation to increase the intensity of pixels; it is easy to implement and does not require training data. CLAHE is based on redistributing the histogram of local regions while preventing the noise from being amplified (Pizer et al. 1987). Both techniques can increase contrast and reveal details in dark regions, but they may also amplify noise or reduce natural colour relationships if the parameters are not carefully chosen. Gamma correction and CLAHE are fast and deterministic, making them useful </w:t>
+        <w:t xml:space="preserve">law transformation to increase the intensity of pixels; it is easy to implement and does not require training data. CLAHE is based on redistributing the histogram of </w:t>
       </w:r>
       <w:r>
         <w:rPr>
@@ -7779,7 +8353,7 @@
           <w:lang w:val="en-US"/>
         </w:rPr>
         <w:lastRenderedPageBreak/>
-        <w:t>for real</w:t>
+        <w:t>local regions while preventing the noise from being amplified (Pizer et al. 1987). Both techniques can increase contrast and reveal details in dark regions, but they may also amplify noise or reduce natural colour relationships if the parameters are not carefully chosen. Gamma correction and CLAHE are fast and deterministic, making them useful for real</w:t>
       </w:r>
       <w:r>
         <w:rPr>
@@ -7900,7 +8474,7 @@
           <w:lang w:val="en-US"/>
         </w:rPr>
       </w:pPr>
-      <w:bookmarkStart w:id="15" w:name="_Toc228478056"/>
+      <w:bookmarkStart w:id="15" w:name="_Toc228539655"/>
       <w:r>
         <w:rPr>
           <w:rFonts w:ascii="Arial" w:hAnsi="Arial" w:cs="Arial"/>
@@ -7959,15 +8533,8 @@
           <w:rFonts w:ascii="Arial" w:hAnsi="Arial" w:cs="Arial"/>
           <w:lang w:val="en-US"/>
         </w:rPr>
-        <w:t xml:space="preserve">Another recent focus is robustness to image corruptions. Hendrycks and Dietterich (2019) tested classifier robustness to various corruptions such as blur, noise and brightness and observed that accuracy may degrade significantly on corrupted </w:t>
-      </w:r>
-      <w:r>
-        <w:rPr>
-          <w:rFonts w:ascii="Arial" w:hAnsi="Arial" w:cs="Arial"/>
-          <w:lang w:val="en-US"/>
-        </w:rPr>
         <w:lastRenderedPageBreak/>
-        <w:t>images. Michaelis et al. (2019) applied this approach to object detection and showed that detectors can have 10-20% lower mAP on common corruptions. These results highlight the importance of evaluating detectors on corrupted images, not just the standard test sets. In this project, performance is measured with COCO mAP (AP@0.50:0.95, AP@0.50, AP@0.75) and other metrics, such as precision, recall, F1 score, mean confidence and confidence drop, to better understand both detection accuracy and prediction confidence under normal, low</w:t>
+        <w:t>Another recent focus is robustness to image corruptions. Hendrycks and Dietterich (2019) tested classifier robustness to various corruptions such as blur, noise and brightness and observed that accuracy may degrade significantly on corrupted images. Michaelis et al. (2019) applied this approach to object detection and showed that detectors can have 10-20% lower mAP on common corruptions. These results highlight the importance of evaluating detectors on corrupted images, not just the standard test sets. In this project, performance is measured with COCO mAP (AP@0.50:0.95, AP@0.50, AP@0.75) and other metrics, such as precision, recall, F1 score, mean confidence and confidence drop, to better understand both detection accuracy and prediction confidence under normal, low</w:t>
       </w:r>
       <w:r>
         <w:rPr>
@@ -8015,7 +8582,7 @@
           <w:lang w:val="en-US"/>
         </w:rPr>
       </w:pPr>
-      <w:bookmarkStart w:id="16" w:name="_Toc228478057"/>
+      <w:bookmarkStart w:id="16" w:name="_Toc228539656"/>
       <w:r>
         <w:rPr>
           <w:rFonts w:ascii="Arial" w:hAnsi="Arial" w:cs="Arial"/>
@@ -8294,7 +8861,15 @@
           <w:rFonts w:ascii="Arial" w:hAnsi="Arial" w:cs="Arial"/>
           <w:lang w:val="en-US"/>
         </w:rPr>
-        <w:t xml:space="preserve"> data across models, the research seeks to evaluate model robustness and provide insights into their effectiveness in the real world.</w:t>
+        <w:t xml:space="preserve"> data across </w:t>
+      </w:r>
+      <w:r>
+        <w:rPr>
+          <w:rFonts w:ascii="Arial" w:hAnsi="Arial" w:cs="Arial"/>
+          <w:lang w:val="en-US"/>
+        </w:rPr>
+        <w:lastRenderedPageBreak/>
+        <w:t>models, the research seeks to evaluate model robustness and provide insights into their effectiveness in the real world.</w:t>
       </w:r>
     </w:p>
     <w:p>
@@ -8314,7 +8889,7 @@
           <w:lang w:val="en-US"/>
         </w:rPr>
       </w:pPr>
-      <w:bookmarkStart w:id="17" w:name="_Toc228478058"/>
+      <w:bookmarkStart w:id="17" w:name="_Toc228539657"/>
       <w:r>
         <w:rPr>
           <w:rFonts w:ascii="Arial" w:hAnsi="Arial" w:cs="Arial"/>
@@ -8325,7 +8900,6 @@
           <w:szCs w:val="24"/>
           <w:lang w:val="en-US"/>
         </w:rPr>
-        <w:lastRenderedPageBreak/>
         <w:t>2.</w:t>
       </w:r>
       <w:r>
@@ -8616,7 +9190,7 @@
           <w:lang w:val="en-US"/>
         </w:rPr>
       </w:pPr>
-      <w:bookmarkStart w:id="18" w:name="_Toc228478059"/>
+      <w:bookmarkStart w:id="18" w:name="_Toc228539658"/>
       <w:r>
         <w:rPr>
           <w:rFonts w:ascii="Arial" w:hAnsi="Arial" w:cs="Arial"/>
@@ -8668,7 +9242,7 @@
           <w:lang w:val="en-US"/>
         </w:rPr>
       </w:pPr>
-      <w:bookmarkStart w:id="19" w:name="_Toc228478060"/>
+      <w:bookmarkStart w:id="19" w:name="_Toc228539659"/>
       <w:r>
         <w:rPr>
           <w:rFonts w:ascii="Arial" w:hAnsi="Arial" w:cs="Arial"/>
@@ -8730,7 +9304,7 @@
           <w:lang w:val="en-US"/>
         </w:rPr>
       </w:pPr>
-      <w:bookmarkStart w:id="20" w:name="_Toc228478061"/>
+      <w:bookmarkStart w:id="20" w:name="_Toc228539660"/>
       <w:r>
         <w:rPr>
           <w:rFonts w:ascii="Arial" w:hAnsi="Arial" w:cs="Arial"/>
@@ -8930,6 +9504,7 @@
           <w:bCs/>
           <w:lang w:val="en-US"/>
         </w:rPr>
+        <w:lastRenderedPageBreak/>
         <w:t>Fig</w:t>
       </w:r>
       <w:r>
@@ -9132,7 +9707,7 @@
           <w:lang w:val="en-US"/>
         </w:rPr>
       </w:pPr>
-      <w:bookmarkStart w:id="21" w:name="_Toc228478062"/>
+      <w:bookmarkStart w:id="21" w:name="_Toc228539661"/>
       <w:r>
         <w:rPr>
           <w:rFonts w:ascii="Arial" w:hAnsi="Arial" w:cs="Arial"/>
@@ -9303,7 +9878,7 @@
           <w:lang w:val="en-US"/>
         </w:rPr>
       </w:pPr>
-      <w:bookmarkStart w:id="22" w:name="_Toc228478063"/>
+      <w:bookmarkStart w:id="22" w:name="_Toc228539662"/>
       <w:r>
         <w:rPr>
           <w:rFonts w:ascii="Arial" w:hAnsi="Arial" w:cs="Arial"/>
@@ -9561,7 +10136,7 @@
           <w:lang w:val="en-US"/>
         </w:rPr>
       </w:pPr>
-      <w:bookmarkStart w:id="23" w:name="_Toc228478064"/>
+      <w:bookmarkStart w:id="23" w:name="_Toc228539663"/>
       <w:r>
         <w:rPr>
           <w:rFonts w:ascii="Arial" w:hAnsi="Arial" w:cs="Arial"/>
@@ -9974,7 +10549,7 @@
           <w:lang w:val="en-US"/>
         </w:rPr>
       </w:pPr>
-      <w:bookmarkStart w:id="24" w:name="_Toc228478065"/>
+      <w:bookmarkStart w:id="24" w:name="_Toc228539664"/>
       <w:r>
         <w:rPr>
           <w:rFonts w:ascii="Arial" w:hAnsi="Arial" w:cs="Arial"/>
@@ -10219,7 +10794,7 @@
           <w:lang w:val="en-US"/>
         </w:rPr>
       </w:pPr>
-      <w:bookmarkStart w:id="25" w:name="_Toc228478066"/>
+      <w:bookmarkStart w:id="25" w:name="_Toc228539665"/>
       <w:r>
         <w:rPr>
           <w:rFonts w:ascii="Arial" w:hAnsi="Arial" w:cs="Arial"/>
@@ -10307,7 +10882,7 @@
           <w:lang w:val="en-US"/>
         </w:rPr>
       </w:pPr>
-      <w:bookmarkStart w:id="26" w:name="_Toc228478067"/>
+      <w:bookmarkStart w:id="26" w:name="_Toc228539666"/>
       <w:r>
         <w:rPr>
           <w:rFonts w:ascii="Arial" w:hAnsi="Arial" w:cs="Arial"/>
@@ -11460,7 +12035,7 @@
           <w:lang w:val="en-US"/>
         </w:rPr>
       </w:pPr>
-      <w:bookmarkStart w:id="27" w:name="_Toc228478068"/>
+      <w:bookmarkStart w:id="27" w:name="_Toc228539667"/>
       <w:r>
         <w:rPr>
           <w:rFonts w:ascii="Arial" w:hAnsi="Arial" w:cs="Arial"/>
@@ -12777,7 +13352,7 @@
           <w:lang w:val="en-US"/>
         </w:rPr>
       </w:pPr>
-      <w:bookmarkStart w:id="28" w:name="_Toc228478069"/>
+      <w:bookmarkStart w:id="28" w:name="_Toc228539668"/>
       <w:r>
         <w:rPr>
           <w:rFonts w:ascii="Arial" w:hAnsi="Arial" w:cs="Arial"/>
@@ -12847,7 +13422,7 @@
           <w:lang w:val="en-US"/>
         </w:rPr>
       </w:pPr>
-      <w:bookmarkStart w:id="29" w:name="_Toc228478070"/>
+      <w:bookmarkStart w:id="29" w:name="_Toc228539669"/>
       <w:r>
         <w:rPr>
           <w:rFonts w:ascii="Arial" w:hAnsi="Arial" w:cs="Arial"/>
@@ -13776,7 +14351,7 @@
           <w:lang w:val="en-US"/>
         </w:rPr>
       </w:pPr>
-      <w:bookmarkStart w:id="30" w:name="_Toc228478071"/>
+      <w:bookmarkStart w:id="30" w:name="_Toc228539670"/>
       <w:r>
         <w:rPr>
           <w:rFonts w:ascii="Arial" w:hAnsi="Arial" w:cs="Arial"/>
@@ -13977,7 +14552,7 @@
           <w:lang w:val="en-US"/>
         </w:rPr>
       </w:pPr>
-      <w:bookmarkStart w:id="31" w:name="_Toc228478072"/>
+      <w:bookmarkStart w:id="31" w:name="_Toc228539671"/>
       <w:r>
         <w:rPr>
           <w:rFonts w:ascii="Arial" w:hAnsi="Arial" w:cs="Arial"/>
@@ -14135,7 +14710,7 @@
           <w:lang w:val="en-US"/>
         </w:rPr>
       </w:pPr>
-      <w:bookmarkStart w:id="32" w:name="_Toc228478073"/>
+      <w:bookmarkStart w:id="32" w:name="_Toc228539672"/>
       <w:r>
         <w:rPr>
           <w:rFonts w:ascii="Arial" w:hAnsi="Arial" w:cs="Arial"/>
@@ -14786,7 +15361,7 @@
           <w:lang w:val="en-US"/>
         </w:rPr>
       </w:pPr>
-      <w:bookmarkStart w:id="33" w:name="_Toc228478074"/>
+      <w:bookmarkStart w:id="33" w:name="_Toc228539673"/>
       <w:r>
         <w:rPr>
           <w:rFonts w:ascii="Arial" w:hAnsi="Arial" w:cs="Arial"/>
@@ -15423,7 +15998,7 @@
           <w:lang w:val="en-US"/>
         </w:rPr>
       </w:pPr>
-      <w:bookmarkStart w:id="34" w:name="_Toc228478075"/>
+      <w:bookmarkStart w:id="34" w:name="_Toc228539674"/>
       <w:r>
         <w:rPr>
           <w:rFonts w:ascii="Arial" w:hAnsi="Arial" w:cs="Arial"/>
@@ -15541,7 +16116,7 @@
           <w:lang w:val="en-US"/>
         </w:rPr>
       </w:pPr>
-      <w:bookmarkStart w:id="35" w:name="_Toc228478076"/>
+      <w:bookmarkStart w:id="35" w:name="_Toc228539675"/>
       <w:r>
         <w:rPr>
           <w:rFonts w:ascii="Arial" w:hAnsi="Arial" w:cs="Arial"/>
@@ -15592,15 +16167,7 @@
           <w:sz w:val="22"/>
           <w:szCs w:val="22"/>
         </w:rPr>
-        <w:t>(Gonzalez and Woods, 2018)</w:t>
-      </w:r>
-      <w:r>
-        <w:rPr>
-          <w:rFonts w:ascii="Arial" w:eastAsia="Arial" w:hAnsi="Arial" w:cs="Arial"/>
-          <w:sz w:val="22"/>
-          <w:szCs w:val="22"/>
-        </w:rPr>
-        <w:t>. The transformation is given by the following equation:</w:t>
+        <w:t>(Gonzalez and Woods, 2018). The transformation is given by the following equation:</w:t>
       </w:r>
     </w:p>
     <w:p>
@@ -15617,8 +16184,37 @@
             <w:rFonts w:ascii="Cambria Math" w:eastAsia="Arial" w:hAnsi="Cambria Math" w:cs="Arial"/>
             <w:szCs w:val="24"/>
           </w:rPr>
-          <m:t>s=r^γ</m:t>
+          <m:t>s=</m:t>
         </m:r>
+        <m:sSup>
+          <m:sSupPr>
+            <m:ctrlPr>
+              <w:rPr>
+                <w:rFonts w:ascii="Cambria Math" w:eastAsia="Arial" w:hAnsi="Cambria Math" w:cs="Arial"/>
+                <w:i/>
+                <w:szCs w:val="24"/>
+              </w:rPr>
+            </m:ctrlPr>
+          </m:sSupPr>
+          <m:e>
+            <m:r>
+              <w:rPr>
+                <w:rFonts w:ascii="Cambria Math" w:eastAsia="Arial" w:hAnsi="Cambria Math" w:cs="Arial"/>
+                <w:szCs w:val="24"/>
+              </w:rPr>
+              <m:t>r</m:t>
+            </m:r>
+          </m:e>
+          <m:sup>
+            <m:r>
+              <w:rPr>
+                <w:rFonts w:ascii="Cambria Math" w:eastAsia="Arial" w:hAnsi="Cambria Math" w:cs="Arial"/>
+                <w:szCs w:val="24"/>
+              </w:rPr>
+              <m:t>γ</m:t>
+            </m:r>
+          </m:sup>
+        </m:sSup>
       </m:oMath>
       <w:r>
         <w:rPr>
@@ -15790,14 +16386,7 @@
             <w:rFonts w:ascii="Cambria Math" w:eastAsia="Arial" w:hAnsi="Cambria Math" w:cs="Arial"/>
             <w:szCs w:val="24"/>
           </w:rPr>
-          <m:t>γ</m:t>
-        </m:r>
-        <m:r>
-          <w:rPr>
-            <w:rFonts w:ascii="Cambria Math" w:eastAsia="Arial" w:hAnsi="Cambria Math" w:cs="Arial"/>
-            <w:szCs w:val="24"/>
-          </w:rPr>
-          <m:t>=</m:t>
+          <m:t>γ=</m:t>
         </m:r>
       </m:oMath>
       <w:r>
@@ -15813,14 +16402,7 @@
             <w:rFonts w:ascii="Cambria Math" w:eastAsia="Arial" w:hAnsi="Cambria Math" w:cs="Arial"/>
             <w:szCs w:val="24"/>
           </w:rPr>
-          <m:t>γ</m:t>
-        </m:r>
-        <m:r>
-          <w:rPr>
-            <w:rFonts w:ascii="Cambria Math" w:eastAsia="Arial" w:hAnsi="Cambria Math" w:cs="Arial"/>
-            <w:szCs w:val="24"/>
-          </w:rPr>
-          <m:t xml:space="preserve">= </m:t>
+          <m:t xml:space="preserve">γ= </m:t>
         </m:r>
       </m:oMath>
       <w:r>
@@ -15854,21 +16436,7 @@
           <w:szCs w:val="24"/>
         </w:rPr>
         <w:lastRenderedPageBreak/>
-        <w:t xml:space="preserve">In real </w:t>
-      </w:r>
-      <w:r>
-        <w:rPr>
-          <w:rFonts w:ascii="Arial" w:eastAsia="Arial" w:hAnsi="Arial" w:cs="Arial"/>
-          <w:szCs w:val="24"/>
-        </w:rPr>
-        <w:t xml:space="preserve">applications, since pixel values are stored as integers in the range </w:t>
-      </w:r>
-      <w:r>
-        <w:rPr>
-          <w:rFonts w:ascii="Arial" w:eastAsia="Arial" w:hAnsi="Arial" w:cs="Arial"/>
-          <w:szCs w:val="24"/>
-        </w:rPr>
-        <w:t>[0, 255], the transformation is performed using a lookup table (LUT), where each input value is computed as:</w:t>
+        <w:t>In real applications, since pixel values are stored as integers in the range [0, 255], the transformation is performed using a lookup table (LUT), where each input value is computed as:</w:t>
       </w:r>
     </w:p>
     <w:p>
@@ -16102,16 +16670,7 @@
                 <w:bCs/>
                 <w:szCs w:val="24"/>
               </w:rPr>
-              <w:t>De</w:t>
-            </w:r>
-            <w:r>
-              <w:rPr>
-                <w:rFonts w:ascii="Arial" w:eastAsia="Times New Roman" w:hAnsi="Arial" w:cs="Arial"/>
-                <w:b/>
-                <w:bCs/>
-                <w:szCs w:val="24"/>
-              </w:rPr>
-              <w:t>gradation Factor</w:t>
+              <w:t>Degradation Factor</w:t>
             </w:r>
           </w:p>
         </w:tc>
@@ -16474,7 +17033,7 @@
           <w:lang w:val="en-US"/>
         </w:rPr>
       </w:pPr>
-      <w:bookmarkStart w:id="36" w:name="_Toc228478077"/>
+      <w:bookmarkStart w:id="36" w:name="_Toc228539676"/>
       <w:r>
         <w:rPr>
           <w:rFonts w:ascii="Arial" w:hAnsi="Arial" w:cs="Arial"/>
@@ -16518,15 +17077,7 @@
           <w:szCs w:val="24"/>
           <w:lang w:val="en-US"/>
         </w:rPr>
-        <w:t xml:space="preserve">CLAHE stands for Contrast Limited Adaptive Histogram Equalization. </w:t>
-      </w:r>
-      <w:r>
-        <w:rPr>
-          <w:rFonts w:ascii="Arial" w:hAnsi="Arial" w:cs="Arial"/>
-          <w:szCs w:val="24"/>
-          <w:lang w:val="en-US"/>
-        </w:rPr>
-        <w:t>It is an adaptive contrast enhancement technique that enhances the visibility of different parts of an image separately, instead of global</w:t>
+        <w:t>CLAHE stands for Contrast Limited Adaptive Histogram Equalization. It is an adaptive contrast enhancement technique that enhances the visibility of different parts of an image separately, instead of global</w:t>
       </w:r>
       <w:r>
         <w:rPr>
@@ -16977,7 +17528,7 @@
           <w:lang w:val="en-US"/>
         </w:rPr>
       </w:pPr>
-      <w:bookmarkStart w:id="37" w:name="_Toc228478078"/>
+      <w:bookmarkStart w:id="37" w:name="_Toc228539677"/>
       <w:r>
         <w:rPr>
           <w:rFonts w:ascii="Arial" w:hAnsi="Arial" w:cs="Arial"/>
@@ -17030,13 +17581,7 @@
         <w:rPr>
           <w:rFonts w:ascii="Arial" w:hAnsi="Arial" w:cs="Arial"/>
         </w:rPr>
-        <w:t>y</w:t>
-      </w:r>
-      <w:r>
-        <w:rPr>
-          <w:rFonts w:ascii="Arial" w:hAnsi="Arial" w:cs="Arial"/>
-        </w:rPr>
-        <w:t xml:space="preserve"> first applying gamma correction to enhance the global brightness level, the image can then be provided to CLAHE to improve local contrast within the image regions.</w:t>
+        <w:t>y first applying gamma correction to enhance the global brightness level, the image can then be provided to CLAHE to improve local contrast within the image regions.</w:t>
       </w:r>
     </w:p>
     <w:p>
@@ -17593,7 +18138,7 @@
           <w:lang w:val="en-US"/>
         </w:rPr>
       </w:pPr>
-      <w:bookmarkStart w:id="38" w:name="_Toc228478079"/>
+      <w:bookmarkStart w:id="38" w:name="_Toc228539678"/>
       <w:r>
         <w:rPr>
           <w:rFonts w:ascii="Arial" w:hAnsi="Arial" w:cs="Arial"/>
@@ -17635,10 +18180,1065 @@
     </w:p>
     <w:p>
       <w:pPr>
-        <w:rPr>
-          <w:lang w:val="en-US"/>
-        </w:rPr>
-      </w:pPr>
+        <w:spacing w:line="360" w:lineRule="auto"/>
+        <w:jc w:val="both"/>
+        <w:rPr>
+          <w:rFonts w:ascii="Arial" w:hAnsi="Arial" w:cs="Arial"/>
+          <w:lang w:val="en-US"/>
+        </w:rPr>
+      </w:pPr>
+      <w:r>
+        <w:rPr>
+          <w:rFonts w:ascii="Arial" w:hAnsi="Arial" w:cs="Arial"/>
+          <w:lang w:val="en-US"/>
+        </w:rPr>
+        <w:t xml:space="preserve">In this project, three object detection models </w:t>
+      </w:r>
+      <w:r>
+        <w:rPr>
+          <w:rFonts w:ascii="Arial" w:hAnsi="Arial" w:cs="Arial"/>
+          <w:lang w:val="en-US"/>
+        </w:rPr>
+        <w:t xml:space="preserve">were used: </w:t>
+      </w:r>
+      <w:r>
+        <w:rPr>
+          <w:rFonts w:ascii="Arial" w:hAnsi="Arial" w:cs="Arial"/>
+          <w:lang w:val="en-US"/>
+        </w:rPr>
+        <w:t xml:space="preserve">YOLOv8, SSD </w:t>
+      </w:r>
+      <w:proofErr w:type="spellStart"/>
+      <w:r>
+        <w:rPr>
+          <w:rFonts w:ascii="Arial" w:hAnsi="Arial" w:cs="Arial"/>
+          <w:lang w:val="en-US"/>
+        </w:rPr>
+        <w:t>MobileNet</w:t>
+      </w:r>
+      <w:proofErr w:type="spellEnd"/>
+      <w:r>
+        <w:rPr>
+          <w:rFonts w:ascii="Arial" w:hAnsi="Arial" w:cs="Arial"/>
+          <w:lang w:val="en-US"/>
+        </w:rPr>
+        <w:t xml:space="preserve"> and Faster R-CNN. The models were not trained or fine-tuned.</w:t>
+      </w:r>
+      <w:r>
+        <w:rPr>
+          <w:rFonts w:ascii="Arial" w:hAnsi="Arial" w:cs="Arial"/>
+          <w:lang w:val="en-US"/>
+        </w:rPr>
+        <w:t xml:space="preserve"> All the models used </w:t>
+      </w:r>
+      <w:r>
+        <w:rPr>
+          <w:rFonts w:ascii="Arial" w:hAnsi="Arial" w:cs="Arial"/>
+          <w:lang w:val="en-US"/>
+        </w:rPr>
+        <w:t xml:space="preserve">publicly available COCO pretrained weights. This decision was made because the aim of the project is to test robustness of detection under various image conditions, rather than the development of new models. The same confidence threshold of 0.25 was applied for all three models and 16 image conditions to make the results comparable. The three models are </w:t>
+      </w:r>
+      <w:r>
+        <w:rPr>
+          <w:rFonts w:ascii="Arial" w:hAnsi="Arial" w:cs="Arial"/>
+          <w:lang w:val="en-US"/>
+        </w:rPr>
+        <w:t>summarized</w:t>
+      </w:r>
+      <w:r>
+        <w:rPr>
+          <w:rFonts w:ascii="Arial" w:hAnsi="Arial" w:cs="Arial"/>
+          <w:lang w:val="en-US"/>
+        </w:rPr>
+        <w:t xml:space="preserve"> in Table 7.5.</w:t>
+      </w:r>
+    </w:p>
+    <w:tbl>
+      <w:tblPr>
+        <w:tblStyle w:val="TableGrid"/>
+        <w:tblW w:w="9779" w:type="dxa"/>
+        <w:tblInd w:w="-10" w:type="dxa"/>
+        <w:tblBorders>
+          <w:top w:val="single" w:sz="8" w:space="0" w:color="auto"/>
+          <w:left w:val="single" w:sz="8" w:space="0" w:color="auto"/>
+          <w:bottom w:val="single" w:sz="8" w:space="0" w:color="auto"/>
+          <w:right w:val="single" w:sz="8" w:space="0" w:color="auto"/>
+          <w:insideH w:val="single" w:sz="8" w:space="0" w:color="auto"/>
+          <w:insideV w:val="single" w:sz="8" w:space="0" w:color="auto"/>
+        </w:tblBorders>
+        <w:tblLayout w:type="fixed"/>
+        <w:tblLook w:val="0600" w:firstRow="0" w:lastRow="0" w:firstColumn="0" w:lastColumn="0" w:noHBand="1" w:noVBand="1"/>
+      </w:tblPr>
+      <w:tblGrid>
+        <w:gridCol w:w="1968"/>
+        <w:gridCol w:w="1601"/>
+        <w:gridCol w:w="3271"/>
+        <w:gridCol w:w="2939"/>
+      </w:tblGrid>
+      <w:tr>
+        <w:trPr>
+          <w:trHeight w:val="333"/>
+        </w:trPr>
+        <w:tc>
+          <w:tcPr>
+            <w:tcW w:w="1968" w:type="dxa"/>
+          </w:tcPr>
+          <w:p>
+            <w:pPr>
+              <w:widowControl w:val="0"/>
+              <w:spacing w:line="360" w:lineRule="auto"/>
+              <w:rPr>
+                <w:rFonts w:ascii="Arial" w:eastAsia="Times New Roman" w:hAnsi="Arial" w:cs="Arial"/>
+                <w:b/>
+                <w:bCs/>
+                <w:szCs w:val="24"/>
+              </w:rPr>
+            </w:pPr>
+            <w:r>
+              <w:rPr>
+                <w:rFonts w:ascii="Arial" w:eastAsia="Times New Roman" w:hAnsi="Arial" w:cs="Arial"/>
+                <w:b/>
+                <w:bCs/>
+                <w:szCs w:val="24"/>
+              </w:rPr>
+              <w:t>Model</w:t>
+            </w:r>
+          </w:p>
+        </w:tc>
+        <w:tc>
+          <w:tcPr>
+            <w:tcW w:w="1601" w:type="dxa"/>
+          </w:tcPr>
+          <w:p>
+            <w:pPr>
+              <w:widowControl w:val="0"/>
+              <w:spacing w:line="360" w:lineRule="auto"/>
+              <w:rPr>
+                <w:rFonts w:ascii="Arial" w:eastAsia="Times New Roman" w:hAnsi="Arial" w:cs="Arial"/>
+                <w:b/>
+                <w:bCs/>
+                <w:szCs w:val="24"/>
+              </w:rPr>
+            </w:pPr>
+            <w:r>
+              <w:rPr>
+                <w:rFonts w:ascii="Arial" w:eastAsia="Times New Roman" w:hAnsi="Arial" w:cs="Arial"/>
+                <w:b/>
+                <w:bCs/>
+                <w:szCs w:val="24"/>
+              </w:rPr>
+              <w:t>Library</w:t>
+            </w:r>
+          </w:p>
+        </w:tc>
+        <w:tc>
+          <w:tcPr>
+            <w:tcW w:w="3271" w:type="dxa"/>
+          </w:tcPr>
+          <w:p>
+            <w:pPr>
+              <w:widowControl w:val="0"/>
+              <w:spacing w:line="360" w:lineRule="auto"/>
+              <w:rPr>
+                <w:rFonts w:ascii="Arial" w:eastAsia="Times New Roman" w:hAnsi="Arial" w:cs="Arial"/>
+                <w:b/>
+                <w:bCs/>
+                <w:szCs w:val="24"/>
+              </w:rPr>
+            </w:pPr>
+            <w:r>
+              <w:rPr>
+                <w:rFonts w:ascii="Arial" w:eastAsia="Times New Roman" w:hAnsi="Arial" w:cs="Arial"/>
+                <w:b/>
+                <w:bCs/>
+                <w:szCs w:val="24"/>
+              </w:rPr>
+              <w:t>Pre-trained Weights</w:t>
+            </w:r>
+          </w:p>
+        </w:tc>
+        <w:tc>
+          <w:tcPr>
+            <w:tcW w:w="2939" w:type="dxa"/>
+          </w:tcPr>
+          <w:p>
+            <w:pPr>
+              <w:widowControl w:val="0"/>
+              <w:spacing w:line="360" w:lineRule="auto"/>
+              <w:rPr>
+                <w:rFonts w:ascii="Arial" w:eastAsia="Times New Roman" w:hAnsi="Arial" w:cs="Arial"/>
+                <w:b/>
+                <w:bCs/>
+                <w:szCs w:val="24"/>
+              </w:rPr>
+            </w:pPr>
+            <w:r>
+              <w:rPr>
+                <w:rFonts w:ascii="Arial" w:eastAsia="Times New Roman" w:hAnsi="Arial" w:cs="Arial"/>
+                <w:b/>
+                <w:bCs/>
+                <w:szCs w:val="24"/>
+              </w:rPr>
+              <w:t>Confidence Threshold</w:t>
+            </w:r>
+          </w:p>
+        </w:tc>
+      </w:tr>
+      <w:tr>
+        <w:trPr>
+          <w:trHeight w:val="333"/>
+        </w:trPr>
+        <w:tc>
+          <w:tcPr>
+            <w:tcW w:w="1968" w:type="dxa"/>
+          </w:tcPr>
+          <w:p>
+            <w:pPr>
+              <w:widowControl w:val="0"/>
+              <w:spacing w:line="360" w:lineRule="auto"/>
+              <w:rPr>
+                <w:rFonts w:ascii="Arial" w:eastAsia="Times New Roman" w:hAnsi="Arial" w:cs="Arial"/>
+                <w:szCs w:val="24"/>
+              </w:rPr>
+            </w:pPr>
+            <w:r>
+              <w:rPr>
+                <w:rFonts w:ascii="Arial" w:eastAsia="Times New Roman" w:hAnsi="Arial" w:cs="Arial"/>
+                <w:szCs w:val="24"/>
+              </w:rPr>
+              <w:t>YOLOv8</w:t>
+            </w:r>
+          </w:p>
+        </w:tc>
+        <w:tc>
+          <w:tcPr>
+            <w:tcW w:w="1601" w:type="dxa"/>
+          </w:tcPr>
+          <w:p>
+            <w:pPr>
+              <w:widowControl w:val="0"/>
+              <w:spacing w:line="360" w:lineRule="auto"/>
+              <w:rPr>
+                <w:rFonts w:ascii="Arial" w:eastAsia="Times New Roman" w:hAnsi="Arial" w:cs="Arial"/>
+                <w:szCs w:val="24"/>
+              </w:rPr>
+            </w:pPr>
+            <w:proofErr w:type="spellStart"/>
+            <w:r>
+              <w:rPr>
+                <w:rFonts w:ascii="Arial" w:eastAsia="Times New Roman" w:hAnsi="Arial" w:cs="Arial"/>
+                <w:szCs w:val="24"/>
+              </w:rPr>
+              <w:t>Ultralytics</w:t>
+            </w:r>
+            <w:proofErr w:type="spellEnd"/>
+          </w:p>
+        </w:tc>
+        <w:tc>
+          <w:tcPr>
+            <w:tcW w:w="3271" w:type="dxa"/>
+            <w:vAlign w:val="center"/>
+          </w:tcPr>
+          <w:p>
+            <w:pPr>
+              <w:widowControl w:val="0"/>
+              <w:spacing w:line="360" w:lineRule="auto"/>
+              <w:rPr>
+                <w:rFonts w:ascii="Arial" w:eastAsia="Times New Roman" w:hAnsi="Arial" w:cs="Arial"/>
+                <w:szCs w:val="24"/>
+              </w:rPr>
+            </w:pPr>
+            <w:r>
+              <w:rPr>
+                <w:rFonts w:ascii="Arial" w:eastAsia="Arial" w:hAnsi="Arial" w:cs="Arial"/>
+                <w:szCs w:val="24"/>
+              </w:rPr>
+              <w:t>yolov8n.pt (COCO-pretrained)</w:t>
+            </w:r>
+          </w:p>
+        </w:tc>
+        <w:tc>
+          <w:tcPr>
+            <w:tcW w:w="2939" w:type="dxa"/>
+          </w:tcPr>
+          <w:p>
+            <w:pPr>
+              <w:widowControl w:val="0"/>
+              <w:spacing w:line="360" w:lineRule="auto"/>
+              <w:rPr>
+                <w:rFonts w:ascii="Arial" w:eastAsia="Times New Roman" w:hAnsi="Arial" w:cs="Arial"/>
+                <w:szCs w:val="24"/>
+              </w:rPr>
+            </w:pPr>
+            <w:r>
+              <w:rPr>
+                <w:rFonts w:ascii="Arial" w:eastAsia="Times New Roman" w:hAnsi="Arial" w:cs="Arial"/>
+                <w:szCs w:val="24"/>
+              </w:rPr>
+              <w:t>0.25</w:t>
+            </w:r>
+          </w:p>
+        </w:tc>
+      </w:tr>
+      <w:tr>
+        <w:trPr>
+          <w:trHeight w:val="333"/>
+        </w:trPr>
+        <w:tc>
+          <w:tcPr>
+            <w:tcW w:w="1968" w:type="dxa"/>
+          </w:tcPr>
+          <w:p>
+            <w:pPr>
+              <w:widowControl w:val="0"/>
+              <w:spacing w:line="360" w:lineRule="auto"/>
+              <w:rPr>
+                <w:rFonts w:ascii="Arial" w:eastAsia="Times New Roman" w:hAnsi="Arial" w:cs="Arial"/>
+                <w:szCs w:val="24"/>
+              </w:rPr>
+            </w:pPr>
+            <w:r>
+              <w:rPr>
+                <w:rFonts w:ascii="Arial" w:eastAsia="Times New Roman" w:hAnsi="Arial" w:cs="Arial"/>
+                <w:szCs w:val="24"/>
+              </w:rPr>
+              <w:t xml:space="preserve">SSD </w:t>
+            </w:r>
+            <w:proofErr w:type="spellStart"/>
+            <w:r>
+              <w:rPr>
+                <w:rFonts w:ascii="Arial" w:eastAsia="Times New Roman" w:hAnsi="Arial" w:cs="Arial"/>
+                <w:szCs w:val="24"/>
+              </w:rPr>
+              <w:t>MobileNet</w:t>
+            </w:r>
+            <w:proofErr w:type="spellEnd"/>
+          </w:p>
+        </w:tc>
+        <w:tc>
+          <w:tcPr>
+            <w:tcW w:w="1601" w:type="dxa"/>
+          </w:tcPr>
+          <w:p>
+            <w:pPr>
+              <w:widowControl w:val="0"/>
+              <w:spacing w:line="360" w:lineRule="auto"/>
+              <w:rPr>
+                <w:rFonts w:ascii="Arial" w:eastAsia="Times New Roman" w:hAnsi="Arial" w:cs="Arial"/>
+                <w:szCs w:val="24"/>
+              </w:rPr>
+            </w:pPr>
+            <w:proofErr w:type="spellStart"/>
+            <w:r>
+              <w:rPr>
+                <w:rFonts w:ascii="Arial" w:eastAsia="Times New Roman" w:hAnsi="Arial" w:cs="Arial"/>
+                <w:szCs w:val="24"/>
+              </w:rPr>
+              <w:t>torchvision</w:t>
+            </w:r>
+            <w:proofErr w:type="spellEnd"/>
+          </w:p>
+        </w:tc>
+        <w:tc>
+          <w:tcPr>
+            <w:tcW w:w="3271" w:type="dxa"/>
+            <w:vAlign w:val="center"/>
+          </w:tcPr>
+          <w:p>
+            <w:pPr>
+              <w:widowControl w:val="0"/>
+              <w:spacing w:line="360" w:lineRule="auto"/>
+              <w:rPr>
+                <w:rFonts w:ascii="Arial" w:eastAsia="Times New Roman" w:hAnsi="Arial" w:cs="Arial"/>
+                <w:szCs w:val="24"/>
+              </w:rPr>
+            </w:pPr>
+            <w:r>
+              <w:rPr>
+                <w:rFonts w:ascii="Arial" w:eastAsia="Arial" w:hAnsi="Arial" w:cs="Arial"/>
+                <w:szCs w:val="24"/>
+              </w:rPr>
+              <w:t>SSDLite320_MobileNet_V3_Large</w:t>
+            </w:r>
+            <w:r>
+              <w:rPr>
+                <w:rFonts w:ascii="Arial" w:eastAsia="Arial" w:hAnsi="Arial" w:cs="Arial"/>
+                <w:szCs w:val="24"/>
+              </w:rPr>
+              <w:t xml:space="preserve"> -</w:t>
+            </w:r>
+            <w:r>
+              <w:rPr>
+                <w:rFonts w:ascii="Arial" w:eastAsia="Arial" w:hAnsi="Arial" w:cs="Arial"/>
+                <w:szCs w:val="24"/>
+              </w:rPr>
+              <w:t xml:space="preserve"> DEFAULT</w:t>
+            </w:r>
+          </w:p>
+        </w:tc>
+        <w:tc>
+          <w:tcPr>
+            <w:tcW w:w="2939" w:type="dxa"/>
+          </w:tcPr>
+          <w:p>
+            <w:pPr>
+              <w:widowControl w:val="0"/>
+              <w:spacing w:line="360" w:lineRule="auto"/>
+              <w:rPr>
+                <w:rFonts w:ascii="Arial" w:eastAsia="Times New Roman" w:hAnsi="Arial" w:cs="Arial"/>
+                <w:szCs w:val="24"/>
+              </w:rPr>
+            </w:pPr>
+            <w:r>
+              <w:rPr>
+                <w:rFonts w:ascii="Arial" w:eastAsia="Times New Roman" w:hAnsi="Arial" w:cs="Arial"/>
+                <w:szCs w:val="24"/>
+              </w:rPr>
+              <w:t>0.25</w:t>
+            </w:r>
+          </w:p>
+        </w:tc>
+      </w:tr>
+      <w:tr>
+        <w:trPr>
+          <w:trHeight w:val="333"/>
+        </w:trPr>
+        <w:tc>
+          <w:tcPr>
+            <w:tcW w:w="1968" w:type="dxa"/>
+          </w:tcPr>
+          <w:p>
+            <w:pPr>
+              <w:widowControl w:val="0"/>
+              <w:spacing w:line="360" w:lineRule="auto"/>
+              <w:rPr>
+                <w:rFonts w:ascii="Arial" w:eastAsia="Times New Roman" w:hAnsi="Arial" w:cs="Arial"/>
+                <w:szCs w:val="24"/>
+              </w:rPr>
+            </w:pPr>
+            <w:r>
+              <w:rPr>
+                <w:rFonts w:ascii="Arial" w:eastAsia="Times New Roman" w:hAnsi="Arial" w:cs="Arial"/>
+                <w:szCs w:val="24"/>
+              </w:rPr>
+              <w:t>Faster R-CNN</w:t>
+            </w:r>
+          </w:p>
+        </w:tc>
+        <w:tc>
+          <w:tcPr>
+            <w:tcW w:w="1601" w:type="dxa"/>
+          </w:tcPr>
+          <w:p>
+            <w:pPr>
+              <w:widowControl w:val="0"/>
+              <w:spacing w:line="360" w:lineRule="auto"/>
+              <w:rPr>
+                <w:rFonts w:ascii="Arial" w:eastAsia="Times New Roman" w:hAnsi="Arial" w:cs="Arial"/>
+                <w:szCs w:val="24"/>
+              </w:rPr>
+            </w:pPr>
+            <w:proofErr w:type="spellStart"/>
+            <w:r>
+              <w:rPr>
+                <w:rFonts w:ascii="Arial" w:eastAsia="Times New Roman" w:hAnsi="Arial" w:cs="Arial"/>
+                <w:szCs w:val="24"/>
+              </w:rPr>
+              <w:t>torchvision</w:t>
+            </w:r>
+            <w:proofErr w:type="spellEnd"/>
+          </w:p>
+        </w:tc>
+        <w:tc>
+          <w:tcPr>
+            <w:tcW w:w="3271" w:type="dxa"/>
+            <w:vAlign w:val="center"/>
+          </w:tcPr>
+          <w:p>
+            <w:pPr>
+              <w:widowControl w:val="0"/>
+              <w:spacing w:line="360" w:lineRule="auto"/>
+              <w:rPr>
+                <w:rFonts w:ascii="Arial" w:eastAsia="Times New Roman" w:hAnsi="Arial" w:cs="Arial"/>
+                <w:szCs w:val="24"/>
+              </w:rPr>
+            </w:pPr>
+            <w:r>
+              <w:rPr>
+                <w:rFonts w:ascii="Arial" w:eastAsia="Arial" w:hAnsi="Arial" w:cs="Arial"/>
+                <w:szCs w:val="24"/>
+              </w:rPr>
+              <w:t>FasterRCNN_ResNet50_FP</w:t>
+            </w:r>
+            <w:r>
+              <w:rPr>
+                <w:rFonts w:ascii="Arial" w:eastAsia="Arial" w:hAnsi="Arial" w:cs="Arial"/>
+                <w:szCs w:val="24"/>
+              </w:rPr>
+              <w:t xml:space="preserve">N - </w:t>
+            </w:r>
+            <w:r>
+              <w:rPr>
+                <w:rFonts w:ascii="Arial" w:eastAsia="Arial" w:hAnsi="Arial" w:cs="Arial"/>
+                <w:szCs w:val="24"/>
+              </w:rPr>
+              <w:t xml:space="preserve"> DEFAULT</w:t>
+            </w:r>
+          </w:p>
+        </w:tc>
+        <w:tc>
+          <w:tcPr>
+            <w:tcW w:w="2939" w:type="dxa"/>
+          </w:tcPr>
+          <w:p>
+            <w:pPr>
+              <w:widowControl w:val="0"/>
+              <w:spacing w:line="360" w:lineRule="auto"/>
+              <w:rPr>
+                <w:rFonts w:ascii="Arial" w:eastAsia="Times New Roman" w:hAnsi="Arial" w:cs="Arial"/>
+                <w:szCs w:val="24"/>
+              </w:rPr>
+            </w:pPr>
+            <w:r>
+              <w:rPr>
+                <w:rFonts w:ascii="Arial" w:eastAsia="Times New Roman" w:hAnsi="Arial" w:cs="Arial"/>
+                <w:szCs w:val="24"/>
+              </w:rPr>
+              <w:t>0.25</w:t>
+            </w:r>
+          </w:p>
+        </w:tc>
+      </w:tr>
+    </w:tbl>
+    <w:p>
+      <w:pPr>
+        <w:spacing w:line="360" w:lineRule="auto"/>
+        <w:rPr>
+          <w:rFonts w:ascii="Arial" w:hAnsi="Arial" w:cs="Arial"/>
+          <w:lang w:val="en-US"/>
+        </w:rPr>
+      </w:pPr>
+    </w:p>
+    <w:p>
+      <w:pPr>
+        <w:spacing w:line="360" w:lineRule="auto"/>
+        <w:jc w:val="center"/>
+        <w:rPr>
+          <w:rFonts w:ascii="Arial" w:hAnsi="Arial" w:cs="Arial"/>
+          <w:b/>
+          <w:bCs/>
+          <w:lang w:val="en-US"/>
+        </w:rPr>
+      </w:pPr>
+      <w:r>
+        <w:rPr>
+          <w:rFonts w:ascii="Arial" w:hAnsi="Arial" w:cs="Arial"/>
+          <w:b/>
+          <w:bCs/>
+          <w:lang w:val="en-US"/>
+        </w:rPr>
+        <w:t>Table 7.5: Overview of the three detection models used in the project</w:t>
+      </w:r>
+    </w:p>
+    <w:p>
+      <w:pPr>
+        <w:pStyle w:val="Heading3"/>
+        <w:numPr>
+          <w:ilvl w:val="0"/>
+          <w:numId w:val="0"/>
+        </w:numPr>
+        <w:rPr>
+          <w:rFonts w:ascii="Arial" w:hAnsi="Arial" w:cs="Arial"/>
+          <w:b/>
+          <w:bCs/>
+          <w:color w:val="auto"/>
+          <w:sz w:val="24"/>
+          <w:szCs w:val="24"/>
+          <w:lang w:val="en-US"/>
+        </w:rPr>
+      </w:pPr>
+      <w:bookmarkStart w:id="39" w:name="_Toc228539679"/>
+      <w:r>
+        <w:rPr>
+          <w:rFonts w:ascii="Arial" w:hAnsi="Arial" w:cs="Arial"/>
+          <w:b/>
+          <w:bCs/>
+          <w:color w:val="auto"/>
+          <w:sz w:val="24"/>
+          <w:szCs w:val="24"/>
+          <w:lang w:val="en-US"/>
+        </w:rPr>
+        <w:t>7.5.1</w:t>
+      </w:r>
+      <w:r>
+        <w:rPr>
+          <w:rFonts w:ascii="Arial" w:hAnsi="Arial" w:cs="Arial"/>
+          <w:b/>
+          <w:bCs/>
+          <w:color w:val="auto"/>
+          <w:sz w:val="24"/>
+          <w:szCs w:val="24"/>
+          <w:lang w:val="en-US"/>
+        </w:rPr>
+        <w:tab/>
+        <w:t>YOLOv8</w:t>
+      </w:r>
+      <w:bookmarkEnd w:id="39"/>
+    </w:p>
+    <w:p>
+      <w:pPr>
+        <w:spacing w:line="360" w:lineRule="auto"/>
+        <w:jc w:val="both"/>
+        <w:rPr>
+          <w:rFonts w:ascii="Arial" w:hAnsi="Arial" w:cs="Arial"/>
+          <w:szCs w:val="24"/>
+          <w:lang w:val="en-US"/>
+        </w:rPr>
+      </w:pPr>
+      <w:r>
+        <w:rPr>
+          <w:rFonts w:ascii="Arial" w:hAnsi="Arial" w:cs="Arial"/>
+          <w:szCs w:val="24"/>
+          <w:lang w:val="en-US"/>
+        </w:rPr>
+        <w:t>YOLOv8</w:t>
+      </w:r>
+      <w:r>
+        <w:rPr>
+          <w:rFonts w:ascii="Arial" w:hAnsi="Arial" w:cs="Arial"/>
+          <w:szCs w:val="24"/>
+          <w:lang w:val="en-US"/>
+        </w:rPr>
+        <w:t xml:space="preserve"> </w:t>
+      </w:r>
+      <w:r>
+        <w:rPr>
+          <w:rFonts w:ascii="Arial" w:eastAsia="Arial" w:hAnsi="Arial" w:cs="Arial"/>
+          <w:szCs w:val="24"/>
+        </w:rPr>
+        <w:t>(Jocher, Chaurasia and Qiu, 2023)</w:t>
+      </w:r>
+      <w:r>
+        <w:rPr>
+          <w:rFonts w:ascii="Arial" w:eastAsia="Arial" w:hAnsi="Arial" w:cs="Arial"/>
+          <w:szCs w:val="24"/>
+        </w:rPr>
+        <w:t xml:space="preserve"> </w:t>
+      </w:r>
+      <w:r>
+        <w:rPr>
+          <w:rFonts w:ascii="Arial" w:hAnsi="Arial" w:cs="Arial"/>
+          <w:szCs w:val="24"/>
+          <w:lang w:val="en-US"/>
+        </w:rPr>
+        <w:t xml:space="preserve">was implemented using the </w:t>
+      </w:r>
+      <w:proofErr w:type="spellStart"/>
+      <w:r>
+        <w:rPr>
+          <w:rFonts w:ascii="Arial" w:hAnsi="Arial" w:cs="Arial"/>
+          <w:szCs w:val="24"/>
+          <w:lang w:val="en-US"/>
+        </w:rPr>
+        <w:t>Ultralytics</w:t>
+      </w:r>
+      <w:proofErr w:type="spellEnd"/>
+      <w:r>
+        <w:rPr>
+          <w:rFonts w:ascii="Arial" w:hAnsi="Arial" w:cs="Arial"/>
+          <w:szCs w:val="24"/>
+          <w:lang w:val="en-US"/>
+        </w:rPr>
+        <w:t xml:space="preserve"> library. The nano version</w:t>
+      </w:r>
+      <w:r>
+        <w:rPr>
+          <w:rFonts w:ascii="Arial" w:hAnsi="Arial" w:cs="Arial"/>
+          <w:szCs w:val="24"/>
+          <w:lang w:val="en-US"/>
+        </w:rPr>
+        <w:t xml:space="preserve"> of </w:t>
+      </w:r>
+      <w:r>
+        <w:rPr>
+          <w:rFonts w:ascii="Arial" w:hAnsi="Arial" w:cs="Arial"/>
+          <w:szCs w:val="24"/>
+          <w:lang w:val="en-US"/>
+        </w:rPr>
+        <w:t xml:space="preserve">yolov8n.pt was chosen as it is small and performs well </w:t>
+      </w:r>
+      <w:r>
+        <w:rPr>
+          <w:rFonts w:ascii="Arial" w:hAnsi="Arial" w:cs="Arial"/>
+          <w:szCs w:val="24"/>
+          <w:lang w:val="en-US"/>
+        </w:rPr>
+        <w:t>in</w:t>
+      </w:r>
+      <w:r>
+        <w:rPr>
+          <w:rFonts w:ascii="Arial" w:hAnsi="Arial" w:cs="Arial"/>
+          <w:szCs w:val="24"/>
+          <w:lang w:val="en-US"/>
+        </w:rPr>
+        <w:t xml:space="preserve"> a CPU environment, making it ideal for this project. YOLOv8 performs very well in terms of speed since it does an entire forward pass on the image. The </w:t>
+      </w:r>
+      <w:proofErr w:type="spellStart"/>
+      <w:r>
+        <w:rPr>
+          <w:rFonts w:ascii="Arial" w:hAnsi="Arial" w:cs="Arial"/>
+          <w:szCs w:val="24"/>
+          <w:lang w:val="en-US"/>
+        </w:rPr>
+        <w:t>IoU</w:t>
+      </w:r>
+      <w:proofErr w:type="spellEnd"/>
+      <w:r>
+        <w:rPr>
+          <w:rFonts w:ascii="Arial" w:hAnsi="Arial" w:cs="Arial"/>
+          <w:szCs w:val="24"/>
+          <w:lang w:val="en-US"/>
+        </w:rPr>
+        <w:t xml:space="preserve"> was set to 0.7 for Non-Maximum Suppression to remove overlapping boxes. Models were predicted on all 16 image conditions and exported in COCO format JSON for analysis.</w:t>
+      </w:r>
+    </w:p>
+    <w:p>
+      <w:pPr>
+        <w:pStyle w:val="Heading3"/>
+        <w:numPr>
+          <w:ilvl w:val="0"/>
+          <w:numId w:val="0"/>
+        </w:numPr>
+        <w:rPr>
+          <w:rFonts w:ascii="Arial" w:hAnsi="Arial" w:cs="Arial"/>
+          <w:b/>
+          <w:bCs/>
+          <w:color w:val="auto"/>
+          <w:sz w:val="24"/>
+          <w:szCs w:val="24"/>
+          <w:lang w:val="en-US"/>
+        </w:rPr>
+      </w:pPr>
+      <w:bookmarkStart w:id="40" w:name="_Toc228539680"/>
+      <w:r>
+        <w:rPr>
+          <w:rFonts w:ascii="Arial" w:hAnsi="Arial" w:cs="Arial"/>
+          <w:b/>
+          <w:bCs/>
+          <w:color w:val="auto"/>
+          <w:sz w:val="24"/>
+          <w:szCs w:val="24"/>
+          <w:lang w:val="en-US"/>
+        </w:rPr>
+        <w:t>7.5.2</w:t>
+      </w:r>
+      <w:r>
+        <w:rPr>
+          <w:rFonts w:ascii="Arial" w:hAnsi="Arial" w:cs="Arial"/>
+          <w:b/>
+          <w:bCs/>
+          <w:color w:val="auto"/>
+          <w:sz w:val="24"/>
+          <w:szCs w:val="24"/>
+          <w:lang w:val="en-US"/>
+        </w:rPr>
+        <w:tab/>
+        <w:t xml:space="preserve">SSD </w:t>
+      </w:r>
+      <w:proofErr w:type="spellStart"/>
+      <w:r>
+        <w:rPr>
+          <w:rFonts w:ascii="Arial" w:hAnsi="Arial" w:cs="Arial"/>
+          <w:b/>
+          <w:bCs/>
+          <w:color w:val="auto"/>
+          <w:sz w:val="24"/>
+          <w:szCs w:val="24"/>
+          <w:lang w:val="en-US"/>
+        </w:rPr>
+        <w:t>MobileNet</w:t>
+      </w:r>
+      <w:bookmarkEnd w:id="40"/>
+      <w:proofErr w:type="spellEnd"/>
+    </w:p>
+    <w:p>
+      <w:pPr>
+        <w:spacing w:after="200" w:line="360" w:lineRule="auto"/>
+        <w:jc w:val="both"/>
+        <w:rPr>
+          <w:szCs w:val="24"/>
+        </w:rPr>
+      </w:pPr>
+      <w:r>
+        <w:rPr>
+          <w:rFonts w:ascii="Arial" w:hAnsi="Arial" w:cs="Arial"/>
+          <w:szCs w:val="24"/>
+          <w:lang w:val="en-US"/>
+        </w:rPr>
+        <w:t xml:space="preserve">The SSD </w:t>
+      </w:r>
+      <w:proofErr w:type="spellStart"/>
+      <w:r>
+        <w:rPr>
+          <w:rFonts w:ascii="Arial" w:hAnsi="Arial" w:cs="Arial"/>
+          <w:szCs w:val="24"/>
+          <w:lang w:val="en-US"/>
+        </w:rPr>
+        <w:t>MobileNet</w:t>
+      </w:r>
+      <w:proofErr w:type="spellEnd"/>
+      <w:r>
+        <w:rPr>
+          <w:rFonts w:ascii="Arial" w:hAnsi="Arial" w:cs="Arial"/>
+          <w:szCs w:val="24"/>
+          <w:lang w:val="en-US"/>
+        </w:rPr>
+        <w:t xml:space="preserve"> </w:t>
+      </w:r>
+      <w:r>
+        <w:rPr>
+          <w:rFonts w:ascii="Arial" w:eastAsia="Arial" w:hAnsi="Arial" w:cs="Arial"/>
+          <w:szCs w:val="24"/>
+        </w:rPr>
+        <w:t>(Liu et al., 2016; Howard et al., 2017)</w:t>
+      </w:r>
+      <w:r>
+        <w:rPr>
+          <w:rFonts w:ascii="Arial" w:eastAsia="Arial" w:hAnsi="Arial" w:cs="Arial"/>
+          <w:szCs w:val="24"/>
+        </w:rPr>
+        <w:t xml:space="preserve"> </w:t>
+      </w:r>
+      <w:r>
+        <w:rPr>
+          <w:rFonts w:ascii="Arial" w:hAnsi="Arial" w:cs="Arial"/>
+          <w:szCs w:val="24"/>
+          <w:lang w:val="en-US"/>
+        </w:rPr>
+        <w:t xml:space="preserve">was implemented using the </w:t>
+      </w:r>
+      <w:proofErr w:type="spellStart"/>
+      <w:r>
+        <w:rPr>
+          <w:rFonts w:ascii="Arial" w:hAnsi="Arial" w:cs="Arial"/>
+          <w:szCs w:val="24"/>
+          <w:lang w:val="en-US"/>
+        </w:rPr>
+        <w:t>torchvision</w:t>
+      </w:r>
+      <w:proofErr w:type="spellEnd"/>
+      <w:r>
+        <w:rPr>
+          <w:rFonts w:ascii="Arial" w:hAnsi="Arial" w:cs="Arial"/>
+          <w:szCs w:val="24"/>
+          <w:lang w:val="en-US"/>
+        </w:rPr>
+        <w:t xml:space="preserve"> library with the ssdlite320_mobilenet_v3_large model and DEFAULT pre-trained weights. SSD is a single-shot detector which predicts detection boxes and class labels directly from feature maps at different scales, without region proposal. The input images were transformed as per the pipeline used when training the model.</w:t>
+      </w:r>
+      <w:r>
+        <w:rPr>
+          <w:rFonts w:ascii="Arial" w:hAnsi="Arial" w:cs="Arial"/>
+          <w:szCs w:val="24"/>
+          <w:lang w:val="en-US"/>
+        </w:rPr>
+        <w:t xml:space="preserve"> </w:t>
+      </w:r>
+      <w:r>
+        <w:rPr>
+          <w:rFonts w:ascii="Arial" w:eastAsia="Arial" w:hAnsi="Arial" w:cs="Arial"/>
+          <w:szCs w:val="24"/>
+        </w:rPr>
+        <w:t>Predictions were filtered by the confidence threshold of 0.25 and saved in COCO format for evaluation.</w:t>
+      </w:r>
+    </w:p>
+    <w:p>
+      <w:pPr>
+        <w:pStyle w:val="Heading3"/>
+        <w:numPr>
+          <w:ilvl w:val="0"/>
+          <w:numId w:val="0"/>
+        </w:numPr>
+        <w:rPr>
+          <w:rFonts w:ascii="Arial" w:hAnsi="Arial" w:cs="Arial"/>
+          <w:b/>
+          <w:bCs/>
+          <w:color w:val="auto"/>
+          <w:sz w:val="24"/>
+          <w:szCs w:val="24"/>
+          <w:lang w:val="en-US"/>
+        </w:rPr>
+      </w:pPr>
+      <w:bookmarkStart w:id="41" w:name="_Toc228539681"/>
+      <w:r>
+        <w:rPr>
+          <w:rFonts w:ascii="Arial" w:hAnsi="Arial" w:cs="Arial"/>
+          <w:b/>
+          <w:bCs/>
+          <w:color w:val="auto"/>
+          <w:sz w:val="24"/>
+          <w:szCs w:val="24"/>
+          <w:lang w:val="en-US"/>
+        </w:rPr>
+        <w:lastRenderedPageBreak/>
+        <w:t>7.5.3</w:t>
+      </w:r>
+      <w:r>
+        <w:rPr>
+          <w:rFonts w:ascii="Arial" w:hAnsi="Arial" w:cs="Arial"/>
+          <w:b/>
+          <w:bCs/>
+          <w:color w:val="auto"/>
+          <w:sz w:val="24"/>
+          <w:szCs w:val="24"/>
+          <w:lang w:val="en-US"/>
+        </w:rPr>
+        <w:tab/>
+        <w:t>Faster R-CNN</w:t>
+      </w:r>
+      <w:bookmarkEnd w:id="41"/>
+    </w:p>
+    <w:p>
+      <w:pPr>
+        <w:spacing w:line="360" w:lineRule="auto"/>
+        <w:jc w:val="both"/>
+        <w:rPr>
+          <w:rFonts w:ascii="Arial" w:hAnsi="Arial" w:cs="Arial"/>
+          <w:lang w:val="en-US"/>
+        </w:rPr>
+      </w:pPr>
+      <w:r>
+        <w:rPr>
+          <w:rFonts w:ascii="Arial" w:hAnsi="Arial" w:cs="Arial"/>
+          <w:lang w:val="en-US"/>
+        </w:rPr>
+        <w:t>Faster R-CN</w:t>
+      </w:r>
+      <w:r>
+        <w:rPr>
+          <w:rFonts w:ascii="Arial" w:hAnsi="Arial" w:cs="Arial"/>
+          <w:lang w:val="en-US"/>
+        </w:rPr>
+        <w:t xml:space="preserve">N </w:t>
+      </w:r>
+      <w:r>
+        <w:rPr>
+          <w:rFonts w:ascii="Arial" w:hAnsi="Arial" w:cs="Arial"/>
+          <w:lang w:val="en-US"/>
+        </w:rPr>
+        <w:t xml:space="preserve">was implemented using the </w:t>
+      </w:r>
+      <w:proofErr w:type="spellStart"/>
+      <w:r>
+        <w:rPr>
+          <w:rFonts w:ascii="Arial" w:hAnsi="Arial" w:cs="Arial"/>
+          <w:lang w:val="en-US"/>
+        </w:rPr>
+        <w:t>torchvision</w:t>
+      </w:r>
+      <w:proofErr w:type="spellEnd"/>
+      <w:r>
+        <w:rPr>
+          <w:rFonts w:ascii="Arial" w:hAnsi="Arial" w:cs="Arial"/>
+          <w:lang w:val="en-US"/>
+        </w:rPr>
+        <w:t xml:space="preserve"> library and the fasterrcnn_resnet50_fpn model and DEFAULT pre-trained weights. Faster R-CNN has a two-stage approach to object detection with a Region Proposal Network (RPN) first proposing potential regions of interest, and then the second stage classifying and refining the regions. The Faster R-CNN pre-trained weights' transform was applied to the images before inference. </w:t>
+      </w:r>
+      <w:r>
+        <w:rPr>
+          <w:rFonts w:ascii="Arial" w:hAnsi="Arial" w:cs="Arial"/>
+          <w:lang w:val="en-US"/>
+        </w:rPr>
+        <w:t>P</w:t>
+      </w:r>
+      <w:r>
+        <w:rPr>
+          <w:rFonts w:ascii="Arial" w:hAnsi="Arial" w:cs="Arial"/>
+          <w:lang w:val="en-US"/>
+        </w:rPr>
+        <w:t>redictions</w:t>
+      </w:r>
+      <w:r>
+        <w:rPr>
+          <w:rFonts w:ascii="Arial" w:hAnsi="Arial" w:cs="Arial"/>
+          <w:lang w:val="en-US"/>
+        </w:rPr>
+        <w:t xml:space="preserve"> were saved</w:t>
+      </w:r>
+      <w:r>
+        <w:rPr>
+          <w:rFonts w:ascii="Arial" w:hAnsi="Arial" w:cs="Arial"/>
+          <w:lang w:val="en-US"/>
+        </w:rPr>
+        <w:t xml:space="preserve"> in COCO format</w:t>
+      </w:r>
+      <w:r>
+        <w:rPr>
+          <w:rFonts w:ascii="Arial" w:hAnsi="Arial" w:cs="Arial"/>
+          <w:lang w:val="en-US"/>
+        </w:rPr>
+        <w:t xml:space="preserve"> for evaluation.</w:t>
+      </w:r>
+    </w:p>
+    <w:p>
+      <w:pPr>
+        <w:spacing w:line="360" w:lineRule="auto"/>
+        <w:jc w:val="both"/>
+        <w:rPr>
+          <w:rFonts w:ascii="Arial" w:hAnsi="Arial" w:cs="Arial"/>
+          <w:lang w:val="en-US"/>
+        </w:rPr>
+      </w:pPr>
+      <w:r>
+        <w:rPr>
+          <w:rFonts w:ascii="Arial" w:hAnsi="Arial" w:cs="Arial"/>
+          <w:lang w:val="en-US"/>
+        </w:rPr>
+        <w:t xml:space="preserve">The predictions for all three models were in the form of bounding boxes, class labels, and confidence scores. These were then transformed </w:t>
+      </w:r>
+      <w:r>
+        <w:rPr>
+          <w:rFonts w:ascii="Arial" w:hAnsi="Arial" w:cs="Arial"/>
+          <w:lang w:val="en-US"/>
+        </w:rPr>
+        <w:t>into</w:t>
+      </w:r>
+      <w:r>
+        <w:rPr>
+          <w:rFonts w:ascii="Arial" w:hAnsi="Arial" w:cs="Arial"/>
+          <w:lang w:val="en-US"/>
+        </w:rPr>
+        <w:t xml:space="preserve"> COCO format with </w:t>
+      </w:r>
+      <w:proofErr w:type="spellStart"/>
+      <w:r>
+        <w:rPr>
+          <w:rFonts w:ascii="Arial" w:hAnsi="Arial" w:cs="Arial"/>
+          <w:lang w:val="en-US"/>
+        </w:rPr>
+        <w:t>xywh</w:t>
+      </w:r>
+      <w:proofErr w:type="spellEnd"/>
+      <w:r>
+        <w:rPr>
+          <w:rFonts w:ascii="Arial" w:hAnsi="Arial" w:cs="Arial"/>
+          <w:lang w:val="en-US"/>
+        </w:rPr>
+        <w:t xml:space="preserve"> bounding box coordinates and saved as JSON files</w:t>
+      </w:r>
+      <w:r>
+        <w:rPr>
+          <w:rFonts w:ascii="Arial" w:hAnsi="Arial" w:cs="Arial"/>
+          <w:lang w:val="en-US"/>
+        </w:rPr>
+        <w:t xml:space="preserve">, </w:t>
+      </w:r>
+      <w:r>
+        <w:rPr>
+          <w:rFonts w:ascii="Arial" w:hAnsi="Arial" w:cs="Arial"/>
+          <w:lang w:val="en-US"/>
+        </w:rPr>
+        <w:t>one for each model and image condition for evaluation.</w:t>
+      </w:r>
     </w:p>
     <w:p>
       <w:pPr>
@@ -17657,7 +19257,7 @@
           <w:lang w:val="en-US"/>
         </w:rPr>
       </w:pPr>
-      <w:bookmarkStart w:id="39" w:name="_Toc228478080"/>
+      <w:bookmarkStart w:id="42" w:name="_Toc228539682"/>
       <w:r>
         <w:rPr>
           <w:rFonts w:ascii="Arial" w:hAnsi="Arial" w:cs="Arial"/>
@@ -17694,7 +19294,1146 @@
         </w:rPr>
         <w:t>Evaluation Pipeline</w:t>
       </w:r>
-      <w:bookmarkEnd w:id="39"/>
+      <w:bookmarkEnd w:id="42"/>
+    </w:p>
+    <w:p>
+      <w:pPr>
+        <w:spacing w:line="360" w:lineRule="auto"/>
+        <w:jc w:val="both"/>
+        <w:rPr>
+          <w:rFonts w:ascii="Arial" w:hAnsi="Arial" w:cs="Arial"/>
+          <w:szCs w:val="24"/>
+          <w:lang w:val="en-US"/>
+        </w:rPr>
+      </w:pPr>
+      <w:r>
+        <w:rPr>
+          <w:rFonts w:ascii="Arial" w:hAnsi="Arial" w:cs="Arial"/>
+          <w:szCs w:val="24"/>
+          <w:lang w:val="en-US"/>
+        </w:rPr>
+        <w:t>T</w:t>
+      </w:r>
+      <w:r>
+        <w:rPr>
+          <w:rFonts w:ascii="Arial" w:hAnsi="Arial" w:cs="Arial"/>
+          <w:szCs w:val="24"/>
+          <w:lang w:val="en-US"/>
+        </w:rPr>
+        <w:t>wo sets of metrics</w:t>
+      </w:r>
+      <w:r>
+        <w:rPr>
+          <w:rFonts w:ascii="Arial" w:hAnsi="Arial" w:cs="Arial"/>
+          <w:szCs w:val="24"/>
+          <w:lang w:val="en-US"/>
+        </w:rPr>
+        <w:t xml:space="preserve"> were calculated</w:t>
+      </w:r>
+      <w:r>
+        <w:rPr>
+          <w:rFonts w:ascii="Arial" w:hAnsi="Arial" w:cs="Arial"/>
+          <w:szCs w:val="24"/>
+          <w:lang w:val="en-US"/>
+        </w:rPr>
+        <w:t xml:space="preserve"> for each model</w:t>
+      </w:r>
+      <w:r>
+        <w:rPr>
+          <w:rFonts w:ascii="Arial" w:hAnsi="Arial" w:cs="Arial"/>
+          <w:szCs w:val="24"/>
+          <w:lang w:val="en-US"/>
+        </w:rPr>
+        <w:t xml:space="preserve"> across</w:t>
+      </w:r>
+      <w:r>
+        <w:rPr>
+          <w:rFonts w:ascii="Arial" w:hAnsi="Arial" w:cs="Arial"/>
+          <w:szCs w:val="24"/>
+          <w:lang w:val="en-US"/>
+        </w:rPr>
+        <w:t xml:space="preserve"> 16 image conditions: the official COCO metrics with </w:t>
+      </w:r>
+      <w:proofErr w:type="spellStart"/>
+      <w:r>
+        <w:rPr>
+          <w:rFonts w:ascii="Arial" w:hAnsi="Arial" w:cs="Arial"/>
+          <w:szCs w:val="24"/>
+          <w:lang w:val="en-US"/>
+        </w:rPr>
+        <w:t>pycocotools</w:t>
+      </w:r>
+      <w:proofErr w:type="spellEnd"/>
+      <w:r>
+        <w:rPr>
+          <w:rFonts w:ascii="Arial" w:hAnsi="Arial" w:cs="Arial"/>
+          <w:szCs w:val="24"/>
+          <w:lang w:val="en-US"/>
+        </w:rPr>
+        <w:t>, and custom detection metrics</w:t>
+      </w:r>
+      <w:r>
+        <w:rPr>
+          <w:rFonts w:ascii="Arial" w:hAnsi="Arial" w:cs="Arial"/>
+          <w:szCs w:val="24"/>
+          <w:lang w:val="en-US"/>
+        </w:rPr>
+        <w:t xml:space="preserve"> </w:t>
+      </w:r>
+      <w:r>
+        <w:rPr>
+          <w:rFonts w:ascii="Arial" w:hAnsi="Arial" w:cs="Arial"/>
+          <w:szCs w:val="24"/>
+          <w:lang w:val="en-US"/>
+        </w:rPr>
+        <w:t>from scratch</w:t>
+      </w:r>
+      <w:r>
+        <w:rPr>
+          <w:rFonts w:ascii="Arial" w:hAnsi="Arial" w:cs="Arial"/>
+          <w:szCs w:val="24"/>
+          <w:lang w:val="en-US"/>
+        </w:rPr>
+        <w:t xml:space="preserve"> were calculated</w:t>
+      </w:r>
+      <w:r>
+        <w:rPr>
+          <w:rFonts w:ascii="Arial" w:hAnsi="Arial" w:cs="Arial"/>
+          <w:szCs w:val="24"/>
+          <w:lang w:val="en-US"/>
+        </w:rPr>
+        <w:t>.</w:t>
+      </w:r>
+      <w:r>
+        <w:rPr>
+          <w:rFonts w:ascii="Arial" w:hAnsi="Arial" w:cs="Arial"/>
+          <w:szCs w:val="24"/>
+          <w:lang w:val="en-US"/>
+        </w:rPr>
+        <w:t xml:space="preserve"> This section describes both methods, including the formulas and threshold used.</w:t>
+      </w:r>
+    </w:p>
+    <w:p>
+      <w:pPr>
+        <w:pStyle w:val="Heading3"/>
+        <w:numPr>
+          <w:ilvl w:val="0"/>
+          <w:numId w:val="0"/>
+        </w:numPr>
+        <w:rPr>
+          <w:rFonts w:ascii="Arial" w:hAnsi="Arial" w:cs="Arial"/>
+          <w:b/>
+          <w:bCs/>
+          <w:color w:val="auto"/>
+          <w:sz w:val="24"/>
+          <w:szCs w:val="24"/>
+          <w:lang w:val="en-US"/>
+        </w:rPr>
+      </w:pPr>
+      <w:bookmarkStart w:id="43" w:name="_Toc228539683"/>
+      <w:r>
+        <w:rPr>
+          <w:rFonts w:ascii="Arial" w:hAnsi="Arial" w:cs="Arial"/>
+          <w:b/>
+          <w:bCs/>
+          <w:color w:val="auto"/>
+          <w:sz w:val="24"/>
+          <w:szCs w:val="24"/>
+          <w:lang w:val="en-US"/>
+        </w:rPr>
+        <w:t>7.6.1</w:t>
+      </w:r>
+      <w:r>
+        <w:rPr>
+          <w:rFonts w:ascii="Arial" w:hAnsi="Arial" w:cs="Arial"/>
+          <w:b/>
+          <w:bCs/>
+          <w:color w:val="auto"/>
+          <w:sz w:val="24"/>
+          <w:szCs w:val="24"/>
+          <w:lang w:val="en-US"/>
+        </w:rPr>
+        <w:tab/>
+        <w:t>Intersection over Union (</w:t>
+      </w:r>
+      <w:proofErr w:type="spellStart"/>
+      <w:r>
+        <w:rPr>
+          <w:rFonts w:ascii="Arial" w:hAnsi="Arial" w:cs="Arial"/>
+          <w:b/>
+          <w:bCs/>
+          <w:color w:val="auto"/>
+          <w:sz w:val="24"/>
+          <w:szCs w:val="24"/>
+          <w:lang w:val="en-US"/>
+        </w:rPr>
+        <w:t>IoU</w:t>
+      </w:r>
+      <w:proofErr w:type="spellEnd"/>
+      <w:r>
+        <w:rPr>
+          <w:rFonts w:ascii="Arial" w:hAnsi="Arial" w:cs="Arial"/>
+          <w:b/>
+          <w:bCs/>
+          <w:color w:val="auto"/>
+          <w:sz w:val="24"/>
+          <w:szCs w:val="24"/>
+          <w:lang w:val="en-US"/>
+        </w:rPr>
+        <w:t>)</w:t>
+      </w:r>
+      <w:bookmarkEnd w:id="43"/>
+    </w:p>
+    <w:p>
+      <w:pPr>
+        <w:spacing w:line="360" w:lineRule="auto"/>
+        <w:jc w:val="both"/>
+        <w:rPr>
+          <w:rFonts w:ascii="Arial" w:eastAsia="Arial" w:hAnsi="Arial" w:cs="Arial"/>
+          <w:szCs w:val="24"/>
+        </w:rPr>
+      </w:pPr>
+      <w:r>
+        <w:rPr>
+          <w:rFonts w:ascii="Arial" w:hAnsi="Arial" w:cs="Arial"/>
+          <w:szCs w:val="24"/>
+          <w:lang w:val="en-US"/>
+        </w:rPr>
+        <w:t>Intersected over Union (</w:t>
+      </w:r>
+      <w:proofErr w:type="spellStart"/>
+      <w:r>
+        <w:rPr>
+          <w:rFonts w:ascii="Arial" w:hAnsi="Arial" w:cs="Arial"/>
+          <w:szCs w:val="24"/>
+          <w:lang w:val="en-US"/>
+        </w:rPr>
+        <w:t>IoU</w:t>
+      </w:r>
+      <w:proofErr w:type="spellEnd"/>
+      <w:r>
+        <w:rPr>
+          <w:rFonts w:ascii="Arial" w:hAnsi="Arial" w:cs="Arial"/>
+          <w:szCs w:val="24"/>
+          <w:lang w:val="en-US"/>
+        </w:rPr>
+        <w:t xml:space="preserve">) is a standard method of how well a predicted bounding box overlaps with the ground truth bounding box </w:t>
+      </w:r>
+      <w:r>
+        <w:rPr>
+          <w:rFonts w:ascii="Arial" w:eastAsia="Arial" w:hAnsi="Arial" w:cs="Arial"/>
+          <w:szCs w:val="24"/>
+        </w:rPr>
+        <w:t>(Everingham et al., 2010)</w:t>
+      </w:r>
+      <w:r>
+        <w:rPr>
+          <w:rFonts w:ascii="Arial" w:eastAsia="Arial" w:hAnsi="Arial" w:cs="Arial"/>
+          <w:szCs w:val="24"/>
+        </w:rPr>
+        <w:t>. It is calculated as the area of overlap between the two boxes divided by the area of their combined region, as shown in the equation 7.1:</w:t>
+      </w:r>
+    </w:p>
+    <w:p>
+      <w:pPr>
+        <w:spacing w:line="360" w:lineRule="auto"/>
+        <w:jc w:val="center"/>
+        <w:rPr>
+          <w:rFonts w:ascii="Arial" w:eastAsia="Arial" w:hAnsi="Arial" w:cs="Arial"/>
+          <w:szCs w:val="24"/>
+        </w:rPr>
+      </w:pPr>
+      <m:oMath>
+        <m:r>
+          <w:rPr>
+            <w:rFonts w:ascii="Cambria Math" w:eastAsia="Arial" w:hAnsi="Cambria Math" w:cs="Arial"/>
+            <w:szCs w:val="24"/>
+          </w:rPr>
+          <m:t>IoU=Area of Intersection</m:t>
+        </m:r>
+        <m:r>
+          <w:rPr>
+            <w:rFonts w:ascii="Cambria Math" w:eastAsia="Arial" w:hAnsi="Cambria Math" w:cs="Arial"/>
+            <w:szCs w:val="24"/>
+          </w:rPr>
+          <m:t>∕</m:t>
+        </m:r>
+        <m:r>
+          <w:rPr>
+            <w:rFonts w:ascii="Cambria Math" w:eastAsia="Arial" w:hAnsi="Cambria Math" w:cs="Arial"/>
+            <w:szCs w:val="24"/>
+          </w:rPr>
+          <m:t>Area of Union</m:t>
+        </m:r>
+      </m:oMath>
+      <w:r>
+        <w:rPr>
+          <w:rFonts w:ascii="Arial" w:eastAsia="Arial" w:hAnsi="Arial" w:cs="Arial"/>
+          <w:szCs w:val="24"/>
+        </w:rPr>
+        <w:t xml:space="preserve">  (Equation 7.1)</w:t>
+      </w:r>
+    </w:p>
+    <w:p>
+      <w:pPr>
+        <w:spacing w:line="360" w:lineRule="auto"/>
+        <w:jc w:val="both"/>
+        <w:rPr>
+          <w:rFonts w:ascii="Arial" w:eastAsia="Arial" w:hAnsi="Arial" w:cs="Arial"/>
+          <w:szCs w:val="24"/>
+        </w:rPr>
+      </w:pPr>
+      <w:r>
+        <w:rPr>
+          <w:rFonts w:ascii="Arial" w:eastAsia="Arial" w:hAnsi="Arial" w:cs="Arial"/>
+          <w:szCs w:val="24"/>
+        </w:rPr>
+        <w:t xml:space="preserve">A predicted box is considered as a true positive if it has </w:t>
+      </w:r>
+      <w:proofErr w:type="spellStart"/>
+      <w:r>
+        <w:rPr>
+          <w:rFonts w:ascii="Arial" w:eastAsia="Arial" w:hAnsi="Arial" w:cs="Arial"/>
+          <w:szCs w:val="24"/>
+        </w:rPr>
+        <w:t>IoU</w:t>
+      </w:r>
+      <w:proofErr w:type="spellEnd"/>
+      <w:r>
+        <w:rPr>
+          <w:rFonts w:ascii="Arial" w:eastAsia="Arial" w:hAnsi="Arial" w:cs="Arial"/>
+          <w:szCs w:val="24"/>
+        </w:rPr>
+        <w:t xml:space="preserve"> ≥ 0.5 with a ground-truth box of the same class. The </w:t>
+      </w:r>
+      <w:proofErr w:type="spellStart"/>
+      <w:r>
+        <w:rPr>
+          <w:rFonts w:ascii="Arial" w:eastAsia="Arial" w:hAnsi="Arial" w:cs="Arial"/>
+          <w:szCs w:val="24"/>
+        </w:rPr>
+        <w:t>IoU</w:t>
+      </w:r>
+      <w:proofErr w:type="spellEnd"/>
+      <w:r>
+        <w:rPr>
+          <w:rFonts w:ascii="Arial" w:eastAsia="Arial" w:hAnsi="Arial" w:cs="Arial"/>
+          <w:szCs w:val="24"/>
+        </w:rPr>
+        <w:t xml:space="preserve"> threshold used to calculate custom metrics in this project was 0.5, which is commonly used in object detection metrics</w:t>
+      </w:r>
+      <w:r>
+        <w:rPr>
+          <w:rFonts w:ascii="Arial" w:eastAsia="Arial" w:hAnsi="Arial" w:cs="Arial"/>
+          <w:szCs w:val="24"/>
+        </w:rPr>
+        <w:t>.</w:t>
+      </w:r>
+    </w:p>
+    <w:p>
+      <w:pPr>
+        <w:pStyle w:val="Heading3"/>
+        <w:numPr>
+          <w:ilvl w:val="0"/>
+          <w:numId w:val="0"/>
+        </w:numPr>
+        <w:rPr>
+          <w:rFonts w:ascii="Arial" w:hAnsi="Arial" w:cs="Arial"/>
+          <w:b/>
+          <w:bCs/>
+          <w:color w:val="auto"/>
+          <w:sz w:val="24"/>
+          <w:szCs w:val="24"/>
+          <w:lang w:val="en-US"/>
+        </w:rPr>
+      </w:pPr>
+      <w:bookmarkStart w:id="44" w:name="_Toc228539684"/>
+      <w:r>
+        <w:rPr>
+          <w:rFonts w:ascii="Arial" w:hAnsi="Arial" w:cs="Arial"/>
+          <w:b/>
+          <w:bCs/>
+          <w:color w:val="auto"/>
+          <w:sz w:val="24"/>
+          <w:szCs w:val="24"/>
+          <w:lang w:val="en-US"/>
+        </w:rPr>
+        <w:t>7.6.2</w:t>
+      </w:r>
+      <w:r>
+        <w:rPr>
+          <w:rFonts w:ascii="Arial" w:hAnsi="Arial" w:cs="Arial"/>
+          <w:b/>
+          <w:bCs/>
+          <w:color w:val="auto"/>
+          <w:sz w:val="24"/>
+          <w:szCs w:val="24"/>
+          <w:lang w:val="en-US"/>
+        </w:rPr>
+        <w:tab/>
+        <w:t>Precision, Recall, and F1 Score</w:t>
+      </w:r>
+      <w:bookmarkEnd w:id="44"/>
+    </w:p>
+    <w:p>
+      <w:pPr>
+        <w:spacing w:line="360" w:lineRule="auto"/>
+        <w:jc w:val="both"/>
+        <w:rPr>
+          <w:rFonts w:ascii="Arial" w:hAnsi="Arial" w:cs="Arial"/>
+          <w:szCs w:val="24"/>
+          <w:lang w:val="en-US"/>
+        </w:rPr>
+      </w:pPr>
+      <w:r>
+        <w:rPr>
+          <w:rFonts w:ascii="Arial" w:hAnsi="Arial" w:cs="Arial"/>
+          <w:szCs w:val="24"/>
+          <w:lang w:val="en-US"/>
+        </w:rPr>
+        <w:t>Precision,</w:t>
+      </w:r>
+      <w:r>
+        <w:rPr>
+          <w:rFonts w:ascii="Arial" w:hAnsi="Arial" w:cs="Arial"/>
+          <w:szCs w:val="24"/>
+          <w:lang w:val="en-US"/>
+        </w:rPr>
+        <w:t xml:space="preserve"> </w:t>
+      </w:r>
+      <w:r>
+        <w:rPr>
+          <w:rFonts w:ascii="Arial" w:hAnsi="Arial" w:cs="Arial"/>
+          <w:szCs w:val="24"/>
+          <w:lang w:val="en-US"/>
+        </w:rPr>
+        <w:t>Recall, and F1 Score are common metrics to measure detection performance</w:t>
+      </w:r>
+      <w:r>
+        <w:rPr>
+          <w:rFonts w:ascii="Arial" w:hAnsi="Arial" w:cs="Arial"/>
+          <w:szCs w:val="24"/>
+          <w:lang w:val="en-US"/>
+        </w:rPr>
+        <w:t xml:space="preserve"> </w:t>
+      </w:r>
+      <w:r>
+        <w:rPr>
+          <w:rFonts w:ascii="Arial" w:eastAsia="Arial" w:hAnsi="Arial" w:cs="Arial"/>
+          <w:szCs w:val="24"/>
+        </w:rPr>
+        <w:t>(Manning, Raghavan and Schutze, 2008)</w:t>
+      </w:r>
+      <w:r>
+        <w:rPr>
+          <w:rFonts w:ascii="Arial" w:hAnsi="Arial" w:cs="Arial"/>
+          <w:szCs w:val="24"/>
+          <w:lang w:val="en-US"/>
+        </w:rPr>
+        <w:t>. They are derived from three counts</w:t>
+      </w:r>
+      <w:r>
+        <w:rPr>
+          <w:rFonts w:ascii="Arial" w:hAnsi="Arial" w:cs="Arial"/>
+          <w:szCs w:val="24"/>
+          <w:lang w:val="en-US"/>
+        </w:rPr>
+        <w:t xml:space="preserve"> gathered</w:t>
+      </w:r>
+      <w:r>
+        <w:rPr>
+          <w:rFonts w:ascii="Arial" w:hAnsi="Arial" w:cs="Arial"/>
+          <w:szCs w:val="24"/>
+          <w:lang w:val="en-US"/>
+        </w:rPr>
+        <w:t xml:space="preserve"> across all images and predictions:</w:t>
+      </w:r>
+    </w:p>
+    <w:p>
+      <w:pPr>
+        <w:pStyle w:val="ListParagraph"/>
+        <w:numPr>
+          <w:ilvl w:val="0"/>
+          <w:numId w:val="18"/>
+        </w:numPr>
+        <w:spacing w:line="360" w:lineRule="auto"/>
+        <w:jc w:val="both"/>
+        <w:rPr>
+          <w:rFonts w:ascii="Arial" w:hAnsi="Arial" w:cs="Arial"/>
+          <w:lang w:val="en-US"/>
+        </w:rPr>
+      </w:pPr>
+      <w:r>
+        <w:rPr>
+          <w:rFonts w:ascii="Arial" w:hAnsi="Arial" w:cs="Arial"/>
+          <w:lang w:val="en-US"/>
+        </w:rPr>
+        <w:t xml:space="preserve">True positive (TP) - a predicted box that is matched by a ground-truth box with </w:t>
+      </w:r>
+      <w:proofErr w:type="spellStart"/>
+      <w:r>
+        <w:rPr>
+          <w:rFonts w:ascii="Arial" w:hAnsi="Arial" w:cs="Arial"/>
+          <w:lang w:val="en-US"/>
+        </w:rPr>
+        <w:t>IoU</w:t>
+      </w:r>
+      <w:proofErr w:type="spellEnd"/>
+      <w:r>
+        <w:rPr>
+          <w:rFonts w:ascii="Arial" w:hAnsi="Arial" w:cs="Arial"/>
+          <w:lang w:val="en-US"/>
+        </w:rPr>
+        <w:t xml:space="preserve"> ≥ 0.5</w:t>
+      </w:r>
+      <w:r>
+        <w:rPr>
+          <w:rFonts w:ascii="Arial" w:hAnsi="Arial" w:cs="Arial"/>
+          <w:lang w:val="en-US"/>
+        </w:rPr>
+        <w:t xml:space="preserve"> and the correct category label.</w:t>
+      </w:r>
+    </w:p>
+    <w:p>
+      <w:pPr>
+        <w:pStyle w:val="ListParagraph"/>
+        <w:numPr>
+          <w:ilvl w:val="0"/>
+          <w:numId w:val="18"/>
+        </w:numPr>
+        <w:spacing w:line="360" w:lineRule="auto"/>
+        <w:jc w:val="both"/>
+        <w:rPr>
+          <w:rFonts w:ascii="Arial" w:hAnsi="Arial" w:cs="Arial"/>
+          <w:lang w:val="en-US"/>
+        </w:rPr>
+      </w:pPr>
+      <w:r>
+        <w:rPr>
+          <w:rFonts w:ascii="Arial" w:hAnsi="Arial" w:cs="Arial"/>
+          <w:lang w:val="en-US"/>
+        </w:rPr>
+        <w:lastRenderedPageBreak/>
+        <w:t xml:space="preserve">False Positive (FP) - a predicted box that </w:t>
+      </w:r>
+      <w:r>
+        <w:rPr>
+          <w:rFonts w:ascii="Arial" w:hAnsi="Arial" w:cs="Arial"/>
+          <w:lang w:val="en-US"/>
+        </w:rPr>
+        <w:t xml:space="preserve">does not match any ground truth box above the </w:t>
+      </w:r>
+      <w:proofErr w:type="spellStart"/>
+      <w:r>
+        <w:rPr>
+          <w:rFonts w:ascii="Arial" w:hAnsi="Arial" w:cs="Arial"/>
+          <w:lang w:val="en-US"/>
+        </w:rPr>
+        <w:t>IoU</w:t>
+      </w:r>
+      <w:proofErr w:type="spellEnd"/>
+      <w:r>
+        <w:rPr>
+          <w:rFonts w:ascii="Arial" w:hAnsi="Arial" w:cs="Arial"/>
+          <w:lang w:val="en-US"/>
+        </w:rPr>
+        <w:t xml:space="preserve"> threshold.</w:t>
+      </w:r>
+    </w:p>
+    <w:p>
+      <w:pPr>
+        <w:pStyle w:val="ListParagraph"/>
+        <w:numPr>
+          <w:ilvl w:val="0"/>
+          <w:numId w:val="18"/>
+        </w:numPr>
+        <w:spacing w:line="360" w:lineRule="auto"/>
+        <w:jc w:val="both"/>
+        <w:rPr>
+          <w:rFonts w:ascii="Arial" w:hAnsi="Arial" w:cs="Arial"/>
+          <w:lang w:val="en-US"/>
+        </w:rPr>
+      </w:pPr>
+      <w:r>
+        <w:rPr>
+          <w:rFonts w:ascii="Arial" w:hAnsi="Arial" w:cs="Arial"/>
+          <w:lang w:val="en-US"/>
+        </w:rPr>
+        <w:t xml:space="preserve">False Negative (FN) - a ground-truth box that was not </w:t>
+      </w:r>
+      <w:r>
+        <w:rPr>
+          <w:rFonts w:ascii="Arial" w:hAnsi="Arial" w:cs="Arial"/>
+          <w:lang w:val="en-US"/>
+        </w:rPr>
+        <w:t>matched by any prediction.</w:t>
+      </w:r>
+    </w:p>
+    <w:p>
+      <w:pPr>
+        <w:spacing w:line="360" w:lineRule="auto"/>
+        <w:jc w:val="center"/>
+        <w:rPr>
+          <w:rFonts w:ascii="Arial" w:eastAsiaTheme="minorEastAsia" w:hAnsi="Arial" w:cs="Arial"/>
+          <w:lang w:val="en-US"/>
+        </w:rPr>
+      </w:pPr>
+      <m:oMath>
+        <m:r>
+          <w:rPr>
+            <w:rFonts w:ascii="Cambria Math" w:hAnsi="Cambria Math" w:cs="Arial"/>
+            <w:lang w:val="en-US"/>
+          </w:rPr>
+          <m:t>Precision=TP</m:t>
+        </m:r>
+        <m:r>
+          <w:rPr>
+            <w:rFonts w:ascii="Cambria Math" w:hAnsi="Cambria Math" w:cs="Arial"/>
+            <w:lang w:val="en-US"/>
+          </w:rPr>
+          <m:t xml:space="preserve"> ∕ </m:t>
+        </m:r>
+        <m:d>
+          <m:dPr>
+            <m:ctrlPr>
+              <w:rPr>
+                <w:rFonts w:ascii="Cambria Math" w:hAnsi="Cambria Math" w:cs="Arial"/>
+                <w:i/>
+                <w:lang w:val="en-US"/>
+              </w:rPr>
+            </m:ctrlPr>
+          </m:dPr>
+          <m:e>
+            <m:r>
+              <w:rPr>
+                <w:rFonts w:ascii="Cambria Math" w:hAnsi="Cambria Math" w:cs="Arial"/>
+                <w:lang w:val="en-US"/>
+              </w:rPr>
+              <m:t>TP+FP</m:t>
+            </m:r>
+          </m:e>
+        </m:d>
+      </m:oMath>
+      <w:r>
+        <w:rPr>
+          <w:rFonts w:ascii="Arial" w:eastAsiaTheme="minorEastAsia" w:hAnsi="Arial" w:cs="Arial"/>
+          <w:lang w:val="en-US"/>
+        </w:rPr>
+        <w:t xml:space="preserve">  (Equation 7.2)</w:t>
+      </w:r>
+    </w:p>
+    <w:p>
+      <w:pPr>
+        <w:spacing w:line="360" w:lineRule="auto"/>
+        <w:jc w:val="center"/>
+        <w:rPr>
+          <w:rFonts w:ascii="Arial" w:eastAsiaTheme="minorEastAsia" w:hAnsi="Arial" w:cs="Arial"/>
+          <w:lang w:val="en-US"/>
+        </w:rPr>
+      </w:pPr>
+      <m:oMath>
+        <m:r>
+          <w:rPr>
+            <w:rFonts w:ascii="Cambria Math" w:eastAsiaTheme="minorEastAsia" w:hAnsi="Cambria Math" w:cs="Arial"/>
+            <w:lang w:val="en-US"/>
+          </w:rPr>
+          <m:t>Recall=TP</m:t>
+        </m:r>
+        <m:r>
+          <w:rPr>
+            <w:rFonts w:ascii="Cambria Math" w:eastAsiaTheme="minorEastAsia" w:hAnsi="Cambria Math" w:cs="Arial"/>
+            <w:lang w:val="en-US"/>
+          </w:rPr>
+          <m:t xml:space="preserve">∕ </m:t>
+        </m:r>
+        <m:r>
+          <w:rPr>
+            <w:rFonts w:ascii="Cambria Math" w:eastAsiaTheme="minorEastAsia" w:hAnsi="Cambria Math" w:cs="Arial"/>
+            <w:lang w:val="en-US"/>
+          </w:rPr>
+          <m:t xml:space="preserve">(TP+FN) </m:t>
+        </m:r>
+        <m:r>
+          <w:rPr>
+            <w:rFonts w:ascii="Cambria Math" w:eastAsiaTheme="minorEastAsia" w:hAnsi="Cambria Math" w:cs="Arial"/>
+            <w:lang w:val="en-US"/>
+          </w:rPr>
+          <m:t xml:space="preserve"> </m:t>
+        </m:r>
+      </m:oMath>
+      <w:r>
+        <w:rPr>
+          <w:rFonts w:ascii="Arial" w:eastAsiaTheme="minorEastAsia" w:hAnsi="Arial" w:cs="Arial"/>
+          <w:lang w:val="en-US"/>
+        </w:rPr>
+        <w:t xml:space="preserve"> (Equation 7.3)</w:t>
+      </w:r>
+    </w:p>
+    <w:p>
+      <w:pPr>
+        <w:spacing w:line="360" w:lineRule="auto"/>
+        <w:jc w:val="center"/>
+        <w:rPr>
+          <w:rFonts w:ascii="Arial" w:eastAsiaTheme="minorEastAsia" w:hAnsi="Arial" w:cs="Arial"/>
+          <w:lang w:val="en-US"/>
+        </w:rPr>
+      </w:pPr>
+      <m:oMath>
+        <m:r>
+          <w:rPr>
+            <w:rFonts w:ascii="Cambria Math" w:eastAsiaTheme="minorEastAsia" w:hAnsi="Cambria Math" w:cs="Arial"/>
+            <w:lang w:val="en-US"/>
+          </w:rPr>
+          <m:t>F1 Score=</m:t>
+        </m:r>
+        <m:d>
+          <m:dPr>
+            <m:ctrlPr>
+              <w:rPr>
+                <w:rFonts w:ascii="Cambria Math" w:eastAsiaTheme="minorEastAsia" w:hAnsi="Cambria Math" w:cs="Arial"/>
+                <w:i/>
+                <w:lang w:val="en-US"/>
+              </w:rPr>
+            </m:ctrlPr>
+          </m:dPr>
+          <m:e>
+            <m:r>
+              <w:rPr>
+                <w:rFonts w:ascii="Cambria Math" w:eastAsiaTheme="minorEastAsia" w:hAnsi="Cambria Math" w:cs="Arial"/>
+                <w:lang w:val="en-US"/>
+              </w:rPr>
+              <m:t>2×Precision ×Recall</m:t>
+            </m:r>
+          </m:e>
+        </m:d>
+        <m:r>
+          <w:rPr>
+            <w:rFonts w:ascii="Cambria Math" w:eastAsiaTheme="minorEastAsia" w:hAnsi="Cambria Math" w:cs="Arial"/>
+            <w:lang w:val="en-US"/>
+          </w:rPr>
+          <m:t xml:space="preserve"> </m:t>
+        </m:r>
+        <m:r>
+          <w:rPr>
+            <w:rFonts w:ascii="Cambria Math" w:eastAsiaTheme="minorEastAsia" w:hAnsi="Cambria Math" w:cs="Arial"/>
+            <w:lang w:val="en-US"/>
+          </w:rPr>
+          <m:t>∕</m:t>
+        </m:r>
+        <m:r>
+          <w:rPr>
+            <w:rFonts w:ascii="Cambria Math" w:eastAsiaTheme="minorEastAsia" w:hAnsi="Cambria Math" w:cs="Arial"/>
+            <w:lang w:val="en-US"/>
+          </w:rPr>
+          <m:t xml:space="preserve"> </m:t>
+        </m:r>
+        <m:d>
+          <m:dPr>
+            <m:ctrlPr>
+              <w:rPr>
+                <w:rFonts w:ascii="Cambria Math" w:eastAsiaTheme="minorEastAsia" w:hAnsi="Cambria Math" w:cs="Arial"/>
+                <w:i/>
+                <w:lang w:val="en-US"/>
+              </w:rPr>
+            </m:ctrlPr>
+          </m:dPr>
+          <m:e>
+            <m:r>
+              <w:rPr>
+                <w:rFonts w:ascii="Cambria Math" w:eastAsiaTheme="minorEastAsia" w:hAnsi="Cambria Math" w:cs="Arial"/>
+                <w:lang w:val="en-US"/>
+              </w:rPr>
+              <m:t>Precision+Recall</m:t>
+            </m:r>
+          </m:e>
+        </m:d>
+      </m:oMath>
+      <w:r>
+        <w:rPr>
+          <w:rFonts w:ascii="Arial" w:eastAsiaTheme="minorEastAsia" w:hAnsi="Arial" w:cs="Arial"/>
+          <w:lang w:val="en-US"/>
+        </w:rPr>
+        <w:t xml:space="preserve"> (Equation 7.4)</w:t>
+      </w:r>
+    </w:p>
+    <w:p>
+      <w:pPr>
+        <w:spacing w:line="360" w:lineRule="auto"/>
+        <w:jc w:val="both"/>
+        <w:rPr>
+          <w:rFonts w:ascii="Arial" w:hAnsi="Arial" w:cs="Arial"/>
+          <w:lang w:val="en-US"/>
+        </w:rPr>
+      </w:pPr>
+      <w:r>
+        <w:rPr>
+          <w:rFonts w:ascii="Arial" w:hAnsi="Arial" w:cs="Arial"/>
+          <w:lang w:val="en-US"/>
+        </w:rPr>
+        <w:t xml:space="preserve">These measures were calculated with custom scripts - one for each model - that loop through the 1,000 images in the dataset, match predictions to ground-truth boxes by </w:t>
+      </w:r>
+      <w:proofErr w:type="spellStart"/>
+      <w:r>
+        <w:rPr>
+          <w:rFonts w:ascii="Arial" w:hAnsi="Arial" w:cs="Arial"/>
+          <w:lang w:val="en-US"/>
+        </w:rPr>
+        <w:t>IoU</w:t>
+      </w:r>
+      <w:proofErr w:type="spellEnd"/>
+      <w:r>
+        <w:rPr>
+          <w:rFonts w:ascii="Arial" w:hAnsi="Arial" w:cs="Arial"/>
+          <w:lang w:val="en-US"/>
+        </w:rPr>
+        <w:t xml:space="preserve"> and category, and count TP, FP and FN across the entire dataset. Average confidence of all predictions was also stored.</w:t>
+      </w:r>
+    </w:p>
+    <w:p>
+      <w:pPr>
+        <w:pStyle w:val="Heading3"/>
+        <w:numPr>
+          <w:ilvl w:val="0"/>
+          <w:numId w:val="0"/>
+        </w:numPr>
+        <w:rPr>
+          <w:rFonts w:ascii="Arial" w:hAnsi="Arial" w:cs="Arial"/>
+          <w:b/>
+          <w:bCs/>
+          <w:color w:val="auto"/>
+          <w:sz w:val="24"/>
+          <w:szCs w:val="24"/>
+          <w:lang w:val="en-US"/>
+        </w:rPr>
+      </w:pPr>
+      <w:bookmarkStart w:id="45" w:name="_Toc228539685"/>
+      <w:r>
+        <w:rPr>
+          <w:rFonts w:ascii="Arial" w:hAnsi="Arial" w:cs="Arial"/>
+          <w:b/>
+          <w:bCs/>
+          <w:color w:val="auto"/>
+          <w:sz w:val="24"/>
+          <w:szCs w:val="24"/>
+          <w:lang w:val="en-US"/>
+        </w:rPr>
+        <w:t>7.6.3</w:t>
+      </w:r>
+      <w:r>
+        <w:rPr>
+          <w:rFonts w:ascii="Arial" w:hAnsi="Arial" w:cs="Arial"/>
+          <w:b/>
+          <w:bCs/>
+          <w:color w:val="auto"/>
+          <w:sz w:val="24"/>
+          <w:szCs w:val="24"/>
+          <w:lang w:val="en-US"/>
+        </w:rPr>
+        <w:tab/>
+        <w:t xml:space="preserve">AP @50 and </w:t>
+      </w:r>
+      <w:proofErr w:type="spellStart"/>
+      <w:r>
+        <w:rPr>
+          <w:rFonts w:ascii="Arial" w:hAnsi="Arial" w:cs="Arial"/>
+          <w:b/>
+          <w:bCs/>
+          <w:color w:val="auto"/>
+          <w:sz w:val="24"/>
+          <w:szCs w:val="24"/>
+          <w:lang w:val="en-US"/>
+        </w:rPr>
+        <w:t>mAP</w:t>
+      </w:r>
+      <w:bookmarkEnd w:id="45"/>
+      <w:proofErr w:type="spellEnd"/>
+    </w:p>
+    <w:p>
+      <w:pPr>
+        <w:spacing w:line="360" w:lineRule="auto"/>
+        <w:jc w:val="both"/>
+        <w:rPr>
+          <w:rFonts w:ascii="Arial" w:eastAsia="Arial" w:hAnsi="Arial" w:cs="Arial"/>
+          <w:szCs w:val="24"/>
+        </w:rPr>
+      </w:pPr>
+      <w:r>
+        <w:rPr>
+          <w:rFonts w:ascii="Arial" w:hAnsi="Arial" w:cs="Arial"/>
+          <w:szCs w:val="24"/>
+          <w:lang w:val="en-US"/>
+        </w:rPr>
+        <w:t>Average Precision (AP) and Mean Average Precision (</w:t>
+      </w:r>
+      <w:proofErr w:type="spellStart"/>
+      <w:r>
+        <w:rPr>
+          <w:rFonts w:ascii="Arial" w:hAnsi="Arial" w:cs="Arial"/>
+          <w:szCs w:val="24"/>
+          <w:lang w:val="en-US"/>
+        </w:rPr>
+        <w:t>mAP</w:t>
+      </w:r>
+      <w:proofErr w:type="spellEnd"/>
+      <w:r>
+        <w:rPr>
+          <w:rFonts w:ascii="Arial" w:hAnsi="Arial" w:cs="Arial"/>
+          <w:szCs w:val="24"/>
+          <w:lang w:val="en-US"/>
+        </w:rPr>
+        <w:t xml:space="preserve">) were calculated at </w:t>
+      </w:r>
+      <w:proofErr w:type="spellStart"/>
+      <w:r>
+        <w:rPr>
+          <w:rFonts w:ascii="Arial" w:hAnsi="Arial" w:cs="Arial"/>
+          <w:szCs w:val="24"/>
+          <w:lang w:val="en-US"/>
+        </w:rPr>
+        <w:t>IoU</w:t>
+      </w:r>
+      <w:proofErr w:type="spellEnd"/>
+      <w:r>
+        <w:rPr>
+          <w:rFonts w:ascii="Arial" w:hAnsi="Arial" w:cs="Arial"/>
+          <w:szCs w:val="24"/>
+          <w:lang w:val="en-US"/>
+        </w:rPr>
+        <w:t xml:space="preserve"> threshold of 0.5 using </w:t>
+      </w:r>
+      <w:proofErr w:type="spellStart"/>
+      <w:r>
+        <w:rPr>
+          <w:rFonts w:ascii="Arial" w:hAnsi="Arial" w:cs="Arial"/>
+          <w:szCs w:val="24"/>
+          <w:lang w:val="en-US"/>
+        </w:rPr>
+        <w:t>pycocotools</w:t>
+      </w:r>
+      <w:proofErr w:type="spellEnd"/>
+      <w:r>
+        <w:rPr>
+          <w:rFonts w:ascii="Arial" w:hAnsi="Arial" w:cs="Arial"/>
+          <w:szCs w:val="24"/>
+          <w:lang w:val="en-US"/>
+        </w:rPr>
+        <w:t xml:space="preserve"> library. They followed the standard COCO evaluation protocol (</w:t>
+      </w:r>
+      <w:r>
+        <w:rPr>
+          <w:rFonts w:ascii="Arial" w:eastAsia="Arial" w:hAnsi="Arial" w:cs="Arial"/>
+          <w:szCs w:val="24"/>
+        </w:rPr>
+        <w:t>Lin et al., 2014</w:t>
+      </w:r>
+      <w:r>
+        <w:rPr>
+          <w:rFonts w:ascii="Arial" w:eastAsia="Arial" w:hAnsi="Arial" w:cs="Arial"/>
+          <w:szCs w:val="24"/>
+        </w:rPr>
+        <w:t>). As shown in the equation 7.5:</w:t>
+      </w:r>
+    </w:p>
+    <w:p>
+      <w:pPr>
+        <w:spacing w:line="360" w:lineRule="auto"/>
+        <w:jc w:val="center"/>
+        <w:rPr>
+          <w:rFonts w:ascii="Arial" w:eastAsia="Arial" w:hAnsi="Arial" w:cs="Arial"/>
+          <w:iCs/>
+          <w:szCs w:val="24"/>
+        </w:rPr>
+      </w:pPr>
+      <m:oMath>
+        <m:r>
+          <w:rPr>
+            <w:rFonts w:ascii="Cambria Math" w:eastAsia="Arial" w:hAnsi="Cambria Math" w:cs="Arial"/>
+            <w:szCs w:val="24"/>
+          </w:rPr>
+          <m:t>mAP = (1∕10) × Σ AP@IoU,    IoU ϵ {0.50, 0.55, ..., 0.95}</m:t>
+        </m:r>
+      </m:oMath>
+      <w:r>
+        <w:rPr>
+          <w:rFonts w:ascii="Arial" w:eastAsia="Arial" w:hAnsi="Arial" w:cs="Arial"/>
+          <w:i/>
+          <w:szCs w:val="24"/>
+        </w:rPr>
+        <w:t xml:space="preserve"> </w:t>
+      </w:r>
+      <w:r>
+        <w:rPr>
+          <w:rFonts w:ascii="Arial" w:eastAsia="Arial" w:hAnsi="Arial" w:cs="Arial"/>
+          <w:iCs/>
+          <w:szCs w:val="24"/>
+        </w:rPr>
+        <w:t xml:space="preserve"> (Equation 7.5)</w:t>
+      </w:r>
+    </w:p>
+    <w:p>
+      <w:pPr>
+        <w:spacing w:line="360" w:lineRule="auto"/>
+        <w:jc w:val="both"/>
+        <w:rPr>
+          <w:rFonts w:ascii="Arial" w:eastAsia="Arial" w:hAnsi="Arial" w:cs="Arial"/>
+          <w:iCs/>
+          <w:szCs w:val="24"/>
+        </w:rPr>
+      </w:pPr>
+      <w:r>
+        <w:rPr>
+          <w:rFonts w:ascii="Arial" w:eastAsia="Arial" w:hAnsi="Arial" w:cs="Arial"/>
+          <w:szCs w:val="24"/>
+        </w:rPr>
+        <w:t>Prediction JSON files in COCO</w:t>
+      </w:r>
+      <w:r>
+        <w:rPr>
+          <w:rFonts w:ascii="Arial" w:eastAsia="Arial" w:hAnsi="Arial" w:cs="Arial"/>
+          <w:sz w:val="22"/>
+          <w:szCs w:val="22"/>
+        </w:rPr>
+        <w:t xml:space="preserve"> </w:t>
+      </w:r>
+      <w:r>
+        <w:rPr>
+          <w:rFonts w:ascii="Arial" w:eastAsia="Arial" w:hAnsi="Arial" w:cs="Arial"/>
+          <w:iCs/>
+          <w:szCs w:val="24"/>
+        </w:rPr>
+        <w:t xml:space="preserve">were loaded into </w:t>
+      </w:r>
+      <w:proofErr w:type="spellStart"/>
+      <w:r>
+        <w:rPr>
+          <w:rFonts w:ascii="Arial" w:eastAsia="Arial" w:hAnsi="Arial" w:cs="Arial"/>
+          <w:iCs/>
+          <w:szCs w:val="24"/>
+        </w:rPr>
+        <w:t>COCOeval</w:t>
+      </w:r>
+      <w:proofErr w:type="spellEnd"/>
+      <w:r>
+        <w:rPr>
+          <w:rFonts w:ascii="Arial" w:eastAsia="Arial" w:hAnsi="Arial" w:cs="Arial"/>
+          <w:iCs/>
+          <w:szCs w:val="24"/>
+        </w:rPr>
+        <w:t xml:space="preserve"> and compared against the ground truth annotation file. The results were extracted from the stats array returned by </w:t>
+      </w:r>
+      <w:proofErr w:type="spellStart"/>
+      <w:r>
+        <w:rPr>
+          <w:rFonts w:ascii="Arial" w:eastAsia="Arial" w:hAnsi="Arial" w:cs="Arial"/>
+          <w:iCs/>
+          <w:szCs w:val="24"/>
+        </w:rPr>
+        <w:t>pycocotools</w:t>
+      </w:r>
+      <w:proofErr w:type="spellEnd"/>
+      <w:r>
+        <w:rPr>
+          <w:rFonts w:ascii="Arial" w:eastAsia="Arial" w:hAnsi="Arial" w:cs="Arial"/>
+          <w:iCs/>
+          <w:szCs w:val="24"/>
+        </w:rPr>
+        <w:t xml:space="preserve">, stat index 0 is </w:t>
+      </w:r>
+      <w:proofErr w:type="spellStart"/>
+      <w:r>
+        <w:rPr>
+          <w:rFonts w:ascii="Arial" w:eastAsia="Arial" w:hAnsi="Arial" w:cs="Arial"/>
+          <w:iCs/>
+          <w:szCs w:val="24"/>
+        </w:rPr>
+        <w:t>mAP</w:t>
+      </w:r>
+      <w:proofErr w:type="spellEnd"/>
+      <w:r>
+        <w:rPr>
+          <w:rFonts w:ascii="Arial" w:eastAsia="Arial" w:hAnsi="Arial" w:cs="Arial"/>
+          <w:iCs/>
+          <w:szCs w:val="24"/>
+        </w:rPr>
+        <w:t xml:space="preserve"> and index 1 is AP@50.</w:t>
+      </w:r>
+      <w:r>
+        <w:rPr>
+          <w:rFonts w:ascii="Arial" w:eastAsia="Arial" w:hAnsi="Arial" w:cs="Arial"/>
+          <w:iCs/>
+          <w:szCs w:val="24"/>
+        </w:rPr>
+        <w:t xml:space="preserve"> </w:t>
+      </w:r>
+    </w:p>
+    <w:p>
+      <w:pPr>
+        <w:spacing w:line="360" w:lineRule="auto"/>
+        <w:jc w:val="both"/>
+        <w:rPr>
+          <w:rFonts w:ascii="Arial" w:eastAsia="Arial" w:hAnsi="Arial" w:cs="Arial"/>
+          <w:iCs/>
+          <w:szCs w:val="24"/>
+        </w:rPr>
+      </w:pPr>
+      <w:r>
+        <w:rPr>
+          <w:rFonts w:ascii="Arial" w:eastAsia="Arial" w:hAnsi="Arial" w:cs="Arial"/>
+          <w:iCs/>
+          <w:szCs w:val="24"/>
+        </w:rPr>
+        <w:t>All evaluation results were saved to CSV files, which was used in the comparison and dashboard scripts.</w:t>
+      </w:r>
+    </w:p>
+    <w:p>
+      <w:pPr>
+        <w:spacing w:line="360" w:lineRule="auto"/>
+        <w:rPr>
+          <w:lang w:val="en-US"/>
+        </w:rPr>
+      </w:pPr>
+    </w:p>
+    <w:p>
+      <w:pPr>
+        <w:rPr>
+          <w:lang w:val="en-US"/>
+        </w:rPr>
+      </w:pPr>
+    </w:p>
+    <w:p>
+      <w:pPr>
+        <w:rPr>
+          <w:lang w:val="en-US"/>
+        </w:rPr>
+      </w:pPr>
+    </w:p>
+    <w:p>
+      <w:pPr>
+        <w:rPr>
+          <w:lang w:val="en-US"/>
+        </w:rPr>
+      </w:pPr>
+    </w:p>
+    <w:p>
+      <w:pPr>
+        <w:rPr>
+          <w:lang w:val="en-US"/>
+        </w:rPr>
+      </w:pPr>
+    </w:p>
+    <w:p>
+      <w:pPr>
+        <w:rPr>
+          <w:lang w:val="en-US"/>
+        </w:rPr>
+      </w:pPr>
+    </w:p>
+    <w:p>
+      <w:pPr>
+        <w:rPr>
+          <w:lang w:val="en-US"/>
+        </w:rPr>
+      </w:pPr>
     </w:p>
     <w:p>
       <w:pPr>
@@ -17713,7 +20452,7 @@
           <w:lang w:val="en-US"/>
         </w:rPr>
       </w:pPr>
-      <w:bookmarkStart w:id="40" w:name="_Toc228478081"/>
+      <w:bookmarkStart w:id="46" w:name="_Toc228539686"/>
       <w:r>
         <w:rPr>
           <w:rFonts w:ascii="Arial" w:hAnsi="Arial" w:cs="Arial"/>
@@ -17724,6 +20463,7 @@
           <w:szCs w:val="24"/>
           <w:lang w:val="en-US"/>
         </w:rPr>
+        <w:lastRenderedPageBreak/>
         <w:t>7.7</w:t>
       </w:r>
       <w:r>
@@ -17738,6 +20478,7 @@
         </w:rPr>
         <w:tab/>
       </w:r>
+      <w:proofErr w:type="spellStart"/>
       <w:r>
         <w:rPr>
           <w:rFonts w:ascii="Arial" w:hAnsi="Arial" w:cs="Arial"/>
@@ -17748,9 +20489,57 @@
           <w:szCs w:val="24"/>
           <w:lang w:val="en-US"/>
         </w:rPr>
-        <w:t>Streamlit Application</w:t>
-      </w:r>
-      <w:bookmarkEnd w:id="40"/>
+        <w:t>Streamlit</w:t>
+      </w:r>
+      <w:proofErr w:type="spellEnd"/>
+      <w:r>
+        <w:rPr>
+          <w:rFonts w:ascii="Arial" w:hAnsi="Arial" w:cs="Arial"/>
+          <w:b/>
+          <w:bCs/>
+          <w:color w:val="auto"/>
+          <w:sz w:val="24"/>
+          <w:szCs w:val="24"/>
+          <w:lang w:val="en-US"/>
+        </w:rPr>
+        <w:t xml:space="preserve"> Application</w:t>
+      </w:r>
+      <w:bookmarkEnd w:id="46"/>
+    </w:p>
+    <w:p>
+      <w:pPr>
+        <w:rPr>
+          <w:lang w:val="en-US"/>
+        </w:rPr>
+      </w:pPr>
+    </w:p>
+    <w:p>
+      <w:pPr>
+        <w:rPr>
+          <w:lang w:val="en-US"/>
+        </w:rPr>
+      </w:pPr>
+    </w:p>
+    <w:p>
+      <w:pPr>
+        <w:rPr>
+          <w:lang w:val="en-US"/>
+        </w:rPr>
+      </w:pPr>
+    </w:p>
+    <w:p>
+      <w:pPr>
+        <w:rPr>
+          <w:lang w:val="en-US"/>
+        </w:rPr>
+      </w:pPr>
+    </w:p>
+    <w:p>
+      <w:pPr>
+        <w:rPr>
+          <w:lang w:val="en-US"/>
+        </w:rPr>
+      </w:pPr>
     </w:p>
     <w:p>
       <w:pPr>
@@ -17769,7 +20558,7 @@
           <w:lang w:val="en-US"/>
         </w:rPr>
       </w:pPr>
-      <w:bookmarkStart w:id="41" w:name="_Toc228478082"/>
+      <w:bookmarkStart w:id="47" w:name="_Toc228539687"/>
       <w:r>
         <w:rPr>
           <w:rFonts w:ascii="Arial" w:hAnsi="Arial" w:cs="Arial"/>
@@ -17806,18 +20595,10 @@
         </w:rPr>
         <w:t>Functional Testing</w:t>
       </w:r>
-      <w:bookmarkEnd w:id="41"/>
-    </w:p>
-    <w:p>
-      <w:pPr>
-        <w:rPr>
-          <w:lang w:val="en-US"/>
-        </w:rPr>
-      </w:pPr>
-    </w:p>
-    <w:p>
-      <w:pPr>
-        <w:jc w:val="center"/>
+      <w:bookmarkEnd w:id="47"/>
+    </w:p>
+    <w:p>
+      <w:pPr>
         <w:rPr>
           <w:lang w:val="en-US"/>
         </w:rPr>
@@ -18000,7 +20781,7 @@
           <w:lang w:val="en-US"/>
         </w:rPr>
       </w:pPr>
-      <w:bookmarkStart w:id="42" w:name="_Toc228478083"/>
+      <w:bookmarkStart w:id="48" w:name="_Toc228539688"/>
       <w:r>
         <w:rPr>
           <w:rFonts w:ascii="Arial" w:hAnsi="Arial" w:cs="Arial"/>
@@ -18027,7 +20808,7 @@
         <w:tab/>
         <w:t>Product Evaluation</w:t>
       </w:r>
-      <w:bookmarkEnd w:id="42"/>
+      <w:bookmarkEnd w:id="48"/>
     </w:p>
     <w:p>
       <w:pPr>
@@ -18239,7 +21020,7 @@
           <w:lang w:val="en-US"/>
         </w:rPr>
       </w:pPr>
-      <w:bookmarkStart w:id="43" w:name="_Toc228478084"/>
+      <w:bookmarkStart w:id="49" w:name="_Toc228539689"/>
       <w:r>
         <w:rPr>
           <w:rFonts w:ascii="Arial" w:hAnsi="Arial" w:cs="Arial"/>
@@ -18266,7 +21047,7 @@
         <w:tab/>
         <w:t>Project Evaluation</w:t>
       </w:r>
-      <w:bookmarkEnd w:id="43"/>
+      <w:bookmarkEnd w:id="49"/>
     </w:p>
     <w:p>
       <w:pPr>
@@ -18493,7 +21274,7 @@
           <w:lang w:val="en-US"/>
         </w:rPr>
       </w:pPr>
-      <w:bookmarkStart w:id="44" w:name="_Toc228478085"/>
+      <w:bookmarkStart w:id="50" w:name="_Toc228539690"/>
       <w:r>
         <w:rPr>
           <w:rFonts w:ascii="Arial" w:hAnsi="Arial" w:cs="Arial"/>
@@ -18520,7 +21301,7 @@
         <w:tab/>
         <w:t>Summary and Conclusion</w:t>
       </w:r>
-      <w:bookmarkEnd w:id="44"/>
+      <w:bookmarkEnd w:id="50"/>
     </w:p>
     <w:p>
       <w:pPr>
@@ -18756,7 +21537,7 @@
           <w:lang w:val="en-US"/>
         </w:rPr>
       </w:pPr>
-      <w:bookmarkStart w:id="45" w:name="_Toc228478086"/>
+      <w:bookmarkStart w:id="51" w:name="_Toc228539691"/>
       <w:r>
         <w:rPr>
           <w:rFonts w:ascii="Arial" w:hAnsi="Arial" w:cs="Arial"/>
@@ -18806,7 +21587,7 @@
         </w:rPr>
         <w:t>References</w:t>
       </w:r>
-      <w:bookmarkEnd w:id="45"/>
+      <w:bookmarkEnd w:id="51"/>
     </w:p>
     <w:p>
       <w:pPr>
@@ -19832,6 +22613,92 @@
     </w:lvl>
   </w:abstractNum>
   <w:abstractNum w:abstractNumId="3" w15:restartNumberingAfterBreak="0">
+    <w:nsid w:val="150760DE"/>
+    <w:multiLevelType w:val="hybridMultilevel"/>
+    <w:tmpl w:val="E5188EE8"/>
+    <w:lvl w:ilvl="0" w:tplc="0809001B">
+      <w:start w:val="1"/>
+      <w:numFmt w:val="lowerRoman"/>
+      <w:lvlText w:val="%1."/>
+      <w:lvlJc w:val="right"/>
+      <w:pPr>
+        <w:ind w:left="720" w:hanging="360"/>
+      </w:pPr>
+    </w:lvl>
+    <w:lvl w:ilvl="1" w:tplc="08090019" w:tentative="1">
+      <w:start w:val="1"/>
+      <w:numFmt w:val="lowerLetter"/>
+      <w:lvlText w:val="%2."/>
+      <w:lvlJc w:val="left"/>
+      <w:pPr>
+        <w:ind w:left="1440" w:hanging="360"/>
+      </w:pPr>
+    </w:lvl>
+    <w:lvl w:ilvl="2" w:tplc="0809001B" w:tentative="1">
+      <w:start w:val="1"/>
+      <w:numFmt w:val="lowerRoman"/>
+      <w:lvlText w:val="%3."/>
+      <w:lvlJc w:val="right"/>
+      <w:pPr>
+        <w:ind w:left="2160" w:hanging="180"/>
+      </w:pPr>
+    </w:lvl>
+    <w:lvl w:ilvl="3" w:tplc="0809000F" w:tentative="1">
+      <w:start w:val="1"/>
+      <w:numFmt w:val="decimal"/>
+      <w:lvlText w:val="%4."/>
+      <w:lvlJc w:val="left"/>
+      <w:pPr>
+        <w:ind w:left="2880" w:hanging="360"/>
+      </w:pPr>
+    </w:lvl>
+    <w:lvl w:ilvl="4" w:tplc="08090019" w:tentative="1">
+      <w:start w:val="1"/>
+      <w:numFmt w:val="lowerLetter"/>
+      <w:lvlText w:val="%5."/>
+      <w:lvlJc w:val="left"/>
+      <w:pPr>
+        <w:ind w:left="3600" w:hanging="360"/>
+      </w:pPr>
+    </w:lvl>
+    <w:lvl w:ilvl="5" w:tplc="0809001B" w:tentative="1">
+      <w:start w:val="1"/>
+      <w:numFmt w:val="lowerRoman"/>
+      <w:lvlText w:val="%6."/>
+      <w:lvlJc w:val="right"/>
+      <w:pPr>
+        <w:ind w:left="4320" w:hanging="180"/>
+      </w:pPr>
+    </w:lvl>
+    <w:lvl w:ilvl="6" w:tplc="0809000F" w:tentative="1">
+      <w:start w:val="1"/>
+      <w:numFmt w:val="decimal"/>
+      <w:lvlText w:val="%7."/>
+      <w:lvlJc w:val="left"/>
+      <w:pPr>
+        <w:ind w:left="5040" w:hanging="360"/>
+      </w:pPr>
+    </w:lvl>
+    <w:lvl w:ilvl="7" w:tplc="08090019" w:tentative="1">
+      <w:start w:val="1"/>
+      <w:numFmt w:val="lowerLetter"/>
+      <w:lvlText w:val="%8."/>
+      <w:lvlJc w:val="left"/>
+      <w:pPr>
+        <w:ind w:left="5760" w:hanging="360"/>
+      </w:pPr>
+    </w:lvl>
+    <w:lvl w:ilvl="8" w:tplc="0809001B" w:tentative="1">
+      <w:start w:val="1"/>
+      <w:numFmt w:val="lowerRoman"/>
+      <w:lvlText w:val="%9."/>
+      <w:lvlJc w:val="right"/>
+      <w:pPr>
+        <w:ind w:left="6480" w:hanging="180"/>
+      </w:pPr>
+    </w:lvl>
+  </w:abstractNum>
+  <w:abstractNum w:abstractNumId="4" w15:restartNumberingAfterBreak="0">
     <w:nsid w:val="1BBD5288"/>
     <w:multiLevelType w:val="hybridMultilevel"/>
     <w:tmpl w:val="F9421688"/>
@@ -19917,7 +22784,7 @@
       </w:pPr>
     </w:lvl>
   </w:abstractNum>
-  <w:abstractNum w:abstractNumId="4" w15:restartNumberingAfterBreak="0">
+  <w:abstractNum w:abstractNumId="5" w15:restartNumberingAfterBreak="0">
     <w:nsid w:val="3EE17BC7"/>
     <w:multiLevelType w:val="multilevel"/>
     <w:tmpl w:val="0809001F"/>
@@ -20003,7 +22870,7 @@
       </w:pPr>
     </w:lvl>
   </w:abstractNum>
-  <w:abstractNum w:abstractNumId="5" w15:restartNumberingAfterBreak="0">
+  <w:abstractNum w:abstractNumId="6" w15:restartNumberingAfterBreak="0">
     <w:nsid w:val="3F65357C"/>
     <w:multiLevelType w:val="hybridMultilevel"/>
     <w:tmpl w:val="3A040FC0"/>
@@ -20089,7 +22956,7 @@
       </w:pPr>
     </w:lvl>
   </w:abstractNum>
-  <w:abstractNum w:abstractNumId="6" w15:restartNumberingAfterBreak="0">
+  <w:abstractNum w:abstractNumId="7" w15:restartNumberingAfterBreak="0">
     <w:nsid w:val="4ABB335D"/>
     <w:multiLevelType w:val="hybridMultilevel"/>
     <w:tmpl w:val="4454AAE6"/>
@@ -20175,7 +23042,7 @@
       </w:pPr>
     </w:lvl>
   </w:abstractNum>
-  <w:abstractNum w:abstractNumId="7" w15:restartNumberingAfterBreak="0">
+  <w:abstractNum w:abstractNumId="8" w15:restartNumberingAfterBreak="0">
     <w:nsid w:val="4CC90960"/>
     <w:multiLevelType w:val="multilevel"/>
     <w:tmpl w:val="0809001F"/>
@@ -20261,7 +23128,7 @@
       </w:pPr>
     </w:lvl>
   </w:abstractNum>
-  <w:abstractNum w:abstractNumId="8" w15:restartNumberingAfterBreak="0">
+  <w:abstractNum w:abstractNumId="9" w15:restartNumberingAfterBreak="0">
     <w:nsid w:val="51C70391"/>
     <w:multiLevelType w:val="multilevel"/>
     <w:tmpl w:val="7098F38C"/>
@@ -20364,7 +23231,7 @@
       </w:pPr>
     </w:lvl>
   </w:abstractNum>
-  <w:abstractNum w:abstractNumId="9" w15:restartNumberingAfterBreak="0">
+  <w:abstractNum w:abstractNumId="10" w15:restartNumberingAfterBreak="0">
     <w:nsid w:val="53B7615F"/>
     <w:multiLevelType w:val="hybridMultilevel"/>
     <w:tmpl w:val="A178EE1A"/>
@@ -20450,7 +23317,7 @@
       </w:pPr>
     </w:lvl>
   </w:abstractNum>
-  <w:abstractNum w:abstractNumId="10" w15:restartNumberingAfterBreak="0">
+  <w:abstractNum w:abstractNumId="11" w15:restartNumberingAfterBreak="0">
     <w:nsid w:val="58CE2D3C"/>
     <w:multiLevelType w:val="multilevel"/>
     <w:tmpl w:val="0809001F"/>
@@ -20536,7 +23403,7 @@
       </w:pPr>
     </w:lvl>
   </w:abstractNum>
-  <w:abstractNum w:abstractNumId="11" w15:restartNumberingAfterBreak="0">
+  <w:abstractNum w:abstractNumId="12" w15:restartNumberingAfterBreak="0">
     <w:nsid w:val="6DCA2692"/>
     <w:multiLevelType w:val="hybridMultilevel"/>
     <w:tmpl w:val="EA3ECD1C"/>
@@ -20622,7 +23489,7 @@
       </w:pPr>
     </w:lvl>
   </w:abstractNum>
-  <w:abstractNum w:abstractNumId="12" w15:restartNumberingAfterBreak="0">
+  <w:abstractNum w:abstractNumId="13" w15:restartNumberingAfterBreak="0">
     <w:nsid w:val="78466AF0"/>
     <w:multiLevelType w:val="multilevel"/>
     <w:tmpl w:val="0809001F"/>
@@ -20708,7 +23575,7 @@
       </w:pPr>
     </w:lvl>
   </w:abstractNum>
-  <w:abstractNum w:abstractNumId="13" w15:restartNumberingAfterBreak="0">
+  <w:abstractNum w:abstractNumId="14" w15:restartNumberingAfterBreak="0">
     <w:nsid w:val="7A240FC1"/>
     <w:multiLevelType w:val="hybridMultilevel"/>
     <w:tmpl w:val="FF4A5E62"/>
@@ -20794,7 +23661,7 @@
       </w:pPr>
     </w:lvl>
   </w:abstractNum>
-  <w:abstractNum w:abstractNumId="14" w15:restartNumberingAfterBreak="0">
+  <w:abstractNum w:abstractNumId="15" w15:restartNumberingAfterBreak="0">
     <w:nsid w:val="7B843BFD"/>
     <w:multiLevelType w:val="hybridMultilevel"/>
     <w:tmpl w:val="56DC8866"/>
@@ -20872,7 +23739,7 @@
       </w:pPr>
     </w:lvl>
   </w:abstractNum>
-  <w:abstractNum w:abstractNumId="15" w15:restartNumberingAfterBreak="0">
+  <w:abstractNum w:abstractNumId="16" w15:restartNumberingAfterBreak="0">
     <w:nsid w:val="7D992C6C"/>
     <w:multiLevelType w:val="hybridMultilevel"/>
     <w:tmpl w:val="2F8676C8"/>
@@ -20985,40 +23852,40 @@
     </w:lvl>
   </w:abstractNum>
   <w:num w:numId="1" w16cid:durableId="10230161">
-    <w:abstractNumId w:val="12"/>
+    <w:abstractNumId w:val="13"/>
   </w:num>
   <w:num w:numId="2" w16cid:durableId="1591504144">
+    <w:abstractNumId w:val="9"/>
+  </w:num>
+  <w:num w:numId="3" w16cid:durableId="249000125">
+    <w:abstractNumId w:val="11"/>
+  </w:num>
+  <w:num w:numId="4" w16cid:durableId="719397855">
     <w:abstractNumId w:val="8"/>
   </w:num>
-  <w:num w:numId="3" w16cid:durableId="249000125">
-    <w:abstractNumId w:val="10"/>
+  <w:num w:numId="5" w16cid:durableId="1899314918">
+    <w:abstractNumId w:val="5"/>
   </w:num>
-  <w:num w:numId="4" w16cid:durableId="719397855">
+  <w:num w:numId="6" w16cid:durableId="2100835209">
     <w:abstractNumId w:val="7"/>
   </w:num>
-  <w:num w:numId="5" w16cid:durableId="1899314918">
-    <w:abstractNumId w:val="4"/>
+  <w:num w:numId="7" w16cid:durableId="1803574744">
+    <w:abstractNumId w:val="14"/>
   </w:num>
-  <w:num w:numId="6" w16cid:durableId="2100835209">
+  <w:num w:numId="8" w16cid:durableId="548105091">
     <w:abstractNumId w:val="6"/>
   </w:num>
-  <w:num w:numId="7" w16cid:durableId="1803574744">
-    <w:abstractNumId w:val="13"/>
-  </w:num>
-  <w:num w:numId="8" w16cid:durableId="548105091">
-    <w:abstractNumId w:val="5"/>
-  </w:num>
   <w:num w:numId="9" w16cid:durableId="1637251457">
-    <w:abstractNumId w:val="3"/>
+    <w:abstractNumId w:val="4"/>
   </w:num>
   <w:num w:numId="10" w16cid:durableId="1633828864">
     <w:abstractNumId w:val="0"/>
   </w:num>
   <w:num w:numId="11" w16cid:durableId="444547814">
-    <w:abstractNumId w:val="15"/>
+    <w:abstractNumId w:val="16"/>
   </w:num>
   <w:num w:numId="12" w16cid:durableId="887954502">
-    <w:abstractNumId w:val="9"/>
+    <w:abstractNumId w:val="10"/>
   </w:num>
   <w:num w:numId="13" w16cid:durableId="105588906">
     <w:abstractNumId w:val="2"/>
@@ -21027,13 +23894,16 @@
     <w:abstractNumId w:val="1"/>
   </w:num>
   <w:num w:numId="15" w16cid:durableId="21902796">
-    <w:abstractNumId w:val="14"/>
+    <w:abstractNumId w:val="15"/>
   </w:num>
   <w:num w:numId="16" w16cid:durableId="750471313">
-    <w:abstractNumId w:val="14"/>
+    <w:abstractNumId w:val="15"/>
   </w:num>
   <w:num w:numId="17" w16cid:durableId="241762456">
-    <w:abstractNumId w:val="11"/>
+    <w:abstractNumId w:val="12"/>
+  </w:num>
+  <w:num w:numId="18" w16cid:durableId="9525100">
+    <w:abstractNumId w:val="3"/>
   </w:num>
 </w:numbering>
 </file>
@@ -21438,7 +24308,7 @@
   <w:style w:type="paragraph" w:default="1" w:styleId="Normal">
     <w:name w:val="Normal"/>
     <w:qFormat/>
-    <w:rsid w:val="005A05EB"/>
+    <w:rsid w:val="00C30416"/>
   </w:style>
   <w:style w:type="paragraph" w:styleId="Heading1">
     <w:name w:val="heading 1"/>
@@ -21675,6 +24545,7 @@
   <w:style w:type="character" w:default="1" w:styleId="DefaultParagraphFont">
     <w:name w:val="Default Paragraph Font"/>
     <w:uiPriority w:val="1"/>
+    <w:semiHidden/>
     <w:unhideWhenUsed/>
   </w:style>
   <w:style w:type="table" w:default="1" w:styleId="TableNormal">

</xml_diff>